<commit_message>
FDE-2: Add Attribution Request
</commit_message>
<xml_diff>
--- a/Prompts-FDE- 2.docx
+++ b/Prompts-FDE- 2.docx
@@ -558,6 +558,777 @@
         </w:rPr>
         <w:t xml:space="preserve"> values match the business rules in the requirements document</w:t>
       </w:r>
+    </w:p>
+    <w:p>
+      <w:pPr>
+        <w:spacing w:before="280" w:after="80"/>
+      </w:pPr>
+      <w:r>
+        <w:rPr>
+          <w:rFonts w:ascii="Calibri" w:hAnsi="Calibri"/>
+          <w:b/>
+          <w:color w:val="2E74B5"/>
+          <w:sz w:val="28"/>
+        </w:rPr>
+        <w:t xml:space="preserve">STEP </w:t>
+      </w:r>
+      <w:r>
+        <w:rPr>
+          <w:rFonts w:ascii="Calibri" w:hAnsi="Calibri"/>
+          <w:b/>
+          <w:color w:val="2E74B5"/>
+          <w:sz w:val="28"/>
+        </w:rPr>
+        <w:t>2</w:t>
+      </w:r>
+      <w:r>
+        <w:rPr>
+          <w:rFonts w:ascii="Calibri" w:hAnsi="Calibri"/>
+          <w:b/>
+          <w:color w:val="2E74B5"/>
+          <w:sz w:val="28"/>
+        </w:rPr>
+        <w:t xml:space="preserve">  —  Request Model</w:t>
+      </w:r>
+    </w:p>
+    <w:p>
+      <w:pPr>
+        <w:pStyle w:val="ListBullet"/>
+        <w:numPr>
+          <w:ilvl w:val="0"/>
+          <w:numId w:val="0"/>
+        </w:numPr>
+        <w:spacing w:after="40"/>
+        <w:rPr>
+          <w:rFonts w:ascii="Calibri" w:hAnsi="Calibri"/>
+          <w:sz w:val="21"/>
+        </w:rPr>
+      </w:pPr>
+    </w:p>
+    <w:p>
+      <w:pPr>
+        <w:shd w:val="clear" w:color="auto" w:fill="F2F2F2"/>
+        <w:spacing w:after="0"/>
+        <w:ind w:left="288"/>
+      </w:pPr>
+      <w:r>
+        <w:rPr>
+          <w:rFonts w:ascii="Courier New" w:hAnsi="Courier New"/>
+          <w:sz w:val="18"/>
+        </w:rPr>
+        <w:t xml:space="preserve">In package </w:t>
+      </w:r>
+      <w:proofErr w:type="spellStart"/>
+      <w:r>
+        <w:rPr>
+          <w:rFonts w:ascii="Courier New" w:hAnsi="Courier New"/>
+          <w:sz w:val="18"/>
+        </w:rPr>
+        <w:t>com.portfolio.attribution.model.request</w:t>
+      </w:r>
+      <w:proofErr w:type="spellEnd"/>
+      <w:r>
+        <w:rPr>
+          <w:rFonts w:ascii="Courier New" w:hAnsi="Courier New"/>
+          <w:sz w:val="18"/>
+        </w:rPr>
+        <w:t>, create the following classes</w:t>
+      </w:r>
+    </w:p>
+    <w:p>
+      <w:pPr>
+        <w:shd w:val="clear" w:color="auto" w:fill="F2F2F2"/>
+        <w:spacing w:after="0"/>
+        <w:ind w:left="288"/>
+      </w:pPr>
+      <w:r>
+        <w:rPr>
+          <w:rFonts w:ascii="Courier New" w:hAnsi="Courier New"/>
+          <w:sz w:val="18"/>
+        </w:rPr>
+        <w:t>for the Portfolio Attribution API using Java 21, Lombok, and Jakarta Validation:</w:t>
+      </w:r>
+    </w:p>
+    <w:p>
+      <w:pPr>
+        <w:shd w:val="clear" w:color="auto" w:fill="F2F2F2"/>
+        <w:spacing w:after="0"/>
+        <w:ind w:left="288"/>
+      </w:pPr>
+      <w:r>
+        <w:rPr>
+          <w:rFonts w:ascii="Courier New" w:hAnsi="Courier New"/>
+          <w:sz w:val="18"/>
+        </w:rPr>
+        <w:t xml:space="preserve"> </w:t>
+      </w:r>
+    </w:p>
+    <w:p>
+      <w:pPr>
+        <w:shd w:val="clear" w:color="auto" w:fill="F2F2F2"/>
+        <w:spacing w:after="0"/>
+        <w:ind w:left="288"/>
+      </w:pPr>
+      <w:r>
+        <w:rPr>
+          <w:rFonts w:ascii="Courier New" w:hAnsi="Courier New"/>
+          <w:sz w:val="18"/>
+        </w:rPr>
+        <w:t xml:space="preserve">1. </w:t>
+      </w:r>
+      <w:proofErr w:type="spellStart"/>
+      <w:r>
+        <w:rPr>
+          <w:rFonts w:ascii="Courier New" w:hAnsi="Courier New"/>
+          <w:sz w:val="18"/>
+        </w:rPr>
+        <w:t>GroupInput</w:t>
+      </w:r>
+      <w:proofErr w:type="spellEnd"/>
+      <w:r>
+        <w:rPr>
+          <w:rFonts w:ascii="Courier New" w:hAnsi="Courier New"/>
+          <w:sz w:val="18"/>
+        </w:rPr>
+        <w:t xml:space="preserve"> — represents a single asset group in the request:</w:t>
+      </w:r>
+    </w:p>
+    <w:p>
+      <w:pPr>
+        <w:shd w:val="clear" w:color="auto" w:fill="F2F2F2"/>
+        <w:spacing w:after="0"/>
+        <w:ind w:left="288"/>
+      </w:pPr>
+      <w:r>
+        <w:rPr>
+          <w:rFonts w:ascii="Courier New" w:hAnsi="Courier New"/>
+          <w:sz w:val="18"/>
+        </w:rPr>
+        <w:t xml:space="preserve">   Fields:</w:t>
+      </w:r>
+    </w:p>
+    <w:p>
+      <w:pPr>
+        <w:shd w:val="clear" w:color="auto" w:fill="F2F2F2"/>
+        <w:spacing w:after="0"/>
+        <w:ind w:left="288"/>
+      </w:pPr>
+      <w:r>
+        <w:rPr>
+          <w:rFonts w:ascii="Courier New" w:hAnsi="Courier New"/>
+          <w:sz w:val="18"/>
+        </w:rPr>
+        <w:t xml:space="preserve">   - </w:t>
+      </w:r>
+      <w:proofErr w:type="spellStart"/>
+      <w:r>
+        <w:rPr>
+          <w:rFonts w:ascii="Courier New" w:hAnsi="Courier New"/>
+          <w:sz w:val="18"/>
+        </w:rPr>
+        <w:t>groupName</w:t>
+      </w:r>
+      <w:proofErr w:type="spellEnd"/>
+      <w:r>
+        <w:rPr>
+          <w:rFonts w:ascii="Courier New" w:hAnsi="Courier New"/>
+          <w:sz w:val="18"/>
+        </w:rPr>
+        <w:t>: String, @NotBlank</w:t>
+      </w:r>
+    </w:p>
+    <w:p>
+      <w:pPr>
+        <w:shd w:val="clear" w:color="auto" w:fill="F2F2F2"/>
+        <w:spacing w:after="0"/>
+        <w:ind w:left="288"/>
+      </w:pPr>
+      <w:r>
+        <w:rPr>
+          <w:rFonts w:ascii="Courier New" w:hAnsi="Courier New"/>
+          <w:sz w:val="18"/>
+        </w:rPr>
+        <w:t xml:space="preserve">   - </w:t>
+      </w:r>
+      <w:proofErr w:type="spellStart"/>
+      <w:r>
+        <w:rPr>
+          <w:rFonts w:ascii="Courier New" w:hAnsi="Courier New"/>
+          <w:sz w:val="18"/>
+        </w:rPr>
+        <w:t>weightPct</w:t>
+      </w:r>
+      <w:proofErr w:type="spellEnd"/>
+      <w:r>
+        <w:rPr>
+          <w:rFonts w:ascii="Courier New" w:hAnsi="Courier New"/>
+          <w:sz w:val="18"/>
+        </w:rPr>
+        <w:t xml:space="preserve">: </w:t>
+      </w:r>
+      <w:proofErr w:type="spellStart"/>
+      <w:r>
+        <w:rPr>
+          <w:rFonts w:ascii="Courier New" w:hAnsi="Courier New"/>
+          <w:sz w:val="18"/>
+        </w:rPr>
+        <w:t>BigDecimal</w:t>
+      </w:r>
+      <w:proofErr w:type="spellEnd"/>
+      <w:r>
+        <w:rPr>
+          <w:rFonts w:ascii="Courier New" w:hAnsi="Courier New"/>
+          <w:sz w:val="18"/>
+        </w:rPr>
+        <w:t>, @NotNull, @DecimalMin("0.0"), @DecimalMax("100.0")</w:t>
+      </w:r>
+    </w:p>
+    <w:p>
+      <w:pPr>
+        <w:shd w:val="clear" w:color="auto" w:fill="F2F2F2"/>
+        <w:spacing w:after="0"/>
+        <w:ind w:left="288"/>
+      </w:pPr>
+      <w:r>
+        <w:rPr>
+          <w:rFonts w:ascii="Courier New" w:hAnsi="Courier New"/>
+          <w:sz w:val="18"/>
+        </w:rPr>
+        <w:t xml:space="preserve">   - </w:t>
+      </w:r>
+      <w:proofErr w:type="spellStart"/>
+      <w:r>
+        <w:rPr>
+          <w:rFonts w:ascii="Courier New" w:hAnsi="Courier New"/>
+          <w:sz w:val="18"/>
+        </w:rPr>
+        <w:t>returnPct</w:t>
+      </w:r>
+      <w:proofErr w:type="spellEnd"/>
+      <w:r>
+        <w:rPr>
+          <w:rFonts w:ascii="Courier New" w:hAnsi="Courier New"/>
+          <w:sz w:val="18"/>
+        </w:rPr>
+        <w:t xml:space="preserve">: </w:t>
+      </w:r>
+      <w:proofErr w:type="spellStart"/>
+      <w:r>
+        <w:rPr>
+          <w:rFonts w:ascii="Courier New" w:hAnsi="Courier New"/>
+          <w:sz w:val="18"/>
+        </w:rPr>
+        <w:t>BigDecimal</w:t>
+      </w:r>
+      <w:proofErr w:type="spellEnd"/>
+      <w:r>
+        <w:rPr>
+          <w:rFonts w:ascii="Courier New" w:hAnsi="Courier New"/>
+          <w:sz w:val="18"/>
+        </w:rPr>
+        <w:t>, nullable (represents delayed/unavailable pricing)</w:t>
+      </w:r>
+    </w:p>
+    <w:p>
+      <w:pPr>
+        <w:shd w:val="clear" w:color="auto" w:fill="F2F2F2"/>
+        <w:spacing w:after="0"/>
+        <w:ind w:left="288"/>
+      </w:pPr>
+      <w:r>
+        <w:rPr>
+          <w:rFonts w:ascii="Courier New" w:hAnsi="Courier New"/>
+          <w:sz w:val="18"/>
+        </w:rPr>
+        <w:t xml:space="preserve">   - </w:t>
+      </w:r>
+      <w:proofErr w:type="spellStart"/>
+      <w:r>
+        <w:rPr>
+          <w:rFonts w:ascii="Courier New" w:hAnsi="Courier New"/>
+          <w:sz w:val="18"/>
+        </w:rPr>
+        <w:t>fallbackReturnPct</w:t>
+      </w:r>
+      <w:proofErr w:type="spellEnd"/>
+      <w:r>
+        <w:rPr>
+          <w:rFonts w:ascii="Courier New" w:hAnsi="Courier New"/>
+          <w:sz w:val="18"/>
+        </w:rPr>
+        <w:t xml:space="preserve">: </w:t>
+      </w:r>
+      <w:proofErr w:type="spellStart"/>
+      <w:r>
+        <w:rPr>
+          <w:rFonts w:ascii="Courier New" w:hAnsi="Courier New"/>
+          <w:sz w:val="18"/>
+        </w:rPr>
+        <w:t>BigDecimal</w:t>
+      </w:r>
+      <w:proofErr w:type="spellEnd"/>
+      <w:r>
+        <w:rPr>
+          <w:rFonts w:ascii="Courier New" w:hAnsi="Courier New"/>
+          <w:sz w:val="18"/>
+        </w:rPr>
+        <w:t xml:space="preserve">, nullable (used when </w:t>
+      </w:r>
+      <w:proofErr w:type="spellStart"/>
+      <w:r>
+        <w:rPr>
+          <w:rFonts w:ascii="Courier New" w:hAnsi="Courier New"/>
+          <w:sz w:val="18"/>
+        </w:rPr>
+        <w:t>returnPct</w:t>
+      </w:r>
+      <w:proofErr w:type="spellEnd"/>
+      <w:r>
+        <w:rPr>
+          <w:rFonts w:ascii="Courier New" w:hAnsi="Courier New"/>
+          <w:sz w:val="18"/>
+        </w:rPr>
+        <w:t xml:space="preserve"> is null)</w:t>
+      </w:r>
+    </w:p>
+    <w:p>
+      <w:pPr>
+        <w:shd w:val="clear" w:color="auto" w:fill="F2F2F2"/>
+        <w:spacing w:after="0"/>
+        <w:ind w:left="288"/>
+      </w:pPr>
+      <w:r>
+        <w:rPr>
+          <w:rFonts w:ascii="Courier New" w:hAnsi="Courier New"/>
+          <w:sz w:val="18"/>
+        </w:rPr>
+        <w:t xml:space="preserve">   Annotations: @Data, @Builder, @NoArgsConstructor, @AllArgsConstructor</w:t>
+      </w:r>
+    </w:p>
+    <w:p>
+      <w:pPr>
+        <w:shd w:val="clear" w:color="auto" w:fill="F2F2F2"/>
+        <w:spacing w:after="0"/>
+        <w:ind w:left="288"/>
+      </w:pPr>
+      <w:r>
+        <w:rPr>
+          <w:rFonts w:ascii="Courier New" w:hAnsi="Courier New"/>
+          <w:sz w:val="18"/>
+        </w:rPr>
+        <w:t xml:space="preserve"> </w:t>
+      </w:r>
+    </w:p>
+    <w:p>
+      <w:pPr>
+        <w:shd w:val="clear" w:color="auto" w:fill="F2F2F2"/>
+        <w:spacing w:after="0"/>
+        <w:ind w:left="288"/>
+      </w:pPr>
+      <w:r>
+        <w:rPr>
+          <w:rFonts w:ascii="Courier New" w:hAnsi="Courier New"/>
+          <w:sz w:val="18"/>
+        </w:rPr>
+        <w:t xml:space="preserve">2. </w:t>
+      </w:r>
+      <w:proofErr w:type="spellStart"/>
+      <w:r>
+        <w:rPr>
+          <w:rFonts w:ascii="Courier New" w:hAnsi="Courier New"/>
+          <w:sz w:val="18"/>
+        </w:rPr>
+        <w:t>AttributionRequest</w:t>
+      </w:r>
+      <w:proofErr w:type="spellEnd"/>
+      <w:r>
+        <w:rPr>
+          <w:rFonts w:ascii="Courier New" w:hAnsi="Courier New"/>
+          <w:sz w:val="18"/>
+        </w:rPr>
+        <w:t xml:space="preserve"> — the top-level POST body:</w:t>
+      </w:r>
+    </w:p>
+    <w:p>
+      <w:pPr>
+        <w:shd w:val="clear" w:color="auto" w:fill="F2F2F2"/>
+        <w:spacing w:after="0"/>
+        <w:ind w:left="288"/>
+      </w:pPr>
+      <w:r>
+        <w:rPr>
+          <w:rFonts w:ascii="Courier New" w:hAnsi="Courier New"/>
+          <w:sz w:val="18"/>
+        </w:rPr>
+        <w:t xml:space="preserve">   Fields:</w:t>
+      </w:r>
+    </w:p>
+    <w:p>
+      <w:pPr>
+        <w:shd w:val="clear" w:color="auto" w:fill="F2F2F2"/>
+        <w:spacing w:after="0"/>
+        <w:ind w:left="288"/>
+      </w:pPr>
+      <w:r>
+        <w:rPr>
+          <w:rFonts w:ascii="Courier New" w:hAnsi="Courier New"/>
+          <w:sz w:val="18"/>
+        </w:rPr>
+        <w:t xml:space="preserve">   - </w:t>
+      </w:r>
+      <w:proofErr w:type="spellStart"/>
+      <w:r>
+        <w:rPr>
+          <w:rFonts w:ascii="Courier New" w:hAnsi="Courier New"/>
+          <w:sz w:val="18"/>
+        </w:rPr>
+        <w:t>requestId</w:t>
+      </w:r>
+      <w:proofErr w:type="spellEnd"/>
+      <w:r>
+        <w:rPr>
+          <w:rFonts w:ascii="Courier New" w:hAnsi="Courier New"/>
+          <w:sz w:val="18"/>
+        </w:rPr>
+        <w:t>: String, @NotBlank (used for idempotency)</w:t>
+      </w:r>
+    </w:p>
+    <w:p>
+      <w:pPr>
+        <w:shd w:val="clear" w:color="auto" w:fill="F2F2F2"/>
+        <w:spacing w:after="0"/>
+        <w:ind w:left="288"/>
+      </w:pPr>
+      <w:r>
+        <w:rPr>
+          <w:rFonts w:ascii="Courier New" w:hAnsi="Courier New"/>
+          <w:sz w:val="18"/>
+        </w:rPr>
+        <w:t xml:space="preserve">   - </w:t>
+      </w:r>
+      <w:proofErr w:type="spellStart"/>
+      <w:r>
+        <w:rPr>
+          <w:rFonts w:ascii="Courier New" w:hAnsi="Courier New"/>
+          <w:sz w:val="18"/>
+        </w:rPr>
+        <w:t>portfolioId</w:t>
+      </w:r>
+      <w:proofErr w:type="spellEnd"/>
+      <w:r>
+        <w:rPr>
+          <w:rFonts w:ascii="Courier New" w:hAnsi="Courier New"/>
+          <w:sz w:val="18"/>
+        </w:rPr>
+        <w:t>: String, @NotBlank</w:t>
+      </w:r>
+    </w:p>
+    <w:p>
+      <w:pPr>
+        <w:shd w:val="clear" w:color="auto" w:fill="F2F2F2"/>
+        <w:spacing w:after="0"/>
+        <w:ind w:left="288"/>
+      </w:pPr>
+      <w:r>
+        <w:rPr>
+          <w:rFonts w:ascii="Courier New" w:hAnsi="Courier New"/>
+          <w:sz w:val="18"/>
+        </w:rPr>
+        <w:t xml:space="preserve">   - </w:t>
+      </w:r>
+      <w:proofErr w:type="spellStart"/>
+      <w:r>
+        <w:rPr>
+          <w:rFonts w:ascii="Courier New" w:hAnsi="Courier New"/>
+          <w:sz w:val="18"/>
+        </w:rPr>
+        <w:t>valuationDate</w:t>
+      </w:r>
+      <w:proofErr w:type="spellEnd"/>
+      <w:r>
+        <w:rPr>
+          <w:rFonts w:ascii="Courier New" w:hAnsi="Courier New"/>
+          <w:sz w:val="18"/>
+        </w:rPr>
+        <w:t xml:space="preserve">: </w:t>
+      </w:r>
+      <w:proofErr w:type="spellStart"/>
+      <w:r>
+        <w:rPr>
+          <w:rFonts w:ascii="Courier New" w:hAnsi="Courier New"/>
+          <w:sz w:val="18"/>
+        </w:rPr>
+        <w:t>LocalDate</w:t>
+      </w:r>
+      <w:proofErr w:type="spellEnd"/>
+      <w:r>
+        <w:rPr>
+          <w:rFonts w:ascii="Courier New" w:hAnsi="Courier New"/>
+          <w:sz w:val="18"/>
+        </w:rPr>
+        <w:t>, @NotNull</w:t>
+      </w:r>
+    </w:p>
+    <w:p>
+      <w:pPr>
+        <w:shd w:val="clear" w:color="auto" w:fill="F2F2F2"/>
+        <w:spacing w:after="0"/>
+        <w:ind w:left="288"/>
+      </w:pPr>
+      <w:r>
+        <w:rPr>
+          <w:rFonts w:ascii="Courier New" w:hAnsi="Courier New"/>
+          <w:sz w:val="18"/>
+        </w:rPr>
+        <w:t xml:space="preserve">   - groups: List&lt;</w:t>
+      </w:r>
+      <w:proofErr w:type="spellStart"/>
+      <w:r>
+        <w:rPr>
+          <w:rFonts w:ascii="Courier New" w:hAnsi="Courier New"/>
+          <w:sz w:val="18"/>
+        </w:rPr>
+        <w:t>GroupInput</w:t>
+      </w:r>
+      <w:proofErr w:type="spellEnd"/>
+      <w:r>
+        <w:rPr>
+          <w:rFonts w:ascii="Courier New" w:hAnsi="Courier New"/>
+          <w:sz w:val="18"/>
+        </w:rPr>
+        <w:t>&gt;, @NotEmpty, @Valid</w:t>
+      </w:r>
+    </w:p>
+    <w:p>
+      <w:pPr>
+        <w:shd w:val="clear" w:color="auto" w:fill="F2F2F2"/>
+        <w:spacing w:after="0"/>
+        <w:ind w:left="288"/>
+      </w:pPr>
+      <w:r>
+        <w:rPr>
+          <w:rFonts w:ascii="Courier New" w:hAnsi="Courier New"/>
+          <w:sz w:val="18"/>
+        </w:rPr>
+        <w:t xml:space="preserve">   - currency: String, @NotBlank (e.g. "USD")</w:t>
+      </w:r>
+    </w:p>
+    <w:p>
+      <w:pPr>
+        <w:shd w:val="clear" w:color="auto" w:fill="F2F2F2"/>
+        <w:spacing w:after="0"/>
+        <w:ind w:left="288"/>
+      </w:pPr>
+      <w:r>
+        <w:rPr>
+          <w:rFonts w:ascii="Courier New" w:hAnsi="Courier New"/>
+          <w:sz w:val="18"/>
+        </w:rPr>
+        <w:t xml:space="preserve">   - </w:t>
+      </w:r>
+      <w:proofErr w:type="spellStart"/>
+      <w:r>
+        <w:rPr>
+          <w:rFonts w:ascii="Courier New" w:hAnsi="Courier New"/>
+          <w:sz w:val="18"/>
+        </w:rPr>
+        <w:t>requestedBy</w:t>
+      </w:r>
+      <w:proofErr w:type="spellEnd"/>
+      <w:r>
+        <w:rPr>
+          <w:rFonts w:ascii="Courier New" w:hAnsi="Courier New"/>
+          <w:sz w:val="18"/>
+        </w:rPr>
+        <w:t>: String, @NotBlank</w:t>
+      </w:r>
+    </w:p>
+    <w:p>
+      <w:pPr>
+        <w:shd w:val="clear" w:color="auto" w:fill="F2F2F2"/>
+        <w:spacing w:after="0"/>
+        <w:ind w:left="288"/>
+      </w:pPr>
+      <w:r>
+        <w:rPr>
+          <w:rFonts w:ascii="Courier New" w:hAnsi="Courier New"/>
+          <w:sz w:val="18"/>
+        </w:rPr>
+        <w:t xml:space="preserve">   Annotations: @Data, @Builder, @NoArgsConstructor, @AllArgsConstructor</w:t>
+      </w:r>
+    </w:p>
+    <w:p>
+      <w:pPr>
+        <w:shd w:val="clear" w:color="auto" w:fill="F2F2F2"/>
+        <w:spacing w:after="0"/>
+        <w:ind w:left="288"/>
+      </w:pPr>
+      <w:r>
+        <w:rPr>
+          <w:rFonts w:ascii="Courier New" w:hAnsi="Courier New"/>
+          <w:sz w:val="18"/>
+        </w:rPr>
+        <w:t xml:space="preserve"> </w:t>
+      </w:r>
+    </w:p>
+    <w:p>
+      <w:pPr>
+        <w:shd w:val="clear" w:color="auto" w:fill="F2F2F2"/>
+        <w:spacing w:after="0"/>
+        <w:ind w:left="288"/>
+      </w:pPr>
+      <w:r>
+        <w:rPr>
+          <w:rFonts w:ascii="Courier New" w:hAnsi="Courier New"/>
+          <w:sz w:val="18"/>
+        </w:rPr>
+        <w:t>Use @JsonProperty where field names in JSON differ from Java conventions.</w:t>
+      </w:r>
+    </w:p>
+    <w:p>
+      <w:pPr>
+        <w:pStyle w:val="ListBullet"/>
+        <w:numPr>
+          <w:ilvl w:val="0"/>
+          <w:numId w:val="0"/>
+        </w:numPr>
+        <w:spacing w:after="40"/>
+      </w:pPr>
+    </w:p>
+    <w:p>
+      <w:pPr>
+        <w:spacing w:before="120" w:after="40"/>
+      </w:pPr>
+      <w:r>
+        <w:rPr>
+          <w:rFonts w:ascii="Calibri" w:hAnsi="Calibri"/>
+          <w:b/>
+          <w:color w:val="1F497D"/>
+        </w:rPr>
+        <w:t>Validation Gate</w:t>
+      </w:r>
+    </w:p>
+    <w:p>
+      <w:pPr>
+        <w:pStyle w:val="ListBullet"/>
+        <w:tabs>
+          <w:tab w:val="num" w:pos="360"/>
+        </w:tabs>
+        <w:spacing w:after="40"/>
+        <w:ind w:left="360" w:hanging="360"/>
+      </w:pPr>
+      <w:r>
+        <w:rPr>
+          <w:rFonts w:ascii="Calibri" w:hAnsi="Calibri"/>
+          <w:sz w:val="21"/>
+        </w:rPr>
+        <w:t>Run `</w:t>
+      </w:r>
+      <w:proofErr w:type="spellStart"/>
+      <w:r>
+        <w:rPr>
+          <w:rFonts w:ascii="Calibri" w:hAnsi="Calibri"/>
+          <w:sz w:val="21"/>
+        </w:rPr>
+        <w:t>mvn</w:t>
+      </w:r>
+      <w:proofErr w:type="spellEnd"/>
+      <w:r>
+        <w:rPr>
+          <w:rFonts w:ascii="Calibri" w:hAnsi="Calibri"/>
+          <w:sz w:val="21"/>
+        </w:rPr>
+        <w:t xml:space="preserve"> compile` — zero errors</w:t>
+      </w:r>
+    </w:p>
+    <w:p>
+      <w:pPr>
+        <w:pStyle w:val="ListBullet"/>
+        <w:tabs>
+          <w:tab w:val="num" w:pos="360"/>
+        </w:tabs>
+        <w:spacing w:after="40"/>
+        <w:ind w:left="360" w:hanging="360"/>
+      </w:pPr>
+      <w:r>
+        <w:rPr>
+          <w:rFonts w:ascii="Calibri" w:hAnsi="Calibri"/>
+          <w:sz w:val="21"/>
+        </w:rPr>
+        <w:lastRenderedPageBreak/>
+        <w:t xml:space="preserve">Write a unit test using the Lombok builder to create an </w:t>
+      </w:r>
+      <w:proofErr w:type="spellStart"/>
+      <w:r>
+        <w:rPr>
+          <w:rFonts w:ascii="Calibri" w:hAnsi="Calibri"/>
+          <w:sz w:val="21"/>
+        </w:rPr>
+        <w:t>AttributionRequest</w:t>
+      </w:r>
+      <w:proofErr w:type="spellEnd"/>
+      <w:r>
+        <w:rPr>
+          <w:rFonts w:ascii="Calibri" w:hAnsi="Calibri"/>
+          <w:sz w:val="21"/>
+        </w:rPr>
+        <w:t xml:space="preserve"> with three groups and assert non-null fields are populated</w:t>
+      </w:r>
+    </w:p>
+    <w:p>
+      <w:pPr>
+        <w:pStyle w:val="ListBullet"/>
+        <w:tabs>
+          <w:tab w:val="num" w:pos="360"/>
+        </w:tabs>
+        <w:spacing w:after="40"/>
+        <w:ind w:left="360" w:hanging="360"/>
+      </w:pPr>
+      <w:r>
+        <w:rPr>
+          <w:rFonts w:ascii="Calibri" w:hAnsi="Calibri"/>
+          <w:sz w:val="21"/>
+        </w:rPr>
+        <w:t xml:space="preserve">Confirm Jackson can deserialize the sample JSON from the requirements using </w:t>
+      </w:r>
+      <w:proofErr w:type="spellStart"/>
+      <w:r>
+        <w:rPr>
+          <w:rFonts w:ascii="Calibri" w:hAnsi="Calibri"/>
+          <w:sz w:val="21"/>
+        </w:rPr>
+        <w:t>ObjectMapper</w:t>
+      </w:r>
+      <w:proofErr w:type="spellEnd"/>
+      <w:r>
+        <w:rPr>
+          <w:rFonts w:ascii="Calibri" w:hAnsi="Calibri"/>
+          <w:sz w:val="21"/>
+        </w:rPr>
+        <w:t xml:space="preserve"> in the test</w:t>
+      </w:r>
+    </w:p>
+    <w:p>
+      <w:pPr>
+        <w:spacing w:before="40" w:after="40"/>
+      </w:pPr>
+      <w:r>
+        <w:rPr>
+          <w:color w:val="CCCCCC"/>
+          <w:sz w:val="16"/>
+        </w:rPr>
+        <w:t>──────────────────────────────────────────────────────────────────────────────────────────</w:t>
+      </w:r>
+    </w:p>
+    <w:p>
+      <w:pPr>
+        <w:pStyle w:val="ListBullet"/>
+        <w:numPr>
+          <w:ilvl w:val="0"/>
+          <w:numId w:val="0"/>
+        </w:numPr>
+        <w:spacing w:after="40"/>
+      </w:pPr>
     </w:p>
     <w:p>
       <w:pPr>

</xml_diff>

<commit_message>
FDE-2: Add Attribution Response and its test
</commit_message>
<xml_diff>
--- a/Prompts-FDE- 2.docx
+++ b/Prompts-FDE- 2.docx
@@ -45,6 +45,7 @@
         </w:rPr>
         <w:t xml:space="preserve">STEP </w:t>
       </w:r>
+      <w:proofErr w:type="gramStart"/>
       <w:r>
         <w:rPr>
           <w:rFonts w:ascii="Calibri" w:hAnsi="Calibri"/>
@@ -61,8 +62,9 @@
           <w:color w:val="2E74B5"/>
           <w:sz w:val="28"/>
         </w:rPr>
-        <w:t xml:space="preserve">  —  </w:t>
-      </w:r>
+        <w:t xml:space="preserve">  —</w:t>
+      </w:r>
+      <w:proofErr w:type="gramEnd"/>
       <w:r>
         <w:rPr>
           <w:rFonts w:ascii="Calibri" w:hAnsi="Calibri"/>
@@ -70,7 +72,7 @@
           <w:color w:val="2E74B5"/>
           <w:sz w:val="28"/>
         </w:rPr>
-        <w:t xml:space="preserve">Add </w:t>
+        <w:t xml:space="preserve">  </w:t>
       </w:r>
       <w:r>
         <w:rPr>
@@ -79,490 +81,8 @@
           <w:color w:val="2E74B5"/>
           <w:sz w:val="28"/>
         </w:rPr>
-        <w:t>Enums</w:t>
-      </w:r>
-    </w:p>
-    <w:p>
-      <w:pPr>
-        <w:shd w:val="clear" w:color="auto" w:fill="F2F2F2"/>
-        <w:spacing w:after="0"/>
-        <w:ind w:left="288"/>
-      </w:pPr>
-      <w:r>
-        <w:rPr>
-          <w:rFonts w:ascii="Courier New" w:hAnsi="Courier New"/>
-          <w:sz w:val="18"/>
-        </w:rPr>
-        <w:t xml:space="preserve">In package </w:t>
-      </w:r>
-      <w:proofErr w:type="spellStart"/>
-      <w:r>
-        <w:rPr>
-          <w:rFonts w:ascii="Courier New" w:hAnsi="Courier New"/>
-          <w:sz w:val="18"/>
-        </w:rPr>
-        <w:t>com.portfolio.attribution.model.enums</w:t>
-      </w:r>
-      <w:proofErr w:type="spellEnd"/>
-      <w:r>
-        <w:rPr>
-          <w:rFonts w:ascii="Courier New" w:hAnsi="Courier New"/>
-          <w:sz w:val="18"/>
-        </w:rPr>
-        <w:t xml:space="preserve">, create the following </w:t>
-      </w:r>
-      <w:proofErr w:type="spellStart"/>
-      <w:r>
-        <w:rPr>
-          <w:rFonts w:ascii="Courier New" w:hAnsi="Courier New"/>
-          <w:sz w:val="18"/>
-        </w:rPr>
-        <w:t>enums</w:t>
-      </w:r>
-      <w:proofErr w:type="spellEnd"/>
-      <w:r>
-        <w:rPr>
-          <w:rFonts w:ascii="Courier New" w:hAnsi="Courier New"/>
-          <w:sz w:val="18"/>
-        </w:rPr>
-        <w:t xml:space="preserve"> for the</w:t>
-      </w:r>
-    </w:p>
-    <w:p>
-      <w:pPr>
-        <w:shd w:val="clear" w:color="auto" w:fill="F2F2F2"/>
-        <w:spacing w:after="0"/>
-        <w:ind w:left="288"/>
-      </w:pPr>
-      <w:r>
-        <w:rPr>
-          <w:rFonts w:ascii="Courier New" w:hAnsi="Courier New"/>
-          <w:sz w:val="18"/>
-        </w:rPr>
-        <w:t>Portfolio Performance Attribution service:</w:t>
-      </w:r>
-    </w:p>
-    <w:p>
-      <w:pPr>
-        <w:shd w:val="clear" w:color="auto" w:fill="F2F2F2"/>
-        <w:spacing w:after="0"/>
-        <w:ind w:left="288"/>
-      </w:pPr>
-      <w:r>
-        <w:rPr>
-          <w:rFonts w:ascii="Courier New" w:hAnsi="Courier New"/>
-          <w:sz w:val="18"/>
-        </w:rPr>
-        <w:t xml:space="preserve"> </w:t>
-      </w:r>
-    </w:p>
-    <w:p>
-      <w:pPr>
-        <w:shd w:val="clear" w:color="auto" w:fill="F2F2F2"/>
-        <w:spacing w:after="0"/>
-        <w:ind w:left="288"/>
-      </w:pPr>
-      <w:r>
-        <w:rPr>
-          <w:rFonts w:ascii="Courier New" w:hAnsi="Courier New"/>
-          <w:sz w:val="18"/>
-        </w:rPr>
-        <w:t xml:space="preserve">1. </w:t>
-      </w:r>
-      <w:proofErr w:type="spellStart"/>
-      <w:r>
-        <w:rPr>
-          <w:rFonts w:ascii="Courier New" w:hAnsi="Courier New"/>
-          <w:sz w:val="18"/>
-        </w:rPr>
-        <w:t>PricingMode</w:t>
-      </w:r>
-      <w:proofErr w:type="spellEnd"/>
-      <w:r>
-        <w:rPr>
-          <w:rFonts w:ascii="Courier New" w:hAnsi="Courier New"/>
-          <w:sz w:val="18"/>
-        </w:rPr>
-        <w:t xml:space="preserve"> </w:t>
-      </w:r>
-      <w:proofErr w:type="spellStart"/>
-      <w:r>
-        <w:rPr>
-          <w:rFonts w:ascii="Courier New" w:hAnsi="Courier New"/>
-          <w:sz w:val="18"/>
-        </w:rPr>
-        <w:t>enum</w:t>
-      </w:r>
-      <w:proofErr w:type="spellEnd"/>
-      <w:r>
-        <w:rPr>
-          <w:rFonts w:ascii="Courier New" w:hAnsi="Courier New"/>
-          <w:sz w:val="18"/>
-        </w:rPr>
-        <w:t xml:space="preserve"> with values:</w:t>
-      </w:r>
-    </w:p>
-    <w:p>
-      <w:pPr>
-        <w:shd w:val="clear" w:color="auto" w:fill="F2F2F2"/>
-        <w:spacing w:after="0"/>
-        <w:ind w:left="288"/>
-      </w:pPr>
-      <w:r>
-        <w:rPr>
-          <w:rFonts w:ascii="Courier New" w:hAnsi="Courier New"/>
-          <w:sz w:val="18"/>
-        </w:rPr>
-        <w:t xml:space="preserve">   - PRIMARY       (group return was provided directly)</w:t>
-      </w:r>
-    </w:p>
-    <w:p>
-      <w:pPr>
-        <w:shd w:val="clear" w:color="auto" w:fill="F2F2F2"/>
-        <w:spacing w:after="0"/>
-        <w:ind w:left="288"/>
-      </w:pPr>
-      <w:r>
-        <w:rPr>
-          <w:rFonts w:ascii="Courier New" w:hAnsi="Courier New"/>
-          <w:sz w:val="18"/>
-        </w:rPr>
-        <w:t xml:space="preserve">   - FALLBACK_USED (group used </w:t>
-      </w:r>
-      <w:proofErr w:type="spellStart"/>
-      <w:r>
-        <w:rPr>
-          <w:rFonts w:ascii="Courier New" w:hAnsi="Courier New"/>
-          <w:sz w:val="18"/>
-        </w:rPr>
-        <w:t>fallbackReturnPct</w:t>
-      </w:r>
-      <w:proofErr w:type="spellEnd"/>
-      <w:r>
-        <w:rPr>
-          <w:rFonts w:ascii="Courier New" w:hAnsi="Courier New"/>
-          <w:sz w:val="18"/>
-        </w:rPr>
-        <w:t xml:space="preserve"> because </w:t>
-      </w:r>
-      <w:proofErr w:type="spellStart"/>
-      <w:r>
-        <w:rPr>
-          <w:rFonts w:ascii="Courier New" w:hAnsi="Courier New"/>
-          <w:sz w:val="18"/>
-        </w:rPr>
-        <w:t>returnPct</w:t>
-      </w:r>
-      <w:proofErr w:type="spellEnd"/>
-      <w:r>
-        <w:rPr>
-          <w:rFonts w:ascii="Courier New" w:hAnsi="Courier New"/>
-          <w:sz w:val="18"/>
-        </w:rPr>
-        <w:t xml:space="preserve"> was null)</w:t>
-      </w:r>
-    </w:p>
-    <w:p>
-      <w:pPr>
-        <w:shd w:val="clear" w:color="auto" w:fill="F2F2F2"/>
-        <w:spacing w:after="0"/>
-        <w:ind w:left="288"/>
-      </w:pPr>
-      <w:r>
-        <w:rPr>
-          <w:rFonts w:ascii="Courier New" w:hAnsi="Courier New"/>
-          <w:sz w:val="18"/>
-        </w:rPr>
-        <w:t xml:space="preserve">   - UNAVAILABLE   (group has no </w:t>
-      </w:r>
-      <w:proofErr w:type="spellStart"/>
-      <w:r>
-        <w:rPr>
-          <w:rFonts w:ascii="Courier New" w:hAnsi="Courier New"/>
-          <w:sz w:val="18"/>
-        </w:rPr>
-        <w:t>returnPct</w:t>
-      </w:r>
-      <w:proofErr w:type="spellEnd"/>
-      <w:r>
-        <w:rPr>
-          <w:rFonts w:ascii="Courier New" w:hAnsi="Courier New"/>
-          <w:sz w:val="18"/>
-        </w:rPr>
-        <w:t xml:space="preserve"> and no </w:t>
-      </w:r>
-      <w:proofErr w:type="spellStart"/>
-      <w:r>
-        <w:rPr>
-          <w:rFonts w:ascii="Courier New" w:hAnsi="Courier New"/>
-          <w:sz w:val="18"/>
-        </w:rPr>
-        <w:t>fallbackReturnPct</w:t>
-      </w:r>
-      <w:proofErr w:type="spellEnd"/>
-      <w:r>
-        <w:rPr>
-          <w:rFonts w:ascii="Courier New" w:hAnsi="Courier New"/>
-          <w:sz w:val="18"/>
-        </w:rPr>
-        <w:t>)</w:t>
-      </w:r>
-    </w:p>
-    <w:p>
-      <w:pPr>
-        <w:shd w:val="clear" w:color="auto" w:fill="F2F2F2"/>
-        <w:spacing w:after="0"/>
-        <w:ind w:left="288"/>
-      </w:pPr>
-      <w:r>
-        <w:rPr>
-          <w:rFonts w:ascii="Courier New" w:hAnsi="Courier New"/>
-          <w:sz w:val="18"/>
-        </w:rPr>
-        <w:t xml:space="preserve"> </w:t>
-      </w:r>
-    </w:p>
-    <w:p>
-      <w:pPr>
-        <w:shd w:val="clear" w:color="auto" w:fill="F2F2F2"/>
-        <w:spacing w:after="0"/>
-        <w:ind w:left="288"/>
-      </w:pPr>
-      <w:r>
-        <w:rPr>
-          <w:rFonts w:ascii="Courier New" w:hAnsi="Courier New"/>
-          <w:sz w:val="18"/>
-        </w:rPr>
-        <w:t xml:space="preserve">2. </w:t>
-      </w:r>
-      <w:proofErr w:type="spellStart"/>
-      <w:r>
-        <w:rPr>
-          <w:rFonts w:ascii="Courier New" w:hAnsi="Courier New"/>
-          <w:sz w:val="18"/>
-        </w:rPr>
-        <w:t>AttributionStatus</w:t>
-      </w:r>
-      <w:proofErr w:type="spellEnd"/>
-      <w:r>
-        <w:rPr>
-          <w:rFonts w:ascii="Courier New" w:hAnsi="Courier New"/>
-          <w:sz w:val="18"/>
-        </w:rPr>
-        <w:t xml:space="preserve"> </w:t>
-      </w:r>
-      <w:proofErr w:type="spellStart"/>
-      <w:r>
-        <w:rPr>
-          <w:rFonts w:ascii="Courier New" w:hAnsi="Courier New"/>
-          <w:sz w:val="18"/>
-        </w:rPr>
-        <w:t>enum</w:t>
-      </w:r>
-      <w:proofErr w:type="spellEnd"/>
-      <w:r>
-        <w:rPr>
-          <w:rFonts w:ascii="Courier New" w:hAnsi="Courier New"/>
-          <w:sz w:val="18"/>
-        </w:rPr>
-        <w:t xml:space="preserve"> with values:</w:t>
-      </w:r>
-    </w:p>
-    <w:p>
-      <w:pPr>
-        <w:shd w:val="clear" w:color="auto" w:fill="F2F2F2"/>
-        <w:spacing w:after="0"/>
-        <w:ind w:left="288"/>
-      </w:pPr>
-      <w:r>
-        <w:rPr>
-          <w:rFonts w:ascii="Courier New" w:hAnsi="Courier New"/>
-          <w:sz w:val="18"/>
-        </w:rPr>
-        <w:t xml:space="preserve">   - VALID            (all groups processed successfully or with fallback)</w:t>
-      </w:r>
-    </w:p>
-    <w:p>
-      <w:pPr>
-        <w:shd w:val="clear" w:color="auto" w:fill="F2F2F2"/>
-        <w:spacing w:after="0"/>
-        <w:ind w:left="288"/>
-      </w:pPr>
-      <w:r>
-        <w:rPr>
-          <w:rFonts w:ascii="Courier New" w:hAnsi="Courier New"/>
-          <w:sz w:val="18"/>
-        </w:rPr>
-        <w:t xml:space="preserve">   - DEGRADED         (exactly one group missing return with no fallback)</w:t>
-      </w:r>
-    </w:p>
-    <w:p>
-      <w:pPr>
-        <w:shd w:val="clear" w:color="auto" w:fill="F2F2F2"/>
-        <w:spacing w:after="0"/>
-        <w:ind w:left="288"/>
-      </w:pPr>
-      <w:r>
-        <w:rPr>
-          <w:rFonts w:ascii="Courier New" w:hAnsi="Courier New"/>
-          <w:sz w:val="18"/>
-        </w:rPr>
-        <w:t xml:space="preserve">   - REVIEW_REQUIRED  (more than one group missing return with no fallback)</w:t>
-      </w:r>
-    </w:p>
-    <w:p>
-      <w:pPr>
-        <w:shd w:val="clear" w:color="auto" w:fill="F2F2F2"/>
-        <w:spacing w:after="0"/>
-        <w:ind w:left="288"/>
-      </w:pPr>
-      <w:r>
-        <w:rPr>
-          <w:rFonts w:ascii="Courier New" w:hAnsi="Courier New"/>
-          <w:sz w:val="18"/>
-        </w:rPr>
-        <w:t xml:space="preserve">   - INVALID_INPUT    (total weight is outside the 99-101% tolerance range)</w:t>
-      </w:r>
-    </w:p>
-    <w:p>
-      <w:pPr>
-        <w:shd w:val="clear" w:color="auto" w:fill="F2F2F2"/>
-        <w:spacing w:after="0"/>
-        <w:ind w:left="288"/>
-      </w:pPr>
-      <w:r>
-        <w:rPr>
-          <w:rFonts w:ascii="Courier New" w:hAnsi="Courier New"/>
-          <w:sz w:val="18"/>
-        </w:rPr>
-        <w:t xml:space="preserve"> </w:t>
-      </w:r>
-    </w:p>
-    <w:p>
-      <w:pPr>
-        <w:shd w:val="clear" w:color="auto" w:fill="F2F2F2"/>
-        <w:spacing w:after="0"/>
-        <w:ind w:left="288"/>
-        <w:rPr>
-          <w:rFonts w:ascii="Courier New" w:hAnsi="Courier New"/>
-          <w:sz w:val="18"/>
-        </w:rPr>
-      </w:pPr>
-      <w:r>
-        <w:rPr>
-          <w:rFonts w:ascii="Courier New" w:hAnsi="Courier New"/>
-          <w:sz w:val="18"/>
-        </w:rPr>
-        <w:t xml:space="preserve">Each </w:t>
-      </w:r>
-      <w:proofErr w:type="spellStart"/>
-      <w:r>
-        <w:rPr>
-          <w:rFonts w:ascii="Courier New" w:hAnsi="Courier New"/>
-          <w:sz w:val="18"/>
-        </w:rPr>
-        <w:t>enum</w:t>
-      </w:r>
-      <w:proofErr w:type="spellEnd"/>
-      <w:r>
-        <w:rPr>
-          <w:rFonts w:ascii="Courier New" w:hAnsi="Courier New"/>
-          <w:sz w:val="18"/>
-        </w:rPr>
-        <w:t xml:space="preserve"> should have a brief Javadoc comment explaining when it is applied.</w:t>
-      </w:r>
-    </w:p>
-    <w:p>
-      <w:pPr>
-        <w:rPr>
-          <w:b/>
-          <w:bCs/>
-        </w:rPr>
-      </w:pPr>
-    </w:p>
-    <w:p>
-      <w:pPr>
-        <w:spacing w:before="120" w:after="40"/>
-      </w:pPr>
-      <w:r>
-        <w:rPr>
-          <w:rFonts w:ascii="Calibri" w:hAnsi="Calibri"/>
-          <w:b/>
-          <w:color w:val="1F497D"/>
-        </w:rPr>
-        <w:t>Validation Gate</w:t>
-      </w:r>
-    </w:p>
-    <w:p>
-      <w:pPr>
-        <w:pStyle w:val="ListBullet"/>
-        <w:tabs>
-          <w:tab w:val="num" w:pos="360"/>
-        </w:tabs>
-        <w:spacing w:after="40"/>
-        <w:ind w:left="360" w:hanging="360"/>
-      </w:pPr>
-      <w:r>
-        <w:rPr>
-          <w:rFonts w:ascii="Calibri" w:hAnsi="Calibri"/>
-          <w:sz w:val="21"/>
-        </w:rPr>
-        <w:t>Run `</w:t>
-      </w:r>
-      <w:proofErr w:type="spellStart"/>
-      <w:r>
-        <w:rPr>
-          <w:rFonts w:ascii="Calibri" w:hAnsi="Calibri"/>
-          <w:sz w:val="21"/>
-        </w:rPr>
-        <w:t>mvn</w:t>
-      </w:r>
-      <w:proofErr w:type="spellEnd"/>
-      <w:r>
-        <w:rPr>
-          <w:rFonts w:ascii="Calibri" w:hAnsi="Calibri"/>
-          <w:sz w:val="21"/>
-        </w:rPr>
-        <w:t xml:space="preserve"> compile` — zero compilation errors</w:t>
-      </w:r>
-    </w:p>
-    <w:p>
-      <w:pPr>
-        <w:pStyle w:val="ListBullet"/>
-        <w:tabs>
-          <w:tab w:val="num" w:pos="360"/>
-        </w:tabs>
-        <w:spacing w:after="40"/>
-        <w:ind w:left="360" w:hanging="360"/>
-      </w:pPr>
-      <w:r>
-        <w:rPr>
-          <w:rFonts w:ascii="Calibri" w:hAnsi="Calibri"/>
-          <w:sz w:val="21"/>
-        </w:rPr>
-        <w:t xml:space="preserve">Manually verify </w:t>
-      </w:r>
-      <w:proofErr w:type="spellStart"/>
-      <w:r>
-        <w:rPr>
-          <w:rFonts w:ascii="Calibri" w:hAnsi="Calibri"/>
-          <w:sz w:val="21"/>
-        </w:rPr>
-        <w:t>enum</w:t>
-      </w:r>
-      <w:proofErr w:type="spellEnd"/>
-      <w:r>
-        <w:rPr>
-          <w:rFonts w:ascii="Calibri" w:hAnsi="Calibri"/>
-          <w:sz w:val="21"/>
-        </w:rPr>
-        <w:t xml:space="preserve"> values match the business rules in the requirements document</w:t>
-      </w:r>
-    </w:p>
-    <w:p>
-      <w:pPr>
-        <w:spacing w:before="280" w:after="80"/>
-      </w:pPr>
+        <w:t xml:space="preserve">Add </w:t>
+      </w:r>
       <w:r>
         <w:rPr>
           <w:rFonts w:ascii="Calibri" w:hAnsi="Calibri"/>
@@ -570,8 +90,611 @@
           <w:color w:val="2E74B5"/>
           <w:sz w:val="28"/>
         </w:rPr>
-        <w:t xml:space="preserve">STEP </w:t>
-      </w:r>
+        <w:t>Enums</w:t>
+      </w:r>
+    </w:p>
+    <w:p>
+      <w:pPr>
+        <w:shd w:val="clear" w:color="auto" w:fill="F2F2F2"/>
+        <w:spacing w:after="0"/>
+        <w:ind w:left="288"/>
+      </w:pPr>
+      <w:r>
+        <w:rPr>
+          <w:rFonts w:ascii="Courier New" w:hAnsi="Courier New"/>
+          <w:sz w:val="18"/>
+        </w:rPr>
+        <w:t xml:space="preserve">In package </w:t>
+      </w:r>
+      <w:proofErr w:type="spellStart"/>
+      <w:proofErr w:type="gramStart"/>
+      <w:r>
+        <w:rPr>
+          <w:rFonts w:ascii="Courier New" w:hAnsi="Courier New"/>
+          <w:sz w:val="18"/>
+        </w:rPr>
+        <w:t>com.portfolio</w:t>
+      </w:r>
+      <w:proofErr w:type="gramEnd"/>
+      <w:r>
+        <w:rPr>
+          <w:rFonts w:ascii="Courier New" w:hAnsi="Courier New"/>
+          <w:sz w:val="18"/>
+        </w:rPr>
+        <w:t>.</w:t>
+      </w:r>
+      <w:proofErr w:type="gramStart"/>
+      <w:r>
+        <w:rPr>
+          <w:rFonts w:ascii="Courier New" w:hAnsi="Courier New"/>
+          <w:sz w:val="18"/>
+        </w:rPr>
+        <w:t>attribution.model</w:t>
+      </w:r>
+      <w:proofErr w:type="gramEnd"/>
+      <w:r>
+        <w:rPr>
+          <w:rFonts w:ascii="Courier New" w:hAnsi="Courier New"/>
+          <w:sz w:val="18"/>
+        </w:rPr>
+        <w:t>.enums</w:t>
+      </w:r>
+      <w:proofErr w:type="spellEnd"/>
+      <w:r>
+        <w:rPr>
+          <w:rFonts w:ascii="Courier New" w:hAnsi="Courier New"/>
+          <w:sz w:val="18"/>
+        </w:rPr>
+        <w:t xml:space="preserve">, create the following </w:t>
+      </w:r>
+      <w:proofErr w:type="spellStart"/>
+      <w:r>
+        <w:rPr>
+          <w:rFonts w:ascii="Courier New" w:hAnsi="Courier New"/>
+          <w:sz w:val="18"/>
+        </w:rPr>
+        <w:t>enums</w:t>
+      </w:r>
+      <w:proofErr w:type="spellEnd"/>
+      <w:r>
+        <w:rPr>
+          <w:rFonts w:ascii="Courier New" w:hAnsi="Courier New"/>
+          <w:sz w:val="18"/>
+        </w:rPr>
+        <w:t xml:space="preserve"> for the</w:t>
+      </w:r>
+    </w:p>
+    <w:p>
+      <w:pPr>
+        <w:shd w:val="clear" w:color="auto" w:fill="F2F2F2"/>
+        <w:spacing w:after="0"/>
+        <w:ind w:left="288"/>
+      </w:pPr>
+      <w:r>
+        <w:rPr>
+          <w:rFonts w:ascii="Courier New" w:hAnsi="Courier New"/>
+          <w:sz w:val="18"/>
+        </w:rPr>
+        <w:t>Portfolio Performance Attribution service:</w:t>
+      </w:r>
+    </w:p>
+    <w:p>
+      <w:pPr>
+        <w:shd w:val="clear" w:color="auto" w:fill="F2F2F2"/>
+        <w:spacing w:after="0"/>
+        <w:ind w:left="288"/>
+      </w:pPr>
+      <w:r>
+        <w:rPr>
+          <w:rFonts w:ascii="Courier New" w:hAnsi="Courier New"/>
+          <w:sz w:val="18"/>
+        </w:rPr>
+        <w:t xml:space="preserve"> </w:t>
+      </w:r>
+    </w:p>
+    <w:p>
+      <w:pPr>
+        <w:shd w:val="clear" w:color="auto" w:fill="F2F2F2"/>
+        <w:spacing w:after="0"/>
+        <w:ind w:left="288"/>
+      </w:pPr>
+      <w:r>
+        <w:rPr>
+          <w:rFonts w:ascii="Courier New" w:hAnsi="Courier New"/>
+          <w:sz w:val="18"/>
+        </w:rPr>
+        <w:t xml:space="preserve">1. </w:t>
+      </w:r>
+      <w:proofErr w:type="spellStart"/>
+      <w:r>
+        <w:rPr>
+          <w:rFonts w:ascii="Courier New" w:hAnsi="Courier New"/>
+          <w:sz w:val="18"/>
+        </w:rPr>
+        <w:t>PricingMode</w:t>
+      </w:r>
+      <w:proofErr w:type="spellEnd"/>
+      <w:r>
+        <w:rPr>
+          <w:rFonts w:ascii="Courier New" w:hAnsi="Courier New"/>
+          <w:sz w:val="18"/>
+        </w:rPr>
+        <w:t xml:space="preserve"> </w:t>
+      </w:r>
+      <w:proofErr w:type="spellStart"/>
+      <w:r>
+        <w:rPr>
+          <w:rFonts w:ascii="Courier New" w:hAnsi="Courier New"/>
+          <w:sz w:val="18"/>
+        </w:rPr>
+        <w:t>enum</w:t>
+      </w:r>
+      <w:proofErr w:type="spellEnd"/>
+      <w:r>
+        <w:rPr>
+          <w:rFonts w:ascii="Courier New" w:hAnsi="Courier New"/>
+          <w:sz w:val="18"/>
+        </w:rPr>
+        <w:t xml:space="preserve"> with values:</w:t>
+      </w:r>
+    </w:p>
+    <w:p>
+      <w:pPr>
+        <w:shd w:val="clear" w:color="auto" w:fill="F2F2F2"/>
+        <w:spacing w:after="0"/>
+        <w:ind w:left="288"/>
+      </w:pPr>
+      <w:r>
+        <w:rPr>
+          <w:rFonts w:ascii="Courier New" w:hAnsi="Courier New"/>
+          <w:sz w:val="18"/>
+        </w:rPr>
+        <w:t xml:space="preserve">   - PRIMARY    </w:t>
+      </w:r>
+      <w:proofErr w:type="gramStart"/>
+      <w:r>
+        <w:rPr>
+          <w:rFonts w:ascii="Courier New" w:hAnsi="Courier New"/>
+          <w:sz w:val="18"/>
+        </w:rPr>
+        <w:t xml:space="preserve">   (</w:t>
+      </w:r>
+      <w:proofErr w:type="gramEnd"/>
+      <w:r>
+        <w:rPr>
+          <w:rFonts w:ascii="Courier New" w:hAnsi="Courier New"/>
+          <w:sz w:val="18"/>
+        </w:rPr>
+        <w:t>group return was provided directly)</w:t>
+      </w:r>
+    </w:p>
+    <w:p>
+      <w:pPr>
+        <w:shd w:val="clear" w:color="auto" w:fill="F2F2F2"/>
+        <w:spacing w:after="0"/>
+        <w:ind w:left="288"/>
+      </w:pPr>
+      <w:r>
+        <w:rPr>
+          <w:rFonts w:ascii="Courier New" w:hAnsi="Courier New"/>
+          <w:sz w:val="18"/>
+        </w:rPr>
+        <w:t xml:space="preserve">   - FALLBACK_USED (group used </w:t>
+      </w:r>
+      <w:proofErr w:type="spellStart"/>
+      <w:r>
+        <w:rPr>
+          <w:rFonts w:ascii="Courier New" w:hAnsi="Courier New"/>
+          <w:sz w:val="18"/>
+        </w:rPr>
+        <w:t>fallbackReturnPct</w:t>
+      </w:r>
+      <w:proofErr w:type="spellEnd"/>
+      <w:r>
+        <w:rPr>
+          <w:rFonts w:ascii="Courier New" w:hAnsi="Courier New"/>
+          <w:sz w:val="18"/>
+        </w:rPr>
+        <w:t xml:space="preserve"> because </w:t>
+      </w:r>
+      <w:proofErr w:type="spellStart"/>
+      <w:r>
+        <w:rPr>
+          <w:rFonts w:ascii="Courier New" w:hAnsi="Courier New"/>
+          <w:sz w:val="18"/>
+        </w:rPr>
+        <w:t>returnPct</w:t>
+      </w:r>
+      <w:proofErr w:type="spellEnd"/>
+      <w:r>
+        <w:rPr>
+          <w:rFonts w:ascii="Courier New" w:hAnsi="Courier New"/>
+          <w:sz w:val="18"/>
+        </w:rPr>
+        <w:t xml:space="preserve"> was null)</w:t>
+      </w:r>
+    </w:p>
+    <w:p>
+      <w:pPr>
+        <w:shd w:val="clear" w:color="auto" w:fill="F2F2F2"/>
+        <w:spacing w:after="0"/>
+        <w:ind w:left="288"/>
+      </w:pPr>
+      <w:r>
+        <w:rPr>
+          <w:rFonts w:ascii="Courier New" w:hAnsi="Courier New"/>
+          <w:sz w:val="18"/>
+        </w:rPr>
+        <w:t xml:space="preserve">   - UNAVAILABLE</w:t>
+      </w:r>
+      <w:proofErr w:type="gramStart"/>
+      <w:r>
+        <w:rPr>
+          <w:rFonts w:ascii="Courier New" w:hAnsi="Courier New"/>
+          <w:sz w:val="18"/>
+        </w:rPr>
+        <w:t xml:space="preserve">   (</w:t>
+      </w:r>
+      <w:proofErr w:type="gramEnd"/>
+      <w:r>
+        <w:rPr>
+          <w:rFonts w:ascii="Courier New" w:hAnsi="Courier New"/>
+          <w:sz w:val="18"/>
+        </w:rPr>
+        <w:t xml:space="preserve">group has no </w:t>
+      </w:r>
+      <w:proofErr w:type="spellStart"/>
+      <w:r>
+        <w:rPr>
+          <w:rFonts w:ascii="Courier New" w:hAnsi="Courier New"/>
+          <w:sz w:val="18"/>
+        </w:rPr>
+        <w:t>returnPct</w:t>
+      </w:r>
+      <w:proofErr w:type="spellEnd"/>
+      <w:r>
+        <w:rPr>
+          <w:rFonts w:ascii="Courier New" w:hAnsi="Courier New"/>
+          <w:sz w:val="18"/>
+        </w:rPr>
+        <w:t xml:space="preserve"> and no </w:t>
+      </w:r>
+      <w:proofErr w:type="spellStart"/>
+      <w:r>
+        <w:rPr>
+          <w:rFonts w:ascii="Courier New" w:hAnsi="Courier New"/>
+          <w:sz w:val="18"/>
+        </w:rPr>
+        <w:t>fallbackReturnPct</w:t>
+      </w:r>
+      <w:proofErr w:type="spellEnd"/>
+      <w:r>
+        <w:rPr>
+          <w:rFonts w:ascii="Courier New" w:hAnsi="Courier New"/>
+          <w:sz w:val="18"/>
+        </w:rPr>
+        <w:t>)</w:t>
+      </w:r>
+    </w:p>
+    <w:p>
+      <w:pPr>
+        <w:shd w:val="clear" w:color="auto" w:fill="F2F2F2"/>
+        <w:spacing w:after="0"/>
+        <w:ind w:left="288"/>
+      </w:pPr>
+      <w:r>
+        <w:rPr>
+          <w:rFonts w:ascii="Courier New" w:hAnsi="Courier New"/>
+          <w:sz w:val="18"/>
+        </w:rPr>
+        <w:t xml:space="preserve"> </w:t>
+      </w:r>
+    </w:p>
+    <w:p>
+      <w:pPr>
+        <w:shd w:val="clear" w:color="auto" w:fill="F2F2F2"/>
+        <w:spacing w:after="0"/>
+        <w:ind w:left="288"/>
+      </w:pPr>
+      <w:r>
+        <w:rPr>
+          <w:rFonts w:ascii="Courier New" w:hAnsi="Courier New"/>
+          <w:sz w:val="18"/>
+        </w:rPr>
+        <w:t xml:space="preserve">2. </w:t>
+      </w:r>
+      <w:proofErr w:type="spellStart"/>
+      <w:r>
+        <w:rPr>
+          <w:rFonts w:ascii="Courier New" w:hAnsi="Courier New"/>
+          <w:sz w:val="18"/>
+        </w:rPr>
+        <w:t>AttributionStatus</w:t>
+      </w:r>
+      <w:proofErr w:type="spellEnd"/>
+      <w:r>
+        <w:rPr>
+          <w:rFonts w:ascii="Courier New" w:hAnsi="Courier New"/>
+          <w:sz w:val="18"/>
+        </w:rPr>
+        <w:t xml:space="preserve"> </w:t>
+      </w:r>
+      <w:proofErr w:type="spellStart"/>
+      <w:r>
+        <w:rPr>
+          <w:rFonts w:ascii="Courier New" w:hAnsi="Courier New"/>
+          <w:sz w:val="18"/>
+        </w:rPr>
+        <w:t>enum</w:t>
+      </w:r>
+      <w:proofErr w:type="spellEnd"/>
+      <w:r>
+        <w:rPr>
+          <w:rFonts w:ascii="Courier New" w:hAnsi="Courier New"/>
+          <w:sz w:val="18"/>
+        </w:rPr>
+        <w:t xml:space="preserve"> with values:</w:t>
+      </w:r>
+    </w:p>
+    <w:p>
+      <w:pPr>
+        <w:shd w:val="clear" w:color="auto" w:fill="F2F2F2"/>
+        <w:spacing w:after="0"/>
+        <w:ind w:left="288"/>
+      </w:pPr>
+      <w:r>
+        <w:rPr>
+          <w:rFonts w:ascii="Courier New" w:hAnsi="Courier New"/>
+          <w:sz w:val="18"/>
+        </w:rPr>
+        <w:t xml:space="preserve">   - VALID         </w:t>
+      </w:r>
+      <w:proofErr w:type="gramStart"/>
+      <w:r>
+        <w:rPr>
+          <w:rFonts w:ascii="Courier New" w:hAnsi="Courier New"/>
+          <w:sz w:val="18"/>
+        </w:rPr>
+        <w:t xml:space="preserve">   (</w:t>
+      </w:r>
+      <w:proofErr w:type="gramEnd"/>
+      <w:r>
+        <w:rPr>
+          <w:rFonts w:ascii="Courier New" w:hAnsi="Courier New"/>
+          <w:sz w:val="18"/>
+        </w:rPr>
+        <w:t>all groups processed successfully or with fallback)</w:t>
+      </w:r>
+    </w:p>
+    <w:p>
+      <w:pPr>
+        <w:shd w:val="clear" w:color="auto" w:fill="F2F2F2"/>
+        <w:spacing w:after="0"/>
+        <w:ind w:left="288"/>
+      </w:pPr>
+      <w:r>
+        <w:rPr>
+          <w:rFonts w:ascii="Courier New" w:hAnsi="Courier New"/>
+          <w:sz w:val="18"/>
+        </w:rPr>
+        <w:t xml:space="preserve">   - DEGRADED      </w:t>
+      </w:r>
+      <w:proofErr w:type="gramStart"/>
+      <w:r>
+        <w:rPr>
+          <w:rFonts w:ascii="Courier New" w:hAnsi="Courier New"/>
+          <w:sz w:val="18"/>
+        </w:rPr>
+        <w:t xml:space="preserve">   (</w:t>
+      </w:r>
+      <w:proofErr w:type="gramEnd"/>
+      <w:r>
+        <w:rPr>
+          <w:rFonts w:ascii="Courier New" w:hAnsi="Courier New"/>
+          <w:sz w:val="18"/>
+        </w:rPr>
+        <w:t>exactly one group missing return with no fallback)</w:t>
+      </w:r>
+    </w:p>
+    <w:p>
+      <w:pPr>
+        <w:shd w:val="clear" w:color="auto" w:fill="F2F2F2"/>
+        <w:spacing w:after="0"/>
+        <w:ind w:left="288"/>
+      </w:pPr>
+      <w:r>
+        <w:rPr>
+          <w:rFonts w:ascii="Courier New" w:hAnsi="Courier New"/>
+          <w:sz w:val="18"/>
+        </w:rPr>
+        <w:t xml:space="preserve">   - REVIEW_</w:t>
+      </w:r>
+      <w:proofErr w:type="gramStart"/>
+      <w:r>
+        <w:rPr>
+          <w:rFonts w:ascii="Courier New" w:hAnsi="Courier New"/>
+          <w:sz w:val="18"/>
+        </w:rPr>
+        <w:t>REQUIRED  (</w:t>
+      </w:r>
+      <w:proofErr w:type="gramEnd"/>
+      <w:r>
+        <w:rPr>
+          <w:rFonts w:ascii="Courier New" w:hAnsi="Courier New"/>
+          <w:sz w:val="18"/>
+        </w:rPr>
+        <w:t>more than one group missing return with no fallback)</w:t>
+      </w:r>
+    </w:p>
+    <w:p>
+      <w:pPr>
+        <w:shd w:val="clear" w:color="auto" w:fill="F2F2F2"/>
+        <w:spacing w:after="0"/>
+        <w:ind w:left="288"/>
+      </w:pPr>
+      <w:r>
+        <w:rPr>
+          <w:rFonts w:ascii="Courier New" w:hAnsi="Courier New"/>
+          <w:sz w:val="18"/>
+        </w:rPr>
+        <w:t xml:space="preserve">   - INVALID_INPUT </w:t>
+      </w:r>
+      <w:proofErr w:type="gramStart"/>
+      <w:r>
+        <w:rPr>
+          <w:rFonts w:ascii="Courier New" w:hAnsi="Courier New"/>
+          <w:sz w:val="18"/>
+        </w:rPr>
+        <w:t xml:space="preserve">   (</w:t>
+      </w:r>
+      <w:proofErr w:type="gramEnd"/>
+      <w:r>
+        <w:rPr>
+          <w:rFonts w:ascii="Courier New" w:hAnsi="Courier New"/>
+          <w:sz w:val="18"/>
+        </w:rPr>
+        <w:t>total weight is outside the 99-101% tolerance range)</w:t>
+      </w:r>
+    </w:p>
+    <w:p>
+      <w:pPr>
+        <w:shd w:val="clear" w:color="auto" w:fill="F2F2F2"/>
+        <w:spacing w:after="0"/>
+        <w:ind w:left="288"/>
+      </w:pPr>
+      <w:r>
+        <w:rPr>
+          <w:rFonts w:ascii="Courier New" w:hAnsi="Courier New"/>
+          <w:sz w:val="18"/>
+        </w:rPr>
+        <w:t xml:space="preserve"> </w:t>
+      </w:r>
+    </w:p>
+    <w:p>
+      <w:pPr>
+        <w:shd w:val="clear" w:color="auto" w:fill="F2F2F2"/>
+        <w:spacing w:after="0"/>
+        <w:ind w:left="288"/>
+        <w:rPr>
+          <w:rFonts w:ascii="Courier New" w:hAnsi="Courier New"/>
+          <w:sz w:val="18"/>
+        </w:rPr>
+      </w:pPr>
+      <w:r>
+        <w:rPr>
+          <w:rFonts w:ascii="Courier New" w:hAnsi="Courier New"/>
+          <w:sz w:val="18"/>
+        </w:rPr>
+        <w:t xml:space="preserve">Each </w:t>
+      </w:r>
+      <w:proofErr w:type="spellStart"/>
+      <w:r>
+        <w:rPr>
+          <w:rFonts w:ascii="Courier New" w:hAnsi="Courier New"/>
+          <w:sz w:val="18"/>
+        </w:rPr>
+        <w:t>enum</w:t>
+      </w:r>
+      <w:proofErr w:type="spellEnd"/>
+      <w:r>
+        <w:rPr>
+          <w:rFonts w:ascii="Courier New" w:hAnsi="Courier New"/>
+          <w:sz w:val="18"/>
+        </w:rPr>
+        <w:t xml:space="preserve"> should have a brief Javadoc comment explaining when it is applied.</w:t>
+      </w:r>
+    </w:p>
+    <w:p>
+      <w:pPr>
+        <w:rPr>
+          <w:b/>
+          <w:bCs/>
+        </w:rPr>
+      </w:pPr>
+    </w:p>
+    <w:p>
+      <w:pPr>
+        <w:spacing w:before="120" w:after="40"/>
+      </w:pPr>
+      <w:r>
+        <w:rPr>
+          <w:rFonts w:ascii="Calibri" w:hAnsi="Calibri"/>
+          <w:b/>
+          <w:color w:val="1F497D"/>
+        </w:rPr>
+        <w:t>Validation Gate</w:t>
+      </w:r>
+    </w:p>
+    <w:p>
+      <w:pPr>
+        <w:pStyle w:val="ListBullet"/>
+        <w:tabs>
+          <w:tab w:val="num" w:pos="360"/>
+        </w:tabs>
+        <w:spacing w:after="40"/>
+        <w:ind w:left="360" w:hanging="360"/>
+      </w:pPr>
+      <w:r>
+        <w:rPr>
+          <w:rFonts w:ascii="Calibri" w:hAnsi="Calibri"/>
+          <w:sz w:val="21"/>
+        </w:rPr>
+        <w:t>Run `</w:t>
+      </w:r>
+      <w:proofErr w:type="spellStart"/>
+      <w:r>
+        <w:rPr>
+          <w:rFonts w:ascii="Calibri" w:hAnsi="Calibri"/>
+          <w:sz w:val="21"/>
+        </w:rPr>
+        <w:t>mvn</w:t>
+      </w:r>
+      <w:proofErr w:type="spellEnd"/>
+      <w:r>
+        <w:rPr>
+          <w:rFonts w:ascii="Calibri" w:hAnsi="Calibri"/>
+          <w:sz w:val="21"/>
+        </w:rPr>
+        <w:t xml:space="preserve"> compile` — zero compilation errors</w:t>
+      </w:r>
+    </w:p>
+    <w:p>
+      <w:pPr>
+        <w:pStyle w:val="ListBullet"/>
+        <w:tabs>
+          <w:tab w:val="num" w:pos="360"/>
+        </w:tabs>
+        <w:spacing w:after="40"/>
+        <w:ind w:left="360" w:hanging="360"/>
+      </w:pPr>
+      <w:r>
+        <w:rPr>
+          <w:rFonts w:ascii="Calibri" w:hAnsi="Calibri"/>
+          <w:sz w:val="21"/>
+        </w:rPr>
+        <w:t xml:space="preserve">Manually verify </w:t>
+      </w:r>
+      <w:proofErr w:type="spellStart"/>
+      <w:r>
+        <w:rPr>
+          <w:rFonts w:ascii="Calibri" w:hAnsi="Calibri"/>
+          <w:sz w:val="21"/>
+        </w:rPr>
+        <w:t>enum</w:t>
+      </w:r>
+      <w:proofErr w:type="spellEnd"/>
+      <w:r>
+        <w:rPr>
+          <w:rFonts w:ascii="Calibri" w:hAnsi="Calibri"/>
+          <w:sz w:val="21"/>
+        </w:rPr>
+        <w:t xml:space="preserve"> values match the business rules in the requirements document</w:t>
+      </w:r>
+    </w:p>
+    <w:p>
+      <w:pPr>
+        <w:spacing w:before="280" w:after="80"/>
+      </w:pPr>
       <w:r>
         <w:rPr>
           <w:rFonts w:ascii="Calibri" w:hAnsi="Calibri"/>
@@ -579,8 +702,9 @@
           <w:color w:val="2E74B5"/>
           <w:sz w:val="28"/>
         </w:rPr>
-        <w:t>2</w:t>
-      </w:r>
+        <w:t xml:space="preserve">STEP </w:t>
+      </w:r>
+      <w:proofErr w:type="gramStart"/>
       <w:r>
         <w:rPr>
           <w:rFonts w:ascii="Calibri" w:hAnsi="Calibri"/>
@@ -588,7 +712,26 @@
           <w:color w:val="2E74B5"/>
           <w:sz w:val="28"/>
         </w:rPr>
-        <w:t xml:space="preserve">  —  Request Model</w:t>
+        <w:t>2</w:t>
+      </w:r>
+      <w:r>
+        <w:rPr>
+          <w:rFonts w:ascii="Calibri" w:hAnsi="Calibri"/>
+          <w:b/>
+          <w:color w:val="2E74B5"/>
+          <w:sz w:val="28"/>
+        </w:rPr>
+        <w:t xml:space="preserve">  —</w:t>
+      </w:r>
+      <w:proofErr w:type="gramEnd"/>
+      <w:r>
+        <w:rPr>
+          <w:rFonts w:ascii="Calibri" w:hAnsi="Calibri"/>
+          <w:b/>
+          <w:color w:val="2E74B5"/>
+          <w:sz w:val="28"/>
+        </w:rPr>
+        <w:t xml:space="preserve">  Request Model</w:t>
       </w:r>
     </w:p>
     <w:p>
@@ -619,12 +762,37 @@
         <w:t xml:space="preserve">In package </w:t>
       </w:r>
       <w:proofErr w:type="spellStart"/>
-      <w:r>
-        <w:rPr>
-          <w:rFonts w:ascii="Courier New" w:hAnsi="Courier New"/>
-          <w:sz w:val="18"/>
-        </w:rPr>
-        <w:t>com.portfolio.attribution.model.request</w:t>
+      <w:proofErr w:type="gramStart"/>
+      <w:r>
+        <w:rPr>
+          <w:rFonts w:ascii="Courier New" w:hAnsi="Courier New"/>
+          <w:sz w:val="18"/>
+        </w:rPr>
+        <w:t>com.portfolio</w:t>
+      </w:r>
+      <w:proofErr w:type="gramEnd"/>
+      <w:r>
+        <w:rPr>
+          <w:rFonts w:ascii="Courier New" w:hAnsi="Courier New"/>
+          <w:sz w:val="18"/>
+        </w:rPr>
+        <w:t>.</w:t>
+      </w:r>
+      <w:proofErr w:type="gramStart"/>
+      <w:r>
+        <w:rPr>
+          <w:rFonts w:ascii="Courier New" w:hAnsi="Courier New"/>
+          <w:sz w:val="18"/>
+        </w:rPr>
+        <w:t>attribution.model</w:t>
+      </w:r>
+      <w:proofErr w:type="gramEnd"/>
+      <w:r>
+        <w:rPr>
+          <w:rFonts w:ascii="Courier New" w:hAnsi="Courier New"/>
+          <w:sz w:val="18"/>
+        </w:rPr>
+        <w:t>.request</w:t>
       </w:r>
       <w:proofErr w:type="spellEnd"/>
       <w:r>
@@ -780,7 +948,39 @@
           <w:rFonts w:ascii="Courier New" w:hAnsi="Courier New"/>
           <w:sz w:val="18"/>
         </w:rPr>
-        <w:t>, @NotNull, @DecimalMin("0.0"), @DecimalMax("100.0")</w:t>
+        <w:t>, @NotNull, @</w:t>
+      </w:r>
+      <w:proofErr w:type="gramStart"/>
+      <w:r>
+        <w:rPr>
+          <w:rFonts w:ascii="Courier New" w:hAnsi="Courier New"/>
+          <w:sz w:val="18"/>
+        </w:rPr>
+        <w:t>DecimalMin(</w:t>
+      </w:r>
+      <w:proofErr w:type="gramEnd"/>
+      <w:r>
+        <w:rPr>
+          <w:rFonts w:ascii="Courier New" w:hAnsi="Courier New"/>
+          <w:sz w:val="18"/>
+        </w:rPr>
+        <w:t>"0.0"), @</w:t>
+      </w:r>
+      <w:proofErr w:type="gramStart"/>
+      <w:r>
+        <w:rPr>
+          <w:rFonts w:ascii="Courier New" w:hAnsi="Courier New"/>
+          <w:sz w:val="18"/>
+        </w:rPr>
+        <w:t>DecimalMax(</w:t>
+      </w:r>
+      <w:proofErr w:type="gramEnd"/>
+      <w:r>
+        <w:rPr>
+          <w:rFonts w:ascii="Courier New" w:hAnsi="Courier New"/>
+          <w:sz w:val="18"/>
+        </w:rPr>
+        <w:t>"100.0")</w:t>
       </w:r>
     </w:p>
     <w:p>
@@ -1322,6 +1522,923 @@
     </w:p>
     <w:p>
       <w:pPr>
+        <w:spacing w:before="280" w:after="80"/>
+      </w:pPr>
+      <w:r>
+        <w:rPr>
+          <w:rFonts w:ascii="Calibri" w:hAnsi="Calibri"/>
+          <w:b/>
+          <w:color w:val="2E74B5"/>
+          <w:sz w:val="28"/>
+        </w:rPr>
+        <w:t xml:space="preserve">STEP </w:t>
+      </w:r>
+      <w:proofErr w:type="gramStart"/>
+      <w:r>
+        <w:rPr>
+          <w:rFonts w:ascii="Calibri" w:hAnsi="Calibri"/>
+          <w:b/>
+          <w:color w:val="2E74B5"/>
+          <w:sz w:val="28"/>
+        </w:rPr>
+        <w:t>3</w:t>
+      </w:r>
+      <w:r>
+        <w:rPr>
+          <w:rFonts w:ascii="Calibri" w:hAnsi="Calibri"/>
+          <w:b/>
+          <w:color w:val="2E74B5"/>
+          <w:sz w:val="28"/>
+        </w:rPr>
+        <w:t xml:space="preserve">  —</w:t>
+      </w:r>
+      <w:proofErr w:type="gramEnd"/>
+      <w:r>
+        <w:rPr>
+          <w:rFonts w:ascii="Calibri" w:hAnsi="Calibri"/>
+          <w:b/>
+          <w:color w:val="2E74B5"/>
+          <w:sz w:val="28"/>
+        </w:rPr>
+        <w:t xml:space="preserve">  Response Model</w:t>
+      </w:r>
+    </w:p>
+    <w:p>
+      <w:pPr>
+        <w:spacing w:before="120" w:after="40"/>
+      </w:pPr>
+    </w:p>
+    <w:p>
+      <w:pPr>
+        <w:shd w:val="clear" w:color="auto" w:fill="F2F2F2"/>
+        <w:spacing w:after="0"/>
+        <w:ind w:left="288"/>
+      </w:pPr>
+      <w:r>
+        <w:rPr>
+          <w:rFonts w:ascii="Courier New" w:hAnsi="Courier New"/>
+          <w:sz w:val="18"/>
+        </w:rPr>
+        <w:t xml:space="preserve">In package </w:t>
+      </w:r>
+      <w:proofErr w:type="spellStart"/>
+      <w:proofErr w:type="gramStart"/>
+      <w:r>
+        <w:rPr>
+          <w:rFonts w:ascii="Courier New" w:hAnsi="Courier New"/>
+          <w:sz w:val="18"/>
+        </w:rPr>
+        <w:t>com.portfolio</w:t>
+      </w:r>
+      <w:proofErr w:type="gramEnd"/>
+      <w:r>
+        <w:rPr>
+          <w:rFonts w:ascii="Courier New" w:hAnsi="Courier New"/>
+          <w:sz w:val="18"/>
+        </w:rPr>
+        <w:t>.</w:t>
+      </w:r>
+      <w:proofErr w:type="gramStart"/>
+      <w:r>
+        <w:rPr>
+          <w:rFonts w:ascii="Courier New" w:hAnsi="Courier New"/>
+          <w:sz w:val="18"/>
+        </w:rPr>
+        <w:t>attribution.model</w:t>
+      </w:r>
+      <w:proofErr w:type="gramEnd"/>
+      <w:r>
+        <w:rPr>
+          <w:rFonts w:ascii="Courier New" w:hAnsi="Courier New"/>
+          <w:sz w:val="18"/>
+        </w:rPr>
+        <w:t>.response</w:t>
+      </w:r>
+      <w:proofErr w:type="spellEnd"/>
+      <w:r>
+        <w:rPr>
+          <w:rFonts w:ascii="Courier New" w:hAnsi="Courier New"/>
+          <w:sz w:val="18"/>
+        </w:rPr>
+        <w:t>, create the following response</w:t>
+      </w:r>
+    </w:p>
+    <w:p>
+      <w:pPr>
+        <w:shd w:val="clear" w:color="auto" w:fill="F2F2F2"/>
+        <w:spacing w:after="0"/>
+        <w:ind w:left="288"/>
+      </w:pPr>
+      <w:r>
+        <w:rPr>
+          <w:rFonts w:ascii="Courier New" w:hAnsi="Courier New"/>
+          <w:sz w:val="18"/>
+        </w:rPr>
+        <w:t>classes for the Portfolio Attribution API:</w:t>
+      </w:r>
+    </w:p>
+    <w:p>
+      <w:pPr>
+        <w:shd w:val="clear" w:color="auto" w:fill="F2F2F2"/>
+        <w:spacing w:after="0"/>
+        <w:ind w:left="288"/>
+      </w:pPr>
+      <w:r>
+        <w:rPr>
+          <w:rFonts w:ascii="Courier New" w:hAnsi="Courier New"/>
+          <w:sz w:val="18"/>
+        </w:rPr>
+        <w:t xml:space="preserve"> </w:t>
+      </w:r>
+    </w:p>
+    <w:p>
+      <w:pPr>
+        <w:shd w:val="clear" w:color="auto" w:fill="F2F2F2"/>
+        <w:spacing w:after="0"/>
+        <w:ind w:left="288"/>
+      </w:pPr>
+      <w:r>
+        <w:rPr>
+          <w:rFonts w:ascii="Courier New" w:hAnsi="Courier New"/>
+          <w:sz w:val="18"/>
+        </w:rPr>
+        <w:t xml:space="preserve">1. </w:t>
+      </w:r>
+      <w:proofErr w:type="spellStart"/>
+      <w:r>
+        <w:rPr>
+          <w:rFonts w:ascii="Courier New" w:hAnsi="Courier New"/>
+          <w:sz w:val="18"/>
+        </w:rPr>
+        <w:t>GroupContributionResult</w:t>
+      </w:r>
+      <w:proofErr w:type="spellEnd"/>
+      <w:r>
+        <w:rPr>
+          <w:rFonts w:ascii="Courier New" w:hAnsi="Courier New"/>
+          <w:sz w:val="18"/>
+        </w:rPr>
+        <w:t xml:space="preserve"> — represents computed output for one asset group:</w:t>
+      </w:r>
+    </w:p>
+    <w:p>
+      <w:pPr>
+        <w:shd w:val="clear" w:color="auto" w:fill="F2F2F2"/>
+        <w:spacing w:after="0"/>
+        <w:ind w:left="288"/>
+      </w:pPr>
+      <w:r>
+        <w:rPr>
+          <w:rFonts w:ascii="Courier New" w:hAnsi="Courier New"/>
+          <w:sz w:val="18"/>
+        </w:rPr>
+        <w:t xml:space="preserve">   Fields:</w:t>
+      </w:r>
+    </w:p>
+    <w:p>
+      <w:pPr>
+        <w:shd w:val="clear" w:color="auto" w:fill="F2F2F2"/>
+        <w:spacing w:after="0"/>
+        <w:ind w:left="288"/>
+      </w:pPr>
+      <w:r>
+        <w:rPr>
+          <w:rFonts w:ascii="Courier New" w:hAnsi="Courier New"/>
+          <w:sz w:val="18"/>
+        </w:rPr>
+        <w:t xml:space="preserve">   - </w:t>
+      </w:r>
+      <w:proofErr w:type="spellStart"/>
+      <w:r>
+        <w:rPr>
+          <w:rFonts w:ascii="Courier New" w:hAnsi="Courier New"/>
+          <w:sz w:val="18"/>
+        </w:rPr>
+        <w:t>groupName</w:t>
+      </w:r>
+      <w:proofErr w:type="spellEnd"/>
+      <w:r>
+        <w:rPr>
+          <w:rFonts w:ascii="Courier New" w:hAnsi="Courier New"/>
+          <w:sz w:val="18"/>
+        </w:rPr>
+        <w:t>: String</w:t>
+      </w:r>
+    </w:p>
+    <w:p>
+      <w:pPr>
+        <w:shd w:val="clear" w:color="auto" w:fill="F2F2F2"/>
+        <w:spacing w:after="0"/>
+        <w:ind w:left="288"/>
+      </w:pPr>
+      <w:r>
+        <w:rPr>
+          <w:rFonts w:ascii="Courier New" w:hAnsi="Courier New"/>
+          <w:sz w:val="18"/>
+        </w:rPr>
+        <w:t xml:space="preserve">   - </w:t>
+      </w:r>
+      <w:proofErr w:type="spellStart"/>
+      <w:r>
+        <w:rPr>
+          <w:rFonts w:ascii="Courier New" w:hAnsi="Courier New"/>
+          <w:sz w:val="18"/>
+        </w:rPr>
+        <w:t>contributionPct</w:t>
+      </w:r>
+      <w:proofErr w:type="spellEnd"/>
+      <w:r>
+        <w:rPr>
+          <w:rFonts w:ascii="Courier New" w:hAnsi="Courier New"/>
+          <w:sz w:val="18"/>
+        </w:rPr>
+        <w:t xml:space="preserve">: </w:t>
+      </w:r>
+      <w:proofErr w:type="spellStart"/>
+      <w:r>
+        <w:rPr>
+          <w:rFonts w:ascii="Courier New" w:hAnsi="Courier New"/>
+          <w:sz w:val="18"/>
+        </w:rPr>
+        <w:t>BigDecimal</w:t>
+      </w:r>
+      <w:proofErr w:type="spellEnd"/>
+      <w:r>
+        <w:rPr>
+          <w:rFonts w:ascii="Courier New" w:hAnsi="Courier New"/>
+          <w:sz w:val="18"/>
+        </w:rPr>
+        <w:t xml:space="preserve"> (rounded to 6 decimal places)</w:t>
+      </w:r>
+    </w:p>
+    <w:p>
+      <w:pPr>
+        <w:shd w:val="clear" w:color="auto" w:fill="F2F2F2"/>
+        <w:spacing w:after="0"/>
+        <w:ind w:left="288"/>
+      </w:pPr>
+      <w:r>
+        <w:rPr>
+          <w:rFonts w:ascii="Courier New" w:hAnsi="Courier New"/>
+          <w:sz w:val="18"/>
+        </w:rPr>
+        <w:t xml:space="preserve">   - </w:t>
+      </w:r>
+      <w:proofErr w:type="spellStart"/>
+      <w:r>
+        <w:rPr>
+          <w:rFonts w:ascii="Courier New" w:hAnsi="Courier New"/>
+          <w:sz w:val="18"/>
+        </w:rPr>
+        <w:t>pricingMode</w:t>
+      </w:r>
+      <w:proofErr w:type="spellEnd"/>
+      <w:r>
+        <w:rPr>
+          <w:rFonts w:ascii="Courier New" w:hAnsi="Courier New"/>
+          <w:sz w:val="18"/>
+        </w:rPr>
+        <w:t xml:space="preserve">: </w:t>
+      </w:r>
+      <w:proofErr w:type="spellStart"/>
+      <w:r>
+        <w:rPr>
+          <w:rFonts w:ascii="Courier New" w:hAnsi="Courier New"/>
+          <w:sz w:val="18"/>
+        </w:rPr>
+        <w:t>PricingMode</w:t>
+      </w:r>
+      <w:proofErr w:type="spellEnd"/>
+      <w:r>
+        <w:rPr>
+          <w:rFonts w:ascii="Courier New" w:hAnsi="Courier New"/>
+          <w:sz w:val="18"/>
+        </w:rPr>
+        <w:t xml:space="preserve"> (</w:t>
+      </w:r>
+      <w:proofErr w:type="spellStart"/>
+      <w:r>
+        <w:rPr>
+          <w:rFonts w:ascii="Courier New" w:hAnsi="Courier New"/>
+          <w:sz w:val="18"/>
+        </w:rPr>
+        <w:t>enum</w:t>
+      </w:r>
+      <w:proofErr w:type="spellEnd"/>
+      <w:r>
+        <w:rPr>
+          <w:rFonts w:ascii="Courier New" w:hAnsi="Courier New"/>
+          <w:sz w:val="18"/>
+        </w:rPr>
+        <w:t xml:space="preserve"> from </w:t>
+      </w:r>
+      <w:proofErr w:type="spellStart"/>
+      <w:proofErr w:type="gramStart"/>
+      <w:r>
+        <w:rPr>
+          <w:rFonts w:ascii="Courier New" w:hAnsi="Courier New"/>
+          <w:sz w:val="18"/>
+        </w:rPr>
+        <w:t>com.portfolio</w:t>
+      </w:r>
+      <w:proofErr w:type="gramEnd"/>
+      <w:r>
+        <w:rPr>
+          <w:rFonts w:ascii="Courier New" w:hAnsi="Courier New"/>
+          <w:sz w:val="18"/>
+        </w:rPr>
+        <w:t>.</w:t>
+      </w:r>
+      <w:proofErr w:type="gramStart"/>
+      <w:r>
+        <w:rPr>
+          <w:rFonts w:ascii="Courier New" w:hAnsi="Courier New"/>
+          <w:sz w:val="18"/>
+        </w:rPr>
+        <w:t>attribution.model</w:t>
+      </w:r>
+      <w:proofErr w:type="gramEnd"/>
+      <w:r>
+        <w:rPr>
+          <w:rFonts w:ascii="Courier New" w:hAnsi="Courier New"/>
+          <w:sz w:val="18"/>
+        </w:rPr>
+        <w:t>.enums</w:t>
+      </w:r>
+      <w:proofErr w:type="spellEnd"/>
+      <w:r>
+        <w:rPr>
+          <w:rFonts w:ascii="Courier New" w:hAnsi="Courier New"/>
+          <w:sz w:val="18"/>
+        </w:rPr>
+        <w:t>)</w:t>
+      </w:r>
+    </w:p>
+    <w:p>
+      <w:pPr>
+        <w:shd w:val="clear" w:color="auto" w:fill="F2F2F2"/>
+        <w:spacing w:after="0"/>
+        <w:ind w:left="288"/>
+      </w:pPr>
+      <w:r>
+        <w:rPr>
+          <w:rFonts w:ascii="Courier New" w:hAnsi="Courier New"/>
+          <w:sz w:val="18"/>
+        </w:rPr>
+        <w:t xml:space="preserve">   Annotations: @Data, @Builder, @NoArgsConstructor, @AllArgsConstructor</w:t>
+      </w:r>
+    </w:p>
+    <w:p>
+      <w:pPr>
+        <w:shd w:val="clear" w:color="auto" w:fill="F2F2F2"/>
+        <w:spacing w:after="0"/>
+        <w:ind w:left="288"/>
+      </w:pPr>
+      <w:r>
+        <w:rPr>
+          <w:rFonts w:ascii="Courier New" w:hAnsi="Courier New"/>
+          <w:sz w:val="18"/>
+        </w:rPr>
+        <w:t xml:space="preserve"> </w:t>
+      </w:r>
+    </w:p>
+    <w:p>
+      <w:pPr>
+        <w:shd w:val="clear" w:color="auto" w:fill="F2F2F2"/>
+        <w:spacing w:after="0"/>
+        <w:ind w:left="288"/>
+      </w:pPr>
+      <w:r>
+        <w:rPr>
+          <w:rFonts w:ascii="Courier New" w:hAnsi="Courier New"/>
+          <w:sz w:val="18"/>
+        </w:rPr>
+        <w:t xml:space="preserve">2. </w:t>
+      </w:r>
+      <w:proofErr w:type="spellStart"/>
+      <w:r>
+        <w:rPr>
+          <w:rFonts w:ascii="Courier New" w:hAnsi="Courier New"/>
+          <w:sz w:val="18"/>
+        </w:rPr>
+        <w:t>AttributionResponse</w:t>
+      </w:r>
+      <w:proofErr w:type="spellEnd"/>
+      <w:r>
+        <w:rPr>
+          <w:rFonts w:ascii="Courier New" w:hAnsi="Courier New"/>
+          <w:sz w:val="18"/>
+        </w:rPr>
+        <w:t xml:space="preserve"> — the top-level response body:</w:t>
+      </w:r>
+    </w:p>
+    <w:p>
+      <w:pPr>
+        <w:shd w:val="clear" w:color="auto" w:fill="F2F2F2"/>
+        <w:spacing w:after="0"/>
+        <w:ind w:left="288"/>
+      </w:pPr>
+      <w:r>
+        <w:rPr>
+          <w:rFonts w:ascii="Courier New" w:hAnsi="Courier New"/>
+          <w:sz w:val="18"/>
+        </w:rPr>
+        <w:t xml:space="preserve">   Fields:</w:t>
+      </w:r>
+    </w:p>
+    <w:p>
+      <w:pPr>
+        <w:shd w:val="clear" w:color="auto" w:fill="F2F2F2"/>
+        <w:spacing w:after="0"/>
+        <w:ind w:left="288"/>
+      </w:pPr>
+      <w:r>
+        <w:rPr>
+          <w:rFonts w:ascii="Courier New" w:hAnsi="Courier New"/>
+          <w:sz w:val="18"/>
+        </w:rPr>
+        <w:t xml:space="preserve">   - </w:t>
+      </w:r>
+      <w:proofErr w:type="spellStart"/>
+      <w:r>
+        <w:rPr>
+          <w:rFonts w:ascii="Courier New" w:hAnsi="Courier New"/>
+          <w:sz w:val="18"/>
+        </w:rPr>
+        <w:t>requestId</w:t>
+      </w:r>
+      <w:proofErr w:type="spellEnd"/>
+      <w:r>
+        <w:rPr>
+          <w:rFonts w:ascii="Courier New" w:hAnsi="Courier New"/>
+          <w:sz w:val="18"/>
+        </w:rPr>
+        <w:t>: String</w:t>
+      </w:r>
+    </w:p>
+    <w:p>
+      <w:pPr>
+        <w:shd w:val="clear" w:color="auto" w:fill="F2F2F2"/>
+        <w:spacing w:after="0"/>
+        <w:ind w:left="288"/>
+      </w:pPr>
+      <w:r>
+        <w:rPr>
+          <w:rFonts w:ascii="Courier New" w:hAnsi="Courier New"/>
+          <w:sz w:val="18"/>
+        </w:rPr>
+        <w:t xml:space="preserve">   - </w:t>
+      </w:r>
+      <w:proofErr w:type="spellStart"/>
+      <w:r>
+        <w:rPr>
+          <w:rFonts w:ascii="Courier New" w:hAnsi="Courier New"/>
+          <w:sz w:val="18"/>
+        </w:rPr>
+        <w:t>portfolioId</w:t>
+      </w:r>
+      <w:proofErr w:type="spellEnd"/>
+      <w:r>
+        <w:rPr>
+          <w:rFonts w:ascii="Courier New" w:hAnsi="Courier New"/>
+          <w:sz w:val="18"/>
+        </w:rPr>
+        <w:t>: String</w:t>
+      </w:r>
+    </w:p>
+    <w:p>
+      <w:pPr>
+        <w:shd w:val="clear" w:color="auto" w:fill="F2F2F2"/>
+        <w:spacing w:after="0"/>
+        <w:ind w:left="288"/>
+      </w:pPr>
+      <w:r>
+        <w:rPr>
+          <w:rFonts w:ascii="Courier New" w:hAnsi="Courier New"/>
+          <w:sz w:val="18"/>
+        </w:rPr>
+        <w:t xml:space="preserve">   - </w:t>
+      </w:r>
+      <w:proofErr w:type="spellStart"/>
+      <w:r>
+        <w:rPr>
+          <w:rFonts w:ascii="Courier New" w:hAnsi="Courier New"/>
+          <w:sz w:val="18"/>
+        </w:rPr>
+        <w:t>valuationDate</w:t>
+      </w:r>
+      <w:proofErr w:type="spellEnd"/>
+      <w:r>
+        <w:rPr>
+          <w:rFonts w:ascii="Courier New" w:hAnsi="Courier New"/>
+          <w:sz w:val="18"/>
+        </w:rPr>
+        <w:t xml:space="preserve">: </w:t>
+      </w:r>
+      <w:proofErr w:type="spellStart"/>
+      <w:r>
+        <w:rPr>
+          <w:rFonts w:ascii="Courier New" w:hAnsi="Courier New"/>
+          <w:sz w:val="18"/>
+        </w:rPr>
+        <w:t>LocalDate</w:t>
+      </w:r>
+      <w:proofErr w:type="spellEnd"/>
+    </w:p>
+    <w:p>
+      <w:pPr>
+        <w:shd w:val="clear" w:color="auto" w:fill="F2F2F2"/>
+        <w:spacing w:after="0"/>
+        <w:ind w:left="288"/>
+      </w:pPr>
+      <w:r>
+        <w:rPr>
+          <w:rFonts w:ascii="Courier New" w:hAnsi="Courier New"/>
+          <w:sz w:val="18"/>
+        </w:rPr>
+        <w:t xml:space="preserve">   - </w:t>
+      </w:r>
+      <w:proofErr w:type="spellStart"/>
+      <w:r>
+        <w:rPr>
+          <w:rFonts w:ascii="Courier New" w:hAnsi="Courier New"/>
+          <w:sz w:val="18"/>
+        </w:rPr>
+        <w:t>totalContributionPct</w:t>
+      </w:r>
+      <w:proofErr w:type="spellEnd"/>
+      <w:r>
+        <w:rPr>
+          <w:rFonts w:ascii="Courier New" w:hAnsi="Courier New"/>
+          <w:sz w:val="18"/>
+        </w:rPr>
+        <w:t xml:space="preserve">: </w:t>
+      </w:r>
+      <w:proofErr w:type="spellStart"/>
+      <w:r>
+        <w:rPr>
+          <w:rFonts w:ascii="Courier New" w:hAnsi="Courier New"/>
+          <w:sz w:val="18"/>
+        </w:rPr>
+        <w:t>BigDecimal</w:t>
+      </w:r>
+      <w:proofErr w:type="spellEnd"/>
+      <w:r>
+        <w:rPr>
+          <w:rFonts w:ascii="Courier New" w:hAnsi="Courier New"/>
+          <w:sz w:val="18"/>
+        </w:rPr>
+        <w:t xml:space="preserve"> (sum of all group </w:t>
+      </w:r>
+      <w:proofErr w:type="spellStart"/>
+      <w:r>
+        <w:rPr>
+          <w:rFonts w:ascii="Courier New" w:hAnsi="Courier New"/>
+          <w:sz w:val="18"/>
+        </w:rPr>
+        <w:t>contributionPct</w:t>
+      </w:r>
+      <w:proofErr w:type="spellEnd"/>
+      <w:r>
+        <w:rPr>
+          <w:rFonts w:ascii="Courier New" w:hAnsi="Courier New"/>
+          <w:sz w:val="18"/>
+        </w:rPr>
+        <w:t xml:space="preserve"> values)</w:t>
+      </w:r>
+    </w:p>
+    <w:p>
+      <w:pPr>
+        <w:shd w:val="clear" w:color="auto" w:fill="F2F2F2"/>
+        <w:spacing w:after="0"/>
+        <w:ind w:left="288"/>
+      </w:pPr>
+      <w:r>
+        <w:rPr>
+          <w:rFonts w:ascii="Courier New" w:hAnsi="Courier New"/>
+          <w:sz w:val="18"/>
+        </w:rPr>
+        <w:t xml:space="preserve">   - </w:t>
+      </w:r>
+      <w:proofErr w:type="spellStart"/>
+      <w:r>
+        <w:rPr>
+          <w:rFonts w:ascii="Courier New" w:hAnsi="Courier New"/>
+          <w:sz w:val="18"/>
+        </w:rPr>
+        <w:t>groupContributions</w:t>
+      </w:r>
+      <w:proofErr w:type="spellEnd"/>
+      <w:r>
+        <w:rPr>
+          <w:rFonts w:ascii="Courier New" w:hAnsi="Courier New"/>
+          <w:sz w:val="18"/>
+        </w:rPr>
+        <w:t>: List&lt;</w:t>
+      </w:r>
+      <w:proofErr w:type="spellStart"/>
+      <w:r>
+        <w:rPr>
+          <w:rFonts w:ascii="Courier New" w:hAnsi="Courier New"/>
+          <w:sz w:val="18"/>
+        </w:rPr>
+        <w:t>GroupContributionResult</w:t>
+      </w:r>
+      <w:proofErr w:type="spellEnd"/>
+      <w:r>
+        <w:rPr>
+          <w:rFonts w:ascii="Courier New" w:hAnsi="Courier New"/>
+          <w:sz w:val="18"/>
+        </w:rPr>
+        <w:t>&gt;</w:t>
+      </w:r>
+    </w:p>
+    <w:p>
+      <w:pPr>
+        <w:shd w:val="clear" w:color="auto" w:fill="F2F2F2"/>
+        <w:spacing w:after="0"/>
+        <w:ind w:left="288"/>
+      </w:pPr>
+      <w:r>
+        <w:rPr>
+          <w:rFonts w:ascii="Courier New" w:hAnsi="Courier New"/>
+          <w:sz w:val="18"/>
+        </w:rPr>
+        <w:t xml:space="preserve">   - status: </w:t>
+      </w:r>
+      <w:proofErr w:type="spellStart"/>
+      <w:r>
+        <w:rPr>
+          <w:rFonts w:ascii="Courier New" w:hAnsi="Courier New"/>
+          <w:sz w:val="18"/>
+        </w:rPr>
+        <w:t>AttributionStatus</w:t>
+      </w:r>
+      <w:proofErr w:type="spellEnd"/>
+      <w:r>
+        <w:rPr>
+          <w:rFonts w:ascii="Courier New" w:hAnsi="Courier New"/>
+          <w:sz w:val="18"/>
+        </w:rPr>
+        <w:t xml:space="preserve"> (</w:t>
+      </w:r>
+      <w:proofErr w:type="spellStart"/>
+      <w:r>
+        <w:rPr>
+          <w:rFonts w:ascii="Courier New" w:hAnsi="Courier New"/>
+          <w:sz w:val="18"/>
+        </w:rPr>
+        <w:t>enum</w:t>
+      </w:r>
+      <w:proofErr w:type="spellEnd"/>
+      <w:r>
+        <w:rPr>
+          <w:rFonts w:ascii="Courier New" w:hAnsi="Courier New"/>
+          <w:sz w:val="18"/>
+        </w:rPr>
+        <w:t>)</w:t>
+      </w:r>
+    </w:p>
+    <w:p>
+      <w:pPr>
+        <w:shd w:val="clear" w:color="auto" w:fill="F2F2F2"/>
+        <w:spacing w:after="0"/>
+        <w:ind w:left="288"/>
+      </w:pPr>
+      <w:r>
+        <w:rPr>
+          <w:rFonts w:ascii="Courier New" w:hAnsi="Courier New"/>
+          <w:sz w:val="18"/>
+        </w:rPr>
+        <w:t xml:space="preserve">   - degraded: </w:t>
+      </w:r>
+      <w:proofErr w:type="spellStart"/>
+      <w:r>
+        <w:rPr>
+          <w:rFonts w:ascii="Courier New" w:hAnsi="Courier New"/>
+          <w:sz w:val="18"/>
+        </w:rPr>
+        <w:t>boolean</w:t>
+      </w:r>
+      <w:proofErr w:type="spellEnd"/>
+    </w:p>
+    <w:p>
+      <w:pPr>
+        <w:shd w:val="clear" w:color="auto" w:fill="F2F2F2"/>
+        <w:spacing w:after="0"/>
+        <w:ind w:left="288"/>
+      </w:pPr>
+      <w:r>
+        <w:rPr>
+          <w:rFonts w:ascii="Courier New" w:hAnsi="Courier New"/>
+          <w:sz w:val="18"/>
+        </w:rPr>
+        <w:t xml:space="preserve">   - warnings: List&lt;String&gt; (explains fallback usage or missing groups)</w:t>
+      </w:r>
+    </w:p>
+    <w:p>
+      <w:pPr>
+        <w:shd w:val="clear" w:color="auto" w:fill="F2F2F2"/>
+        <w:spacing w:after="0"/>
+        <w:ind w:left="288"/>
+      </w:pPr>
+      <w:r>
+        <w:rPr>
+          <w:rFonts w:ascii="Courier New" w:hAnsi="Courier New"/>
+          <w:sz w:val="18"/>
+        </w:rPr>
+        <w:t xml:space="preserve">   - </w:t>
+      </w:r>
+      <w:proofErr w:type="spellStart"/>
+      <w:r>
+        <w:rPr>
+          <w:rFonts w:ascii="Courier New" w:hAnsi="Courier New"/>
+          <w:sz w:val="18"/>
+        </w:rPr>
+        <w:t>processedAt</w:t>
+      </w:r>
+      <w:proofErr w:type="spellEnd"/>
+      <w:r>
+        <w:rPr>
+          <w:rFonts w:ascii="Courier New" w:hAnsi="Courier New"/>
+          <w:sz w:val="18"/>
+        </w:rPr>
+        <w:t>: Instant</w:t>
+      </w:r>
+    </w:p>
+    <w:p>
+      <w:pPr>
+        <w:shd w:val="clear" w:color="auto" w:fill="F2F2F2"/>
+        <w:spacing w:after="0"/>
+        <w:ind w:left="288"/>
+      </w:pPr>
+      <w:r>
+        <w:rPr>
+          <w:rFonts w:ascii="Courier New" w:hAnsi="Courier New"/>
+          <w:sz w:val="18"/>
+        </w:rPr>
+        <w:t xml:space="preserve">   Annotations: @Data, @Builder, @NoArgsConstructor, @AllArgsConstructor</w:t>
+      </w:r>
+    </w:p>
+    <w:p>
+      <w:pPr>
+        <w:shd w:val="clear" w:color="auto" w:fill="F2F2F2"/>
+        <w:spacing w:after="0"/>
+        <w:ind w:left="288"/>
+      </w:pPr>
+      <w:r>
+        <w:rPr>
+          <w:rFonts w:ascii="Courier New" w:hAnsi="Courier New"/>
+          <w:sz w:val="18"/>
+        </w:rPr>
+        <w:t xml:space="preserve"> </w:t>
+      </w:r>
+    </w:p>
+    <w:p>
+      <w:pPr>
+        <w:shd w:val="clear" w:color="auto" w:fill="F2F2F2"/>
+        <w:spacing w:after="0"/>
+        <w:ind w:left="288"/>
+      </w:pPr>
+      <w:r>
+        <w:rPr>
+          <w:rFonts w:ascii="Courier New" w:hAnsi="Courier New"/>
+          <w:sz w:val="18"/>
+        </w:rPr>
+        <w:t>Ensure Instant is serialized as ISO-8601 UTC string using @JsonFormat.</w:t>
+      </w:r>
+    </w:p>
+    <w:p/>
+    <w:p>
+      <w:pPr>
+        <w:spacing w:before="120" w:after="40"/>
+      </w:pPr>
+      <w:r>
+        <w:rPr>
+          <w:rFonts w:ascii="Calibri" w:hAnsi="Calibri"/>
+          <w:b/>
+          <w:color w:val="1F497D"/>
+        </w:rPr>
+        <w:t>Validation Gate</w:t>
+      </w:r>
+    </w:p>
+    <w:p>
+      <w:pPr>
+        <w:pStyle w:val="ListBullet"/>
+        <w:tabs>
+          <w:tab w:val="num" w:pos="360"/>
+        </w:tabs>
+        <w:spacing w:after="40"/>
+        <w:ind w:left="360" w:hanging="360"/>
+      </w:pPr>
+      <w:r>
+        <w:rPr>
+          <w:rFonts w:ascii="Calibri" w:hAnsi="Calibri"/>
+          <w:sz w:val="21"/>
+        </w:rPr>
+        <w:t>Run `</w:t>
+      </w:r>
+      <w:proofErr w:type="spellStart"/>
+      <w:r>
+        <w:rPr>
+          <w:rFonts w:ascii="Calibri" w:hAnsi="Calibri"/>
+          <w:sz w:val="21"/>
+        </w:rPr>
+        <w:t>mvn</w:t>
+      </w:r>
+      <w:proofErr w:type="spellEnd"/>
+      <w:r>
+        <w:rPr>
+          <w:rFonts w:ascii="Calibri" w:hAnsi="Calibri"/>
+          <w:sz w:val="21"/>
+        </w:rPr>
+        <w:t xml:space="preserve"> compile` — zero errors</w:t>
+      </w:r>
+    </w:p>
+    <w:p>
+      <w:pPr>
+        <w:pStyle w:val="ListBullet"/>
+        <w:tabs>
+          <w:tab w:val="num" w:pos="360"/>
+        </w:tabs>
+        <w:spacing w:after="40"/>
+        <w:ind w:left="360" w:hanging="360"/>
+      </w:pPr>
+      <w:r>
+        <w:rPr>
+          <w:rFonts w:ascii="Calibri" w:hAnsi="Calibri"/>
+          <w:sz w:val="21"/>
+        </w:rPr>
+        <w:t xml:space="preserve">Write a unit test that builds an </w:t>
+      </w:r>
+      <w:proofErr w:type="spellStart"/>
+      <w:r>
+        <w:rPr>
+          <w:rFonts w:ascii="Calibri" w:hAnsi="Calibri"/>
+          <w:sz w:val="21"/>
+        </w:rPr>
+        <w:t>AttributionResponse</w:t>
+      </w:r>
+      <w:proofErr w:type="spellEnd"/>
+      <w:r>
+        <w:rPr>
+          <w:rFonts w:ascii="Calibri" w:hAnsi="Calibri"/>
+          <w:sz w:val="21"/>
+        </w:rPr>
+        <w:t xml:space="preserve"> using the Lombok builder, serializes it with </w:t>
+      </w:r>
+      <w:proofErr w:type="spellStart"/>
+      <w:r>
+        <w:rPr>
+          <w:rFonts w:ascii="Calibri" w:hAnsi="Calibri"/>
+          <w:sz w:val="21"/>
+        </w:rPr>
+        <w:t>ObjectMapper</w:t>
+      </w:r>
+      <w:proofErr w:type="spellEnd"/>
+      <w:r>
+        <w:rPr>
+          <w:rFonts w:ascii="Calibri" w:hAnsi="Calibri"/>
+          <w:sz w:val="21"/>
+        </w:rPr>
+        <w:t>, and asserts the JSON contains 'status', 'degraded', and 'warnings' keys</w:t>
+      </w:r>
+    </w:p>
+    <w:p>
+      <w:pPr>
+        <w:pStyle w:val="ListBullet"/>
+        <w:tabs>
+          <w:tab w:val="num" w:pos="360"/>
+        </w:tabs>
+        <w:spacing w:after="40"/>
+        <w:ind w:left="360" w:hanging="360"/>
+      </w:pPr>
+      <w:r>
+        <w:rPr>
+          <w:rFonts w:ascii="Calibri" w:hAnsi="Calibri"/>
+          <w:sz w:val="21"/>
+        </w:rPr>
+        <w:t xml:space="preserve">Verify </w:t>
+      </w:r>
+      <w:proofErr w:type="spellStart"/>
+      <w:r>
+        <w:rPr>
+          <w:rFonts w:ascii="Calibri" w:hAnsi="Calibri"/>
+          <w:sz w:val="21"/>
+        </w:rPr>
+        <w:t>processedAt</w:t>
+      </w:r>
+      <w:proofErr w:type="spellEnd"/>
+      <w:r>
+        <w:rPr>
+          <w:rFonts w:ascii="Calibri" w:hAnsi="Calibri"/>
+          <w:sz w:val="21"/>
+        </w:rPr>
+        <w:t xml:space="preserve"> serializes in ISO-8601 UTC format (e.g. '2026-06-14T10:45:00Z')</w:t>
+      </w:r>
+    </w:p>
+    <w:p>
+      <w:pPr>
         <w:pStyle w:val="ListBullet"/>
         <w:numPr>
           <w:ilvl w:val="0"/>
@@ -1329,6 +2446,13 @@
         </w:numPr>
         <w:spacing w:after="40"/>
       </w:pPr>
+      <w:r>
+        <w:rPr>
+          <w:color w:val="CCCCCC"/>
+          <w:sz w:val="16"/>
+        </w:rPr>
+        <w:t>─────────────────────────────────────────────────────────────────────────────────────────</w:t>
+      </w:r>
     </w:p>
     <w:p>
       <w:pPr>

</xml_diff>

<commit_message>
FDE-2: Add JPA Audit Entity, Repository and its test
</commit_message>
<xml_diff>
--- a/Prompts-FDE- 2.docx
+++ b/Prompts-FDE- 2.docx
@@ -2456,11 +2456,1019 @@
     </w:p>
     <w:p>
       <w:pPr>
+        <w:spacing w:before="280" w:after="80"/>
+      </w:pPr>
+      <w:r>
+        <w:rPr>
+          <w:rFonts w:ascii="Calibri" w:hAnsi="Calibri"/>
+          <w:b/>
+          <w:color w:val="2E74B5"/>
+          <w:sz w:val="28"/>
+        </w:rPr>
+        <w:t xml:space="preserve">STEP </w:t>
+      </w:r>
+      <w:proofErr w:type="gramStart"/>
+      <w:r>
+        <w:rPr>
+          <w:rFonts w:ascii="Calibri" w:hAnsi="Calibri"/>
+          <w:b/>
+          <w:color w:val="2E74B5"/>
+          <w:sz w:val="28"/>
+        </w:rPr>
+        <w:t>4</w:t>
+      </w:r>
+      <w:r>
+        <w:rPr>
+          <w:rFonts w:ascii="Calibri" w:hAnsi="Calibri"/>
+          <w:b/>
+          <w:color w:val="2E74B5"/>
+          <w:sz w:val="28"/>
+        </w:rPr>
+        <w:t xml:space="preserve">  —</w:t>
+      </w:r>
+      <w:proofErr w:type="gramEnd"/>
+      <w:r>
+        <w:rPr>
+          <w:rFonts w:ascii="Calibri" w:hAnsi="Calibri"/>
+          <w:b/>
+          <w:color w:val="2E74B5"/>
+          <w:sz w:val="28"/>
+        </w:rPr>
+        <w:t xml:space="preserve">  JPA Audit Entity &amp; Repository</w:t>
+      </w:r>
+    </w:p>
+    <w:p>
+      <w:pPr>
+        <w:spacing w:after="60"/>
+      </w:pPr>
+      <w:r>
+        <w:rPr>
+          <w:rFonts w:ascii="Calibri" w:hAnsi="Calibri"/>
+          <w:b/>
+          <w:color w:val="2E74B5"/>
+        </w:rPr>
+        <w:t xml:space="preserve">Depends on: </w:t>
+      </w:r>
+      <w:r>
+        <w:rPr>
+          <w:rFonts w:ascii="Calibri" w:hAnsi="Calibri"/>
+        </w:rPr>
+        <w:t xml:space="preserve">Step </w:t>
+      </w:r>
+      <w:r>
+        <w:rPr>
+          <w:rFonts w:ascii="Calibri" w:hAnsi="Calibri"/>
+        </w:rPr>
+        <w:t>3</w:t>
+      </w:r>
+    </w:p>
+    <w:p>
+      <w:pPr>
+        <w:shd w:val="clear" w:color="auto" w:fill="F2F2F2"/>
+        <w:spacing w:after="0"/>
+        <w:ind w:left="288"/>
+      </w:pPr>
+      <w:r>
+        <w:rPr>
+          <w:rFonts w:ascii="Courier New" w:hAnsi="Courier New"/>
+          <w:sz w:val="18"/>
+        </w:rPr>
+        <w:t xml:space="preserve">In package </w:t>
+      </w:r>
+      <w:proofErr w:type="spellStart"/>
+      <w:proofErr w:type="gramStart"/>
+      <w:r>
+        <w:rPr>
+          <w:rFonts w:ascii="Courier New" w:hAnsi="Courier New"/>
+          <w:sz w:val="18"/>
+        </w:rPr>
+        <w:t>com.portfolio</w:t>
+      </w:r>
+      <w:proofErr w:type="gramEnd"/>
+      <w:r>
+        <w:rPr>
+          <w:rFonts w:ascii="Courier New" w:hAnsi="Courier New"/>
+          <w:sz w:val="18"/>
+        </w:rPr>
+        <w:t>.</w:t>
+      </w:r>
+      <w:proofErr w:type="gramStart"/>
+      <w:r>
+        <w:rPr>
+          <w:rFonts w:ascii="Courier New" w:hAnsi="Courier New"/>
+          <w:sz w:val="18"/>
+        </w:rPr>
+        <w:t>attribution.model</w:t>
+      </w:r>
+      <w:proofErr w:type="gramEnd"/>
+      <w:r>
+        <w:rPr>
+          <w:rFonts w:ascii="Courier New" w:hAnsi="Courier New"/>
+          <w:sz w:val="18"/>
+        </w:rPr>
+        <w:t>.entity</w:t>
+      </w:r>
+      <w:proofErr w:type="spellEnd"/>
+      <w:r>
+        <w:rPr>
+          <w:rFonts w:ascii="Courier New" w:hAnsi="Courier New"/>
+          <w:sz w:val="18"/>
+        </w:rPr>
+        <w:t>, create a JPA entity</w:t>
+      </w:r>
+    </w:p>
+    <w:p>
+      <w:pPr>
+        <w:shd w:val="clear" w:color="auto" w:fill="F2F2F2"/>
+        <w:spacing w:after="0"/>
+        <w:ind w:left="288"/>
+      </w:pPr>
+      <w:proofErr w:type="spellStart"/>
+      <w:r>
+        <w:rPr>
+          <w:rFonts w:ascii="Courier New" w:hAnsi="Courier New"/>
+          <w:sz w:val="18"/>
+        </w:rPr>
+        <w:t>AttributionAudit</w:t>
+      </w:r>
+      <w:proofErr w:type="spellEnd"/>
+      <w:r>
+        <w:rPr>
+          <w:rFonts w:ascii="Courier New" w:hAnsi="Courier New"/>
+          <w:sz w:val="18"/>
+        </w:rPr>
+        <w:t xml:space="preserve"> to persist each attribution request for idempotency and audit:</w:t>
+      </w:r>
+    </w:p>
+    <w:p>
+      <w:pPr>
+        <w:shd w:val="clear" w:color="auto" w:fill="F2F2F2"/>
+        <w:spacing w:after="0"/>
+        <w:ind w:left="288"/>
+      </w:pPr>
+      <w:r>
+        <w:rPr>
+          <w:rFonts w:ascii="Courier New" w:hAnsi="Courier New"/>
+          <w:sz w:val="18"/>
+        </w:rPr>
+        <w:t xml:space="preserve"> </w:t>
+      </w:r>
+    </w:p>
+    <w:p>
+      <w:pPr>
+        <w:shd w:val="clear" w:color="auto" w:fill="F2F2F2"/>
+        <w:spacing w:after="0"/>
+        <w:ind w:left="288"/>
+      </w:pPr>
+      <w:r>
+        <w:rPr>
+          <w:rFonts w:ascii="Courier New" w:hAnsi="Courier New"/>
+          <w:sz w:val="18"/>
+        </w:rPr>
+        <w:t>Fields:</w:t>
+      </w:r>
+    </w:p>
+    <w:p>
+      <w:pPr>
+        <w:shd w:val="clear" w:color="auto" w:fill="F2F2F2"/>
+        <w:spacing w:after="0"/>
+        <w:ind w:left="288"/>
+      </w:pPr>
+      <w:r>
+        <w:rPr>
+          <w:rFonts w:ascii="Courier New" w:hAnsi="Courier New"/>
+          <w:sz w:val="18"/>
+        </w:rPr>
+        <w:t>- id: Long, @Id, @</w:t>
+      </w:r>
+      <w:proofErr w:type="gramStart"/>
+      <w:r>
+        <w:rPr>
+          <w:rFonts w:ascii="Courier New" w:hAnsi="Courier New"/>
+          <w:sz w:val="18"/>
+        </w:rPr>
+        <w:t>GeneratedValue(</w:t>
+      </w:r>
+      <w:proofErr w:type="gramEnd"/>
+      <w:r>
+        <w:rPr>
+          <w:rFonts w:ascii="Courier New" w:hAnsi="Courier New"/>
+          <w:sz w:val="18"/>
+        </w:rPr>
+        <w:t xml:space="preserve">strategy = </w:t>
+      </w:r>
+      <w:proofErr w:type="spellStart"/>
+      <w:r>
+        <w:rPr>
+          <w:rFonts w:ascii="Courier New" w:hAnsi="Courier New"/>
+          <w:sz w:val="18"/>
+        </w:rPr>
+        <w:t>GenerationType.IDENTITY</w:t>
+      </w:r>
+      <w:proofErr w:type="spellEnd"/>
+      <w:r>
+        <w:rPr>
+          <w:rFonts w:ascii="Courier New" w:hAnsi="Courier New"/>
+          <w:sz w:val="18"/>
+        </w:rPr>
+        <w:t>)</w:t>
+      </w:r>
+    </w:p>
+    <w:p>
+      <w:pPr>
+        <w:shd w:val="clear" w:color="auto" w:fill="F2F2F2"/>
+        <w:spacing w:after="0"/>
+        <w:ind w:left="288"/>
+      </w:pPr>
+      <w:r>
+        <w:rPr>
+          <w:rFonts w:ascii="Courier New" w:hAnsi="Courier New"/>
+          <w:sz w:val="18"/>
+        </w:rPr>
+        <w:t xml:space="preserve">- </w:t>
+      </w:r>
+      <w:proofErr w:type="spellStart"/>
+      <w:r>
+        <w:rPr>
+          <w:rFonts w:ascii="Courier New" w:hAnsi="Courier New"/>
+          <w:sz w:val="18"/>
+        </w:rPr>
+        <w:t>requestId</w:t>
+      </w:r>
+      <w:proofErr w:type="spellEnd"/>
+      <w:r>
+        <w:rPr>
+          <w:rFonts w:ascii="Courier New" w:hAnsi="Courier New"/>
+          <w:sz w:val="18"/>
+        </w:rPr>
+        <w:t>: String, @</w:t>
+      </w:r>
+      <w:proofErr w:type="gramStart"/>
+      <w:r>
+        <w:rPr>
+          <w:rFonts w:ascii="Courier New" w:hAnsi="Courier New"/>
+          <w:sz w:val="18"/>
+        </w:rPr>
+        <w:t>Column(</w:t>
+      </w:r>
+      <w:proofErr w:type="gramEnd"/>
+      <w:r>
+        <w:rPr>
+          <w:rFonts w:ascii="Courier New" w:hAnsi="Courier New"/>
+          <w:sz w:val="18"/>
+        </w:rPr>
+        <w:t>unique=true, nullable=false)</w:t>
+      </w:r>
+    </w:p>
+    <w:p>
+      <w:pPr>
+        <w:shd w:val="clear" w:color="auto" w:fill="F2F2F2"/>
+        <w:spacing w:after="0"/>
+        <w:ind w:left="288"/>
+      </w:pPr>
+      <w:r>
+        <w:rPr>
+          <w:rFonts w:ascii="Courier New" w:hAnsi="Courier New"/>
+          <w:sz w:val="18"/>
+        </w:rPr>
+        <w:t xml:space="preserve">- </w:t>
+      </w:r>
+      <w:proofErr w:type="spellStart"/>
+      <w:r>
+        <w:rPr>
+          <w:rFonts w:ascii="Courier New" w:hAnsi="Courier New"/>
+          <w:sz w:val="18"/>
+        </w:rPr>
+        <w:t>portfolioId</w:t>
+      </w:r>
+      <w:proofErr w:type="spellEnd"/>
+      <w:r>
+        <w:rPr>
+          <w:rFonts w:ascii="Courier New" w:hAnsi="Courier New"/>
+          <w:sz w:val="18"/>
+        </w:rPr>
+        <w:t>: String, @Column(nullable=false)</w:t>
+      </w:r>
+    </w:p>
+    <w:p>
+      <w:pPr>
+        <w:shd w:val="clear" w:color="auto" w:fill="F2F2F2"/>
+        <w:spacing w:after="0"/>
+        <w:ind w:left="288"/>
+      </w:pPr>
+      <w:r>
+        <w:rPr>
+          <w:rFonts w:ascii="Courier New" w:hAnsi="Courier New"/>
+          <w:sz w:val="18"/>
+        </w:rPr>
+        <w:t xml:space="preserve">- </w:t>
+      </w:r>
+      <w:proofErr w:type="spellStart"/>
+      <w:r>
+        <w:rPr>
+          <w:rFonts w:ascii="Courier New" w:hAnsi="Courier New"/>
+          <w:sz w:val="18"/>
+        </w:rPr>
+        <w:t>valuationDate</w:t>
+      </w:r>
+      <w:proofErr w:type="spellEnd"/>
+      <w:r>
+        <w:rPr>
+          <w:rFonts w:ascii="Courier New" w:hAnsi="Courier New"/>
+          <w:sz w:val="18"/>
+        </w:rPr>
+        <w:t xml:space="preserve">: </w:t>
+      </w:r>
+      <w:proofErr w:type="spellStart"/>
+      <w:r>
+        <w:rPr>
+          <w:rFonts w:ascii="Courier New" w:hAnsi="Courier New"/>
+          <w:sz w:val="18"/>
+        </w:rPr>
+        <w:t>LocalDate</w:t>
+      </w:r>
+      <w:proofErr w:type="spellEnd"/>
+      <w:r>
+        <w:rPr>
+          <w:rFonts w:ascii="Courier New" w:hAnsi="Courier New"/>
+          <w:sz w:val="18"/>
+        </w:rPr>
+        <w:t>, @Column(nullable=false)</w:t>
+      </w:r>
+    </w:p>
+    <w:p>
+      <w:pPr>
+        <w:shd w:val="clear" w:color="auto" w:fill="F2F2F2"/>
+        <w:spacing w:after="0"/>
+        <w:ind w:left="288"/>
+      </w:pPr>
+      <w:r>
+        <w:rPr>
+          <w:rFonts w:ascii="Courier New" w:hAnsi="Courier New"/>
+          <w:sz w:val="18"/>
+        </w:rPr>
+        <w:t xml:space="preserve">- status: String (stores </w:t>
+      </w:r>
+      <w:proofErr w:type="spellStart"/>
+      <w:r>
+        <w:rPr>
+          <w:rFonts w:ascii="Courier New" w:hAnsi="Courier New"/>
+          <w:sz w:val="18"/>
+        </w:rPr>
+        <w:t>AttributionStatus</w:t>
+      </w:r>
+      <w:proofErr w:type="spellEnd"/>
+      <w:r>
+        <w:rPr>
+          <w:rFonts w:ascii="Courier New" w:hAnsi="Courier New"/>
+          <w:sz w:val="18"/>
+        </w:rPr>
+        <w:t xml:space="preserve"> </w:t>
+      </w:r>
+      <w:proofErr w:type="gramStart"/>
+      <w:r>
+        <w:rPr>
+          <w:rFonts w:ascii="Courier New" w:hAnsi="Courier New"/>
+          <w:sz w:val="18"/>
+        </w:rPr>
+        <w:t>name(</w:t>
+      </w:r>
+      <w:proofErr w:type="gramEnd"/>
+      <w:r>
+        <w:rPr>
+          <w:rFonts w:ascii="Courier New" w:hAnsi="Courier New"/>
+          <w:sz w:val="18"/>
+        </w:rPr>
+        <w:t>))</w:t>
+      </w:r>
+    </w:p>
+    <w:p>
+      <w:pPr>
+        <w:shd w:val="clear" w:color="auto" w:fill="F2F2F2"/>
+        <w:spacing w:after="0"/>
+        <w:ind w:left="288"/>
+      </w:pPr>
+      <w:r>
+        <w:rPr>
+          <w:rFonts w:ascii="Courier New" w:hAnsi="Courier New"/>
+          <w:sz w:val="18"/>
+        </w:rPr>
+        <w:t xml:space="preserve">- </w:t>
+      </w:r>
+      <w:proofErr w:type="spellStart"/>
+      <w:r>
+        <w:rPr>
+          <w:rFonts w:ascii="Courier New" w:hAnsi="Courier New"/>
+          <w:sz w:val="18"/>
+        </w:rPr>
+        <w:t>totalContributionPct</w:t>
+      </w:r>
+      <w:proofErr w:type="spellEnd"/>
+      <w:r>
+        <w:rPr>
+          <w:rFonts w:ascii="Courier New" w:hAnsi="Courier New"/>
+          <w:sz w:val="18"/>
+        </w:rPr>
+        <w:t xml:space="preserve">: </w:t>
+      </w:r>
+      <w:proofErr w:type="spellStart"/>
+      <w:r>
+        <w:rPr>
+          <w:rFonts w:ascii="Courier New" w:hAnsi="Courier New"/>
+          <w:sz w:val="18"/>
+        </w:rPr>
+        <w:t>BigDecimal</w:t>
+      </w:r>
+      <w:proofErr w:type="spellEnd"/>
+    </w:p>
+    <w:p>
+      <w:pPr>
+        <w:shd w:val="clear" w:color="auto" w:fill="F2F2F2"/>
+        <w:spacing w:after="0"/>
+        <w:ind w:left="288"/>
+      </w:pPr>
+      <w:r>
+        <w:rPr>
+          <w:rFonts w:ascii="Courier New" w:hAnsi="Courier New"/>
+          <w:sz w:val="18"/>
+        </w:rPr>
+        <w:lastRenderedPageBreak/>
+        <w:t xml:space="preserve">- degraded: </w:t>
+      </w:r>
+      <w:proofErr w:type="spellStart"/>
+      <w:r>
+        <w:rPr>
+          <w:rFonts w:ascii="Courier New" w:hAnsi="Courier New"/>
+          <w:sz w:val="18"/>
+        </w:rPr>
+        <w:t>boolean</w:t>
+      </w:r>
+      <w:proofErr w:type="spellEnd"/>
+    </w:p>
+    <w:p>
+      <w:pPr>
+        <w:shd w:val="clear" w:color="auto" w:fill="F2F2F2"/>
+        <w:spacing w:after="0"/>
+        <w:ind w:left="288"/>
+      </w:pPr>
+      <w:r>
+        <w:rPr>
+          <w:rFonts w:ascii="Courier New" w:hAnsi="Courier New"/>
+          <w:sz w:val="18"/>
+        </w:rPr>
+        <w:t>- warnings: String (@Column length=4000, stores JSON array as string)</w:t>
+      </w:r>
+    </w:p>
+    <w:p>
+      <w:pPr>
+        <w:shd w:val="clear" w:color="auto" w:fill="F2F2F2"/>
+        <w:spacing w:after="0"/>
+        <w:ind w:left="288"/>
+      </w:pPr>
+      <w:r>
+        <w:rPr>
+          <w:rFonts w:ascii="Courier New" w:hAnsi="Courier New"/>
+          <w:sz w:val="18"/>
+        </w:rPr>
+        <w:t xml:space="preserve">- </w:t>
+      </w:r>
+      <w:proofErr w:type="spellStart"/>
+      <w:r>
+        <w:rPr>
+          <w:rFonts w:ascii="Courier New" w:hAnsi="Courier New"/>
+          <w:sz w:val="18"/>
+        </w:rPr>
+        <w:t>groupContributionsJson</w:t>
+      </w:r>
+      <w:proofErr w:type="spellEnd"/>
+      <w:r>
+        <w:rPr>
+          <w:rFonts w:ascii="Courier New" w:hAnsi="Courier New"/>
+          <w:sz w:val="18"/>
+        </w:rPr>
+        <w:t>: String (@Column(columnDefinition="TEXT"), stores full</w:t>
+      </w:r>
+    </w:p>
+    <w:p>
+      <w:pPr>
+        <w:shd w:val="clear" w:color="auto" w:fill="F2F2F2"/>
+        <w:spacing w:after="0"/>
+        <w:ind w:left="288"/>
+      </w:pPr>
+      <w:r>
+        <w:rPr>
+          <w:rFonts w:ascii="Courier New" w:hAnsi="Courier New"/>
+          <w:sz w:val="18"/>
+        </w:rPr>
+        <w:t xml:space="preserve">  </w:t>
+      </w:r>
+      <w:proofErr w:type="spellStart"/>
+      <w:r>
+        <w:rPr>
+          <w:rFonts w:ascii="Courier New" w:hAnsi="Courier New"/>
+          <w:sz w:val="18"/>
+        </w:rPr>
+        <w:t>groupContributions</w:t>
+      </w:r>
+      <w:proofErr w:type="spellEnd"/>
+      <w:r>
+        <w:rPr>
+          <w:rFonts w:ascii="Courier New" w:hAnsi="Courier New"/>
+          <w:sz w:val="18"/>
+        </w:rPr>
+        <w:t xml:space="preserve"> list serialized as JSON)</w:t>
+      </w:r>
+    </w:p>
+    <w:p>
+      <w:pPr>
+        <w:shd w:val="clear" w:color="auto" w:fill="F2F2F2"/>
+        <w:spacing w:after="0"/>
+        <w:ind w:left="288"/>
+      </w:pPr>
+      <w:r>
+        <w:rPr>
+          <w:rFonts w:ascii="Courier New" w:hAnsi="Courier New"/>
+          <w:sz w:val="18"/>
+        </w:rPr>
+        <w:t xml:space="preserve">- </w:t>
+      </w:r>
+      <w:proofErr w:type="spellStart"/>
+      <w:r>
+        <w:rPr>
+          <w:rFonts w:ascii="Courier New" w:hAnsi="Courier New"/>
+          <w:sz w:val="18"/>
+        </w:rPr>
+        <w:t>requestedBy</w:t>
+      </w:r>
+      <w:proofErr w:type="spellEnd"/>
+      <w:r>
+        <w:rPr>
+          <w:rFonts w:ascii="Courier New" w:hAnsi="Courier New"/>
+          <w:sz w:val="18"/>
+        </w:rPr>
+        <w:t>: String</w:t>
+      </w:r>
+    </w:p>
+    <w:p>
+      <w:pPr>
+        <w:shd w:val="clear" w:color="auto" w:fill="F2F2F2"/>
+        <w:spacing w:after="0"/>
+        <w:ind w:left="288"/>
+      </w:pPr>
+      <w:r>
+        <w:rPr>
+          <w:rFonts w:ascii="Courier New" w:hAnsi="Courier New"/>
+          <w:sz w:val="18"/>
+        </w:rPr>
+        <w:t>- currency: String</w:t>
+      </w:r>
+    </w:p>
+    <w:p>
+      <w:pPr>
+        <w:shd w:val="clear" w:color="auto" w:fill="F2F2F2"/>
+        <w:spacing w:after="0"/>
+        <w:ind w:left="288"/>
+      </w:pPr>
+      <w:r>
+        <w:rPr>
+          <w:rFonts w:ascii="Courier New" w:hAnsi="Courier New"/>
+          <w:sz w:val="18"/>
+        </w:rPr>
+        <w:t xml:space="preserve">- </w:t>
+      </w:r>
+      <w:proofErr w:type="spellStart"/>
+      <w:r>
+        <w:rPr>
+          <w:rFonts w:ascii="Courier New" w:hAnsi="Courier New"/>
+          <w:sz w:val="18"/>
+        </w:rPr>
+        <w:t>processedAt</w:t>
+      </w:r>
+      <w:proofErr w:type="spellEnd"/>
+      <w:r>
+        <w:rPr>
+          <w:rFonts w:ascii="Courier New" w:hAnsi="Courier New"/>
+          <w:sz w:val="18"/>
+        </w:rPr>
+        <w:t>: Instant, @Column(nullable=false)</w:t>
+      </w:r>
+    </w:p>
+    <w:p>
+      <w:pPr>
+        <w:shd w:val="clear" w:color="auto" w:fill="F2F2F2"/>
+        <w:spacing w:after="0"/>
+        <w:ind w:left="288"/>
+      </w:pPr>
+      <w:r>
+        <w:rPr>
+          <w:rFonts w:ascii="Courier New" w:hAnsi="Courier New"/>
+          <w:sz w:val="18"/>
+        </w:rPr>
+        <w:t>Annotations: @Entity, @Table(name="attribution_audit"), @Data, @Builder,</w:t>
+      </w:r>
+    </w:p>
+    <w:p>
+      <w:pPr>
+        <w:shd w:val="clear" w:color="auto" w:fill="F2F2F2"/>
+        <w:spacing w:after="0"/>
+        <w:ind w:left="288"/>
+      </w:pPr>
+      <w:r>
+        <w:rPr>
+          <w:rFonts w:ascii="Courier New" w:hAnsi="Courier New"/>
+          <w:sz w:val="18"/>
+        </w:rPr>
+        <w:t>@NoArgsConstructor, @AllArgsConstructor</w:t>
+      </w:r>
+    </w:p>
+    <w:p>
+      <w:pPr>
+        <w:shd w:val="clear" w:color="auto" w:fill="F2F2F2"/>
+        <w:spacing w:after="0"/>
+        <w:ind w:left="288"/>
+      </w:pPr>
+      <w:r>
+        <w:rPr>
+          <w:rFonts w:ascii="Courier New" w:hAnsi="Courier New"/>
+          <w:sz w:val="18"/>
+        </w:rPr>
+        <w:t xml:space="preserve"> </w:t>
+      </w:r>
+    </w:p>
+    <w:p>
+      <w:pPr>
+        <w:shd w:val="clear" w:color="auto" w:fill="F2F2F2"/>
+        <w:spacing w:after="0"/>
+        <w:ind w:left="288"/>
+      </w:pPr>
+      <w:r>
+        <w:rPr>
+          <w:rFonts w:ascii="Courier New" w:hAnsi="Courier New"/>
+          <w:sz w:val="18"/>
+        </w:rPr>
+        <w:t xml:space="preserve">In package </w:t>
+      </w:r>
+      <w:proofErr w:type="spellStart"/>
+      <w:proofErr w:type="gramStart"/>
+      <w:r>
+        <w:rPr>
+          <w:rFonts w:ascii="Courier New" w:hAnsi="Courier New"/>
+          <w:sz w:val="18"/>
+        </w:rPr>
+        <w:t>com.portfolio</w:t>
+      </w:r>
+      <w:proofErr w:type="gramEnd"/>
+      <w:r>
+        <w:rPr>
+          <w:rFonts w:ascii="Courier New" w:hAnsi="Courier New"/>
+          <w:sz w:val="18"/>
+        </w:rPr>
+        <w:t>.</w:t>
+      </w:r>
+      <w:proofErr w:type="gramStart"/>
+      <w:r>
+        <w:rPr>
+          <w:rFonts w:ascii="Courier New" w:hAnsi="Courier New"/>
+          <w:sz w:val="18"/>
+        </w:rPr>
+        <w:t>attribution.repository</w:t>
+      </w:r>
+      <w:proofErr w:type="spellEnd"/>
+      <w:proofErr w:type="gramEnd"/>
+      <w:r>
+        <w:rPr>
+          <w:rFonts w:ascii="Courier New" w:hAnsi="Courier New"/>
+          <w:sz w:val="18"/>
+        </w:rPr>
+        <w:t xml:space="preserve">, create </w:t>
+      </w:r>
+      <w:proofErr w:type="spellStart"/>
+      <w:r>
+        <w:rPr>
+          <w:rFonts w:ascii="Courier New" w:hAnsi="Courier New"/>
+          <w:sz w:val="18"/>
+        </w:rPr>
+        <w:t>AttributionAuditRepository</w:t>
+      </w:r>
+      <w:proofErr w:type="spellEnd"/>
+    </w:p>
+    <w:p>
+      <w:pPr>
+        <w:shd w:val="clear" w:color="auto" w:fill="F2F2F2"/>
+        <w:spacing w:after="0"/>
+        <w:ind w:left="288"/>
+      </w:pPr>
+      <w:r>
+        <w:rPr>
+          <w:rFonts w:ascii="Courier New" w:hAnsi="Courier New"/>
+          <w:sz w:val="18"/>
+        </w:rPr>
+        <w:t xml:space="preserve">extending </w:t>
+      </w:r>
+      <w:proofErr w:type="spellStart"/>
+      <w:r>
+        <w:rPr>
+          <w:rFonts w:ascii="Courier New" w:hAnsi="Courier New"/>
+          <w:sz w:val="18"/>
+        </w:rPr>
+        <w:t>JpaRepository</w:t>
+      </w:r>
+      <w:proofErr w:type="spellEnd"/>
+      <w:r>
+        <w:rPr>
+          <w:rFonts w:ascii="Courier New" w:hAnsi="Courier New"/>
+          <w:sz w:val="18"/>
+        </w:rPr>
+        <w:t>&lt;</w:t>
+      </w:r>
+      <w:proofErr w:type="spellStart"/>
+      <w:r>
+        <w:rPr>
+          <w:rFonts w:ascii="Courier New" w:hAnsi="Courier New"/>
+          <w:sz w:val="18"/>
+        </w:rPr>
+        <w:t>AttributionAudit</w:t>
+      </w:r>
+      <w:proofErr w:type="spellEnd"/>
+      <w:r>
+        <w:rPr>
+          <w:rFonts w:ascii="Courier New" w:hAnsi="Courier New"/>
+          <w:sz w:val="18"/>
+        </w:rPr>
+        <w:t>, Long&gt; with one custom query method:</w:t>
+      </w:r>
+    </w:p>
+    <w:p>
+      <w:pPr>
+        <w:shd w:val="clear" w:color="auto" w:fill="F2F2F2"/>
+        <w:spacing w:after="0"/>
+        <w:ind w:left="288"/>
+      </w:pPr>
+      <w:r>
+        <w:rPr>
+          <w:rFonts w:ascii="Courier New" w:hAnsi="Courier New"/>
+          <w:sz w:val="18"/>
+        </w:rPr>
+        <w:t>- Optional&lt;</w:t>
+      </w:r>
+      <w:proofErr w:type="spellStart"/>
+      <w:r>
+        <w:rPr>
+          <w:rFonts w:ascii="Courier New" w:hAnsi="Courier New"/>
+          <w:sz w:val="18"/>
+        </w:rPr>
+        <w:t>AttributionAudit</w:t>
+      </w:r>
+      <w:proofErr w:type="spellEnd"/>
+      <w:r>
+        <w:rPr>
+          <w:rFonts w:ascii="Courier New" w:hAnsi="Courier New"/>
+          <w:sz w:val="18"/>
+        </w:rPr>
+        <w:t xml:space="preserve">&gt; </w:t>
+      </w:r>
+      <w:proofErr w:type="spellStart"/>
+      <w:proofErr w:type="gramStart"/>
+      <w:r>
+        <w:rPr>
+          <w:rFonts w:ascii="Courier New" w:hAnsi="Courier New"/>
+          <w:sz w:val="18"/>
+        </w:rPr>
+        <w:t>findByRequestId</w:t>
+      </w:r>
+      <w:proofErr w:type="spellEnd"/>
+      <w:r>
+        <w:rPr>
+          <w:rFonts w:ascii="Courier New" w:hAnsi="Courier New"/>
+          <w:sz w:val="18"/>
+        </w:rPr>
+        <w:t>(</w:t>
+      </w:r>
+      <w:proofErr w:type="gramEnd"/>
+      <w:r>
+        <w:rPr>
+          <w:rFonts w:ascii="Courier New" w:hAnsi="Courier New"/>
+          <w:sz w:val="18"/>
+        </w:rPr>
+        <w:t xml:space="preserve">String </w:t>
+      </w:r>
+      <w:proofErr w:type="spellStart"/>
+      <w:r>
+        <w:rPr>
+          <w:rFonts w:ascii="Courier New" w:hAnsi="Courier New"/>
+          <w:sz w:val="18"/>
+        </w:rPr>
+        <w:t>requestId</w:t>
+      </w:r>
+      <w:proofErr w:type="spellEnd"/>
+      <w:r>
+        <w:rPr>
+          <w:rFonts w:ascii="Courier New" w:hAnsi="Courier New"/>
+          <w:sz w:val="18"/>
+        </w:rPr>
+        <w:t>)</w:t>
+      </w:r>
+    </w:p>
+    <w:p/>
+    <w:p>
+      <w:pPr>
+        <w:spacing w:before="120" w:after="40"/>
+      </w:pPr>
+      <w:r>
+        <w:rPr>
+          <w:rFonts w:ascii="Calibri" w:hAnsi="Calibri"/>
+          <w:b/>
+          <w:color w:val="1F497D"/>
+        </w:rPr>
+        <w:t>Validation Gate</w:t>
+      </w:r>
+    </w:p>
+    <w:p>
+      <w:pPr>
+        <w:pStyle w:val="ListBullet"/>
+        <w:tabs>
+          <w:tab w:val="num" w:pos="360"/>
+        </w:tabs>
+        <w:spacing w:after="40"/>
+        <w:ind w:left="360" w:hanging="360"/>
+      </w:pPr>
+      <w:r>
+        <w:rPr>
+          <w:rFonts w:ascii="Calibri" w:hAnsi="Calibri"/>
+          <w:sz w:val="21"/>
+        </w:rPr>
+        <w:t>Run `</w:t>
+      </w:r>
+      <w:proofErr w:type="spellStart"/>
+      <w:r>
+        <w:rPr>
+          <w:rFonts w:ascii="Calibri" w:hAnsi="Calibri"/>
+          <w:sz w:val="21"/>
+        </w:rPr>
+        <w:t>mvn</w:t>
+      </w:r>
+      <w:proofErr w:type="spellEnd"/>
+      <w:r>
+        <w:rPr>
+          <w:rFonts w:ascii="Calibri" w:hAnsi="Calibri"/>
+          <w:sz w:val="21"/>
+        </w:rPr>
+        <w:t xml:space="preserve"> </w:t>
+      </w:r>
+      <w:proofErr w:type="spellStart"/>
+      <w:r>
+        <w:rPr>
+          <w:rFonts w:ascii="Calibri" w:hAnsi="Calibri"/>
+          <w:sz w:val="21"/>
+        </w:rPr>
+        <w:t>spring-</w:t>
+      </w:r>
+      <w:proofErr w:type="gramStart"/>
+      <w:r>
+        <w:rPr>
+          <w:rFonts w:ascii="Calibri" w:hAnsi="Calibri"/>
+          <w:sz w:val="21"/>
+        </w:rPr>
+        <w:t>boot:run</w:t>
+      </w:r>
+      <w:proofErr w:type="spellEnd"/>
+      <w:proofErr w:type="gramEnd"/>
+      <w:r>
+        <w:rPr>
+          <w:rFonts w:ascii="Calibri" w:hAnsi="Calibri"/>
+          <w:sz w:val="21"/>
+        </w:rPr>
+        <w:t xml:space="preserve">` — H2 creates the </w:t>
+      </w:r>
+      <w:proofErr w:type="spellStart"/>
+      <w:r>
+        <w:rPr>
+          <w:rFonts w:ascii="Calibri" w:hAnsi="Calibri"/>
+          <w:sz w:val="21"/>
+        </w:rPr>
+        <w:t>attribution_audit</w:t>
+      </w:r>
+      <w:proofErr w:type="spellEnd"/>
+      <w:r>
+        <w:rPr>
+          <w:rFonts w:ascii="Calibri" w:hAnsi="Calibri"/>
+          <w:sz w:val="21"/>
+        </w:rPr>
+        <w:t xml:space="preserve"> table at startup (confirm in H2 console with SHOW TABLES)</w:t>
+      </w:r>
+    </w:p>
+    <w:p>
+      <w:pPr>
+        <w:pStyle w:val="ListBullet"/>
+        <w:tabs>
+          <w:tab w:val="num" w:pos="360"/>
+        </w:tabs>
+        <w:spacing w:after="40"/>
+        <w:ind w:left="360" w:hanging="360"/>
+      </w:pPr>
+      <w:r>
+        <w:rPr>
+          <w:rFonts w:ascii="Calibri" w:hAnsi="Calibri"/>
+          <w:sz w:val="21"/>
+        </w:rPr>
+        <w:t>Run `</w:t>
+      </w:r>
+      <w:proofErr w:type="spellStart"/>
+      <w:r>
+        <w:rPr>
+          <w:rFonts w:ascii="Calibri" w:hAnsi="Calibri"/>
+          <w:sz w:val="21"/>
+        </w:rPr>
+        <w:t>mvn</w:t>
+      </w:r>
+      <w:proofErr w:type="spellEnd"/>
+      <w:r>
+        <w:rPr>
+          <w:rFonts w:ascii="Calibri" w:hAnsi="Calibri"/>
+          <w:sz w:val="21"/>
+        </w:rPr>
+        <w:t xml:space="preserve"> test` — all existing tests still pass</w:t>
+      </w:r>
+    </w:p>
+    <w:p>
+      <w:pPr>
+        <w:pStyle w:val="ListBullet"/>
+        <w:tabs>
+          <w:tab w:val="num" w:pos="360"/>
+        </w:tabs>
+        <w:spacing w:after="40"/>
+        <w:ind w:left="360" w:hanging="360"/>
+      </w:pPr>
+      <w:r>
+        <w:rPr>
+          <w:rFonts w:ascii="Calibri" w:hAnsi="Calibri"/>
+          <w:sz w:val="21"/>
+        </w:rPr>
+        <w:t xml:space="preserve">Write a @DataJpaTest slice test that saves an </w:t>
+      </w:r>
+      <w:proofErr w:type="spellStart"/>
+      <w:r>
+        <w:rPr>
+          <w:rFonts w:ascii="Calibri" w:hAnsi="Calibri"/>
+          <w:sz w:val="21"/>
+        </w:rPr>
+        <w:t>AttributionAudit</w:t>
+      </w:r>
+      <w:proofErr w:type="spellEnd"/>
+      <w:r>
+        <w:rPr>
+          <w:rFonts w:ascii="Calibri" w:hAnsi="Calibri"/>
+          <w:sz w:val="21"/>
+        </w:rPr>
+        <w:t xml:space="preserve"> record and retrieves it by </w:t>
+      </w:r>
+      <w:proofErr w:type="spellStart"/>
+      <w:r>
+        <w:rPr>
+          <w:rFonts w:ascii="Calibri" w:hAnsi="Calibri"/>
+          <w:sz w:val="21"/>
+        </w:rPr>
+        <w:t>requestId</w:t>
+      </w:r>
+      <w:proofErr w:type="spellEnd"/>
+      <w:r>
+        <w:rPr>
+          <w:rFonts w:ascii="Calibri" w:hAnsi="Calibri"/>
+          <w:sz w:val="21"/>
+        </w:rPr>
+        <w:t xml:space="preserve">, asserting the returned Optional is non-empty and </w:t>
+      </w:r>
+      <w:proofErr w:type="spellStart"/>
+      <w:r>
+        <w:rPr>
+          <w:rFonts w:ascii="Calibri" w:hAnsi="Calibri"/>
+          <w:sz w:val="21"/>
+        </w:rPr>
+        <w:t>portfolioId</w:t>
+      </w:r>
+      <w:proofErr w:type="spellEnd"/>
+      <w:r>
+        <w:rPr>
+          <w:rFonts w:ascii="Calibri" w:hAnsi="Calibri"/>
+          <w:sz w:val="21"/>
+        </w:rPr>
+        <w:t xml:space="preserve"> matches</w:t>
+      </w:r>
+    </w:p>
+    <w:p>
+      <w:pPr>
         <w:rPr>
           <w:b/>
           <w:bCs/>
         </w:rPr>
       </w:pPr>
+      <w:r>
+        <w:rPr>
+          <w:color w:val="CCCCCC"/>
+          <w:sz w:val="16"/>
+        </w:rPr>
+        <w:t>─────────────────────────────────────────────────────────────────────────────────────────</w:t>
+      </w:r>
     </w:p>
     <w:sectPr>
       <w:pgSz w:w="11906" w:h="16838"/>

</xml_diff>

<commit_message>
FDE-2: Add Input Validation Logic (Weight Gate) and its test
</commit_message>
<xml_diff>
--- a/Prompts-FDE- 2.docx
+++ b/Prompts-FDE- 2.docx
@@ -3458,17 +3458,713 @@
     <w:p>
       <w:pPr>
         <w:rPr>
+          <w:color w:val="CCCCCC"/>
+          <w:sz w:val="16"/>
+        </w:rPr>
+      </w:pPr>
+      <w:r>
+        <w:rPr>
+          <w:color w:val="CCCCCC"/>
+          <w:sz w:val="16"/>
+        </w:rPr>
+        <w:t>─────────────────────────────────────────────────────────────────────────────────────────</w:t>
+      </w:r>
+    </w:p>
+    <w:p>
+      <w:pPr>
+        <w:spacing w:before="280" w:after="80"/>
+      </w:pPr>
+      <w:r>
+        <w:rPr>
+          <w:rFonts w:ascii="Calibri" w:hAnsi="Calibri"/>
+          <w:b/>
+          <w:color w:val="2E74B5"/>
+          <w:sz w:val="28"/>
+        </w:rPr>
+        <w:t xml:space="preserve">STEP </w:t>
+      </w:r>
+      <w:proofErr w:type="gramStart"/>
+      <w:r>
+        <w:rPr>
+          <w:rFonts w:ascii="Calibri" w:hAnsi="Calibri"/>
+          <w:b/>
+          <w:color w:val="2E74B5"/>
+          <w:sz w:val="28"/>
+        </w:rPr>
+        <w:t>5</w:t>
+      </w:r>
+      <w:r>
+        <w:rPr>
+          <w:rFonts w:ascii="Calibri" w:hAnsi="Calibri"/>
+          <w:b/>
+          <w:color w:val="2E74B5"/>
+          <w:sz w:val="28"/>
+        </w:rPr>
+        <w:t xml:space="preserve">  —</w:t>
+      </w:r>
+      <w:proofErr w:type="gramEnd"/>
+      <w:r>
+        <w:rPr>
+          <w:rFonts w:ascii="Calibri" w:hAnsi="Calibri"/>
+          <w:b/>
+          <w:color w:val="2E74B5"/>
+          <w:sz w:val="28"/>
+        </w:rPr>
+        <w:t xml:space="preserve">  Input Validation Logic (Weight Gate)</w:t>
+      </w:r>
+    </w:p>
+    <w:p>
+      <w:pPr>
+        <w:spacing w:after="60"/>
+      </w:pPr>
+      <w:r>
+        <w:rPr>
+          <w:rFonts w:ascii="Calibri" w:hAnsi="Calibri"/>
+          <w:b/>
+          <w:color w:val="2E74B5"/>
+        </w:rPr>
+        <w:t xml:space="preserve">Depends on: </w:t>
+      </w:r>
+      <w:r>
+        <w:rPr>
+          <w:rFonts w:ascii="Calibri" w:hAnsi="Calibri"/>
+        </w:rPr>
+        <w:t xml:space="preserve">Step </w:t>
+      </w:r>
+      <w:r>
+        <w:rPr>
+          <w:rFonts w:ascii="Calibri" w:hAnsi="Calibri"/>
+        </w:rPr>
+        <w:t>4</w:t>
+      </w:r>
+    </w:p>
+    <w:p>
+      <w:pPr>
+        <w:shd w:val="clear" w:color="auto" w:fill="F2F2F2"/>
+        <w:spacing w:after="0"/>
+        <w:ind w:left="288"/>
+      </w:pPr>
+      <w:r>
+        <w:rPr>
+          <w:rFonts w:ascii="Courier New" w:hAnsi="Courier New"/>
+          <w:sz w:val="18"/>
+        </w:rPr>
+        <w:t xml:space="preserve">In package </w:t>
+      </w:r>
+      <w:proofErr w:type="spellStart"/>
+      <w:proofErr w:type="gramStart"/>
+      <w:r>
+        <w:rPr>
+          <w:rFonts w:ascii="Courier New" w:hAnsi="Courier New"/>
+          <w:sz w:val="18"/>
+        </w:rPr>
+        <w:t>com.portfolio</w:t>
+      </w:r>
+      <w:proofErr w:type="gramEnd"/>
+      <w:r>
+        <w:rPr>
+          <w:rFonts w:ascii="Courier New" w:hAnsi="Courier New"/>
+          <w:sz w:val="18"/>
+        </w:rPr>
+        <w:t>.</w:t>
+      </w:r>
+      <w:proofErr w:type="gramStart"/>
+      <w:r>
+        <w:rPr>
+          <w:rFonts w:ascii="Courier New" w:hAnsi="Courier New"/>
+          <w:sz w:val="18"/>
+        </w:rPr>
+        <w:t>attribution.service</w:t>
+      </w:r>
+      <w:proofErr w:type="spellEnd"/>
+      <w:proofErr w:type="gramEnd"/>
+      <w:r>
+        <w:rPr>
+          <w:rFonts w:ascii="Courier New" w:hAnsi="Courier New"/>
+          <w:sz w:val="18"/>
+        </w:rPr>
+        <w:t xml:space="preserve">, create a class </w:t>
+      </w:r>
+      <w:proofErr w:type="spellStart"/>
+      <w:r>
+        <w:rPr>
+          <w:rFonts w:ascii="Courier New" w:hAnsi="Courier New"/>
+          <w:sz w:val="18"/>
+        </w:rPr>
+        <w:t>AttributionValidator</w:t>
+      </w:r>
+      <w:proofErr w:type="spellEnd"/>
+    </w:p>
+    <w:p>
+      <w:pPr>
+        <w:shd w:val="clear" w:color="auto" w:fill="F2F2F2"/>
+        <w:spacing w:after="0"/>
+        <w:ind w:left="288"/>
+      </w:pPr>
+      <w:r>
+        <w:rPr>
+          <w:rFonts w:ascii="Courier New" w:hAnsi="Courier New"/>
+          <w:sz w:val="18"/>
+        </w:rPr>
+        <w:t>with a single public method:</w:t>
+      </w:r>
+    </w:p>
+    <w:p>
+      <w:pPr>
+        <w:shd w:val="clear" w:color="auto" w:fill="F2F2F2"/>
+        <w:spacing w:after="0"/>
+        <w:ind w:left="288"/>
+      </w:pPr>
+      <w:r>
+        <w:rPr>
+          <w:rFonts w:ascii="Courier New" w:hAnsi="Courier New"/>
+          <w:sz w:val="18"/>
+        </w:rPr>
+        <w:t xml:space="preserve"> </w:t>
+      </w:r>
+    </w:p>
+    <w:p>
+      <w:pPr>
+        <w:shd w:val="clear" w:color="auto" w:fill="F2F2F2"/>
+        <w:spacing w:after="0"/>
+        <w:ind w:left="288"/>
+      </w:pPr>
+      <w:r>
+        <w:rPr>
+          <w:rFonts w:ascii="Courier New" w:hAnsi="Courier New"/>
+          <w:sz w:val="18"/>
+        </w:rPr>
+        <w:t xml:space="preserve">  void </w:t>
+      </w:r>
+      <w:proofErr w:type="spellStart"/>
+      <w:proofErr w:type="gramStart"/>
+      <w:r>
+        <w:rPr>
+          <w:rFonts w:ascii="Courier New" w:hAnsi="Courier New"/>
+          <w:sz w:val="18"/>
+        </w:rPr>
+        <w:t>validateWeights</w:t>
+      </w:r>
+      <w:proofErr w:type="spellEnd"/>
+      <w:r>
+        <w:rPr>
+          <w:rFonts w:ascii="Courier New" w:hAnsi="Courier New"/>
+          <w:sz w:val="18"/>
+        </w:rPr>
+        <w:t>(</w:t>
+      </w:r>
+      <w:proofErr w:type="gramEnd"/>
+      <w:r>
+        <w:rPr>
+          <w:rFonts w:ascii="Courier New" w:hAnsi="Courier New"/>
+          <w:sz w:val="18"/>
+        </w:rPr>
+        <w:t>List&lt;</w:t>
+      </w:r>
+      <w:proofErr w:type="spellStart"/>
+      <w:r>
+        <w:rPr>
+          <w:rFonts w:ascii="Courier New" w:hAnsi="Courier New"/>
+          <w:sz w:val="18"/>
+        </w:rPr>
+        <w:t>GroupInput</w:t>
+      </w:r>
+      <w:proofErr w:type="spellEnd"/>
+      <w:r>
+        <w:rPr>
+          <w:rFonts w:ascii="Courier New" w:hAnsi="Courier New"/>
+          <w:sz w:val="18"/>
+        </w:rPr>
+        <w:t>&gt; groups)</w:t>
+      </w:r>
+    </w:p>
+    <w:p>
+      <w:pPr>
+        <w:shd w:val="clear" w:color="auto" w:fill="F2F2F2"/>
+        <w:spacing w:after="0"/>
+        <w:ind w:left="288"/>
+      </w:pPr>
+      <w:r>
+        <w:rPr>
+          <w:rFonts w:ascii="Courier New" w:hAnsi="Courier New"/>
+          <w:sz w:val="18"/>
+        </w:rPr>
+        <w:t xml:space="preserve"> </w:t>
+      </w:r>
+    </w:p>
+    <w:p>
+      <w:pPr>
+        <w:shd w:val="clear" w:color="auto" w:fill="F2F2F2"/>
+        <w:spacing w:after="0"/>
+        <w:ind w:left="288"/>
+      </w:pPr>
+      <w:r>
+        <w:rPr>
+          <w:rFonts w:ascii="Courier New" w:hAnsi="Courier New"/>
+          <w:sz w:val="18"/>
+        </w:rPr>
+        <w:t>Rules:</w:t>
+      </w:r>
+    </w:p>
+    <w:p>
+      <w:pPr>
+        <w:shd w:val="clear" w:color="auto" w:fill="F2F2F2"/>
+        <w:spacing w:after="0"/>
+        <w:ind w:left="288"/>
+      </w:pPr>
+      <w:r>
+        <w:rPr>
+          <w:rFonts w:ascii="Courier New" w:hAnsi="Courier New"/>
+          <w:sz w:val="18"/>
+        </w:rPr>
+        <w:t xml:space="preserve">- Sum the </w:t>
+      </w:r>
+      <w:proofErr w:type="spellStart"/>
+      <w:r>
+        <w:rPr>
+          <w:rFonts w:ascii="Courier New" w:hAnsi="Courier New"/>
+          <w:sz w:val="18"/>
+        </w:rPr>
+        <w:t>weightPct</w:t>
+      </w:r>
+      <w:proofErr w:type="spellEnd"/>
+      <w:r>
+        <w:rPr>
+          <w:rFonts w:ascii="Courier New" w:hAnsi="Courier New"/>
+          <w:sz w:val="18"/>
+        </w:rPr>
+        <w:t xml:space="preserve"> of all groups using </w:t>
+      </w:r>
+      <w:proofErr w:type="spellStart"/>
+      <w:r>
+        <w:rPr>
+          <w:rFonts w:ascii="Courier New" w:hAnsi="Courier New"/>
+          <w:sz w:val="18"/>
+        </w:rPr>
+        <w:t>BigDecimal</w:t>
+      </w:r>
+      <w:proofErr w:type="spellEnd"/>
+      <w:r>
+        <w:rPr>
+          <w:rFonts w:ascii="Courier New" w:hAnsi="Courier New"/>
+          <w:sz w:val="18"/>
+        </w:rPr>
+        <w:t xml:space="preserve"> arithmetic (never double)</w:t>
+      </w:r>
+    </w:p>
+    <w:p>
+      <w:pPr>
+        <w:shd w:val="clear" w:color="auto" w:fill="F2F2F2"/>
+        <w:spacing w:after="0"/>
+        <w:ind w:left="288"/>
+      </w:pPr>
+      <w:r>
+        <w:rPr>
+          <w:rFonts w:ascii="Courier New" w:hAnsi="Courier New"/>
+          <w:sz w:val="18"/>
+        </w:rPr>
+        <w:t>- If the total is less than 99.00 or greater than 101.00, throw a custom</w:t>
+      </w:r>
+    </w:p>
+    <w:p>
+      <w:pPr>
+        <w:shd w:val="clear" w:color="auto" w:fill="F2F2F2"/>
+        <w:spacing w:after="0"/>
+        <w:ind w:left="288"/>
+      </w:pPr>
+      <w:r>
+        <w:rPr>
+          <w:rFonts w:ascii="Courier New" w:hAnsi="Courier New"/>
+          <w:sz w:val="18"/>
+        </w:rPr>
+        <w:t xml:space="preserve">  </w:t>
+      </w:r>
+      <w:proofErr w:type="spellStart"/>
+      <w:r>
+        <w:rPr>
+          <w:rFonts w:ascii="Courier New" w:hAnsi="Courier New"/>
+          <w:sz w:val="18"/>
+        </w:rPr>
+        <w:t>InvalidAttributionInputException</w:t>
+      </w:r>
+      <w:proofErr w:type="spellEnd"/>
+      <w:r>
+        <w:rPr>
+          <w:rFonts w:ascii="Courier New" w:hAnsi="Courier New"/>
+          <w:sz w:val="18"/>
+        </w:rPr>
+        <w:t xml:space="preserve"> (unchecked) with a descriptive message</w:t>
+      </w:r>
+    </w:p>
+    <w:p>
+      <w:pPr>
+        <w:shd w:val="clear" w:color="auto" w:fill="F2F2F2"/>
+        <w:spacing w:after="0"/>
+        <w:ind w:left="288"/>
+      </w:pPr>
+      <w:r>
+        <w:rPr>
+          <w:rFonts w:ascii="Courier New" w:hAnsi="Courier New"/>
+          <w:sz w:val="18"/>
+        </w:rPr>
+        <w:t xml:space="preserve">  that includes the actual total weight, e.g.:</w:t>
+      </w:r>
+    </w:p>
+    <w:p>
+      <w:pPr>
+        <w:shd w:val="clear" w:color="auto" w:fill="F2F2F2"/>
+        <w:spacing w:after="0"/>
+        <w:ind w:left="288"/>
+      </w:pPr>
+      <w:r>
+        <w:rPr>
+          <w:rFonts w:ascii="Courier New" w:hAnsi="Courier New"/>
+          <w:sz w:val="18"/>
+        </w:rPr>
+        <w:t xml:space="preserve">  "Total weight 95.00% is outside the allowed range of 99-101%"</w:t>
+      </w:r>
+    </w:p>
+    <w:p>
+      <w:pPr>
+        <w:shd w:val="clear" w:color="auto" w:fill="F2F2F2"/>
+        <w:spacing w:after="0"/>
+        <w:ind w:left="288"/>
+      </w:pPr>
+      <w:r>
+        <w:rPr>
+          <w:rFonts w:ascii="Courier New" w:hAnsi="Courier New"/>
+          <w:sz w:val="18"/>
+        </w:rPr>
+        <w:t xml:space="preserve"> </w:t>
+      </w:r>
+    </w:p>
+    <w:p>
+      <w:pPr>
+        <w:shd w:val="clear" w:color="auto" w:fill="F2F2F2"/>
+        <w:spacing w:after="0"/>
+        <w:ind w:left="288"/>
+      </w:pPr>
+      <w:r>
+        <w:rPr>
+          <w:rFonts w:ascii="Courier New" w:hAnsi="Courier New"/>
+          <w:sz w:val="18"/>
+        </w:rPr>
+        <w:t xml:space="preserve">Create the </w:t>
+      </w:r>
+      <w:proofErr w:type="spellStart"/>
+      <w:r>
+        <w:rPr>
+          <w:rFonts w:ascii="Courier New" w:hAnsi="Courier New"/>
+          <w:sz w:val="18"/>
+        </w:rPr>
+        <w:t>InvalidAttributionInputException</w:t>
+      </w:r>
+      <w:proofErr w:type="spellEnd"/>
+      <w:r>
+        <w:rPr>
+          <w:rFonts w:ascii="Courier New" w:hAnsi="Courier New"/>
+          <w:sz w:val="18"/>
+        </w:rPr>
+        <w:t xml:space="preserve"> in package</w:t>
+      </w:r>
+    </w:p>
+    <w:p>
+      <w:pPr>
+        <w:shd w:val="clear" w:color="auto" w:fill="F2F2F2"/>
+        <w:spacing w:after="0"/>
+        <w:ind w:left="288"/>
+      </w:pPr>
+      <w:proofErr w:type="spellStart"/>
+      <w:proofErr w:type="gramStart"/>
+      <w:r>
+        <w:rPr>
+          <w:rFonts w:ascii="Courier New" w:hAnsi="Courier New"/>
+          <w:sz w:val="18"/>
+        </w:rPr>
+        <w:t>com.portfolio</w:t>
+      </w:r>
+      <w:proofErr w:type="gramEnd"/>
+      <w:r>
+        <w:rPr>
+          <w:rFonts w:ascii="Courier New" w:hAnsi="Courier New"/>
+          <w:sz w:val="18"/>
+        </w:rPr>
+        <w:t>.</w:t>
+      </w:r>
+      <w:proofErr w:type="gramStart"/>
+      <w:r>
+        <w:rPr>
+          <w:rFonts w:ascii="Courier New" w:hAnsi="Courier New"/>
+          <w:sz w:val="18"/>
+        </w:rPr>
+        <w:t>attribution.exception</w:t>
+      </w:r>
+      <w:proofErr w:type="spellEnd"/>
+      <w:proofErr w:type="gramEnd"/>
+      <w:r>
+        <w:rPr>
+          <w:rFonts w:ascii="Courier New" w:hAnsi="Courier New"/>
+          <w:sz w:val="18"/>
+        </w:rPr>
+        <w:t xml:space="preserve">. It should extend </w:t>
+      </w:r>
+      <w:proofErr w:type="spellStart"/>
+      <w:r>
+        <w:rPr>
+          <w:rFonts w:ascii="Courier New" w:hAnsi="Courier New"/>
+          <w:sz w:val="18"/>
+        </w:rPr>
+        <w:t>RuntimeException</w:t>
+      </w:r>
+      <w:proofErr w:type="spellEnd"/>
+      <w:r>
+        <w:rPr>
+          <w:rFonts w:ascii="Courier New" w:hAnsi="Courier New"/>
+          <w:sz w:val="18"/>
+        </w:rPr>
+        <w:t xml:space="preserve"> and</w:t>
+      </w:r>
+    </w:p>
+    <w:p>
+      <w:pPr>
+        <w:shd w:val="clear" w:color="auto" w:fill="F2F2F2"/>
+        <w:spacing w:after="0"/>
+        <w:ind w:left="288"/>
+      </w:pPr>
+      <w:r>
+        <w:rPr>
+          <w:rFonts w:ascii="Courier New" w:hAnsi="Courier New"/>
+          <w:sz w:val="18"/>
+        </w:rPr>
+        <w:t>accept a String message.</w:t>
+      </w:r>
+    </w:p>
+    <w:p>
+      <w:pPr>
+        <w:shd w:val="clear" w:color="auto" w:fill="F2F2F2"/>
+        <w:spacing w:after="0"/>
+        <w:ind w:left="288"/>
+      </w:pPr>
+      <w:r>
+        <w:rPr>
+          <w:rFonts w:ascii="Courier New" w:hAnsi="Courier New"/>
+          <w:sz w:val="18"/>
+        </w:rPr>
+        <w:t xml:space="preserve"> </w:t>
+      </w:r>
+    </w:p>
+    <w:p>
+      <w:pPr>
+        <w:shd w:val="clear" w:color="auto" w:fill="F2F2F2"/>
+        <w:spacing w:after="0"/>
+        <w:ind w:left="288"/>
+      </w:pPr>
+      <w:r>
+        <w:rPr>
+          <w:rFonts w:ascii="Courier New" w:hAnsi="Courier New"/>
+          <w:sz w:val="18"/>
+        </w:rPr>
+        <w:t xml:space="preserve">Do not use Spring annotations on </w:t>
+      </w:r>
+      <w:proofErr w:type="spellStart"/>
+      <w:r>
+        <w:rPr>
+          <w:rFonts w:ascii="Courier New" w:hAnsi="Courier New"/>
+          <w:sz w:val="18"/>
+        </w:rPr>
+        <w:t>AttributionValidator</w:t>
+      </w:r>
+      <w:proofErr w:type="spellEnd"/>
+      <w:r>
+        <w:rPr>
+          <w:rFonts w:ascii="Courier New" w:hAnsi="Courier New"/>
+          <w:sz w:val="18"/>
+        </w:rPr>
+        <w:t xml:space="preserve"> yet; keep it a plain</w:t>
+      </w:r>
+    </w:p>
+    <w:p>
+      <w:pPr>
+        <w:shd w:val="clear" w:color="auto" w:fill="F2F2F2"/>
+        <w:spacing w:after="0"/>
+        <w:ind w:left="288"/>
+      </w:pPr>
+      <w:r>
+        <w:rPr>
+          <w:rFonts w:ascii="Courier New" w:hAnsi="Courier New"/>
+          <w:sz w:val="18"/>
+        </w:rPr>
+        <w:t>POJO so it can be unit tested without a Spring context.</w:t>
+      </w:r>
+    </w:p>
+    <w:p/>
+    <w:p>
+      <w:pPr>
+        <w:spacing w:before="120" w:after="40"/>
+      </w:pPr>
+      <w:r>
+        <w:rPr>
+          <w:rFonts w:ascii="Calibri" w:hAnsi="Calibri"/>
+          <w:b/>
+          <w:color w:val="1F497D"/>
+        </w:rPr>
+        <w:t>Validation Gate</w:t>
+      </w:r>
+    </w:p>
+    <w:p>
+      <w:pPr>
+        <w:pStyle w:val="ListBullet"/>
+        <w:tabs>
+          <w:tab w:val="num" w:pos="360"/>
+        </w:tabs>
+        <w:spacing w:after="40"/>
+        <w:ind w:left="360" w:hanging="360"/>
+      </w:pPr>
+      <w:r>
+        <w:rPr>
+          <w:rFonts w:ascii="Calibri" w:hAnsi="Calibri"/>
+          <w:sz w:val="21"/>
+        </w:rPr>
+        <w:t>Valid: weights summing to exactly 100 — no exception thrown</w:t>
+      </w:r>
+    </w:p>
+    <w:p>
+      <w:pPr>
+        <w:pStyle w:val="ListBullet"/>
+        <w:tabs>
+          <w:tab w:val="num" w:pos="360"/>
+        </w:tabs>
+        <w:spacing w:after="40"/>
+        <w:ind w:left="360" w:hanging="360"/>
+      </w:pPr>
+      <w:r>
+        <w:rPr>
+          <w:rFonts w:ascii="Calibri" w:hAnsi="Calibri"/>
+          <w:sz w:val="21"/>
+        </w:rPr>
+        <w:t>Valid boundary low: weights summing to 99.00 — no exception thrown</w:t>
+      </w:r>
+    </w:p>
+    <w:p>
+      <w:pPr>
+        <w:pStyle w:val="ListBullet"/>
+        <w:tabs>
+          <w:tab w:val="num" w:pos="360"/>
+        </w:tabs>
+        <w:spacing w:after="40"/>
+        <w:ind w:left="360" w:hanging="360"/>
+      </w:pPr>
+      <w:r>
+        <w:rPr>
+          <w:rFonts w:ascii="Calibri" w:hAnsi="Calibri"/>
+          <w:sz w:val="21"/>
+        </w:rPr>
+        <w:t>Valid boundary high: weights summing to 101.00 — no exception thrown</w:t>
+      </w:r>
+    </w:p>
+    <w:p>
+      <w:pPr>
+        <w:pStyle w:val="ListBullet"/>
+        <w:tabs>
+          <w:tab w:val="num" w:pos="360"/>
+        </w:tabs>
+        <w:spacing w:after="40"/>
+        <w:ind w:left="360" w:hanging="360"/>
+      </w:pPr>
+      <w:r>
+        <w:rPr>
+          <w:rFonts w:ascii="Calibri" w:hAnsi="Calibri"/>
+          <w:sz w:val="21"/>
+        </w:rPr>
+        <w:t xml:space="preserve">Invalid low: weights summing to 95.00 — </w:t>
+      </w:r>
+      <w:proofErr w:type="spellStart"/>
+      <w:r>
+        <w:rPr>
+          <w:rFonts w:ascii="Calibri" w:hAnsi="Calibri"/>
+          <w:sz w:val="21"/>
+        </w:rPr>
+        <w:t>InvalidAttributionInputException</w:t>
+      </w:r>
+      <w:proofErr w:type="spellEnd"/>
+      <w:r>
+        <w:rPr>
+          <w:rFonts w:ascii="Calibri" w:hAnsi="Calibri"/>
+          <w:sz w:val="21"/>
+        </w:rPr>
+        <w:t xml:space="preserve"> thrown, message contains '95.00'</w:t>
+      </w:r>
+    </w:p>
+    <w:p>
+      <w:pPr>
+        <w:pStyle w:val="ListBullet"/>
+        <w:tabs>
+          <w:tab w:val="num" w:pos="360"/>
+        </w:tabs>
+        <w:spacing w:after="40"/>
+        <w:ind w:left="360" w:hanging="360"/>
+      </w:pPr>
+      <w:r>
+        <w:rPr>
+          <w:rFonts w:ascii="Calibri" w:hAnsi="Calibri"/>
+          <w:sz w:val="21"/>
+        </w:rPr>
+        <w:t>Invalid high: weights summing to 102.00 — exception thrown</w:t>
+      </w:r>
+    </w:p>
+    <w:p>
+      <w:pPr>
+        <w:pStyle w:val="ListBullet"/>
+        <w:tabs>
+          <w:tab w:val="num" w:pos="360"/>
+        </w:tabs>
+        <w:spacing w:after="40"/>
+        <w:ind w:left="360" w:hanging="360"/>
+      </w:pPr>
+      <w:r>
+        <w:rPr>
+          <w:rFonts w:ascii="Calibri" w:hAnsi="Calibri"/>
+          <w:sz w:val="21"/>
+        </w:rPr>
+        <w:lastRenderedPageBreak/>
+        <w:t>Run `</w:t>
+      </w:r>
+      <w:proofErr w:type="spellStart"/>
+      <w:r>
+        <w:rPr>
+          <w:rFonts w:ascii="Calibri" w:hAnsi="Calibri"/>
+          <w:sz w:val="21"/>
+        </w:rPr>
+        <w:t>mvn</w:t>
+      </w:r>
+      <w:proofErr w:type="spellEnd"/>
+      <w:r>
+        <w:rPr>
+          <w:rFonts w:ascii="Calibri" w:hAnsi="Calibri"/>
+          <w:sz w:val="21"/>
+        </w:rPr>
+        <w:t xml:space="preserve"> test` — all five tests pass</w:t>
+      </w:r>
+    </w:p>
+    <w:p>
+      <w:pPr>
+        <w:spacing w:before="40" w:after="40"/>
+      </w:pPr>
+      <w:r>
+        <w:rPr>
+          <w:color w:val="CCCCCC"/>
+          <w:sz w:val="16"/>
+        </w:rPr>
+        <w:t>──────────────────────────────────────────────────────────────────────────────────────────</w:t>
+      </w:r>
+    </w:p>
+    <w:p>
+      <w:pPr>
+        <w:rPr>
           <w:b/>
           <w:bCs/>
         </w:rPr>
       </w:pPr>
-      <w:r>
-        <w:rPr>
-          <w:color w:val="CCCCCC"/>
-          <w:sz w:val="16"/>
-        </w:rPr>
-        <w:t>─────────────────────────────────────────────────────────────────────────────────────────</w:t>
-      </w:r>
     </w:p>
     <w:sectPr>
       <w:pgSz w:w="11906" w:h="16838"/>

</xml_diff>

<commit_message>
FDE-2: Add Attribution Calculation & Fallback Logic and its test
</commit_message>
<xml_diff>
--- a/Prompts-FDE- 2.docx
+++ b/Prompts-FDE- 2.docx
@@ -4144,6 +4144,1292 @@
           <w:sz w:val="21"/>
         </w:rPr>
         <w:t xml:space="preserve"> test` — all five tests pass</w:t>
+      </w:r>
+    </w:p>
+    <w:p>
+      <w:pPr>
+        <w:spacing w:before="40" w:after="40"/>
+      </w:pPr>
+      <w:r>
+        <w:rPr>
+          <w:color w:val="CCCCCC"/>
+          <w:sz w:val="16"/>
+        </w:rPr>
+        <w:t>──────────────────────────────────────────────────────────────────────────────────────────</w:t>
+      </w:r>
+    </w:p>
+    <w:p>
+      <w:pPr>
+        <w:spacing w:before="280" w:after="80"/>
+      </w:pPr>
+      <w:r>
+        <w:rPr>
+          <w:rFonts w:ascii="Calibri" w:hAnsi="Calibri"/>
+          <w:b/>
+          <w:color w:val="2E74B5"/>
+          <w:sz w:val="28"/>
+        </w:rPr>
+        <w:t xml:space="preserve">STEP </w:t>
+      </w:r>
+      <w:proofErr w:type="gramStart"/>
+      <w:r>
+        <w:rPr>
+          <w:rFonts w:ascii="Calibri" w:hAnsi="Calibri"/>
+          <w:b/>
+          <w:color w:val="2E74B5"/>
+          <w:sz w:val="28"/>
+        </w:rPr>
+        <w:t>6</w:t>
+      </w:r>
+      <w:r>
+        <w:rPr>
+          <w:rFonts w:ascii="Calibri" w:hAnsi="Calibri"/>
+          <w:b/>
+          <w:color w:val="2E74B5"/>
+          <w:sz w:val="28"/>
+        </w:rPr>
+        <w:t xml:space="preserve">  —</w:t>
+      </w:r>
+      <w:proofErr w:type="gramEnd"/>
+      <w:r>
+        <w:rPr>
+          <w:rFonts w:ascii="Calibri" w:hAnsi="Calibri"/>
+          <w:b/>
+          <w:color w:val="2E74B5"/>
+          <w:sz w:val="28"/>
+        </w:rPr>
+        <w:t xml:space="preserve">  Attribution Calculation &amp; Fallback Logic</w:t>
+      </w:r>
+    </w:p>
+    <w:p>
+      <w:pPr>
+        <w:spacing w:after="60"/>
+      </w:pPr>
+      <w:r>
+        <w:rPr>
+          <w:rFonts w:ascii="Calibri" w:hAnsi="Calibri"/>
+          <w:b/>
+          <w:color w:val="2E74B5"/>
+        </w:rPr>
+        <w:t xml:space="preserve">Depends on: </w:t>
+      </w:r>
+      <w:r>
+        <w:rPr>
+          <w:rFonts w:ascii="Calibri" w:hAnsi="Calibri"/>
+        </w:rPr>
+        <w:t xml:space="preserve">Step </w:t>
+      </w:r>
+      <w:r>
+        <w:rPr>
+          <w:rFonts w:ascii="Calibri" w:hAnsi="Calibri"/>
+        </w:rPr>
+        <w:t>5</w:t>
+      </w:r>
+    </w:p>
+    <w:p>
+      <w:pPr>
+        <w:shd w:val="clear" w:color="auto" w:fill="F2F2F2"/>
+        <w:spacing w:after="0"/>
+        <w:ind w:left="288"/>
+      </w:pPr>
+      <w:r>
+        <w:rPr>
+          <w:rFonts w:ascii="Courier New" w:hAnsi="Courier New"/>
+          <w:sz w:val="18"/>
+        </w:rPr>
+        <w:t xml:space="preserve">In package </w:t>
+      </w:r>
+      <w:proofErr w:type="spellStart"/>
+      <w:proofErr w:type="gramStart"/>
+      <w:r>
+        <w:rPr>
+          <w:rFonts w:ascii="Courier New" w:hAnsi="Courier New"/>
+          <w:sz w:val="18"/>
+        </w:rPr>
+        <w:t>com.portfolio</w:t>
+      </w:r>
+      <w:proofErr w:type="gramEnd"/>
+      <w:r>
+        <w:rPr>
+          <w:rFonts w:ascii="Courier New" w:hAnsi="Courier New"/>
+          <w:sz w:val="18"/>
+        </w:rPr>
+        <w:t>.</w:t>
+      </w:r>
+      <w:proofErr w:type="gramStart"/>
+      <w:r>
+        <w:rPr>
+          <w:rFonts w:ascii="Courier New" w:hAnsi="Courier New"/>
+          <w:sz w:val="18"/>
+        </w:rPr>
+        <w:t>attribution.service</w:t>
+      </w:r>
+      <w:proofErr w:type="spellEnd"/>
+      <w:proofErr w:type="gramEnd"/>
+      <w:r>
+        <w:rPr>
+          <w:rFonts w:ascii="Courier New" w:hAnsi="Courier New"/>
+          <w:sz w:val="18"/>
+        </w:rPr>
+        <w:t xml:space="preserve">, create a class </w:t>
+      </w:r>
+      <w:proofErr w:type="spellStart"/>
+      <w:r>
+        <w:rPr>
+          <w:rFonts w:ascii="Courier New" w:hAnsi="Courier New"/>
+          <w:sz w:val="18"/>
+        </w:rPr>
+        <w:t>AttributionCalculator</w:t>
+      </w:r>
+      <w:proofErr w:type="spellEnd"/>
+    </w:p>
+    <w:p>
+      <w:pPr>
+        <w:shd w:val="clear" w:color="auto" w:fill="F2F2F2"/>
+        <w:spacing w:after="0"/>
+        <w:ind w:left="288"/>
+      </w:pPr>
+      <w:r>
+        <w:rPr>
+          <w:rFonts w:ascii="Courier New" w:hAnsi="Courier New"/>
+          <w:sz w:val="18"/>
+        </w:rPr>
+        <w:t>with a single public method:</w:t>
+      </w:r>
+    </w:p>
+    <w:p>
+      <w:pPr>
+        <w:shd w:val="clear" w:color="auto" w:fill="F2F2F2"/>
+        <w:spacing w:after="0"/>
+        <w:ind w:left="288"/>
+      </w:pPr>
+      <w:r>
+        <w:rPr>
+          <w:rFonts w:ascii="Courier New" w:hAnsi="Courier New"/>
+          <w:sz w:val="18"/>
+        </w:rPr>
+        <w:t xml:space="preserve"> </w:t>
+      </w:r>
+    </w:p>
+    <w:p>
+      <w:pPr>
+        <w:shd w:val="clear" w:color="auto" w:fill="F2F2F2"/>
+        <w:spacing w:after="0"/>
+        <w:ind w:left="288"/>
+      </w:pPr>
+      <w:r>
+        <w:rPr>
+          <w:rFonts w:ascii="Courier New" w:hAnsi="Courier New"/>
+          <w:sz w:val="18"/>
+        </w:rPr>
+        <w:t xml:space="preserve">  </w:t>
+      </w:r>
+      <w:proofErr w:type="spellStart"/>
+      <w:r>
+        <w:rPr>
+          <w:rFonts w:ascii="Courier New" w:hAnsi="Courier New"/>
+          <w:sz w:val="18"/>
+        </w:rPr>
+        <w:t>AttributionResponse</w:t>
+      </w:r>
+      <w:proofErr w:type="spellEnd"/>
+      <w:r>
+        <w:rPr>
+          <w:rFonts w:ascii="Courier New" w:hAnsi="Courier New"/>
+          <w:sz w:val="18"/>
+        </w:rPr>
+        <w:t xml:space="preserve"> </w:t>
+      </w:r>
+      <w:proofErr w:type="gramStart"/>
+      <w:r>
+        <w:rPr>
+          <w:rFonts w:ascii="Courier New" w:hAnsi="Courier New"/>
+          <w:sz w:val="18"/>
+        </w:rPr>
+        <w:t>calculate(</w:t>
+      </w:r>
+      <w:proofErr w:type="spellStart"/>
+      <w:proofErr w:type="gramEnd"/>
+      <w:r>
+        <w:rPr>
+          <w:rFonts w:ascii="Courier New" w:hAnsi="Courier New"/>
+          <w:sz w:val="18"/>
+        </w:rPr>
+        <w:t>AttributionRequest</w:t>
+      </w:r>
+      <w:proofErr w:type="spellEnd"/>
+      <w:r>
+        <w:rPr>
+          <w:rFonts w:ascii="Courier New" w:hAnsi="Courier New"/>
+          <w:sz w:val="18"/>
+        </w:rPr>
+        <w:t xml:space="preserve"> request)</w:t>
+      </w:r>
+    </w:p>
+    <w:p>
+      <w:pPr>
+        <w:shd w:val="clear" w:color="auto" w:fill="F2F2F2"/>
+        <w:spacing w:after="0"/>
+        <w:ind w:left="288"/>
+      </w:pPr>
+      <w:r>
+        <w:rPr>
+          <w:rFonts w:ascii="Courier New" w:hAnsi="Courier New"/>
+          <w:sz w:val="18"/>
+        </w:rPr>
+        <w:t xml:space="preserve"> </w:t>
+      </w:r>
+    </w:p>
+    <w:p>
+      <w:pPr>
+        <w:shd w:val="clear" w:color="auto" w:fill="F2F2F2"/>
+        <w:spacing w:after="0"/>
+        <w:ind w:left="288"/>
+      </w:pPr>
+      <w:r>
+        <w:rPr>
+          <w:rFonts w:ascii="Courier New" w:hAnsi="Courier New"/>
+          <w:sz w:val="18"/>
+        </w:rPr>
+        <w:t xml:space="preserve">Implement the following rules using </w:t>
+      </w:r>
+      <w:proofErr w:type="spellStart"/>
+      <w:r>
+        <w:rPr>
+          <w:rFonts w:ascii="Courier New" w:hAnsi="Courier New"/>
+          <w:sz w:val="18"/>
+        </w:rPr>
+        <w:t>BigDecimal</w:t>
+      </w:r>
+      <w:proofErr w:type="spellEnd"/>
+      <w:r>
+        <w:rPr>
+          <w:rFonts w:ascii="Courier New" w:hAnsi="Courier New"/>
+          <w:sz w:val="18"/>
+        </w:rPr>
+        <w:t xml:space="preserve"> arithmetic throughout:</w:t>
+      </w:r>
+    </w:p>
+    <w:p>
+      <w:pPr>
+        <w:shd w:val="clear" w:color="auto" w:fill="F2F2F2"/>
+        <w:spacing w:after="0"/>
+        <w:ind w:left="288"/>
+      </w:pPr>
+      <w:r>
+        <w:rPr>
+          <w:rFonts w:ascii="Courier New" w:hAnsi="Courier New"/>
+          <w:sz w:val="18"/>
+        </w:rPr>
+        <w:t xml:space="preserve"> </w:t>
+      </w:r>
+    </w:p>
+    <w:p>
+      <w:pPr>
+        <w:shd w:val="clear" w:color="auto" w:fill="F2F2F2"/>
+        <w:spacing w:after="0"/>
+        <w:ind w:left="288"/>
+      </w:pPr>
+      <w:r>
+        <w:rPr>
+          <w:rFonts w:ascii="Courier New" w:hAnsi="Courier New"/>
+          <w:sz w:val="18"/>
+        </w:rPr>
+        <w:t xml:space="preserve">1. For each group in </w:t>
+      </w:r>
+      <w:proofErr w:type="spellStart"/>
+      <w:proofErr w:type="gramStart"/>
+      <w:r>
+        <w:rPr>
+          <w:rFonts w:ascii="Courier New" w:hAnsi="Courier New"/>
+          <w:sz w:val="18"/>
+        </w:rPr>
+        <w:t>request.getGroups</w:t>
+      </w:r>
+      <w:proofErr w:type="spellEnd"/>
+      <w:proofErr w:type="gramEnd"/>
+      <w:r>
+        <w:rPr>
+          <w:rFonts w:ascii="Courier New" w:hAnsi="Courier New"/>
+          <w:sz w:val="18"/>
+        </w:rPr>
+        <w:t>():</w:t>
+      </w:r>
+    </w:p>
+    <w:p>
+      <w:pPr>
+        <w:shd w:val="clear" w:color="auto" w:fill="F2F2F2"/>
+        <w:spacing w:after="0"/>
+        <w:ind w:left="288"/>
+      </w:pPr>
+      <w:r>
+        <w:rPr>
+          <w:rFonts w:ascii="Courier New" w:hAnsi="Courier New"/>
+          <w:sz w:val="18"/>
+        </w:rPr>
+        <w:t xml:space="preserve">   a. If </w:t>
+      </w:r>
+      <w:proofErr w:type="spellStart"/>
+      <w:r>
+        <w:rPr>
+          <w:rFonts w:ascii="Courier New" w:hAnsi="Courier New"/>
+          <w:sz w:val="18"/>
+        </w:rPr>
+        <w:t>returnPct</w:t>
+      </w:r>
+      <w:proofErr w:type="spellEnd"/>
+      <w:r>
+        <w:rPr>
+          <w:rFonts w:ascii="Courier New" w:hAnsi="Courier New"/>
+          <w:sz w:val="18"/>
+        </w:rPr>
+        <w:t xml:space="preserve"> is non-null:</w:t>
+      </w:r>
+    </w:p>
+    <w:p>
+      <w:pPr>
+        <w:shd w:val="clear" w:color="auto" w:fill="F2F2F2"/>
+        <w:spacing w:after="0"/>
+        <w:ind w:left="288"/>
+      </w:pPr>
+      <w:r>
+        <w:rPr>
+          <w:rFonts w:ascii="Courier New" w:hAnsi="Courier New"/>
+          <w:sz w:val="18"/>
+        </w:rPr>
+        <w:t xml:space="preserve">      - </w:t>
+      </w:r>
+      <w:proofErr w:type="spellStart"/>
+      <w:r>
+        <w:rPr>
+          <w:rFonts w:ascii="Courier New" w:hAnsi="Courier New"/>
+          <w:sz w:val="18"/>
+        </w:rPr>
+        <w:t>contributionPct</w:t>
+      </w:r>
+      <w:proofErr w:type="spellEnd"/>
+      <w:r>
+        <w:rPr>
+          <w:rFonts w:ascii="Courier New" w:hAnsi="Courier New"/>
+          <w:sz w:val="18"/>
+        </w:rPr>
+        <w:t xml:space="preserve"> = </w:t>
+      </w:r>
+      <w:proofErr w:type="spellStart"/>
+      <w:r>
+        <w:rPr>
+          <w:rFonts w:ascii="Courier New" w:hAnsi="Courier New"/>
+          <w:sz w:val="18"/>
+        </w:rPr>
+        <w:t>weightPct</w:t>
+      </w:r>
+      <w:proofErr w:type="spellEnd"/>
+      <w:r>
+        <w:rPr>
+          <w:rFonts w:ascii="Courier New" w:hAnsi="Courier New"/>
+          <w:sz w:val="18"/>
+        </w:rPr>
+        <w:t xml:space="preserve"> * </w:t>
+      </w:r>
+      <w:proofErr w:type="spellStart"/>
+      <w:r>
+        <w:rPr>
+          <w:rFonts w:ascii="Courier New" w:hAnsi="Courier New"/>
+          <w:sz w:val="18"/>
+        </w:rPr>
+        <w:t>returnPct</w:t>
+      </w:r>
+      <w:proofErr w:type="spellEnd"/>
+      <w:r>
+        <w:rPr>
+          <w:rFonts w:ascii="Courier New" w:hAnsi="Courier New"/>
+          <w:sz w:val="18"/>
+        </w:rPr>
+        <w:t xml:space="preserve"> / 100 (scale 6, HALF_UP)</w:t>
+      </w:r>
+    </w:p>
+    <w:p>
+      <w:pPr>
+        <w:shd w:val="clear" w:color="auto" w:fill="F2F2F2"/>
+        <w:spacing w:after="0"/>
+        <w:ind w:left="288"/>
+      </w:pPr>
+      <w:r>
+        <w:rPr>
+          <w:rFonts w:ascii="Courier New" w:hAnsi="Courier New"/>
+          <w:sz w:val="18"/>
+        </w:rPr>
+        <w:t xml:space="preserve">      - </w:t>
+      </w:r>
+      <w:proofErr w:type="spellStart"/>
+      <w:r>
+        <w:rPr>
+          <w:rFonts w:ascii="Courier New" w:hAnsi="Courier New"/>
+          <w:sz w:val="18"/>
+        </w:rPr>
+        <w:t>pricingMode</w:t>
+      </w:r>
+      <w:proofErr w:type="spellEnd"/>
+      <w:r>
+        <w:rPr>
+          <w:rFonts w:ascii="Courier New" w:hAnsi="Courier New"/>
+          <w:sz w:val="18"/>
+        </w:rPr>
+        <w:t xml:space="preserve"> = </w:t>
+      </w:r>
+      <w:proofErr w:type="spellStart"/>
+      <w:r>
+        <w:rPr>
+          <w:rFonts w:ascii="Courier New" w:hAnsi="Courier New"/>
+          <w:sz w:val="18"/>
+        </w:rPr>
+        <w:t>PricingMode.PRIMARY</w:t>
+      </w:r>
+      <w:proofErr w:type="spellEnd"/>
+    </w:p>
+    <w:p>
+      <w:pPr>
+        <w:shd w:val="clear" w:color="auto" w:fill="F2F2F2"/>
+        <w:spacing w:after="0"/>
+        <w:ind w:left="288"/>
+      </w:pPr>
+      <w:r>
+        <w:rPr>
+          <w:rFonts w:ascii="Courier New" w:hAnsi="Courier New"/>
+          <w:sz w:val="18"/>
+        </w:rPr>
+        <w:t xml:space="preserve">   b. If </w:t>
+      </w:r>
+      <w:proofErr w:type="spellStart"/>
+      <w:r>
+        <w:rPr>
+          <w:rFonts w:ascii="Courier New" w:hAnsi="Courier New"/>
+          <w:sz w:val="18"/>
+        </w:rPr>
+        <w:t>returnPct</w:t>
+      </w:r>
+      <w:proofErr w:type="spellEnd"/>
+      <w:r>
+        <w:rPr>
+          <w:rFonts w:ascii="Courier New" w:hAnsi="Courier New"/>
+          <w:sz w:val="18"/>
+        </w:rPr>
+        <w:t xml:space="preserve"> is null and </w:t>
+      </w:r>
+      <w:proofErr w:type="spellStart"/>
+      <w:r>
+        <w:rPr>
+          <w:rFonts w:ascii="Courier New" w:hAnsi="Courier New"/>
+          <w:sz w:val="18"/>
+        </w:rPr>
+        <w:t>fallbackReturnPct</w:t>
+      </w:r>
+      <w:proofErr w:type="spellEnd"/>
+      <w:r>
+        <w:rPr>
+          <w:rFonts w:ascii="Courier New" w:hAnsi="Courier New"/>
+          <w:sz w:val="18"/>
+        </w:rPr>
+        <w:t xml:space="preserve"> is non-null:</w:t>
+      </w:r>
+    </w:p>
+    <w:p>
+      <w:pPr>
+        <w:shd w:val="clear" w:color="auto" w:fill="F2F2F2"/>
+        <w:spacing w:after="0"/>
+        <w:ind w:left="288"/>
+      </w:pPr>
+      <w:r>
+        <w:rPr>
+          <w:rFonts w:ascii="Courier New" w:hAnsi="Courier New"/>
+          <w:sz w:val="18"/>
+        </w:rPr>
+        <w:t xml:space="preserve">      - </w:t>
+      </w:r>
+      <w:proofErr w:type="spellStart"/>
+      <w:r>
+        <w:rPr>
+          <w:rFonts w:ascii="Courier New" w:hAnsi="Courier New"/>
+          <w:sz w:val="18"/>
+        </w:rPr>
+        <w:t>contributionPct</w:t>
+      </w:r>
+      <w:proofErr w:type="spellEnd"/>
+      <w:r>
+        <w:rPr>
+          <w:rFonts w:ascii="Courier New" w:hAnsi="Courier New"/>
+          <w:sz w:val="18"/>
+        </w:rPr>
+        <w:t xml:space="preserve"> = </w:t>
+      </w:r>
+      <w:proofErr w:type="spellStart"/>
+      <w:r>
+        <w:rPr>
+          <w:rFonts w:ascii="Courier New" w:hAnsi="Courier New"/>
+          <w:sz w:val="18"/>
+        </w:rPr>
+        <w:t>weightPct</w:t>
+      </w:r>
+      <w:proofErr w:type="spellEnd"/>
+      <w:r>
+        <w:rPr>
+          <w:rFonts w:ascii="Courier New" w:hAnsi="Courier New"/>
+          <w:sz w:val="18"/>
+        </w:rPr>
+        <w:t xml:space="preserve"> * </w:t>
+      </w:r>
+      <w:proofErr w:type="spellStart"/>
+      <w:r>
+        <w:rPr>
+          <w:rFonts w:ascii="Courier New" w:hAnsi="Courier New"/>
+          <w:sz w:val="18"/>
+        </w:rPr>
+        <w:t>fallbackReturnPct</w:t>
+      </w:r>
+      <w:proofErr w:type="spellEnd"/>
+      <w:r>
+        <w:rPr>
+          <w:rFonts w:ascii="Courier New" w:hAnsi="Courier New"/>
+          <w:sz w:val="18"/>
+        </w:rPr>
+        <w:t xml:space="preserve"> / 100 (scale 6, HALF_UP)</w:t>
+      </w:r>
+    </w:p>
+    <w:p>
+      <w:pPr>
+        <w:shd w:val="clear" w:color="auto" w:fill="F2F2F2"/>
+        <w:spacing w:after="0"/>
+        <w:ind w:left="288"/>
+      </w:pPr>
+      <w:r>
+        <w:rPr>
+          <w:rFonts w:ascii="Courier New" w:hAnsi="Courier New"/>
+          <w:sz w:val="18"/>
+        </w:rPr>
+        <w:t xml:space="preserve">      - </w:t>
+      </w:r>
+      <w:proofErr w:type="spellStart"/>
+      <w:r>
+        <w:rPr>
+          <w:rFonts w:ascii="Courier New" w:hAnsi="Courier New"/>
+          <w:sz w:val="18"/>
+        </w:rPr>
+        <w:t>pricingMode</w:t>
+      </w:r>
+      <w:proofErr w:type="spellEnd"/>
+      <w:r>
+        <w:rPr>
+          <w:rFonts w:ascii="Courier New" w:hAnsi="Courier New"/>
+          <w:sz w:val="18"/>
+        </w:rPr>
+        <w:t xml:space="preserve"> = </w:t>
+      </w:r>
+      <w:proofErr w:type="spellStart"/>
+      <w:r>
+        <w:rPr>
+          <w:rFonts w:ascii="Courier New" w:hAnsi="Courier New"/>
+          <w:sz w:val="18"/>
+        </w:rPr>
+        <w:t>PricingMode.FALLBACK_USED</w:t>
+      </w:r>
+      <w:proofErr w:type="spellEnd"/>
+    </w:p>
+    <w:p>
+      <w:pPr>
+        <w:shd w:val="clear" w:color="auto" w:fill="F2F2F2"/>
+        <w:spacing w:after="0"/>
+        <w:ind w:left="288"/>
+      </w:pPr>
+      <w:r>
+        <w:rPr>
+          <w:rFonts w:ascii="Courier New" w:hAnsi="Courier New"/>
+          <w:sz w:val="18"/>
+        </w:rPr>
+        <w:t xml:space="preserve">      - Add warning: "Fallback pricing used for {</w:t>
+      </w:r>
+      <w:proofErr w:type="spellStart"/>
+      <w:r>
+        <w:rPr>
+          <w:rFonts w:ascii="Courier New" w:hAnsi="Courier New"/>
+          <w:sz w:val="18"/>
+        </w:rPr>
+        <w:t>groupName</w:t>
+      </w:r>
+      <w:proofErr w:type="spellEnd"/>
+      <w:r>
+        <w:rPr>
+          <w:rFonts w:ascii="Courier New" w:hAnsi="Courier New"/>
+          <w:sz w:val="18"/>
+        </w:rPr>
+        <w:t>}"</w:t>
+      </w:r>
+    </w:p>
+    <w:p>
+      <w:pPr>
+        <w:shd w:val="clear" w:color="auto" w:fill="F2F2F2"/>
+        <w:spacing w:after="0"/>
+        <w:ind w:left="288"/>
+      </w:pPr>
+      <w:r>
+        <w:rPr>
+          <w:rFonts w:ascii="Courier New" w:hAnsi="Courier New"/>
+          <w:sz w:val="18"/>
+        </w:rPr>
+        <w:t xml:space="preserve">   c. If both </w:t>
+      </w:r>
+      <w:proofErr w:type="spellStart"/>
+      <w:r>
+        <w:rPr>
+          <w:rFonts w:ascii="Courier New" w:hAnsi="Courier New"/>
+          <w:sz w:val="18"/>
+        </w:rPr>
+        <w:t>returnPct</w:t>
+      </w:r>
+      <w:proofErr w:type="spellEnd"/>
+      <w:r>
+        <w:rPr>
+          <w:rFonts w:ascii="Courier New" w:hAnsi="Courier New"/>
+          <w:sz w:val="18"/>
+        </w:rPr>
+        <w:t xml:space="preserve"> and </w:t>
+      </w:r>
+      <w:proofErr w:type="spellStart"/>
+      <w:r>
+        <w:rPr>
+          <w:rFonts w:ascii="Courier New" w:hAnsi="Courier New"/>
+          <w:sz w:val="18"/>
+        </w:rPr>
+        <w:t>fallbackReturnPct</w:t>
+      </w:r>
+      <w:proofErr w:type="spellEnd"/>
+      <w:r>
+        <w:rPr>
+          <w:rFonts w:ascii="Courier New" w:hAnsi="Courier New"/>
+          <w:sz w:val="18"/>
+        </w:rPr>
+        <w:t xml:space="preserve"> are null:</w:t>
+      </w:r>
+    </w:p>
+    <w:p>
+      <w:pPr>
+        <w:shd w:val="clear" w:color="auto" w:fill="F2F2F2"/>
+        <w:spacing w:after="0"/>
+        <w:ind w:left="288"/>
+      </w:pPr>
+      <w:r>
+        <w:rPr>
+          <w:rFonts w:ascii="Courier New" w:hAnsi="Courier New"/>
+          <w:sz w:val="18"/>
+        </w:rPr>
+        <w:t xml:space="preserve">      - </w:t>
+      </w:r>
+      <w:proofErr w:type="spellStart"/>
+      <w:r>
+        <w:rPr>
+          <w:rFonts w:ascii="Courier New" w:hAnsi="Courier New"/>
+          <w:sz w:val="18"/>
+        </w:rPr>
+        <w:t>contributionPct</w:t>
+      </w:r>
+      <w:proofErr w:type="spellEnd"/>
+      <w:r>
+        <w:rPr>
+          <w:rFonts w:ascii="Courier New" w:hAnsi="Courier New"/>
+          <w:sz w:val="18"/>
+        </w:rPr>
+        <w:t xml:space="preserve"> = </w:t>
+      </w:r>
+      <w:proofErr w:type="spellStart"/>
+      <w:r>
+        <w:rPr>
+          <w:rFonts w:ascii="Courier New" w:hAnsi="Courier New"/>
+          <w:sz w:val="18"/>
+        </w:rPr>
+        <w:t>BigDecimal.ZERO</w:t>
+      </w:r>
+      <w:proofErr w:type="spellEnd"/>
+    </w:p>
+    <w:p>
+      <w:pPr>
+        <w:shd w:val="clear" w:color="auto" w:fill="F2F2F2"/>
+        <w:spacing w:after="0"/>
+        <w:ind w:left="288"/>
+      </w:pPr>
+      <w:r>
+        <w:rPr>
+          <w:rFonts w:ascii="Courier New" w:hAnsi="Courier New"/>
+          <w:sz w:val="18"/>
+        </w:rPr>
+        <w:t xml:space="preserve">      - </w:t>
+      </w:r>
+      <w:proofErr w:type="spellStart"/>
+      <w:r>
+        <w:rPr>
+          <w:rFonts w:ascii="Courier New" w:hAnsi="Courier New"/>
+          <w:sz w:val="18"/>
+        </w:rPr>
+        <w:t>pricingMode</w:t>
+      </w:r>
+      <w:proofErr w:type="spellEnd"/>
+      <w:r>
+        <w:rPr>
+          <w:rFonts w:ascii="Courier New" w:hAnsi="Courier New"/>
+          <w:sz w:val="18"/>
+        </w:rPr>
+        <w:t xml:space="preserve"> = </w:t>
+      </w:r>
+      <w:proofErr w:type="spellStart"/>
+      <w:r>
+        <w:rPr>
+          <w:rFonts w:ascii="Courier New" w:hAnsi="Courier New"/>
+          <w:sz w:val="18"/>
+        </w:rPr>
+        <w:t>PricingMode.UNAVAILABLE</w:t>
+      </w:r>
+      <w:proofErr w:type="spellEnd"/>
+    </w:p>
+    <w:p>
+      <w:pPr>
+        <w:shd w:val="clear" w:color="auto" w:fill="F2F2F2"/>
+        <w:spacing w:after="0"/>
+        <w:ind w:left="288"/>
+      </w:pPr>
+      <w:r>
+        <w:rPr>
+          <w:rFonts w:ascii="Courier New" w:hAnsi="Courier New"/>
+          <w:sz w:val="18"/>
+        </w:rPr>
+        <w:t xml:space="preserve">      - Track this group as missing</w:t>
+      </w:r>
+    </w:p>
+    <w:p>
+      <w:pPr>
+        <w:shd w:val="clear" w:color="auto" w:fill="F2F2F2"/>
+        <w:spacing w:after="0"/>
+        <w:ind w:left="288"/>
+      </w:pPr>
+      <w:r>
+        <w:rPr>
+          <w:rFonts w:ascii="Courier New" w:hAnsi="Courier New"/>
+          <w:sz w:val="18"/>
+        </w:rPr>
+        <w:t xml:space="preserve"> </w:t>
+      </w:r>
+    </w:p>
+    <w:p>
+      <w:pPr>
+        <w:shd w:val="clear" w:color="auto" w:fill="F2F2F2"/>
+        <w:spacing w:after="0"/>
+        <w:ind w:left="288"/>
+      </w:pPr>
+      <w:r>
+        <w:rPr>
+          <w:rFonts w:ascii="Courier New" w:hAnsi="Courier New"/>
+          <w:sz w:val="18"/>
+        </w:rPr>
+        <w:t>2. Count missing groups (UNAVAILABLE):</w:t>
+      </w:r>
+    </w:p>
+    <w:p>
+      <w:pPr>
+        <w:shd w:val="clear" w:color="auto" w:fill="F2F2F2"/>
+        <w:spacing w:after="0"/>
+        <w:ind w:left="288"/>
+      </w:pPr>
+      <w:r>
+        <w:rPr>
+          <w:rFonts w:ascii="Courier New" w:hAnsi="Courier New"/>
+          <w:sz w:val="18"/>
+        </w:rPr>
+        <w:t xml:space="preserve">   - 0 missing → status = VALID</w:t>
+      </w:r>
+    </w:p>
+    <w:p>
+      <w:pPr>
+        <w:shd w:val="clear" w:color="auto" w:fill="F2F2F2"/>
+        <w:spacing w:after="0"/>
+        <w:ind w:left="288"/>
+      </w:pPr>
+      <w:r>
+        <w:rPr>
+          <w:rFonts w:ascii="Courier New" w:hAnsi="Courier New"/>
+          <w:sz w:val="18"/>
+        </w:rPr>
+        <w:t xml:space="preserve">   - 1 missing → status = DEGRADED; add warning: "Return unavailable for {</w:t>
+      </w:r>
+      <w:proofErr w:type="spellStart"/>
+      <w:r>
+        <w:rPr>
+          <w:rFonts w:ascii="Courier New" w:hAnsi="Courier New"/>
+          <w:sz w:val="18"/>
+        </w:rPr>
+        <w:t>groupName</w:t>
+      </w:r>
+      <w:proofErr w:type="spellEnd"/>
+      <w:r>
+        <w:rPr>
+          <w:rFonts w:ascii="Courier New" w:hAnsi="Courier New"/>
+          <w:sz w:val="18"/>
+        </w:rPr>
+        <w:t>}"</w:t>
+      </w:r>
+    </w:p>
+    <w:p>
+      <w:pPr>
+        <w:shd w:val="clear" w:color="auto" w:fill="F2F2F2"/>
+        <w:spacing w:after="0"/>
+        <w:ind w:left="288"/>
+      </w:pPr>
+      <w:r>
+        <w:rPr>
+          <w:rFonts w:ascii="Courier New" w:hAnsi="Courier New"/>
+          <w:sz w:val="18"/>
+        </w:rPr>
+        <w:t xml:space="preserve">   - 2+ missing → status = REVIEW_REQUIRED; add warning for each missing group</w:t>
+      </w:r>
+    </w:p>
+    <w:p>
+      <w:pPr>
+        <w:shd w:val="clear" w:color="auto" w:fill="F2F2F2"/>
+        <w:spacing w:after="0"/>
+        <w:ind w:left="288"/>
+      </w:pPr>
+      <w:r>
+        <w:rPr>
+          <w:rFonts w:ascii="Courier New" w:hAnsi="Courier New"/>
+          <w:sz w:val="18"/>
+        </w:rPr>
+        <w:t xml:space="preserve"> </w:t>
+      </w:r>
+    </w:p>
+    <w:p>
+      <w:pPr>
+        <w:shd w:val="clear" w:color="auto" w:fill="F2F2F2"/>
+        <w:spacing w:after="0"/>
+        <w:ind w:left="288"/>
+      </w:pPr>
+      <w:r>
+        <w:rPr>
+          <w:rFonts w:ascii="Courier New" w:hAnsi="Courier New"/>
+          <w:sz w:val="18"/>
+        </w:rPr>
+        <w:t>3. Set degraded = true if status is DEGRADED or REVIEW_REQUIRED</w:t>
+      </w:r>
+    </w:p>
+    <w:p>
+      <w:pPr>
+        <w:shd w:val="clear" w:color="auto" w:fill="F2F2F2"/>
+        <w:spacing w:after="0"/>
+        <w:ind w:left="288"/>
+      </w:pPr>
+      <w:r>
+        <w:rPr>
+          <w:rFonts w:ascii="Courier New" w:hAnsi="Courier New"/>
+          <w:sz w:val="18"/>
+        </w:rPr>
+        <w:t xml:space="preserve"> </w:t>
+      </w:r>
+    </w:p>
+    <w:p>
+      <w:pPr>
+        <w:shd w:val="clear" w:color="auto" w:fill="F2F2F2"/>
+        <w:spacing w:after="0"/>
+        <w:ind w:left="288"/>
+      </w:pPr>
+      <w:r>
+        <w:rPr>
+          <w:rFonts w:ascii="Courier New" w:hAnsi="Courier New"/>
+          <w:sz w:val="18"/>
+        </w:rPr>
+        <w:t xml:space="preserve">4. </w:t>
+      </w:r>
+      <w:proofErr w:type="spellStart"/>
+      <w:r>
+        <w:rPr>
+          <w:rFonts w:ascii="Courier New" w:hAnsi="Courier New"/>
+          <w:sz w:val="18"/>
+        </w:rPr>
+        <w:t>totalContributionPct</w:t>
+      </w:r>
+      <w:proofErr w:type="spellEnd"/>
+      <w:r>
+        <w:rPr>
+          <w:rFonts w:ascii="Courier New" w:hAnsi="Courier New"/>
+          <w:sz w:val="18"/>
+        </w:rPr>
+        <w:t xml:space="preserve"> = sum of all </w:t>
+      </w:r>
+      <w:proofErr w:type="spellStart"/>
+      <w:r>
+        <w:rPr>
+          <w:rFonts w:ascii="Courier New" w:hAnsi="Courier New"/>
+          <w:sz w:val="18"/>
+        </w:rPr>
+        <w:t>contributionPct</w:t>
+      </w:r>
+      <w:proofErr w:type="spellEnd"/>
+      <w:r>
+        <w:rPr>
+          <w:rFonts w:ascii="Courier New" w:hAnsi="Courier New"/>
+          <w:sz w:val="18"/>
+        </w:rPr>
+        <w:t xml:space="preserve"> values (scale 6, HALF_UP)</w:t>
+      </w:r>
+    </w:p>
+    <w:p>
+      <w:pPr>
+        <w:shd w:val="clear" w:color="auto" w:fill="F2F2F2"/>
+        <w:spacing w:after="0"/>
+        <w:ind w:left="288"/>
+      </w:pPr>
+      <w:r>
+        <w:rPr>
+          <w:rFonts w:ascii="Courier New" w:hAnsi="Courier New"/>
+          <w:sz w:val="18"/>
+        </w:rPr>
+        <w:t xml:space="preserve"> </w:t>
+      </w:r>
+    </w:p>
+    <w:p>
+      <w:pPr>
+        <w:shd w:val="clear" w:color="auto" w:fill="F2F2F2"/>
+        <w:spacing w:after="0"/>
+        <w:ind w:left="288"/>
+      </w:pPr>
+      <w:r>
+        <w:rPr>
+          <w:rFonts w:ascii="Courier New" w:hAnsi="Courier New"/>
+          <w:sz w:val="18"/>
+        </w:rPr>
+        <w:t xml:space="preserve">5. Set </w:t>
+      </w:r>
+      <w:proofErr w:type="spellStart"/>
+      <w:r>
+        <w:rPr>
+          <w:rFonts w:ascii="Courier New" w:hAnsi="Courier New"/>
+          <w:sz w:val="18"/>
+        </w:rPr>
+        <w:t>processedAt</w:t>
+      </w:r>
+      <w:proofErr w:type="spellEnd"/>
+      <w:r>
+        <w:rPr>
+          <w:rFonts w:ascii="Courier New" w:hAnsi="Courier New"/>
+          <w:sz w:val="18"/>
+        </w:rPr>
+        <w:t xml:space="preserve"> = </w:t>
+      </w:r>
+      <w:proofErr w:type="spellStart"/>
+      <w:proofErr w:type="gramStart"/>
+      <w:r>
+        <w:rPr>
+          <w:rFonts w:ascii="Courier New" w:hAnsi="Courier New"/>
+          <w:sz w:val="18"/>
+        </w:rPr>
+        <w:t>Instant.now</w:t>
+      </w:r>
+      <w:proofErr w:type="spellEnd"/>
+      <w:r>
+        <w:rPr>
+          <w:rFonts w:ascii="Courier New" w:hAnsi="Courier New"/>
+          <w:sz w:val="18"/>
+        </w:rPr>
+        <w:t>(</w:t>
+      </w:r>
+      <w:proofErr w:type="gramEnd"/>
+      <w:r>
+        <w:rPr>
+          <w:rFonts w:ascii="Courier New" w:hAnsi="Courier New"/>
+          <w:sz w:val="18"/>
+        </w:rPr>
+        <w:t>)</w:t>
+      </w:r>
+    </w:p>
+    <w:p>
+      <w:pPr>
+        <w:shd w:val="clear" w:color="auto" w:fill="F2F2F2"/>
+        <w:spacing w:after="0"/>
+        <w:ind w:left="288"/>
+      </w:pPr>
+      <w:r>
+        <w:rPr>
+          <w:rFonts w:ascii="Courier New" w:hAnsi="Courier New"/>
+          <w:sz w:val="18"/>
+        </w:rPr>
+        <w:t xml:space="preserve"> </w:t>
+      </w:r>
+    </w:p>
+    <w:p>
+      <w:pPr>
+        <w:shd w:val="clear" w:color="auto" w:fill="F2F2F2"/>
+        <w:spacing w:after="0"/>
+        <w:ind w:left="288"/>
+      </w:pPr>
+      <w:r>
+        <w:rPr>
+          <w:rFonts w:ascii="Courier New" w:hAnsi="Courier New"/>
+          <w:sz w:val="18"/>
+        </w:rPr>
+        <w:t xml:space="preserve">Return a fully populated </w:t>
+      </w:r>
+      <w:proofErr w:type="spellStart"/>
+      <w:r>
+        <w:rPr>
+          <w:rFonts w:ascii="Courier New" w:hAnsi="Courier New"/>
+          <w:sz w:val="18"/>
+        </w:rPr>
+        <w:t>AttributionResponse</w:t>
+      </w:r>
+      <w:proofErr w:type="spellEnd"/>
+      <w:r>
+        <w:rPr>
+          <w:rFonts w:ascii="Courier New" w:hAnsi="Courier New"/>
+          <w:sz w:val="18"/>
+        </w:rPr>
+        <w:t>. Do not use Spring annotations;</w:t>
+      </w:r>
+    </w:p>
+    <w:p>
+      <w:pPr>
+        <w:shd w:val="clear" w:color="auto" w:fill="F2F2F2"/>
+        <w:spacing w:after="0"/>
+        <w:ind w:left="288"/>
+      </w:pPr>
+      <w:r>
+        <w:rPr>
+          <w:rFonts w:ascii="Courier New" w:hAnsi="Courier New"/>
+          <w:sz w:val="18"/>
+        </w:rPr>
+        <w:t>keep as a plain POJO for unit testability.</w:t>
+      </w:r>
+    </w:p>
+    <w:p/>
+    <w:p>
+      <w:pPr>
+        <w:spacing w:before="120" w:after="40"/>
+      </w:pPr>
+      <w:r>
+        <w:rPr>
+          <w:rFonts w:ascii="Calibri" w:hAnsi="Calibri"/>
+          <w:b/>
+          <w:color w:val="1F497D"/>
+        </w:rPr>
+        <w:t>Validation Gate</w:t>
+      </w:r>
+    </w:p>
+    <w:p>
+      <w:pPr>
+        <w:pStyle w:val="ListBullet"/>
+        <w:tabs>
+          <w:tab w:val="num" w:pos="360"/>
+        </w:tabs>
+        <w:spacing w:after="40"/>
+        <w:ind w:left="360" w:hanging="360"/>
+      </w:pPr>
+      <w:r>
+        <w:rPr>
+          <w:rFonts w:ascii="Calibri" w:hAnsi="Calibri"/>
+          <w:sz w:val="21"/>
+        </w:rPr>
+        <w:t xml:space="preserve">All groups have </w:t>
+      </w:r>
+      <w:proofErr w:type="spellStart"/>
+      <w:r>
+        <w:rPr>
+          <w:rFonts w:ascii="Calibri" w:hAnsi="Calibri"/>
+          <w:sz w:val="21"/>
+        </w:rPr>
+        <w:t>returnPct</w:t>
+      </w:r>
+      <w:proofErr w:type="spellEnd"/>
+      <w:r>
+        <w:rPr>
+          <w:rFonts w:ascii="Calibri" w:hAnsi="Calibri"/>
+          <w:sz w:val="21"/>
+        </w:rPr>
+        <w:t xml:space="preserve"> — status=VALID, degraded=false, correct contributions</w:t>
+      </w:r>
+    </w:p>
+    <w:p>
+      <w:pPr>
+        <w:pStyle w:val="ListBullet"/>
+        <w:tabs>
+          <w:tab w:val="num" w:pos="360"/>
+        </w:tabs>
+        <w:spacing w:after="40"/>
+        <w:ind w:left="360" w:hanging="360"/>
+      </w:pPr>
+      <w:r>
+        <w:rPr>
+          <w:rFonts w:ascii="Calibri" w:hAnsi="Calibri"/>
+          <w:sz w:val="21"/>
+        </w:rPr>
+        <w:t xml:space="preserve">One group uses </w:t>
+      </w:r>
+      <w:proofErr w:type="spellStart"/>
+      <w:r>
+        <w:rPr>
+          <w:rFonts w:ascii="Calibri" w:hAnsi="Calibri"/>
+          <w:sz w:val="21"/>
+        </w:rPr>
+        <w:t>fallbackReturnPct</w:t>
+      </w:r>
+      <w:proofErr w:type="spellEnd"/>
+      <w:r>
+        <w:rPr>
+          <w:rFonts w:ascii="Calibri" w:hAnsi="Calibri"/>
+          <w:sz w:val="21"/>
+        </w:rPr>
+        <w:t xml:space="preserve"> — status=VALID, </w:t>
+      </w:r>
+      <w:proofErr w:type="spellStart"/>
+      <w:r>
+        <w:rPr>
+          <w:rFonts w:ascii="Calibri" w:hAnsi="Calibri"/>
+          <w:sz w:val="21"/>
+        </w:rPr>
+        <w:t>pricingMode</w:t>
+      </w:r>
+      <w:proofErr w:type="spellEnd"/>
+      <w:r>
+        <w:rPr>
+          <w:rFonts w:ascii="Calibri" w:hAnsi="Calibri"/>
+          <w:sz w:val="21"/>
+        </w:rPr>
+        <w:t>=FALLBACK_USED, warning added</w:t>
+      </w:r>
+    </w:p>
+    <w:p>
+      <w:pPr>
+        <w:pStyle w:val="ListBullet"/>
+        <w:tabs>
+          <w:tab w:val="num" w:pos="360"/>
+        </w:tabs>
+        <w:spacing w:after="40"/>
+        <w:ind w:left="360" w:hanging="360"/>
+      </w:pPr>
+      <w:r>
+        <w:rPr>
+          <w:rFonts w:ascii="Calibri" w:hAnsi="Calibri"/>
+          <w:sz w:val="21"/>
+        </w:rPr>
+        <w:t>One group has no return and no fallback — status=DEGRADED, degraded=true, warning added</w:t>
+      </w:r>
+    </w:p>
+    <w:p>
+      <w:pPr>
+        <w:pStyle w:val="ListBullet"/>
+        <w:tabs>
+          <w:tab w:val="num" w:pos="360"/>
+        </w:tabs>
+        <w:spacing w:after="40"/>
+        <w:ind w:left="360" w:hanging="360"/>
+      </w:pPr>
+      <w:r>
+        <w:rPr>
+          <w:rFonts w:ascii="Calibri" w:hAnsi="Calibri"/>
+          <w:sz w:val="21"/>
+        </w:rPr>
+        <w:t>Two groups have no return and no fallback — status=REVIEW_REQUIRED, degraded=true, two warnings</w:t>
+      </w:r>
+    </w:p>
+    <w:p>
+      <w:pPr>
+        <w:pStyle w:val="ListBullet"/>
+        <w:tabs>
+          <w:tab w:val="num" w:pos="360"/>
+        </w:tabs>
+        <w:spacing w:after="40"/>
+        <w:ind w:left="360" w:hanging="360"/>
+      </w:pPr>
+      <w:r>
+        <w:rPr>
+          <w:rFonts w:ascii="Calibri" w:hAnsi="Calibri"/>
+          <w:sz w:val="21"/>
+        </w:rPr>
+        <w:t>Mixed: one fallback used, one missing — status=DEGRADED, two warnings, correct totals</w:t>
+      </w:r>
+    </w:p>
+    <w:p>
+      <w:pPr>
+        <w:pStyle w:val="ListBullet"/>
+        <w:tabs>
+          <w:tab w:val="num" w:pos="360"/>
+        </w:tabs>
+        <w:spacing w:after="40"/>
+        <w:ind w:left="360" w:hanging="360"/>
+      </w:pPr>
+      <w:r>
+        <w:rPr>
+          <w:rFonts w:ascii="Calibri" w:hAnsi="Calibri"/>
+          <w:sz w:val="21"/>
+        </w:rPr>
+        <w:t>Verify math: (60*1.5/</w:t>
+      </w:r>
+      <w:proofErr w:type="gramStart"/>
+      <w:r>
+        <w:rPr>
+          <w:rFonts w:ascii="Calibri" w:hAnsi="Calibri"/>
+          <w:sz w:val="21"/>
+        </w:rPr>
+        <w:t>100)+(</w:t>
+      </w:r>
+      <w:proofErr w:type="gramEnd"/>
+      <w:r>
+        <w:rPr>
+          <w:rFonts w:ascii="Calibri" w:hAnsi="Calibri"/>
+          <w:sz w:val="21"/>
+        </w:rPr>
+        <w:t>30*0.4/</w:t>
+      </w:r>
+      <w:proofErr w:type="gramStart"/>
+      <w:r>
+        <w:rPr>
+          <w:rFonts w:ascii="Calibri" w:hAnsi="Calibri"/>
+          <w:sz w:val="21"/>
+        </w:rPr>
+        <w:t>100)+(</w:t>
+      </w:r>
+      <w:proofErr w:type="gramEnd"/>
+      <w:r>
+        <w:rPr>
+          <w:rFonts w:ascii="Calibri" w:hAnsi="Calibri"/>
+          <w:sz w:val="21"/>
+        </w:rPr>
+        <w:t>10*0.05/100) = 0.9+0.12+0.005 = 1.025</w:t>
+      </w:r>
+    </w:p>
+    <w:p>
+      <w:pPr>
+        <w:pStyle w:val="ListBullet"/>
+        <w:tabs>
+          <w:tab w:val="num" w:pos="360"/>
+        </w:tabs>
+        <w:spacing w:after="40"/>
+        <w:ind w:left="360" w:hanging="360"/>
+      </w:pPr>
+      <w:r>
+        <w:rPr>
+          <w:rFonts w:ascii="Calibri" w:hAnsi="Calibri"/>
+          <w:sz w:val="21"/>
+        </w:rPr>
+        <w:t>Run `</w:t>
+      </w:r>
+      <w:proofErr w:type="spellStart"/>
+      <w:r>
+        <w:rPr>
+          <w:rFonts w:ascii="Calibri" w:hAnsi="Calibri"/>
+          <w:sz w:val="21"/>
+        </w:rPr>
+        <w:t>mvn</w:t>
+      </w:r>
+      <w:proofErr w:type="spellEnd"/>
+      <w:r>
+        <w:rPr>
+          <w:rFonts w:ascii="Calibri" w:hAnsi="Calibri"/>
+          <w:sz w:val="21"/>
+        </w:rPr>
+        <w:t xml:space="preserve"> test` — all tests pass</w:t>
       </w:r>
     </w:p>
     <w:p>

</xml_diff>

<commit_message>
FDE-2: Add Idempotency Service Logic and its test
</commit_message>
<xml_diff>
--- a/Prompts-FDE- 2.docx
+++ b/Prompts-FDE- 2.docx
@@ -5397,6 +5397,1119 @@
           <w:sz w:val="21"/>
         </w:rPr>
         <w:t>10*0.05/100) = 0.9+0.12+0.005 = 1.025</w:t>
+      </w:r>
+    </w:p>
+    <w:p>
+      <w:pPr>
+        <w:pStyle w:val="ListBullet"/>
+        <w:tabs>
+          <w:tab w:val="num" w:pos="360"/>
+        </w:tabs>
+        <w:spacing w:after="40"/>
+        <w:ind w:left="360" w:hanging="360"/>
+      </w:pPr>
+      <w:r>
+        <w:rPr>
+          <w:rFonts w:ascii="Calibri" w:hAnsi="Calibri"/>
+          <w:sz w:val="21"/>
+        </w:rPr>
+        <w:t>Run `</w:t>
+      </w:r>
+      <w:proofErr w:type="spellStart"/>
+      <w:r>
+        <w:rPr>
+          <w:rFonts w:ascii="Calibri" w:hAnsi="Calibri"/>
+          <w:sz w:val="21"/>
+        </w:rPr>
+        <w:t>mvn</w:t>
+      </w:r>
+      <w:proofErr w:type="spellEnd"/>
+      <w:r>
+        <w:rPr>
+          <w:rFonts w:ascii="Calibri" w:hAnsi="Calibri"/>
+          <w:sz w:val="21"/>
+        </w:rPr>
+        <w:t xml:space="preserve"> test` — all tests pass</w:t>
+      </w:r>
+    </w:p>
+    <w:p>
+      <w:pPr>
+        <w:spacing w:before="40" w:after="40"/>
+      </w:pPr>
+      <w:r>
+        <w:rPr>
+          <w:color w:val="CCCCCC"/>
+          <w:sz w:val="16"/>
+        </w:rPr>
+        <w:t>──────────────────────────────────────────────────────────────────────────────────────────</w:t>
+      </w:r>
+    </w:p>
+    <w:p>
+      <w:pPr>
+        <w:spacing w:before="280" w:after="80"/>
+      </w:pPr>
+      <w:r>
+        <w:rPr>
+          <w:rFonts w:ascii="Calibri" w:hAnsi="Calibri"/>
+          <w:b/>
+          <w:color w:val="2E74B5"/>
+          <w:sz w:val="28"/>
+        </w:rPr>
+        <w:lastRenderedPageBreak/>
+        <w:t xml:space="preserve">STEP </w:t>
+      </w:r>
+      <w:proofErr w:type="gramStart"/>
+      <w:r>
+        <w:rPr>
+          <w:rFonts w:ascii="Calibri" w:hAnsi="Calibri"/>
+          <w:b/>
+          <w:color w:val="2E74B5"/>
+          <w:sz w:val="28"/>
+        </w:rPr>
+        <w:t>7</w:t>
+      </w:r>
+      <w:r>
+        <w:rPr>
+          <w:rFonts w:ascii="Calibri" w:hAnsi="Calibri"/>
+          <w:b/>
+          <w:color w:val="2E74B5"/>
+          <w:sz w:val="28"/>
+        </w:rPr>
+        <w:t xml:space="preserve">  —</w:t>
+      </w:r>
+      <w:proofErr w:type="gramEnd"/>
+      <w:r>
+        <w:rPr>
+          <w:rFonts w:ascii="Calibri" w:hAnsi="Calibri"/>
+          <w:b/>
+          <w:color w:val="2E74B5"/>
+          <w:sz w:val="28"/>
+        </w:rPr>
+        <w:t xml:space="preserve">  Idempotency Service</w:t>
+      </w:r>
+    </w:p>
+    <w:p>
+      <w:pPr>
+        <w:spacing w:after="60"/>
+      </w:pPr>
+      <w:r>
+        <w:rPr>
+          <w:rFonts w:ascii="Calibri" w:hAnsi="Calibri"/>
+          <w:b/>
+          <w:color w:val="2E74B5"/>
+        </w:rPr>
+        <w:t xml:space="preserve">Depends on: </w:t>
+      </w:r>
+      <w:r>
+        <w:rPr>
+          <w:rFonts w:ascii="Calibri" w:hAnsi="Calibri"/>
+        </w:rPr>
+        <w:t xml:space="preserve">Step </w:t>
+      </w:r>
+      <w:r>
+        <w:rPr>
+          <w:rFonts w:ascii="Calibri" w:hAnsi="Calibri"/>
+        </w:rPr>
+        <w:t>6</w:t>
+      </w:r>
+    </w:p>
+    <w:p>
+      <w:pPr>
+        <w:shd w:val="clear" w:color="auto" w:fill="F2F2F2"/>
+        <w:spacing w:after="0"/>
+        <w:ind w:left="288"/>
+      </w:pPr>
+      <w:r>
+        <w:rPr>
+          <w:rFonts w:ascii="Courier New" w:hAnsi="Courier New"/>
+          <w:sz w:val="18"/>
+        </w:rPr>
+        <w:t xml:space="preserve">In package </w:t>
+      </w:r>
+      <w:proofErr w:type="spellStart"/>
+      <w:proofErr w:type="gramStart"/>
+      <w:r>
+        <w:rPr>
+          <w:rFonts w:ascii="Courier New" w:hAnsi="Courier New"/>
+          <w:sz w:val="18"/>
+        </w:rPr>
+        <w:t>com.portfolio</w:t>
+      </w:r>
+      <w:proofErr w:type="gramEnd"/>
+      <w:r>
+        <w:rPr>
+          <w:rFonts w:ascii="Courier New" w:hAnsi="Courier New"/>
+          <w:sz w:val="18"/>
+        </w:rPr>
+        <w:t>.</w:t>
+      </w:r>
+      <w:proofErr w:type="gramStart"/>
+      <w:r>
+        <w:rPr>
+          <w:rFonts w:ascii="Courier New" w:hAnsi="Courier New"/>
+          <w:sz w:val="18"/>
+        </w:rPr>
+        <w:t>attribution.service</w:t>
+      </w:r>
+      <w:proofErr w:type="spellEnd"/>
+      <w:proofErr w:type="gramEnd"/>
+      <w:r>
+        <w:rPr>
+          <w:rFonts w:ascii="Courier New" w:hAnsi="Courier New"/>
+          <w:sz w:val="18"/>
+        </w:rPr>
+        <w:t xml:space="preserve">, create a class </w:t>
+      </w:r>
+      <w:proofErr w:type="spellStart"/>
+      <w:r>
+        <w:rPr>
+          <w:rFonts w:ascii="Courier New" w:hAnsi="Courier New"/>
+          <w:sz w:val="18"/>
+        </w:rPr>
+        <w:t>IdempotencyService</w:t>
+      </w:r>
+      <w:proofErr w:type="spellEnd"/>
+    </w:p>
+    <w:p>
+      <w:pPr>
+        <w:shd w:val="clear" w:color="auto" w:fill="F2F2F2"/>
+        <w:spacing w:after="0"/>
+        <w:ind w:left="288"/>
+      </w:pPr>
+      <w:r>
+        <w:rPr>
+          <w:rFonts w:ascii="Courier New" w:hAnsi="Courier New"/>
+          <w:sz w:val="18"/>
+        </w:rPr>
+        <w:t xml:space="preserve">with constructor injection of </w:t>
+      </w:r>
+      <w:proofErr w:type="spellStart"/>
+      <w:r>
+        <w:rPr>
+          <w:rFonts w:ascii="Courier New" w:hAnsi="Courier New"/>
+          <w:sz w:val="18"/>
+        </w:rPr>
+        <w:t>AttributionAuditRepository</w:t>
+      </w:r>
+      <w:proofErr w:type="spellEnd"/>
+      <w:r>
+        <w:rPr>
+          <w:rFonts w:ascii="Courier New" w:hAnsi="Courier New"/>
+          <w:sz w:val="18"/>
+        </w:rPr>
+        <w:t xml:space="preserve"> and </w:t>
+      </w:r>
+      <w:proofErr w:type="spellStart"/>
+      <w:r>
+        <w:rPr>
+          <w:rFonts w:ascii="Courier New" w:hAnsi="Courier New"/>
+          <w:sz w:val="18"/>
+        </w:rPr>
+        <w:t>ObjectMapper</w:t>
+      </w:r>
+      <w:proofErr w:type="spellEnd"/>
+      <w:r>
+        <w:rPr>
+          <w:rFonts w:ascii="Courier New" w:hAnsi="Courier New"/>
+          <w:sz w:val="18"/>
+        </w:rPr>
+        <w:t>:</w:t>
+      </w:r>
+    </w:p>
+    <w:p>
+      <w:pPr>
+        <w:shd w:val="clear" w:color="auto" w:fill="F2F2F2"/>
+        <w:spacing w:after="0"/>
+        <w:ind w:left="288"/>
+      </w:pPr>
+      <w:r>
+        <w:rPr>
+          <w:rFonts w:ascii="Courier New" w:hAnsi="Courier New"/>
+          <w:sz w:val="18"/>
+        </w:rPr>
+        <w:t xml:space="preserve"> </w:t>
+      </w:r>
+    </w:p>
+    <w:p>
+      <w:pPr>
+        <w:shd w:val="clear" w:color="auto" w:fill="F2F2F2"/>
+        <w:spacing w:after="0"/>
+        <w:ind w:left="288"/>
+      </w:pPr>
+      <w:r>
+        <w:rPr>
+          <w:rFonts w:ascii="Courier New" w:hAnsi="Courier New"/>
+          <w:sz w:val="18"/>
+        </w:rPr>
+        <w:t>Implement:</w:t>
+      </w:r>
+    </w:p>
+    <w:p>
+      <w:pPr>
+        <w:shd w:val="clear" w:color="auto" w:fill="F2F2F2"/>
+        <w:spacing w:after="0"/>
+        <w:ind w:left="288"/>
+      </w:pPr>
+      <w:r>
+        <w:rPr>
+          <w:rFonts w:ascii="Courier New" w:hAnsi="Courier New"/>
+          <w:sz w:val="18"/>
+        </w:rPr>
+        <w:t xml:space="preserve">  Optional&lt;</w:t>
+      </w:r>
+      <w:proofErr w:type="spellStart"/>
+      <w:r>
+        <w:rPr>
+          <w:rFonts w:ascii="Courier New" w:hAnsi="Courier New"/>
+          <w:sz w:val="18"/>
+        </w:rPr>
+        <w:t>AttributionResponse</w:t>
+      </w:r>
+      <w:proofErr w:type="spellEnd"/>
+      <w:r>
+        <w:rPr>
+          <w:rFonts w:ascii="Courier New" w:hAnsi="Courier New"/>
+          <w:sz w:val="18"/>
+        </w:rPr>
+        <w:t xml:space="preserve">&gt; </w:t>
+      </w:r>
+      <w:proofErr w:type="spellStart"/>
+      <w:proofErr w:type="gramStart"/>
+      <w:r>
+        <w:rPr>
+          <w:rFonts w:ascii="Courier New" w:hAnsi="Courier New"/>
+          <w:sz w:val="18"/>
+        </w:rPr>
+        <w:t>findExistingResult</w:t>
+      </w:r>
+      <w:proofErr w:type="spellEnd"/>
+      <w:r>
+        <w:rPr>
+          <w:rFonts w:ascii="Courier New" w:hAnsi="Courier New"/>
+          <w:sz w:val="18"/>
+        </w:rPr>
+        <w:t>(</w:t>
+      </w:r>
+      <w:proofErr w:type="gramEnd"/>
+      <w:r>
+        <w:rPr>
+          <w:rFonts w:ascii="Courier New" w:hAnsi="Courier New"/>
+          <w:sz w:val="18"/>
+        </w:rPr>
+        <w:t xml:space="preserve">String </w:t>
+      </w:r>
+      <w:proofErr w:type="spellStart"/>
+      <w:r>
+        <w:rPr>
+          <w:rFonts w:ascii="Courier New" w:hAnsi="Courier New"/>
+          <w:sz w:val="18"/>
+        </w:rPr>
+        <w:t>requestId</w:t>
+      </w:r>
+      <w:proofErr w:type="spellEnd"/>
+      <w:r>
+        <w:rPr>
+          <w:rFonts w:ascii="Courier New" w:hAnsi="Courier New"/>
+          <w:sz w:val="18"/>
+        </w:rPr>
+        <w:t>)</w:t>
+      </w:r>
+    </w:p>
+    <w:p>
+      <w:pPr>
+        <w:shd w:val="clear" w:color="auto" w:fill="F2F2F2"/>
+        <w:spacing w:after="0"/>
+        <w:ind w:left="288"/>
+      </w:pPr>
+      <w:r>
+        <w:rPr>
+          <w:rFonts w:ascii="Courier New" w:hAnsi="Courier New"/>
+          <w:sz w:val="18"/>
+        </w:rPr>
+        <w:t xml:space="preserve"> </w:t>
+      </w:r>
+    </w:p>
+    <w:p>
+      <w:pPr>
+        <w:shd w:val="clear" w:color="auto" w:fill="F2F2F2"/>
+        <w:spacing w:after="0"/>
+        <w:ind w:left="288"/>
+      </w:pPr>
+      <w:r>
+        <w:rPr>
+          <w:rFonts w:ascii="Courier New" w:hAnsi="Courier New"/>
+          <w:sz w:val="18"/>
+        </w:rPr>
+        <w:t>Logic:</w:t>
+      </w:r>
+    </w:p>
+    <w:p>
+      <w:pPr>
+        <w:shd w:val="clear" w:color="auto" w:fill="F2F2F2"/>
+        <w:spacing w:after="0"/>
+        <w:ind w:left="288"/>
+      </w:pPr>
+      <w:r>
+        <w:rPr>
+          <w:rFonts w:ascii="Courier New" w:hAnsi="Courier New"/>
+          <w:sz w:val="18"/>
+        </w:rPr>
+        <w:t xml:space="preserve">- Query </w:t>
+      </w:r>
+      <w:proofErr w:type="spellStart"/>
+      <w:r>
+        <w:rPr>
+          <w:rFonts w:ascii="Courier New" w:hAnsi="Courier New"/>
+          <w:sz w:val="18"/>
+        </w:rPr>
+        <w:t>AttributionAuditRepository.findByRequestId</w:t>
+      </w:r>
+      <w:proofErr w:type="spellEnd"/>
+      <w:r>
+        <w:rPr>
+          <w:rFonts w:ascii="Courier New" w:hAnsi="Courier New"/>
+          <w:sz w:val="18"/>
+        </w:rPr>
+        <w:t>(</w:t>
+      </w:r>
+      <w:proofErr w:type="spellStart"/>
+      <w:r>
+        <w:rPr>
+          <w:rFonts w:ascii="Courier New" w:hAnsi="Courier New"/>
+          <w:sz w:val="18"/>
+        </w:rPr>
+        <w:t>requestId</w:t>
+      </w:r>
+      <w:proofErr w:type="spellEnd"/>
+      <w:r>
+        <w:rPr>
+          <w:rFonts w:ascii="Courier New" w:hAnsi="Courier New"/>
+          <w:sz w:val="18"/>
+        </w:rPr>
+        <w:t>)</w:t>
+      </w:r>
+    </w:p>
+    <w:p>
+      <w:pPr>
+        <w:shd w:val="clear" w:color="auto" w:fill="F2F2F2"/>
+        <w:spacing w:after="0"/>
+        <w:ind w:left="288"/>
+      </w:pPr>
+      <w:r>
+        <w:rPr>
+          <w:rFonts w:ascii="Courier New" w:hAnsi="Courier New"/>
+          <w:sz w:val="18"/>
+        </w:rPr>
+        <w:t xml:space="preserve">- If present, reconstruct and return an </w:t>
+      </w:r>
+      <w:proofErr w:type="spellStart"/>
+      <w:r>
+        <w:rPr>
+          <w:rFonts w:ascii="Courier New" w:hAnsi="Courier New"/>
+          <w:sz w:val="18"/>
+        </w:rPr>
+        <w:t>AttributionResponse</w:t>
+      </w:r>
+      <w:proofErr w:type="spellEnd"/>
+      <w:r>
+        <w:rPr>
+          <w:rFonts w:ascii="Courier New" w:hAnsi="Courier New"/>
+          <w:sz w:val="18"/>
+        </w:rPr>
+        <w:t xml:space="preserve"> from the stored</w:t>
+      </w:r>
+    </w:p>
+    <w:p>
+      <w:pPr>
+        <w:shd w:val="clear" w:color="auto" w:fill="F2F2F2"/>
+        <w:spacing w:after="0"/>
+        <w:ind w:left="288"/>
+      </w:pPr>
+      <w:r>
+        <w:rPr>
+          <w:rFonts w:ascii="Courier New" w:hAnsi="Courier New"/>
+          <w:sz w:val="18"/>
+        </w:rPr>
+        <w:t xml:space="preserve">  </w:t>
+      </w:r>
+      <w:proofErr w:type="spellStart"/>
+      <w:r>
+        <w:rPr>
+          <w:rFonts w:ascii="Courier New" w:hAnsi="Courier New"/>
+          <w:sz w:val="18"/>
+        </w:rPr>
+        <w:t>AttributionAudit</w:t>
+      </w:r>
+      <w:proofErr w:type="spellEnd"/>
+      <w:r>
+        <w:rPr>
+          <w:rFonts w:ascii="Courier New" w:hAnsi="Courier New"/>
+          <w:sz w:val="18"/>
+        </w:rPr>
+        <w:t xml:space="preserve"> record:</w:t>
+      </w:r>
+    </w:p>
+    <w:p>
+      <w:pPr>
+        <w:shd w:val="clear" w:color="auto" w:fill="F2F2F2"/>
+        <w:spacing w:after="0"/>
+        <w:ind w:left="288"/>
+      </w:pPr>
+      <w:r>
+        <w:rPr>
+          <w:rFonts w:ascii="Courier New" w:hAnsi="Courier New"/>
+          <w:sz w:val="18"/>
+        </w:rPr>
+        <w:t xml:space="preserve">  - Deserialize </w:t>
+      </w:r>
+      <w:proofErr w:type="spellStart"/>
+      <w:r>
+        <w:rPr>
+          <w:rFonts w:ascii="Courier New" w:hAnsi="Courier New"/>
+          <w:sz w:val="18"/>
+        </w:rPr>
+        <w:t>groupContributionsJson</w:t>
+      </w:r>
+      <w:proofErr w:type="spellEnd"/>
+      <w:r>
+        <w:rPr>
+          <w:rFonts w:ascii="Courier New" w:hAnsi="Courier New"/>
+          <w:sz w:val="18"/>
+        </w:rPr>
+        <w:t xml:space="preserve"> back to List&lt;</w:t>
+      </w:r>
+      <w:proofErr w:type="spellStart"/>
+      <w:r>
+        <w:rPr>
+          <w:rFonts w:ascii="Courier New" w:hAnsi="Courier New"/>
+          <w:sz w:val="18"/>
+        </w:rPr>
+        <w:t>GroupContributionResult</w:t>
+      </w:r>
+      <w:proofErr w:type="spellEnd"/>
+      <w:r>
+        <w:rPr>
+          <w:rFonts w:ascii="Courier New" w:hAnsi="Courier New"/>
+          <w:sz w:val="18"/>
+        </w:rPr>
+        <w:t>&gt;</w:t>
+      </w:r>
+    </w:p>
+    <w:p>
+      <w:pPr>
+        <w:shd w:val="clear" w:color="auto" w:fill="F2F2F2"/>
+        <w:spacing w:after="0"/>
+        <w:ind w:left="288"/>
+      </w:pPr>
+      <w:r>
+        <w:rPr>
+          <w:rFonts w:ascii="Courier New" w:hAnsi="Courier New"/>
+          <w:sz w:val="18"/>
+        </w:rPr>
+        <w:t xml:space="preserve">    using </w:t>
+      </w:r>
+      <w:proofErr w:type="spellStart"/>
+      <w:r>
+        <w:rPr>
+          <w:rFonts w:ascii="Courier New" w:hAnsi="Courier New"/>
+          <w:sz w:val="18"/>
+        </w:rPr>
+        <w:t>ObjectMapper</w:t>
+      </w:r>
+      <w:proofErr w:type="spellEnd"/>
+    </w:p>
+    <w:p>
+      <w:pPr>
+        <w:shd w:val="clear" w:color="auto" w:fill="F2F2F2"/>
+        <w:spacing w:after="0"/>
+        <w:ind w:left="288"/>
+      </w:pPr>
+      <w:r>
+        <w:rPr>
+          <w:rFonts w:ascii="Courier New" w:hAnsi="Courier New"/>
+          <w:sz w:val="18"/>
+        </w:rPr>
+        <w:t xml:space="preserve">  - Deserialize warnings back to List&lt;String&gt; using </w:t>
+      </w:r>
+      <w:proofErr w:type="spellStart"/>
+      <w:r>
+        <w:rPr>
+          <w:rFonts w:ascii="Courier New" w:hAnsi="Courier New"/>
+          <w:sz w:val="18"/>
+        </w:rPr>
+        <w:t>ObjectMapper</w:t>
+      </w:r>
+      <w:proofErr w:type="spellEnd"/>
+    </w:p>
+    <w:p>
+      <w:pPr>
+        <w:shd w:val="clear" w:color="auto" w:fill="F2F2F2"/>
+        <w:spacing w:after="0"/>
+        <w:ind w:left="288"/>
+      </w:pPr>
+      <w:r>
+        <w:rPr>
+          <w:rFonts w:ascii="Courier New" w:hAnsi="Courier New"/>
+          <w:sz w:val="18"/>
+        </w:rPr>
+        <w:t xml:space="preserve">  - Map all other fields directly</w:t>
+      </w:r>
+    </w:p>
+    <w:p>
+      <w:pPr>
+        <w:shd w:val="clear" w:color="auto" w:fill="F2F2F2"/>
+        <w:spacing w:after="0"/>
+        <w:ind w:left="288"/>
+      </w:pPr>
+      <w:r>
+        <w:rPr>
+          <w:rFonts w:ascii="Courier New" w:hAnsi="Courier New"/>
+          <w:sz w:val="18"/>
+        </w:rPr>
+        <w:t xml:space="preserve">  - Return </w:t>
+      </w:r>
+      <w:proofErr w:type="spellStart"/>
+      <w:r>
+        <w:rPr>
+          <w:rFonts w:ascii="Courier New" w:hAnsi="Courier New"/>
+          <w:sz w:val="18"/>
+        </w:rPr>
+        <w:t>Optional.of</w:t>
+      </w:r>
+      <w:proofErr w:type="spellEnd"/>
+      <w:r>
+        <w:rPr>
+          <w:rFonts w:ascii="Courier New" w:hAnsi="Courier New"/>
+          <w:sz w:val="18"/>
+        </w:rPr>
+        <w:t>(reconstructed response)</w:t>
+      </w:r>
+    </w:p>
+    <w:p>
+      <w:pPr>
+        <w:shd w:val="clear" w:color="auto" w:fill="F2F2F2"/>
+        <w:spacing w:after="0"/>
+        <w:ind w:left="288"/>
+      </w:pPr>
+      <w:r>
+        <w:rPr>
+          <w:rFonts w:ascii="Courier New" w:hAnsi="Courier New"/>
+          <w:sz w:val="18"/>
+        </w:rPr>
+        <w:t xml:space="preserve">- If not present, return </w:t>
+      </w:r>
+      <w:proofErr w:type="spellStart"/>
+      <w:r>
+        <w:rPr>
+          <w:rFonts w:ascii="Courier New" w:hAnsi="Courier New"/>
+          <w:sz w:val="18"/>
+        </w:rPr>
+        <w:t>Optional.empty</w:t>
+      </w:r>
+      <w:proofErr w:type="spellEnd"/>
+      <w:r>
+        <w:rPr>
+          <w:rFonts w:ascii="Courier New" w:hAnsi="Courier New"/>
+          <w:sz w:val="18"/>
+        </w:rPr>
+        <w:t>()</w:t>
+      </w:r>
+    </w:p>
+    <w:p>
+      <w:pPr>
+        <w:shd w:val="clear" w:color="auto" w:fill="F2F2F2"/>
+        <w:spacing w:after="0"/>
+        <w:ind w:left="288"/>
+      </w:pPr>
+      <w:r>
+        <w:rPr>
+          <w:rFonts w:ascii="Courier New" w:hAnsi="Courier New"/>
+          <w:sz w:val="18"/>
+        </w:rPr>
+        <w:t xml:space="preserve"> </w:t>
+      </w:r>
+    </w:p>
+    <w:p>
+      <w:pPr>
+        <w:shd w:val="clear" w:color="auto" w:fill="F2F2F2"/>
+        <w:spacing w:after="0"/>
+        <w:ind w:left="288"/>
+      </w:pPr>
+      <w:r>
+        <w:rPr>
+          <w:rFonts w:ascii="Courier New" w:hAnsi="Courier New"/>
+          <w:sz w:val="18"/>
+        </w:rPr>
+        <w:t>Also implement:</w:t>
+      </w:r>
+    </w:p>
+    <w:p>
+      <w:pPr>
+        <w:shd w:val="clear" w:color="auto" w:fill="F2F2F2"/>
+        <w:spacing w:after="0"/>
+        <w:ind w:left="288"/>
+      </w:pPr>
+      <w:r>
+        <w:rPr>
+          <w:rFonts w:ascii="Courier New" w:hAnsi="Courier New"/>
+          <w:sz w:val="18"/>
+        </w:rPr>
+        <w:t xml:space="preserve">  void </w:t>
+      </w:r>
+      <w:proofErr w:type="spellStart"/>
+      <w:proofErr w:type="gramStart"/>
+      <w:r>
+        <w:rPr>
+          <w:rFonts w:ascii="Courier New" w:hAnsi="Courier New"/>
+          <w:sz w:val="18"/>
+        </w:rPr>
+        <w:t>persistResult</w:t>
+      </w:r>
+      <w:proofErr w:type="spellEnd"/>
+      <w:r>
+        <w:rPr>
+          <w:rFonts w:ascii="Courier New" w:hAnsi="Courier New"/>
+          <w:sz w:val="18"/>
+        </w:rPr>
+        <w:t>(</w:t>
+      </w:r>
+      <w:proofErr w:type="spellStart"/>
+      <w:proofErr w:type="gramEnd"/>
+      <w:r>
+        <w:rPr>
+          <w:rFonts w:ascii="Courier New" w:hAnsi="Courier New"/>
+          <w:sz w:val="18"/>
+        </w:rPr>
+        <w:t>AttributionRequest</w:t>
+      </w:r>
+      <w:proofErr w:type="spellEnd"/>
+      <w:r>
+        <w:rPr>
+          <w:rFonts w:ascii="Courier New" w:hAnsi="Courier New"/>
+          <w:sz w:val="18"/>
+        </w:rPr>
+        <w:t xml:space="preserve"> request, </w:t>
+      </w:r>
+      <w:proofErr w:type="spellStart"/>
+      <w:r>
+        <w:rPr>
+          <w:rFonts w:ascii="Courier New" w:hAnsi="Courier New"/>
+          <w:sz w:val="18"/>
+        </w:rPr>
+        <w:t>AttributionResponse</w:t>
+      </w:r>
+      <w:proofErr w:type="spellEnd"/>
+      <w:r>
+        <w:rPr>
+          <w:rFonts w:ascii="Courier New" w:hAnsi="Courier New"/>
+          <w:sz w:val="18"/>
+        </w:rPr>
+        <w:t xml:space="preserve"> response)</w:t>
+      </w:r>
+    </w:p>
+    <w:p>
+      <w:pPr>
+        <w:shd w:val="clear" w:color="auto" w:fill="F2F2F2"/>
+        <w:spacing w:after="0"/>
+        <w:ind w:left="288"/>
+      </w:pPr>
+      <w:r>
+        <w:rPr>
+          <w:rFonts w:ascii="Courier New" w:hAnsi="Courier New"/>
+          <w:sz w:val="18"/>
+        </w:rPr>
+        <w:t xml:space="preserve"> </w:t>
+      </w:r>
+    </w:p>
+    <w:p>
+      <w:pPr>
+        <w:shd w:val="clear" w:color="auto" w:fill="F2F2F2"/>
+        <w:spacing w:after="0"/>
+        <w:ind w:left="288"/>
+      </w:pPr>
+      <w:r>
+        <w:rPr>
+          <w:rFonts w:ascii="Courier New" w:hAnsi="Courier New"/>
+          <w:sz w:val="18"/>
+        </w:rPr>
+        <w:t>Logic:</w:t>
+      </w:r>
+    </w:p>
+    <w:p>
+      <w:pPr>
+        <w:shd w:val="clear" w:color="auto" w:fill="F2F2F2"/>
+        <w:spacing w:after="0"/>
+        <w:ind w:left="288"/>
+      </w:pPr>
+      <w:r>
+        <w:rPr>
+          <w:rFonts w:ascii="Courier New" w:hAnsi="Courier New"/>
+          <w:sz w:val="18"/>
+        </w:rPr>
+        <w:t xml:space="preserve">- Map request + response fields to a new </w:t>
+      </w:r>
+      <w:proofErr w:type="spellStart"/>
+      <w:r>
+        <w:rPr>
+          <w:rFonts w:ascii="Courier New" w:hAnsi="Courier New"/>
+          <w:sz w:val="18"/>
+        </w:rPr>
+        <w:t>AttributionAudit</w:t>
+      </w:r>
+      <w:proofErr w:type="spellEnd"/>
+      <w:r>
+        <w:rPr>
+          <w:rFonts w:ascii="Courier New" w:hAnsi="Courier New"/>
+          <w:sz w:val="18"/>
+        </w:rPr>
+        <w:t xml:space="preserve"> entity</w:t>
+      </w:r>
+    </w:p>
+    <w:p>
+      <w:pPr>
+        <w:shd w:val="clear" w:color="auto" w:fill="F2F2F2"/>
+        <w:spacing w:after="0"/>
+        <w:ind w:left="288"/>
+      </w:pPr>
+      <w:r>
+        <w:rPr>
+          <w:rFonts w:ascii="Courier New" w:hAnsi="Courier New"/>
+          <w:sz w:val="18"/>
+        </w:rPr>
+        <w:t xml:space="preserve">- Serialize </w:t>
+      </w:r>
+      <w:proofErr w:type="spellStart"/>
+      <w:proofErr w:type="gramStart"/>
+      <w:r>
+        <w:rPr>
+          <w:rFonts w:ascii="Courier New" w:hAnsi="Courier New"/>
+          <w:sz w:val="18"/>
+        </w:rPr>
+        <w:t>response.getGroupContributions</w:t>
+      </w:r>
+      <w:proofErr w:type="spellEnd"/>
+      <w:proofErr w:type="gramEnd"/>
+      <w:r>
+        <w:rPr>
+          <w:rFonts w:ascii="Courier New" w:hAnsi="Courier New"/>
+          <w:sz w:val="18"/>
+        </w:rPr>
+        <w:t>() to JSON string for storage</w:t>
+      </w:r>
+    </w:p>
+    <w:p>
+      <w:pPr>
+        <w:shd w:val="clear" w:color="auto" w:fill="F2F2F2"/>
+        <w:spacing w:after="0"/>
+        <w:ind w:left="288"/>
+      </w:pPr>
+      <w:r>
+        <w:rPr>
+          <w:rFonts w:ascii="Courier New" w:hAnsi="Courier New"/>
+          <w:sz w:val="18"/>
+        </w:rPr>
+        <w:t xml:space="preserve">- Serialize </w:t>
+      </w:r>
+      <w:proofErr w:type="spellStart"/>
+      <w:proofErr w:type="gramStart"/>
+      <w:r>
+        <w:rPr>
+          <w:rFonts w:ascii="Courier New" w:hAnsi="Courier New"/>
+          <w:sz w:val="18"/>
+        </w:rPr>
+        <w:t>response.getWarnings</w:t>
+      </w:r>
+      <w:proofErr w:type="spellEnd"/>
+      <w:proofErr w:type="gramEnd"/>
+      <w:r>
+        <w:rPr>
+          <w:rFonts w:ascii="Courier New" w:hAnsi="Courier New"/>
+          <w:sz w:val="18"/>
+        </w:rPr>
+        <w:t>() to JSON string for storage</w:t>
+      </w:r>
+    </w:p>
+    <w:p>
+      <w:pPr>
+        <w:shd w:val="clear" w:color="auto" w:fill="F2F2F2"/>
+        <w:spacing w:after="0"/>
+        <w:ind w:left="288"/>
+      </w:pPr>
+      <w:r>
+        <w:rPr>
+          <w:rFonts w:ascii="Courier New" w:hAnsi="Courier New"/>
+          <w:sz w:val="18"/>
+        </w:rPr>
+        <w:t xml:space="preserve">- Save via </w:t>
+      </w:r>
+      <w:proofErr w:type="spellStart"/>
+      <w:r>
+        <w:rPr>
+          <w:rFonts w:ascii="Courier New" w:hAnsi="Courier New"/>
+          <w:sz w:val="18"/>
+        </w:rPr>
+        <w:t>AttributionAuditRepository</w:t>
+      </w:r>
+      <w:proofErr w:type="spellEnd"/>
+    </w:p>
+    <w:p>
+      <w:pPr>
+        <w:shd w:val="clear" w:color="auto" w:fill="F2F2F2"/>
+        <w:spacing w:after="0"/>
+        <w:ind w:left="288"/>
+      </w:pPr>
+      <w:r>
+        <w:rPr>
+          <w:rFonts w:ascii="Courier New" w:hAnsi="Courier New"/>
+          <w:sz w:val="18"/>
+        </w:rPr>
+        <w:t xml:space="preserve"> </w:t>
+      </w:r>
+    </w:p>
+    <w:p>
+      <w:pPr>
+        <w:shd w:val="clear" w:color="auto" w:fill="F2F2F2"/>
+        <w:spacing w:after="0"/>
+        <w:ind w:left="288"/>
+      </w:pPr>
+      <w:r>
+        <w:rPr>
+          <w:rFonts w:ascii="Courier New" w:hAnsi="Courier New"/>
+          <w:sz w:val="18"/>
+        </w:rPr>
+        <w:t xml:space="preserve">Annotate </w:t>
+      </w:r>
+      <w:proofErr w:type="spellStart"/>
+      <w:r>
+        <w:rPr>
+          <w:rFonts w:ascii="Courier New" w:hAnsi="Courier New"/>
+          <w:sz w:val="18"/>
+        </w:rPr>
+        <w:t>IdempotencyService</w:t>
+      </w:r>
+      <w:proofErr w:type="spellEnd"/>
+      <w:r>
+        <w:rPr>
+          <w:rFonts w:ascii="Courier New" w:hAnsi="Courier New"/>
+          <w:sz w:val="18"/>
+        </w:rPr>
+        <w:t xml:space="preserve"> with @Service. Use @Slf4j and log at INFO level</w:t>
+      </w:r>
+    </w:p>
+    <w:p>
+      <w:pPr>
+        <w:shd w:val="clear" w:color="auto" w:fill="F2F2F2"/>
+        <w:spacing w:after="0"/>
+        <w:ind w:left="288"/>
+      </w:pPr>
+      <w:r>
+        <w:rPr>
+          <w:rFonts w:ascii="Courier New" w:hAnsi="Courier New"/>
+          <w:sz w:val="18"/>
+        </w:rPr>
+        <w:t xml:space="preserve">when a duplicate </w:t>
+      </w:r>
+      <w:proofErr w:type="spellStart"/>
+      <w:r>
+        <w:rPr>
+          <w:rFonts w:ascii="Courier New" w:hAnsi="Courier New"/>
+          <w:sz w:val="18"/>
+        </w:rPr>
+        <w:t>requestId</w:t>
+      </w:r>
+      <w:proofErr w:type="spellEnd"/>
+      <w:r>
+        <w:rPr>
+          <w:rFonts w:ascii="Courier New" w:hAnsi="Courier New"/>
+          <w:sz w:val="18"/>
+        </w:rPr>
+        <w:t xml:space="preserve"> is detected (idempotency hit).</w:t>
+      </w:r>
+    </w:p>
+    <w:p/>
+    <w:p>
+      <w:pPr>
+        <w:spacing w:before="120" w:after="40"/>
+      </w:pPr>
+      <w:r>
+        <w:rPr>
+          <w:rFonts w:ascii="Calibri" w:hAnsi="Calibri"/>
+          <w:b/>
+          <w:color w:val="1F497D"/>
+        </w:rPr>
+        <w:t>Validation Gate</w:t>
+      </w:r>
+    </w:p>
+    <w:p>
+      <w:pPr>
+        <w:pStyle w:val="ListBullet"/>
+        <w:tabs>
+          <w:tab w:val="num" w:pos="360"/>
+        </w:tabs>
+        <w:spacing w:after="40"/>
+        <w:ind w:left="360" w:hanging="360"/>
+      </w:pPr>
+      <w:r>
+        <w:rPr>
+          <w:rFonts w:ascii="Calibri" w:hAnsi="Calibri"/>
+          <w:sz w:val="21"/>
+        </w:rPr>
+        <w:t xml:space="preserve">First call with </w:t>
+      </w:r>
+      <w:proofErr w:type="spellStart"/>
+      <w:r>
+        <w:rPr>
+          <w:rFonts w:ascii="Calibri" w:hAnsi="Calibri"/>
+          <w:sz w:val="21"/>
+        </w:rPr>
+        <w:t>requestId</w:t>
+      </w:r>
+      <w:proofErr w:type="spellEnd"/>
+      <w:r>
+        <w:rPr>
+          <w:rFonts w:ascii="Calibri" w:hAnsi="Calibri"/>
+          <w:sz w:val="21"/>
+        </w:rPr>
+        <w:t xml:space="preserve">='ATTR-TEST-01' — </w:t>
+      </w:r>
+      <w:proofErr w:type="spellStart"/>
+      <w:r>
+        <w:rPr>
+          <w:rFonts w:ascii="Calibri" w:hAnsi="Calibri"/>
+          <w:sz w:val="21"/>
+        </w:rPr>
+        <w:t>findExistingResult</w:t>
+      </w:r>
+      <w:proofErr w:type="spellEnd"/>
+      <w:r>
+        <w:rPr>
+          <w:rFonts w:ascii="Calibri" w:hAnsi="Calibri"/>
+          <w:sz w:val="21"/>
+        </w:rPr>
+        <w:t xml:space="preserve"> returns empty</w:t>
+      </w:r>
+    </w:p>
+    <w:p>
+      <w:pPr>
+        <w:pStyle w:val="ListBullet"/>
+        <w:tabs>
+          <w:tab w:val="num" w:pos="360"/>
+        </w:tabs>
+        <w:spacing w:after="40"/>
+        <w:ind w:left="360" w:hanging="360"/>
+      </w:pPr>
+      <w:r>
+        <w:rPr>
+          <w:rFonts w:ascii="Calibri" w:hAnsi="Calibri"/>
+          <w:sz w:val="21"/>
+        </w:rPr>
+        <w:t xml:space="preserve">After </w:t>
+      </w:r>
+      <w:proofErr w:type="spellStart"/>
+      <w:r>
+        <w:rPr>
+          <w:rFonts w:ascii="Calibri" w:hAnsi="Calibri"/>
+          <w:sz w:val="21"/>
+        </w:rPr>
+        <w:t>persistResult</w:t>
+      </w:r>
+      <w:proofErr w:type="spellEnd"/>
+      <w:r>
+        <w:rPr>
+          <w:rFonts w:ascii="Calibri" w:hAnsi="Calibri"/>
+          <w:sz w:val="21"/>
+        </w:rPr>
+        <w:t xml:space="preserve">, second call with same </w:t>
+      </w:r>
+      <w:proofErr w:type="spellStart"/>
+      <w:r>
+        <w:rPr>
+          <w:rFonts w:ascii="Calibri" w:hAnsi="Calibri"/>
+          <w:sz w:val="21"/>
+        </w:rPr>
+        <w:t>requestId</w:t>
+      </w:r>
+      <w:proofErr w:type="spellEnd"/>
+      <w:r>
+        <w:rPr>
+          <w:rFonts w:ascii="Calibri" w:hAnsi="Calibri"/>
+          <w:sz w:val="21"/>
+        </w:rPr>
+        <w:t xml:space="preserve"> — </w:t>
+      </w:r>
+      <w:proofErr w:type="spellStart"/>
+      <w:r>
+        <w:rPr>
+          <w:rFonts w:ascii="Calibri" w:hAnsi="Calibri"/>
+          <w:sz w:val="21"/>
+        </w:rPr>
+        <w:t>findExistingResult</w:t>
+      </w:r>
+      <w:proofErr w:type="spellEnd"/>
+      <w:r>
+        <w:rPr>
+          <w:rFonts w:ascii="Calibri" w:hAnsi="Calibri"/>
+          <w:sz w:val="21"/>
+        </w:rPr>
+        <w:t xml:space="preserve"> returns stored response with matching </w:t>
+      </w:r>
+      <w:proofErr w:type="spellStart"/>
+      <w:r>
+        <w:rPr>
+          <w:rFonts w:ascii="Calibri" w:hAnsi="Calibri"/>
+          <w:sz w:val="21"/>
+        </w:rPr>
+        <w:t>portfolioId</w:t>
+      </w:r>
+      <w:proofErr w:type="spellEnd"/>
+    </w:p>
+    <w:p>
+      <w:pPr>
+        <w:pStyle w:val="ListBullet"/>
+        <w:tabs>
+          <w:tab w:val="num" w:pos="360"/>
+        </w:tabs>
+        <w:spacing w:after="40"/>
+        <w:ind w:left="360" w:hanging="360"/>
+      </w:pPr>
+      <w:r>
+        <w:rPr>
+          <w:rFonts w:ascii="Calibri" w:hAnsi="Calibri"/>
+          <w:sz w:val="21"/>
+        </w:rPr>
+        <w:t xml:space="preserve">Verify no second </w:t>
+      </w:r>
+      <w:proofErr w:type="spellStart"/>
+      <w:r>
+        <w:rPr>
+          <w:rFonts w:ascii="Calibri" w:hAnsi="Calibri"/>
+          <w:sz w:val="21"/>
+        </w:rPr>
+        <w:t>AttributionAudit</w:t>
+      </w:r>
+      <w:proofErr w:type="spellEnd"/>
+      <w:r>
+        <w:rPr>
+          <w:rFonts w:ascii="Calibri" w:hAnsi="Calibri"/>
+          <w:sz w:val="21"/>
+        </w:rPr>
+        <w:t xml:space="preserve"> row is created for the same </w:t>
+      </w:r>
+      <w:proofErr w:type="spellStart"/>
+      <w:r>
+        <w:rPr>
+          <w:rFonts w:ascii="Calibri" w:hAnsi="Calibri"/>
+          <w:sz w:val="21"/>
+        </w:rPr>
+        <w:t>requestId</w:t>
+      </w:r>
+      <w:proofErr w:type="spellEnd"/>
+      <w:r>
+        <w:rPr>
+          <w:rFonts w:ascii="Calibri" w:hAnsi="Calibri"/>
+          <w:sz w:val="21"/>
+        </w:rPr>
+        <w:t xml:space="preserve"> (count query returns 1)</w:t>
       </w:r>
     </w:p>
     <w:p>

</xml_diff>

<commit_message>
FDE-2: Add Attribution Orchestration Service and its test
</commit_message>
<xml_diff>
--- a/Prompts-FDE- 2.docx
+++ b/Prompts-FDE- 2.docx
@@ -6510,6 +6510,1003 @@
           <w:sz w:val="21"/>
         </w:rPr>
         <w:t xml:space="preserve"> (count query returns 1)</w:t>
+      </w:r>
+    </w:p>
+    <w:p>
+      <w:pPr>
+        <w:pStyle w:val="ListBullet"/>
+        <w:tabs>
+          <w:tab w:val="num" w:pos="360"/>
+        </w:tabs>
+        <w:spacing w:after="40"/>
+        <w:ind w:left="360" w:hanging="360"/>
+      </w:pPr>
+      <w:r>
+        <w:rPr>
+          <w:rFonts w:ascii="Calibri" w:hAnsi="Calibri"/>
+          <w:sz w:val="21"/>
+        </w:rPr>
+        <w:t>Run `</w:t>
+      </w:r>
+      <w:proofErr w:type="spellStart"/>
+      <w:r>
+        <w:rPr>
+          <w:rFonts w:ascii="Calibri" w:hAnsi="Calibri"/>
+          <w:sz w:val="21"/>
+        </w:rPr>
+        <w:t>mvn</w:t>
+      </w:r>
+      <w:proofErr w:type="spellEnd"/>
+      <w:r>
+        <w:rPr>
+          <w:rFonts w:ascii="Calibri" w:hAnsi="Calibri"/>
+          <w:sz w:val="21"/>
+        </w:rPr>
+        <w:t xml:space="preserve"> test` — all tests pass</w:t>
+      </w:r>
+    </w:p>
+    <w:p>
+      <w:pPr>
+        <w:spacing w:before="40" w:after="40"/>
+      </w:pPr>
+      <w:r>
+        <w:rPr>
+          <w:color w:val="CCCCCC"/>
+          <w:sz w:val="16"/>
+        </w:rPr>
+        <w:t>──────────────────────────────────────────────────────────────────────────────────────────</w:t>
+      </w:r>
+    </w:p>
+    <w:p>
+      <w:pPr>
+        <w:spacing w:before="280" w:after="80"/>
+      </w:pPr>
+      <w:r>
+        <w:rPr>
+          <w:rFonts w:ascii="Calibri" w:hAnsi="Calibri"/>
+          <w:b/>
+          <w:color w:val="2E74B5"/>
+          <w:sz w:val="28"/>
+        </w:rPr>
+        <w:t xml:space="preserve">STEP </w:t>
+      </w:r>
+      <w:proofErr w:type="gramStart"/>
+      <w:r>
+        <w:rPr>
+          <w:rFonts w:ascii="Calibri" w:hAnsi="Calibri"/>
+          <w:b/>
+          <w:color w:val="2E74B5"/>
+          <w:sz w:val="28"/>
+        </w:rPr>
+        <w:t>8</w:t>
+      </w:r>
+      <w:r>
+        <w:rPr>
+          <w:rFonts w:ascii="Calibri" w:hAnsi="Calibri"/>
+          <w:b/>
+          <w:color w:val="2E74B5"/>
+          <w:sz w:val="28"/>
+        </w:rPr>
+        <w:t xml:space="preserve">  —</w:t>
+      </w:r>
+      <w:proofErr w:type="gramEnd"/>
+      <w:r>
+        <w:rPr>
+          <w:rFonts w:ascii="Calibri" w:hAnsi="Calibri"/>
+          <w:b/>
+          <w:color w:val="2E74B5"/>
+          <w:sz w:val="28"/>
+        </w:rPr>
+        <w:t xml:space="preserve">  Attribution Orchestration Service</w:t>
+      </w:r>
+    </w:p>
+    <w:p>
+      <w:pPr>
+        <w:spacing w:after="60"/>
+      </w:pPr>
+      <w:r>
+        <w:rPr>
+          <w:rFonts w:ascii="Calibri" w:hAnsi="Calibri"/>
+          <w:b/>
+          <w:color w:val="2E74B5"/>
+        </w:rPr>
+        <w:t xml:space="preserve">Depends on: </w:t>
+      </w:r>
+      <w:r>
+        <w:rPr>
+          <w:rFonts w:ascii="Calibri" w:hAnsi="Calibri"/>
+        </w:rPr>
+        <w:t xml:space="preserve">Step </w:t>
+      </w:r>
+      <w:r>
+        <w:rPr>
+          <w:rFonts w:ascii="Calibri" w:hAnsi="Calibri"/>
+        </w:rPr>
+        <w:t>7</w:t>
+      </w:r>
+    </w:p>
+    <w:p>
+      <w:pPr>
+        <w:shd w:val="clear" w:color="auto" w:fill="F2F2F2"/>
+        <w:spacing w:after="0"/>
+        <w:ind w:left="288"/>
+      </w:pPr>
+      <w:r>
+        <w:rPr>
+          <w:rFonts w:ascii="Courier New" w:hAnsi="Courier New"/>
+          <w:sz w:val="18"/>
+        </w:rPr>
+        <w:t xml:space="preserve">In package </w:t>
+      </w:r>
+      <w:proofErr w:type="spellStart"/>
+      <w:proofErr w:type="gramStart"/>
+      <w:r>
+        <w:rPr>
+          <w:rFonts w:ascii="Courier New" w:hAnsi="Courier New"/>
+          <w:sz w:val="18"/>
+        </w:rPr>
+        <w:t>com.portfolio</w:t>
+      </w:r>
+      <w:proofErr w:type="gramEnd"/>
+      <w:r>
+        <w:rPr>
+          <w:rFonts w:ascii="Courier New" w:hAnsi="Courier New"/>
+          <w:sz w:val="18"/>
+        </w:rPr>
+        <w:t>.</w:t>
+      </w:r>
+      <w:proofErr w:type="gramStart"/>
+      <w:r>
+        <w:rPr>
+          <w:rFonts w:ascii="Courier New" w:hAnsi="Courier New"/>
+          <w:sz w:val="18"/>
+        </w:rPr>
+        <w:t>attribution.service</w:t>
+      </w:r>
+      <w:proofErr w:type="spellEnd"/>
+      <w:proofErr w:type="gramEnd"/>
+      <w:r>
+        <w:rPr>
+          <w:rFonts w:ascii="Courier New" w:hAnsi="Courier New"/>
+          <w:sz w:val="18"/>
+        </w:rPr>
+        <w:t>, create an interface</w:t>
+      </w:r>
+    </w:p>
+    <w:p>
+      <w:pPr>
+        <w:shd w:val="clear" w:color="auto" w:fill="F2F2F2"/>
+        <w:spacing w:after="0"/>
+        <w:ind w:left="288"/>
+      </w:pPr>
+      <w:proofErr w:type="spellStart"/>
+      <w:r>
+        <w:rPr>
+          <w:rFonts w:ascii="Courier New" w:hAnsi="Courier New"/>
+          <w:sz w:val="18"/>
+        </w:rPr>
+        <w:t>AttributionService</w:t>
+      </w:r>
+      <w:proofErr w:type="spellEnd"/>
+      <w:r>
+        <w:rPr>
+          <w:rFonts w:ascii="Courier New" w:hAnsi="Courier New"/>
+          <w:sz w:val="18"/>
+        </w:rPr>
+        <w:t xml:space="preserve"> with method:</w:t>
+      </w:r>
+    </w:p>
+    <w:p>
+      <w:pPr>
+        <w:shd w:val="clear" w:color="auto" w:fill="F2F2F2"/>
+        <w:spacing w:after="0"/>
+        <w:ind w:left="288"/>
+      </w:pPr>
+      <w:r>
+        <w:rPr>
+          <w:rFonts w:ascii="Courier New" w:hAnsi="Courier New"/>
+          <w:sz w:val="18"/>
+        </w:rPr>
+        <w:t xml:space="preserve"> </w:t>
+      </w:r>
+    </w:p>
+    <w:p>
+      <w:pPr>
+        <w:shd w:val="clear" w:color="auto" w:fill="F2F2F2"/>
+        <w:spacing w:after="0"/>
+        <w:ind w:left="288"/>
+      </w:pPr>
+      <w:r>
+        <w:rPr>
+          <w:rFonts w:ascii="Courier New" w:hAnsi="Courier New"/>
+          <w:sz w:val="18"/>
+        </w:rPr>
+        <w:t xml:space="preserve">  </w:t>
+      </w:r>
+      <w:proofErr w:type="spellStart"/>
+      <w:r>
+        <w:rPr>
+          <w:rFonts w:ascii="Courier New" w:hAnsi="Courier New"/>
+          <w:sz w:val="18"/>
+        </w:rPr>
+        <w:t>AttributionResponse</w:t>
+      </w:r>
+      <w:proofErr w:type="spellEnd"/>
+      <w:r>
+        <w:rPr>
+          <w:rFonts w:ascii="Courier New" w:hAnsi="Courier New"/>
+          <w:sz w:val="18"/>
+        </w:rPr>
+        <w:t xml:space="preserve"> </w:t>
+      </w:r>
+      <w:proofErr w:type="spellStart"/>
+      <w:proofErr w:type="gramStart"/>
+      <w:r>
+        <w:rPr>
+          <w:rFonts w:ascii="Courier New" w:hAnsi="Courier New"/>
+          <w:sz w:val="18"/>
+        </w:rPr>
+        <w:t>processAttribution</w:t>
+      </w:r>
+      <w:proofErr w:type="spellEnd"/>
+      <w:r>
+        <w:rPr>
+          <w:rFonts w:ascii="Courier New" w:hAnsi="Courier New"/>
+          <w:sz w:val="18"/>
+        </w:rPr>
+        <w:t>(</w:t>
+      </w:r>
+      <w:proofErr w:type="spellStart"/>
+      <w:proofErr w:type="gramEnd"/>
+      <w:r>
+        <w:rPr>
+          <w:rFonts w:ascii="Courier New" w:hAnsi="Courier New"/>
+          <w:sz w:val="18"/>
+        </w:rPr>
+        <w:t>AttributionRequest</w:t>
+      </w:r>
+      <w:proofErr w:type="spellEnd"/>
+      <w:r>
+        <w:rPr>
+          <w:rFonts w:ascii="Courier New" w:hAnsi="Courier New"/>
+          <w:sz w:val="18"/>
+        </w:rPr>
+        <w:t xml:space="preserve"> request)</w:t>
+      </w:r>
+    </w:p>
+    <w:p>
+      <w:pPr>
+        <w:shd w:val="clear" w:color="auto" w:fill="F2F2F2"/>
+        <w:spacing w:after="0"/>
+        <w:ind w:left="288"/>
+      </w:pPr>
+      <w:r>
+        <w:rPr>
+          <w:rFonts w:ascii="Courier New" w:hAnsi="Courier New"/>
+          <w:sz w:val="18"/>
+        </w:rPr>
+        <w:t xml:space="preserve"> </w:t>
+      </w:r>
+    </w:p>
+    <w:p>
+      <w:pPr>
+        <w:shd w:val="clear" w:color="auto" w:fill="F2F2F2"/>
+        <w:spacing w:after="0"/>
+        <w:ind w:left="288"/>
+      </w:pPr>
+      <w:r>
+        <w:rPr>
+          <w:rFonts w:ascii="Courier New" w:hAnsi="Courier New"/>
+          <w:sz w:val="18"/>
+        </w:rPr>
+        <w:t xml:space="preserve">Create the implementation class </w:t>
+      </w:r>
+      <w:proofErr w:type="spellStart"/>
+      <w:r>
+        <w:rPr>
+          <w:rFonts w:ascii="Courier New" w:hAnsi="Courier New"/>
+          <w:sz w:val="18"/>
+        </w:rPr>
+        <w:t>AttributionServiceImpl</w:t>
+      </w:r>
+      <w:proofErr w:type="spellEnd"/>
+      <w:r>
+        <w:rPr>
+          <w:rFonts w:ascii="Courier New" w:hAnsi="Courier New"/>
+          <w:sz w:val="18"/>
+        </w:rPr>
+        <w:t xml:space="preserve"> annotated with @Service,</w:t>
+      </w:r>
+    </w:p>
+    <w:p>
+      <w:pPr>
+        <w:shd w:val="clear" w:color="auto" w:fill="F2F2F2"/>
+        <w:spacing w:after="0"/>
+        <w:ind w:left="288"/>
+      </w:pPr>
+      <w:r>
+        <w:rPr>
+          <w:rFonts w:ascii="Courier New" w:hAnsi="Courier New"/>
+          <w:sz w:val="18"/>
+        </w:rPr>
+        <w:t>@Slf4j, injecting via constructor:</w:t>
+      </w:r>
+    </w:p>
+    <w:p>
+      <w:pPr>
+        <w:shd w:val="clear" w:color="auto" w:fill="F2F2F2"/>
+        <w:spacing w:after="0"/>
+        <w:ind w:left="288"/>
+      </w:pPr>
+      <w:r>
+        <w:rPr>
+          <w:rFonts w:ascii="Courier New" w:hAnsi="Courier New"/>
+          <w:sz w:val="18"/>
+        </w:rPr>
+        <w:t xml:space="preserve">- </w:t>
+      </w:r>
+      <w:proofErr w:type="spellStart"/>
+      <w:r>
+        <w:rPr>
+          <w:rFonts w:ascii="Courier New" w:hAnsi="Courier New"/>
+          <w:sz w:val="18"/>
+        </w:rPr>
+        <w:t>AttributionValidator</w:t>
+      </w:r>
+      <w:proofErr w:type="spellEnd"/>
+      <w:r>
+        <w:rPr>
+          <w:rFonts w:ascii="Courier New" w:hAnsi="Courier New"/>
+          <w:sz w:val="18"/>
+        </w:rPr>
+        <w:t xml:space="preserve"> validator</w:t>
+      </w:r>
+    </w:p>
+    <w:p>
+      <w:pPr>
+        <w:shd w:val="clear" w:color="auto" w:fill="F2F2F2"/>
+        <w:spacing w:after="0"/>
+        <w:ind w:left="288"/>
+      </w:pPr>
+      <w:r>
+        <w:rPr>
+          <w:rFonts w:ascii="Courier New" w:hAnsi="Courier New"/>
+          <w:sz w:val="18"/>
+        </w:rPr>
+        <w:t xml:space="preserve">- </w:t>
+      </w:r>
+      <w:proofErr w:type="spellStart"/>
+      <w:r>
+        <w:rPr>
+          <w:rFonts w:ascii="Courier New" w:hAnsi="Courier New"/>
+          <w:sz w:val="18"/>
+        </w:rPr>
+        <w:t>AttributionCalculator</w:t>
+      </w:r>
+      <w:proofErr w:type="spellEnd"/>
+      <w:r>
+        <w:rPr>
+          <w:rFonts w:ascii="Courier New" w:hAnsi="Courier New"/>
+          <w:sz w:val="18"/>
+        </w:rPr>
+        <w:t xml:space="preserve"> calculator</w:t>
+      </w:r>
+    </w:p>
+    <w:p>
+      <w:pPr>
+        <w:shd w:val="clear" w:color="auto" w:fill="F2F2F2"/>
+        <w:spacing w:after="0"/>
+        <w:ind w:left="288"/>
+      </w:pPr>
+      <w:r>
+        <w:rPr>
+          <w:rFonts w:ascii="Courier New" w:hAnsi="Courier New"/>
+          <w:sz w:val="18"/>
+        </w:rPr>
+        <w:t xml:space="preserve">- </w:t>
+      </w:r>
+      <w:proofErr w:type="spellStart"/>
+      <w:r>
+        <w:rPr>
+          <w:rFonts w:ascii="Courier New" w:hAnsi="Courier New"/>
+          <w:sz w:val="18"/>
+        </w:rPr>
+        <w:t>IdempotencyService</w:t>
+      </w:r>
+      <w:proofErr w:type="spellEnd"/>
+      <w:r>
+        <w:rPr>
+          <w:rFonts w:ascii="Courier New" w:hAnsi="Courier New"/>
+          <w:sz w:val="18"/>
+        </w:rPr>
+        <w:t xml:space="preserve"> </w:t>
+      </w:r>
+      <w:proofErr w:type="spellStart"/>
+      <w:r>
+        <w:rPr>
+          <w:rFonts w:ascii="Courier New" w:hAnsi="Courier New"/>
+          <w:sz w:val="18"/>
+        </w:rPr>
+        <w:t>idempotencyService</w:t>
+      </w:r>
+      <w:proofErr w:type="spellEnd"/>
+    </w:p>
+    <w:p>
+      <w:pPr>
+        <w:shd w:val="clear" w:color="auto" w:fill="F2F2F2"/>
+        <w:spacing w:after="0"/>
+        <w:ind w:left="288"/>
+      </w:pPr>
+      <w:r>
+        <w:rPr>
+          <w:rFonts w:ascii="Courier New" w:hAnsi="Courier New"/>
+          <w:sz w:val="18"/>
+        </w:rPr>
+        <w:t xml:space="preserve"> </w:t>
+      </w:r>
+    </w:p>
+    <w:p>
+      <w:pPr>
+        <w:shd w:val="clear" w:color="auto" w:fill="F2F2F2"/>
+        <w:spacing w:after="0"/>
+        <w:ind w:left="288"/>
+      </w:pPr>
+      <w:r>
+        <w:rPr>
+          <w:rFonts w:ascii="Courier New" w:hAnsi="Courier New"/>
+          <w:sz w:val="18"/>
+        </w:rPr>
+        <w:t xml:space="preserve">Implement </w:t>
+      </w:r>
+      <w:proofErr w:type="spellStart"/>
+      <w:r>
+        <w:rPr>
+          <w:rFonts w:ascii="Courier New" w:hAnsi="Courier New"/>
+          <w:sz w:val="18"/>
+        </w:rPr>
+        <w:t>processAttribution</w:t>
+      </w:r>
+      <w:proofErr w:type="spellEnd"/>
+      <w:r>
+        <w:rPr>
+          <w:rFonts w:ascii="Courier New" w:hAnsi="Courier New"/>
+          <w:sz w:val="18"/>
+        </w:rPr>
+        <w:t>:</w:t>
+      </w:r>
+    </w:p>
+    <w:p>
+      <w:pPr>
+        <w:shd w:val="clear" w:color="auto" w:fill="F2F2F2"/>
+        <w:spacing w:after="0"/>
+        <w:ind w:left="288"/>
+      </w:pPr>
+      <w:r>
+        <w:rPr>
+          <w:rFonts w:ascii="Courier New" w:hAnsi="Courier New"/>
+          <w:sz w:val="18"/>
+        </w:rPr>
+        <w:lastRenderedPageBreak/>
+        <w:t>1. Log at INFO: "Processing attribution request [</w:t>
+      </w:r>
+      <w:proofErr w:type="spellStart"/>
+      <w:r>
+        <w:rPr>
+          <w:rFonts w:ascii="Courier New" w:hAnsi="Courier New"/>
+          <w:sz w:val="18"/>
+        </w:rPr>
+        <w:t>requestId</w:t>
+      </w:r>
+      <w:proofErr w:type="spellEnd"/>
+      <w:proofErr w:type="gramStart"/>
+      <w:r>
+        <w:rPr>
+          <w:rFonts w:ascii="Courier New" w:hAnsi="Courier New"/>
+          <w:sz w:val="18"/>
+        </w:rPr>
+        <w:t>={</w:t>
+      </w:r>
+      <w:proofErr w:type="gramEnd"/>
+      <w:r>
+        <w:rPr>
+          <w:rFonts w:ascii="Courier New" w:hAnsi="Courier New"/>
+          <w:sz w:val="18"/>
+        </w:rPr>
+        <w:t xml:space="preserve">}, </w:t>
+      </w:r>
+      <w:proofErr w:type="spellStart"/>
+      <w:r>
+        <w:rPr>
+          <w:rFonts w:ascii="Courier New" w:hAnsi="Courier New"/>
+          <w:sz w:val="18"/>
+        </w:rPr>
+        <w:t>portfolioId</w:t>
+      </w:r>
+      <w:proofErr w:type="spellEnd"/>
+      <w:proofErr w:type="gramStart"/>
+      <w:r>
+        <w:rPr>
+          <w:rFonts w:ascii="Courier New" w:hAnsi="Courier New"/>
+          <w:sz w:val="18"/>
+        </w:rPr>
+        <w:t>={</w:t>
+      </w:r>
+      <w:proofErr w:type="gramEnd"/>
+      <w:r>
+        <w:rPr>
+          <w:rFonts w:ascii="Courier New" w:hAnsi="Courier New"/>
+          <w:sz w:val="18"/>
+        </w:rPr>
+        <w:t>}]"</w:t>
+      </w:r>
+    </w:p>
+    <w:p>
+      <w:pPr>
+        <w:shd w:val="clear" w:color="auto" w:fill="F2F2F2"/>
+        <w:spacing w:after="0"/>
+        <w:ind w:left="288"/>
+      </w:pPr>
+      <w:r>
+        <w:rPr>
+          <w:rFonts w:ascii="Courier New" w:hAnsi="Courier New"/>
+          <w:sz w:val="18"/>
+        </w:rPr>
+        <w:t xml:space="preserve">2. Call </w:t>
+      </w:r>
+      <w:proofErr w:type="spellStart"/>
+      <w:r>
+        <w:rPr>
+          <w:rFonts w:ascii="Courier New" w:hAnsi="Courier New"/>
+          <w:sz w:val="18"/>
+        </w:rPr>
+        <w:t>idempotencyService.findExistingResult</w:t>
+      </w:r>
+      <w:proofErr w:type="spellEnd"/>
+      <w:r>
+        <w:rPr>
+          <w:rFonts w:ascii="Courier New" w:hAnsi="Courier New"/>
+          <w:sz w:val="18"/>
+        </w:rPr>
+        <w:t>(</w:t>
+      </w:r>
+      <w:proofErr w:type="spellStart"/>
+      <w:proofErr w:type="gramStart"/>
+      <w:r>
+        <w:rPr>
+          <w:rFonts w:ascii="Courier New" w:hAnsi="Courier New"/>
+          <w:sz w:val="18"/>
+        </w:rPr>
+        <w:t>request.getRequestId</w:t>
+      </w:r>
+      <w:proofErr w:type="spellEnd"/>
+      <w:proofErr w:type="gramEnd"/>
+      <w:r>
+        <w:rPr>
+          <w:rFonts w:ascii="Courier New" w:hAnsi="Courier New"/>
+          <w:sz w:val="18"/>
+        </w:rPr>
+        <w:t>())</w:t>
+      </w:r>
+    </w:p>
+    <w:p>
+      <w:pPr>
+        <w:shd w:val="clear" w:color="auto" w:fill="F2F2F2"/>
+        <w:spacing w:after="0"/>
+        <w:ind w:left="288"/>
+      </w:pPr>
+      <w:r>
+        <w:rPr>
+          <w:rFonts w:ascii="Courier New" w:hAnsi="Courier New"/>
+          <w:sz w:val="18"/>
+        </w:rPr>
+        <w:t xml:space="preserve">   - If present: log "Idempotent hit for </w:t>
+      </w:r>
+      <w:proofErr w:type="spellStart"/>
+      <w:r>
+        <w:rPr>
+          <w:rFonts w:ascii="Courier New" w:hAnsi="Courier New"/>
+          <w:sz w:val="18"/>
+        </w:rPr>
+        <w:t>requestId</w:t>
+      </w:r>
+      <w:proofErr w:type="spellEnd"/>
+      <w:proofErr w:type="gramStart"/>
+      <w:r>
+        <w:rPr>
+          <w:rFonts w:ascii="Courier New" w:hAnsi="Courier New"/>
+          <w:sz w:val="18"/>
+        </w:rPr>
+        <w:t>={</w:t>
+      </w:r>
+      <w:proofErr w:type="gramEnd"/>
+      <w:r>
+        <w:rPr>
+          <w:rFonts w:ascii="Courier New" w:hAnsi="Courier New"/>
+          <w:sz w:val="18"/>
+        </w:rPr>
+        <w:t>}", return cached response immediately</w:t>
+      </w:r>
+    </w:p>
+    <w:p>
+      <w:pPr>
+        <w:shd w:val="clear" w:color="auto" w:fill="F2F2F2"/>
+        <w:spacing w:after="0"/>
+        <w:ind w:left="288"/>
+      </w:pPr>
+      <w:r>
+        <w:rPr>
+          <w:rFonts w:ascii="Courier New" w:hAnsi="Courier New"/>
+          <w:sz w:val="18"/>
+        </w:rPr>
+        <w:t xml:space="preserve">3. Call </w:t>
+      </w:r>
+      <w:proofErr w:type="spellStart"/>
+      <w:proofErr w:type="gramStart"/>
+      <w:r>
+        <w:rPr>
+          <w:rFonts w:ascii="Courier New" w:hAnsi="Courier New"/>
+          <w:sz w:val="18"/>
+        </w:rPr>
+        <w:t>validator.validateWeights</w:t>
+      </w:r>
+      <w:proofErr w:type="spellEnd"/>
+      <w:proofErr w:type="gramEnd"/>
+      <w:r>
+        <w:rPr>
+          <w:rFonts w:ascii="Courier New" w:hAnsi="Courier New"/>
+          <w:sz w:val="18"/>
+        </w:rPr>
+        <w:t>(</w:t>
+      </w:r>
+      <w:proofErr w:type="spellStart"/>
+      <w:proofErr w:type="gramStart"/>
+      <w:r>
+        <w:rPr>
+          <w:rFonts w:ascii="Courier New" w:hAnsi="Courier New"/>
+          <w:sz w:val="18"/>
+        </w:rPr>
+        <w:t>request.getGroups</w:t>
+      </w:r>
+      <w:proofErr w:type="spellEnd"/>
+      <w:proofErr w:type="gramEnd"/>
+      <w:r>
+        <w:rPr>
+          <w:rFonts w:ascii="Courier New" w:hAnsi="Courier New"/>
+          <w:sz w:val="18"/>
+        </w:rPr>
+        <w:t>())</w:t>
+      </w:r>
+    </w:p>
+    <w:p>
+      <w:pPr>
+        <w:shd w:val="clear" w:color="auto" w:fill="F2F2F2"/>
+        <w:spacing w:after="0"/>
+        <w:ind w:left="288"/>
+      </w:pPr>
+      <w:r>
+        <w:rPr>
+          <w:rFonts w:ascii="Courier New" w:hAnsi="Courier New"/>
+          <w:sz w:val="18"/>
+        </w:rPr>
+        <w:t xml:space="preserve">   - Throws </w:t>
+      </w:r>
+      <w:proofErr w:type="spellStart"/>
+      <w:r>
+        <w:rPr>
+          <w:rFonts w:ascii="Courier New" w:hAnsi="Courier New"/>
+          <w:sz w:val="18"/>
+        </w:rPr>
+        <w:t>InvalidAttributionInputException</w:t>
+      </w:r>
+      <w:proofErr w:type="spellEnd"/>
+      <w:r>
+        <w:rPr>
+          <w:rFonts w:ascii="Courier New" w:hAnsi="Courier New"/>
+          <w:sz w:val="18"/>
+        </w:rPr>
+        <w:t xml:space="preserve"> on invalid weights (let it propagate)</w:t>
+      </w:r>
+    </w:p>
+    <w:p>
+      <w:pPr>
+        <w:shd w:val="clear" w:color="auto" w:fill="F2F2F2"/>
+        <w:spacing w:after="0"/>
+        <w:ind w:left="288"/>
+      </w:pPr>
+      <w:r>
+        <w:rPr>
+          <w:rFonts w:ascii="Courier New" w:hAnsi="Courier New"/>
+          <w:sz w:val="18"/>
+        </w:rPr>
+        <w:t xml:space="preserve">4. Call </w:t>
+      </w:r>
+      <w:proofErr w:type="spellStart"/>
+      <w:proofErr w:type="gramStart"/>
+      <w:r>
+        <w:rPr>
+          <w:rFonts w:ascii="Courier New" w:hAnsi="Courier New"/>
+          <w:sz w:val="18"/>
+        </w:rPr>
+        <w:t>calculator.calculate</w:t>
+      </w:r>
+      <w:proofErr w:type="spellEnd"/>
+      <w:proofErr w:type="gramEnd"/>
+      <w:r>
+        <w:rPr>
+          <w:rFonts w:ascii="Courier New" w:hAnsi="Courier New"/>
+          <w:sz w:val="18"/>
+        </w:rPr>
+        <w:t>(request) to get the response</w:t>
+      </w:r>
+    </w:p>
+    <w:p>
+      <w:pPr>
+        <w:shd w:val="clear" w:color="auto" w:fill="F2F2F2"/>
+        <w:spacing w:after="0"/>
+        <w:ind w:left="288"/>
+      </w:pPr>
+      <w:r>
+        <w:rPr>
+          <w:rFonts w:ascii="Courier New" w:hAnsi="Courier New"/>
+          <w:sz w:val="18"/>
+        </w:rPr>
+        <w:t xml:space="preserve">5. Call </w:t>
+      </w:r>
+      <w:proofErr w:type="spellStart"/>
+      <w:r>
+        <w:rPr>
+          <w:rFonts w:ascii="Courier New" w:hAnsi="Courier New"/>
+          <w:sz w:val="18"/>
+        </w:rPr>
+        <w:t>idempotencyService.persistResult</w:t>
+      </w:r>
+      <w:proofErr w:type="spellEnd"/>
+      <w:r>
+        <w:rPr>
+          <w:rFonts w:ascii="Courier New" w:hAnsi="Courier New"/>
+          <w:sz w:val="18"/>
+        </w:rPr>
+        <w:t>(request, response) to store for future idempotency</w:t>
+      </w:r>
+    </w:p>
+    <w:p>
+      <w:pPr>
+        <w:shd w:val="clear" w:color="auto" w:fill="F2F2F2"/>
+        <w:spacing w:after="0"/>
+        <w:ind w:left="288"/>
+      </w:pPr>
+      <w:r>
+        <w:rPr>
+          <w:rFonts w:ascii="Courier New" w:hAnsi="Courier New"/>
+          <w:sz w:val="18"/>
+        </w:rPr>
+        <w:t>6. Log at INFO: "Completed attribution [</w:t>
+      </w:r>
+      <w:proofErr w:type="spellStart"/>
+      <w:r>
+        <w:rPr>
+          <w:rFonts w:ascii="Courier New" w:hAnsi="Courier New"/>
+          <w:sz w:val="18"/>
+        </w:rPr>
+        <w:t>requestId</w:t>
+      </w:r>
+      <w:proofErr w:type="spellEnd"/>
+      <w:proofErr w:type="gramStart"/>
+      <w:r>
+        <w:rPr>
+          <w:rFonts w:ascii="Courier New" w:hAnsi="Courier New"/>
+          <w:sz w:val="18"/>
+        </w:rPr>
+        <w:t>={</w:t>
+      </w:r>
+      <w:proofErr w:type="gramEnd"/>
+      <w:r>
+        <w:rPr>
+          <w:rFonts w:ascii="Courier New" w:hAnsi="Courier New"/>
+          <w:sz w:val="18"/>
+        </w:rPr>
+        <w:t>}, status</w:t>
+      </w:r>
+      <w:proofErr w:type="gramStart"/>
+      <w:r>
+        <w:rPr>
+          <w:rFonts w:ascii="Courier New" w:hAnsi="Courier New"/>
+          <w:sz w:val="18"/>
+        </w:rPr>
+        <w:t>={</w:t>
+      </w:r>
+      <w:proofErr w:type="gramEnd"/>
+      <w:r>
+        <w:rPr>
+          <w:rFonts w:ascii="Courier New" w:hAnsi="Courier New"/>
+          <w:sz w:val="18"/>
+        </w:rPr>
+        <w:t>}, degraded</w:t>
+      </w:r>
+      <w:proofErr w:type="gramStart"/>
+      <w:r>
+        <w:rPr>
+          <w:rFonts w:ascii="Courier New" w:hAnsi="Courier New"/>
+          <w:sz w:val="18"/>
+        </w:rPr>
+        <w:t>={</w:t>
+      </w:r>
+      <w:proofErr w:type="gramEnd"/>
+      <w:r>
+        <w:rPr>
+          <w:rFonts w:ascii="Courier New" w:hAnsi="Courier New"/>
+          <w:sz w:val="18"/>
+        </w:rPr>
+        <w:t>}]"</w:t>
+      </w:r>
+    </w:p>
+    <w:p>
+      <w:pPr>
+        <w:shd w:val="clear" w:color="auto" w:fill="F2F2F2"/>
+        <w:spacing w:after="0"/>
+        <w:ind w:left="288"/>
+      </w:pPr>
+      <w:r>
+        <w:rPr>
+          <w:rFonts w:ascii="Courier New" w:hAnsi="Courier New"/>
+          <w:sz w:val="18"/>
+        </w:rPr>
+        <w:t>7. Return the response</w:t>
+      </w:r>
+    </w:p>
+    <w:p>
+      <w:pPr>
+        <w:shd w:val="clear" w:color="auto" w:fill="F2F2F2"/>
+        <w:spacing w:after="0"/>
+        <w:ind w:left="288"/>
+      </w:pPr>
+      <w:r>
+        <w:rPr>
+          <w:rFonts w:ascii="Courier New" w:hAnsi="Courier New"/>
+          <w:sz w:val="18"/>
+        </w:rPr>
+        <w:t xml:space="preserve"> </w:t>
+      </w:r>
+    </w:p>
+    <w:p>
+      <w:pPr>
+        <w:shd w:val="clear" w:color="auto" w:fill="F2F2F2"/>
+        <w:spacing w:after="0"/>
+        <w:ind w:left="288"/>
+      </w:pPr>
+      <w:r>
+        <w:rPr>
+          <w:rFonts w:ascii="Courier New" w:hAnsi="Courier New"/>
+          <w:sz w:val="18"/>
+        </w:rPr>
+        <w:t xml:space="preserve">Make </w:t>
+      </w:r>
+      <w:proofErr w:type="spellStart"/>
+      <w:r>
+        <w:rPr>
+          <w:rFonts w:ascii="Courier New" w:hAnsi="Courier New"/>
+          <w:sz w:val="18"/>
+        </w:rPr>
+        <w:t>AttributionValidator</w:t>
+      </w:r>
+      <w:proofErr w:type="spellEnd"/>
+      <w:r>
+        <w:rPr>
+          <w:rFonts w:ascii="Courier New" w:hAnsi="Courier New"/>
+          <w:sz w:val="18"/>
+        </w:rPr>
+        <w:t xml:space="preserve"> and </w:t>
+      </w:r>
+      <w:proofErr w:type="spellStart"/>
+      <w:r>
+        <w:rPr>
+          <w:rFonts w:ascii="Courier New" w:hAnsi="Courier New"/>
+          <w:sz w:val="18"/>
+        </w:rPr>
+        <w:t>AttributionCalculator</w:t>
+      </w:r>
+      <w:proofErr w:type="spellEnd"/>
+      <w:r>
+        <w:rPr>
+          <w:rFonts w:ascii="Courier New" w:hAnsi="Courier New"/>
+          <w:sz w:val="18"/>
+        </w:rPr>
+        <w:t xml:space="preserve"> Spring @Component beans</w:t>
+      </w:r>
+    </w:p>
+    <w:p>
+      <w:pPr>
+        <w:shd w:val="clear" w:color="auto" w:fill="F2F2F2"/>
+        <w:spacing w:after="0"/>
+        <w:ind w:left="288"/>
+      </w:pPr>
+      <w:r>
+        <w:rPr>
+          <w:rFonts w:ascii="Courier New" w:hAnsi="Courier New"/>
+          <w:sz w:val="18"/>
+        </w:rPr>
+        <w:t>(add @Component annotation to each).</w:t>
+      </w:r>
+    </w:p>
+    <w:p/>
+    <w:p>
+      <w:pPr>
+        <w:spacing w:before="120" w:after="40"/>
+      </w:pPr>
+      <w:r>
+        <w:rPr>
+          <w:rFonts w:ascii="Calibri" w:hAnsi="Calibri"/>
+          <w:b/>
+          <w:color w:val="1F497D"/>
+        </w:rPr>
+        <w:t>Validation Gate</w:t>
+      </w:r>
+    </w:p>
+    <w:p>
+      <w:pPr>
+        <w:pStyle w:val="ListBullet"/>
+        <w:tabs>
+          <w:tab w:val="num" w:pos="360"/>
+        </w:tabs>
+        <w:spacing w:after="40"/>
+        <w:ind w:left="360" w:hanging="360"/>
+      </w:pPr>
+      <w:r>
+        <w:rPr>
+          <w:rFonts w:ascii="Calibri" w:hAnsi="Calibri"/>
+          <w:sz w:val="21"/>
+        </w:rPr>
+        <w:t>Happy path: valid request → VALID response returned and persisted</w:t>
+      </w:r>
+    </w:p>
+    <w:p>
+      <w:pPr>
+        <w:pStyle w:val="ListBullet"/>
+        <w:tabs>
+          <w:tab w:val="num" w:pos="360"/>
+        </w:tabs>
+        <w:spacing w:after="40"/>
+        <w:ind w:left="360" w:hanging="360"/>
+      </w:pPr>
+      <w:r>
+        <w:rPr>
+          <w:rFonts w:ascii="Calibri" w:hAnsi="Calibri"/>
+          <w:sz w:val="21"/>
+        </w:rPr>
+        <w:t>Idempotency: same request twice → second call returns identical response, audit table still has only 1 row</w:t>
+      </w:r>
+    </w:p>
+    <w:p>
+      <w:pPr>
+        <w:pStyle w:val="ListBullet"/>
+        <w:tabs>
+          <w:tab w:val="num" w:pos="360"/>
+        </w:tabs>
+        <w:spacing w:after="40"/>
+        <w:ind w:left="360" w:hanging="360"/>
+      </w:pPr>
+      <w:r>
+        <w:rPr>
+          <w:rFonts w:ascii="Calibri" w:hAnsi="Calibri"/>
+          <w:sz w:val="21"/>
+        </w:rPr>
+        <w:t xml:space="preserve">Invalid weights: request with weights summing to 95 → </w:t>
+      </w:r>
+      <w:proofErr w:type="spellStart"/>
+      <w:r>
+        <w:rPr>
+          <w:rFonts w:ascii="Calibri" w:hAnsi="Calibri"/>
+          <w:sz w:val="21"/>
+        </w:rPr>
+        <w:t>InvalidAttributionInputException</w:t>
+      </w:r>
+      <w:proofErr w:type="spellEnd"/>
+      <w:r>
+        <w:rPr>
+          <w:rFonts w:ascii="Calibri" w:hAnsi="Calibri"/>
+          <w:sz w:val="21"/>
+        </w:rPr>
+        <w:t xml:space="preserve"> thrown</w:t>
       </w:r>
     </w:p>
     <w:p>

</xml_diff>

<commit_message>
FDE-2: Add REST Controller and its test
</commit_message>
<xml_diff>
--- a/Prompts-FDE- 2.docx
+++ b/Prompts-FDE- 2.docx
@@ -7551,6 +7551,737 @@
           <w:color w:val="CCCCCC"/>
           <w:sz w:val="16"/>
         </w:rPr>
+        <w:t>──────────────────────────────────────────────────────────────────────────────────────────</w:t>
+      </w:r>
+    </w:p>
+    <w:p>
+      <w:pPr>
+        <w:spacing w:before="280" w:after="80"/>
+      </w:pPr>
+      <w:r>
+        <w:rPr>
+          <w:rFonts w:ascii="Calibri" w:hAnsi="Calibri"/>
+          <w:b/>
+          <w:color w:val="2E74B5"/>
+          <w:sz w:val="28"/>
+        </w:rPr>
+        <w:t xml:space="preserve">STEP </w:t>
+      </w:r>
+      <w:proofErr w:type="gramStart"/>
+      <w:r>
+        <w:rPr>
+          <w:rFonts w:ascii="Calibri" w:hAnsi="Calibri"/>
+          <w:b/>
+          <w:color w:val="2E74B5"/>
+          <w:sz w:val="28"/>
+        </w:rPr>
+        <w:t>9</w:t>
+      </w:r>
+      <w:r>
+        <w:rPr>
+          <w:rFonts w:ascii="Calibri" w:hAnsi="Calibri"/>
+          <w:b/>
+          <w:color w:val="2E74B5"/>
+          <w:sz w:val="28"/>
+        </w:rPr>
+        <w:t xml:space="preserve">  —</w:t>
+      </w:r>
+      <w:proofErr w:type="gramEnd"/>
+      <w:r>
+        <w:rPr>
+          <w:rFonts w:ascii="Calibri" w:hAnsi="Calibri"/>
+          <w:b/>
+          <w:color w:val="2E74B5"/>
+          <w:sz w:val="28"/>
+        </w:rPr>
+        <w:t xml:space="preserve">  REST Controller</w:t>
+      </w:r>
+    </w:p>
+    <w:p>
+      <w:pPr>
+        <w:spacing w:after="60"/>
+      </w:pPr>
+      <w:r>
+        <w:rPr>
+          <w:rFonts w:ascii="Calibri" w:hAnsi="Calibri"/>
+          <w:b/>
+          <w:color w:val="2E74B5"/>
+        </w:rPr>
+        <w:t xml:space="preserve">Depends on: </w:t>
+      </w:r>
+      <w:r>
+        <w:rPr>
+          <w:rFonts w:ascii="Calibri" w:hAnsi="Calibri"/>
+        </w:rPr>
+        <w:t xml:space="preserve">Step </w:t>
+      </w:r>
+      <w:r>
+        <w:rPr>
+          <w:rFonts w:ascii="Calibri" w:hAnsi="Calibri"/>
+        </w:rPr>
+        <w:t>8</w:t>
+      </w:r>
+    </w:p>
+    <w:p>
+      <w:pPr>
+        <w:shd w:val="clear" w:color="auto" w:fill="F2F2F2"/>
+        <w:spacing w:after="0"/>
+        <w:ind w:left="288"/>
+      </w:pPr>
+      <w:r>
+        <w:rPr>
+          <w:rFonts w:ascii="Courier New" w:hAnsi="Courier New"/>
+          <w:sz w:val="18"/>
+        </w:rPr>
+        <w:t xml:space="preserve">In package </w:t>
+      </w:r>
+      <w:proofErr w:type="spellStart"/>
+      <w:proofErr w:type="gramStart"/>
+      <w:r>
+        <w:rPr>
+          <w:rFonts w:ascii="Courier New" w:hAnsi="Courier New"/>
+          <w:sz w:val="18"/>
+        </w:rPr>
+        <w:t>com.portfolio</w:t>
+      </w:r>
+      <w:proofErr w:type="gramEnd"/>
+      <w:r>
+        <w:rPr>
+          <w:rFonts w:ascii="Courier New" w:hAnsi="Courier New"/>
+          <w:sz w:val="18"/>
+        </w:rPr>
+        <w:t>.</w:t>
+      </w:r>
+      <w:proofErr w:type="gramStart"/>
+      <w:r>
+        <w:rPr>
+          <w:rFonts w:ascii="Courier New" w:hAnsi="Courier New"/>
+          <w:sz w:val="18"/>
+        </w:rPr>
+        <w:t>attribution.controller</w:t>
+      </w:r>
+      <w:proofErr w:type="spellEnd"/>
+      <w:proofErr w:type="gramEnd"/>
+      <w:r>
+        <w:rPr>
+          <w:rFonts w:ascii="Courier New" w:hAnsi="Courier New"/>
+          <w:sz w:val="18"/>
+        </w:rPr>
+        <w:t xml:space="preserve">, create </w:t>
+      </w:r>
+      <w:proofErr w:type="spellStart"/>
+      <w:r>
+        <w:rPr>
+          <w:rFonts w:ascii="Courier New" w:hAnsi="Courier New"/>
+          <w:sz w:val="18"/>
+        </w:rPr>
+        <w:t>AttributionController</w:t>
+      </w:r>
+      <w:proofErr w:type="spellEnd"/>
+      <w:r>
+        <w:rPr>
+          <w:rFonts w:ascii="Courier New" w:hAnsi="Courier New"/>
+          <w:sz w:val="18"/>
+        </w:rPr>
+        <w:t>:</w:t>
+      </w:r>
+    </w:p>
+    <w:p>
+      <w:pPr>
+        <w:shd w:val="clear" w:color="auto" w:fill="F2F2F2"/>
+        <w:spacing w:after="0"/>
+        <w:ind w:left="288"/>
+      </w:pPr>
+      <w:r>
+        <w:rPr>
+          <w:rFonts w:ascii="Courier New" w:hAnsi="Courier New"/>
+          <w:sz w:val="18"/>
+        </w:rPr>
+        <w:t xml:space="preserve"> </w:t>
+      </w:r>
+    </w:p>
+    <w:p>
+      <w:pPr>
+        <w:shd w:val="clear" w:color="auto" w:fill="F2F2F2"/>
+        <w:spacing w:after="0"/>
+        <w:ind w:left="288"/>
+      </w:pPr>
+      <w:r>
+        <w:rPr>
+          <w:rFonts w:ascii="Courier New" w:hAnsi="Courier New"/>
+          <w:sz w:val="18"/>
+        </w:rPr>
+        <w:t>Annotations: @RestController, @RequestMapping("/api/performance"), @Slf4j,</w:t>
+      </w:r>
+    </w:p>
+    <w:p>
+      <w:pPr>
+        <w:shd w:val="clear" w:color="auto" w:fill="F2F2F2"/>
+        <w:spacing w:after="0"/>
+        <w:ind w:left="288"/>
+      </w:pPr>
+      <w:r>
+        <w:rPr>
+          <w:rFonts w:ascii="Courier New" w:hAnsi="Courier New"/>
+          <w:sz w:val="18"/>
+        </w:rPr>
+        <w:t>@RequiredArgsConstructor</w:t>
+      </w:r>
+    </w:p>
+    <w:p>
+      <w:pPr>
+        <w:shd w:val="clear" w:color="auto" w:fill="F2F2F2"/>
+        <w:spacing w:after="0"/>
+        <w:ind w:left="288"/>
+      </w:pPr>
+      <w:r>
+        <w:rPr>
+          <w:rFonts w:ascii="Courier New" w:hAnsi="Courier New"/>
+          <w:sz w:val="18"/>
+        </w:rPr>
+        <w:t xml:space="preserve"> </w:t>
+      </w:r>
+    </w:p>
+    <w:p>
+      <w:pPr>
+        <w:shd w:val="clear" w:color="auto" w:fill="F2F2F2"/>
+        <w:spacing w:after="0"/>
+        <w:ind w:left="288"/>
+      </w:pPr>
+      <w:r>
+        <w:rPr>
+          <w:rFonts w:ascii="Courier New" w:hAnsi="Courier New"/>
+          <w:sz w:val="18"/>
+        </w:rPr>
+        <w:t xml:space="preserve">Inject: </w:t>
+      </w:r>
+      <w:proofErr w:type="spellStart"/>
+      <w:r>
+        <w:rPr>
+          <w:rFonts w:ascii="Courier New" w:hAnsi="Courier New"/>
+          <w:sz w:val="18"/>
+        </w:rPr>
+        <w:t>AttributionService</w:t>
+      </w:r>
+      <w:proofErr w:type="spellEnd"/>
+      <w:r>
+        <w:rPr>
+          <w:rFonts w:ascii="Courier New" w:hAnsi="Courier New"/>
+          <w:sz w:val="18"/>
+        </w:rPr>
+        <w:t xml:space="preserve"> </w:t>
+      </w:r>
+      <w:proofErr w:type="spellStart"/>
+      <w:r>
+        <w:rPr>
+          <w:rFonts w:ascii="Courier New" w:hAnsi="Courier New"/>
+          <w:sz w:val="18"/>
+        </w:rPr>
+        <w:t>attributionService</w:t>
+      </w:r>
+      <w:proofErr w:type="spellEnd"/>
+    </w:p>
+    <w:p>
+      <w:pPr>
+        <w:shd w:val="clear" w:color="auto" w:fill="F2F2F2"/>
+        <w:spacing w:after="0"/>
+        <w:ind w:left="288"/>
+      </w:pPr>
+      <w:r>
+        <w:rPr>
+          <w:rFonts w:ascii="Courier New" w:hAnsi="Courier New"/>
+          <w:sz w:val="18"/>
+        </w:rPr>
+        <w:t xml:space="preserve"> </w:t>
+      </w:r>
+    </w:p>
+    <w:p>
+      <w:pPr>
+        <w:shd w:val="clear" w:color="auto" w:fill="F2F2F2"/>
+        <w:spacing w:after="0"/>
+        <w:ind w:left="288"/>
+      </w:pPr>
+      <w:r>
+        <w:rPr>
+          <w:rFonts w:ascii="Courier New" w:hAnsi="Courier New"/>
+          <w:sz w:val="18"/>
+        </w:rPr>
+        <w:t>Implement one endpoint:</w:t>
+      </w:r>
+    </w:p>
+    <w:p>
+      <w:pPr>
+        <w:shd w:val="clear" w:color="auto" w:fill="F2F2F2"/>
+        <w:spacing w:after="0"/>
+        <w:ind w:left="288"/>
+      </w:pPr>
+      <w:r>
+        <w:rPr>
+          <w:rFonts w:ascii="Courier New" w:hAnsi="Courier New"/>
+          <w:sz w:val="18"/>
+        </w:rPr>
+        <w:t xml:space="preserve">  POST /</w:t>
+      </w:r>
+      <w:proofErr w:type="spellStart"/>
+      <w:r>
+        <w:rPr>
+          <w:rFonts w:ascii="Courier New" w:hAnsi="Courier New"/>
+          <w:sz w:val="18"/>
+        </w:rPr>
+        <w:t>api</w:t>
+      </w:r>
+      <w:proofErr w:type="spellEnd"/>
+      <w:r>
+        <w:rPr>
+          <w:rFonts w:ascii="Courier New" w:hAnsi="Courier New"/>
+          <w:sz w:val="18"/>
+        </w:rPr>
+        <w:t>/performance/attribution</w:t>
+      </w:r>
+    </w:p>
+    <w:p>
+      <w:pPr>
+        <w:shd w:val="clear" w:color="auto" w:fill="F2F2F2"/>
+        <w:spacing w:after="0"/>
+        <w:ind w:left="288"/>
+      </w:pPr>
+      <w:r>
+        <w:rPr>
+          <w:rFonts w:ascii="Courier New" w:hAnsi="Courier New"/>
+          <w:sz w:val="18"/>
+        </w:rPr>
+        <w:t xml:space="preserve">  - Accepts: @Valid @RequestBody </w:t>
+      </w:r>
+      <w:proofErr w:type="spellStart"/>
+      <w:r>
+        <w:rPr>
+          <w:rFonts w:ascii="Courier New" w:hAnsi="Courier New"/>
+          <w:sz w:val="18"/>
+        </w:rPr>
+        <w:t>AttributionRequest</w:t>
+      </w:r>
+      <w:proofErr w:type="spellEnd"/>
+      <w:r>
+        <w:rPr>
+          <w:rFonts w:ascii="Courier New" w:hAnsi="Courier New"/>
+          <w:sz w:val="18"/>
+        </w:rPr>
+        <w:t xml:space="preserve"> request</w:t>
+      </w:r>
+    </w:p>
+    <w:p>
+      <w:pPr>
+        <w:shd w:val="clear" w:color="auto" w:fill="F2F2F2"/>
+        <w:spacing w:after="0"/>
+        <w:ind w:left="288"/>
+      </w:pPr>
+      <w:r>
+        <w:rPr>
+          <w:rFonts w:ascii="Courier New" w:hAnsi="Courier New"/>
+          <w:sz w:val="18"/>
+        </w:rPr>
+        <w:t xml:space="preserve">  - Returns: </w:t>
+      </w:r>
+      <w:proofErr w:type="spellStart"/>
+      <w:r>
+        <w:rPr>
+          <w:rFonts w:ascii="Courier New" w:hAnsi="Courier New"/>
+          <w:sz w:val="18"/>
+        </w:rPr>
+        <w:t>ResponseEntity</w:t>
+      </w:r>
+      <w:proofErr w:type="spellEnd"/>
+      <w:r>
+        <w:rPr>
+          <w:rFonts w:ascii="Courier New" w:hAnsi="Courier New"/>
+          <w:sz w:val="18"/>
+        </w:rPr>
+        <w:t>&lt;</w:t>
+      </w:r>
+      <w:proofErr w:type="spellStart"/>
+      <w:r>
+        <w:rPr>
+          <w:rFonts w:ascii="Courier New" w:hAnsi="Courier New"/>
+          <w:sz w:val="18"/>
+        </w:rPr>
+        <w:t>AttributionResponse</w:t>
+      </w:r>
+      <w:proofErr w:type="spellEnd"/>
+      <w:r>
+        <w:rPr>
+          <w:rFonts w:ascii="Courier New" w:hAnsi="Courier New"/>
+          <w:sz w:val="18"/>
+        </w:rPr>
+        <w:t>&gt;</w:t>
+      </w:r>
+    </w:p>
+    <w:p>
+      <w:pPr>
+        <w:shd w:val="clear" w:color="auto" w:fill="F2F2F2"/>
+        <w:spacing w:after="0"/>
+        <w:ind w:left="288"/>
+      </w:pPr>
+      <w:r>
+        <w:rPr>
+          <w:rFonts w:ascii="Courier New" w:hAnsi="Courier New"/>
+          <w:sz w:val="18"/>
+        </w:rPr>
+        <w:t xml:space="preserve">  - On success: return HTTP 200 with the </w:t>
+      </w:r>
+      <w:proofErr w:type="spellStart"/>
+      <w:r>
+        <w:rPr>
+          <w:rFonts w:ascii="Courier New" w:hAnsi="Courier New"/>
+          <w:sz w:val="18"/>
+        </w:rPr>
+        <w:t>AttributionResponse</w:t>
+      </w:r>
+      <w:proofErr w:type="spellEnd"/>
+      <w:r>
+        <w:rPr>
+          <w:rFonts w:ascii="Courier New" w:hAnsi="Courier New"/>
+          <w:sz w:val="18"/>
+        </w:rPr>
+        <w:t xml:space="preserve"> body</w:t>
+      </w:r>
+    </w:p>
+    <w:p>
+      <w:pPr>
+        <w:shd w:val="clear" w:color="auto" w:fill="F2F2F2"/>
+        <w:spacing w:after="0"/>
+        <w:ind w:left="288"/>
+      </w:pPr>
+      <w:r>
+        <w:rPr>
+          <w:rFonts w:ascii="Courier New" w:hAnsi="Courier New"/>
+          <w:sz w:val="18"/>
+        </w:rPr>
+        <w:t xml:space="preserve">  - Log at INFO on entry: "Attribution request received [</w:t>
+      </w:r>
+      <w:proofErr w:type="spellStart"/>
+      <w:r>
+        <w:rPr>
+          <w:rFonts w:ascii="Courier New" w:hAnsi="Courier New"/>
+          <w:sz w:val="18"/>
+        </w:rPr>
+        <w:t>requestId</w:t>
+      </w:r>
+      <w:proofErr w:type="spellEnd"/>
+      <w:proofErr w:type="gramStart"/>
+      <w:r>
+        <w:rPr>
+          <w:rFonts w:ascii="Courier New" w:hAnsi="Courier New"/>
+          <w:sz w:val="18"/>
+        </w:rPr>
+        <w:t>={</w:t>
+      </w:r>
+      <w:proofErr w:type="gramEnd"/>
+      <w:r>
+        <w:rPr>
+          <w:rFonts w:ascii="Courier New" w:hAnsi="Courier New"/>
+          <w:sz w:val="18"/>
+        </w:rPr>
+        <w:t xml:space="preserve">}, </w:t>
+      </w:r>
+      <w:proofErr w:type="spellStart"/>
+      <w:r>
+        <w:rPr>
+          <w:rFonts w:ascii="Courier New" w:hAnsi="Courier New"/>
+          <w:sz w:val="18"/>
+        </w:rPr>
+        <w:t>portfolioId</w:t>
+      </w:r>
+      <w:proofErr w:type="spellEnd"/>
+      <w:proofErr w:type="gramStart"/>
+      <w:r>
+        <w:rPr>
+          <w:rFonts w:ascii="Courier New" w:hAnsi="Courier New"/>
+          <w:sz w:val="18"/>
+        </w:rPr>
+        <w:t>={</w:t>
+      </w:r>
+      <w:proofErr w:type="gramEnd"/>
+      <w:r>
+        <w:rPr>
+          <w:rFonts w:ascii="Courier New" w:hAnsi="Courier New"/>
+          <w:sz w:val="18"/>
+        </w:rPr>
+        <w:t>}]"</w:t>
+      </w:r>
+    </w:p>
+    <w:p>
+      <w:pPr>
+        <w:shd w:val="clear" w:color="auto" w:fill="F2F2F2"/>
+        <w:spacing w:after="0"/>
+        <w:ind w:left="288"/>
+      </w:pPr>
+      <w:r>
+        <w:rPr>
+          <w:rFonts w:ascii="Courier New" w:hAnsi="Courier New"/>
+          <w:sz w:val="18"/>
+        </w:rPr>
+        <w:t xml:space="preserve"> </w:t>
+      </w:r>
+    </w:p>
+    <w:p>
+      <w:pPr>
+        <w:shd w:val="clear" w:color="auto" w:fill="F2F2F2"/>
+        <w:spacing w:after="0"/>
+        <w:ind w:left="288"/>
+      </w:pPr>
+      <w:r>
+        <w:rPr>
+          <w:rFonts w:ascii="Courier New" w:hAnsi="Courier New"/>
+          <w:sz w:val="18"/>
+        </w:rPr>
+        <w:t>The controller must be thin: no business logic, only delegation to</w:t>
+      </w:r>
+    </w:p>
+    <w:p>
+      <w:pPr>
+        <w:shd w:val="clear" w:color="auto" w:fill="F2F2F2"/>
+        <w:spacing w:after="0"/>
+        <w:ind w:left="288"/>
+      </w:pPr>
+      <w:proofErr w:type="spellStart"/>
+      <w:r>
+        <w:rPr>
+          <w:rFonts w:ascii="Courier New" w:hAnsi="Courier New"/>
+          <w:sz w:val="18"/>
+        </w:rPr>
+        <w:t>attributionService.processAttribution</w:t>
+      </w:r>
+      <w:proofErr w:type="spellEnd"/>
+      <w:r>
+        <w:rPr>
+          <w:rFonts w:ascii="Courier New" w:hAnsi="Courier New"/>
+          <w:sz w:val="18"/>
+        </w:rPr>
+        <w:t>(request).</w:t>
+      </w:r>
+    </w:p>
+    <w:p/>
+    <w:p>
+      <w:pPr>
+        <w:spacing w:before="120" w:after="40"/>
+      </w:pPr>
+      <w:r>
+        <w:rPr>
+          <w:rFonts w:ascii="Calibri" w:hAnsi="Calibri"/>
+          <w:b/>
+          <w:color w:val="1F497D"/>
+        </w:rPr>
+        <w:t>Validation Gate</w:t>
+      </w:r>
+    </w:p>
+    <w:p>
+      <w:pPr>
+        <w:pStyle w:val="ListBullet"/>
+        <w:tabs>
+          <w:tab w:val="num" w:pos="360"/>
+        </w:tabs>
+        <w:spacing w:after="40"/>
+        <w:ind w:left="360" w:hanging="360"/>
+      </w:pPr>
+      <w:r>
+        <w:rPr>
+          <w:rFonts w:ascii="Calibri" w:hAnsi="Calibri"/>
+          <w:sz w:val="21"/>
+        </w:rPr>
+        <w:t>Run `</w:t>
+      </w:r>
+      <w:proofErr w:type="spellStart"/>
+      <w:r>
+        <w:rPr>
+          <w:rFonts w:ascii="Calibri" w:hAnsi="Calibri"/>
+          <w:sz w:val="21"/>
+        </w:rPr>
+        <w:t>mvn</w:t>
+      </w:r>
+      <w:proofErr w:type="spellEnd"/>
+      <w:r>
+        <w:rPr>
+          <w:rFonts w:ascii="Calibri" w:hAnsi="Calibri"/>
+          <w:sz w:val="21"/>
+        </w:rPr>
+        <w:t xml:space="preserve"> </w:t>
+      </w:r>
+      <w:proofErr w:type="spellStart"/>
+      <w:r>
+        <w:rPr>
+          <w:rFonts w:ascii="Calibri" w:hAnsi="Calibri"/>
+          <w:sz w:val="21"/>
+        </w:rPr>
+        <w:t>spring-</w:t>
+      </w:r>
+      <w:proofErr w:type="gramStart"/>
+      <w:r>
+        <w:rPr>
+          <w:rFonts w:ascii="Calibri" w:hAnsi="Calibri"/>
+          <w:sz w:val="21"/>
+        </w:rPr>
+        <w:t>boot:run</w:t>
+      </w:r>
+      <w:proofErr w:type="spellEnd"/>
+      <w:proofErr w:type="gramEnd"/>
+      <w:r>
+        <w:rPr>
+          <w:rFonts w:ascii="Calibri" w:hAnsi="Calibri"/>
+          <w:sz w:val="21"/>
+        </w:rPr>
+        <w:t>` and test with curl or Postman using the sample request from the requirements</w:t>
+      </w:r>
+    </w:p>
+    <w:p>
+      <w:pPr>
+        <w:pStyle w:val="ListBullet"/>
+        <w:tabs>
+          <w:tab w:val="num" w:pos="360"/>
+        </w:tabs>
+        <w:spacing w:after="40"/>
+        <w:ind w:left="360" w:hanging="360"/>
+      </w:pPr>
+      <w:r>
+        <w:rPr>
+          <w:rFonts w:ascii="Calibri" w:hAnsi="Calibri"/>
+          <w:sz w:val="21"/>
+        </w:rPr>
+        <w:t xml:space="preserve">Verify HTTP 200 is returned with body containing </w:t>
+      </w:r>
+      <w:proofErr w:type="spellStart"/>
+      <w:r>
+        <w:rPr>
+          <w:rFonts w:ascii="Calibri" w:hAnsi="Calibri"/>
+          <w:sz w:val="21"/>
+        </w:rPr>
+        <w:t>requestId</w:t>
+      </w:r>
+      <w:proofErr w:type="spellEnd"/>
+      <w:r>
+        <w:rPr>
+          <w:rFonts w:ascii="Calibri" w:hAnsi="Calibri"/>
+          <w:sz w:val="21"/>
+        </w:rPr>
+        <w:t xml:space="preserve">, status, degraded, warnings, </w:t>
+      </w:r>
+      <w:proofErr w:type="spellStart"/>
+      <w:r>
+        <w:rPr>
+          <w:rFonts w:ascii="Calibri" w:hAnsi="Calibri"/>
+          <w:sz w:val="21"/>
+        </w:rPr>
+        <w:t>groupContributions</w:t>
+      </w:r>
+      <w:proofErr w:type="spellEnd"/>
+      <w:r>
+        <w:rPr>
+          <w:rFonts w:ascii="Calibri" w:hAnsi="Calibri"/>
+          <w:sz w:val="21"/>
+        </w:rPr>
+        <w:t xml:space="preserve">, and </w:t>
+      </w:r>
+      <w:proofErr w:type="spellStart"/>
+      <w:r>
+        <w:rPr>
+          <w:rFonts w:ascii="Calibri" w:hAnsi="Calibri"/>
+          <w:sz w:val="21"/>
+        </w:rPr>
+        <w:t>processedAt</w:t>
+      </w:r>
+      <w:proofErr w:type="spellEnd"/>
+    </w:p>
+    <w:p>
+      <w:pPr>
+        <w:pStyle w:val="ListBullet"/>
+        <w:tabs>
+          <w:tab w:val="num" w:pos="360"/>
+        </w:tabs>
+        <w:spacing w:after="40"/>
+        <w:ind w:left="360" w:hanging="360"/>
+      </w:pPr>
+      <w:r>
+        <w:rPr>
+          <w:rFonts w:ascii="Calibri" w:hAnsi="Calibri"/>
+          <w:sz w:val="21"/>
+        </w:rPr>
+        <w:t xml:space="preserve">Send the same request a second time — verify same </w:t>
+      </w:r>
+      <w:proofErr w:type="spellStart"/>
+      <w:r>
+        <w:rPr>
+          <w:rFonts w:ascii="Calibri" w:hAnsi="Calibri"/>
+          <w:sz w:val="21"/>
+        </w:rPr>
+        <w:t>processedAt</w:t>
+      </w:r>
+      <w:proofErr w:type="spellEnd"/>
+      <w:r>
+        <w:rPr>
+          <w:rFonts w:ascii="Calibri" w:hAnsi="Calibri"/>
+          <w:sz w:val="21"/>
+        </w:rPr>
+        <w:t xml:space="preserve"> is returned (idempotency working)</w:t>
+      </w:r>
+    </w:p>
+    <w:p>
+      <w:pPr>
+        <w:pStyle w:val="ListBullet"/>
+        <w:tabs>
+          <w:tab w:val="num" w:pos="360"/>
+        </w:tabs>
+        <w:spacing w:after="40"/>
+        <w:ind w:left="360" w:hanging="360"/>
+      </w:pPr>
+      <w:r>
+        <w:rPr>
+          <w:rFonts w:ascii="Calibri" w:hAnsi="Calibri"/>
+          <w:sz w:val="21"/>
+        </w:rPr>
+        <w:t>Write a @</w:t>
+      </w:r>
+      <w:proofErr w:type="gramStart"/>
+      <w:r>
+        <w:rPr>
+          <w:rFonts w:ascii="Calibri" w:hAnsi="Calibri"/>
+          <w:sz w:val="21"/>
+        </w:rPr>
+        <w:t>WebMvcTest(</w:t>
+      </w:r>
+      <w:proofErr w:type="gramEnd"/>
+      <w:r>
+        <w:rPr>
+          <w:rFonts w:ascii="Calibri" w:hAnsi="Calibri"/>
+          <w:sz w:val="21"/>
+        </w:rPr>
+        <w:t xml:space="preserve">AttributionController.class) test that mocks </w:t>
+      </w:r>
+      <w:proofErr w:type="spellStart"/>
+      <w:r>
+        <w:rPr>
+          <w:rFonts w:ascii="Calibri" w:hAnsi="Calibri"/>
+          <w:sz w:val="21"/>
+        </w:rPr>
+        <w:t>AttributionService</w:t>
+      </w:r>
+      <w:proofErr w:type="spellEnd"/>
+      <w:r>
+        <w:rPr>
+          <w:rFonts w:ascii="Calibri" w:hAnsi="Calibri"/>
+          <w:sz w:val="21"/>
+        </w:rPr>
+        <w:t xml:space="preserve"> and verifies endpoint returns 200 with JSON body</w:t>
+      </w:r>
+    </w:p>
+    <w:p>
+      <w:pPr>
+        <w:spacing w:before="40" w:after="40"/>
+      </w:pPr>
+      <w:r>
+        <w:rPr>
+          <w:color w:val="CCCCCC"/>
+          <w:sz w:val="16"/>
+        </w:rPr>
+        <w:lastRenderedPageBreak/>
         <w:t>──────────────────────────────────────────────────────────────────────────────────────────</w:t>
       </w:r>
     </w:p>

</xml_diff>

<commit_message>
FDE-2: Add Comprehensive Integration Test Suite and one fix AttributionAudit.totalContributionPct precision scaling
</commit_message>
<xml_diff>
--- a/Prompts-FDE- 2.docx
+++ b/Prompts-FDE- 2.docx
@@ -8282,6 +8282,3112 @@
           <w:sz w:val="16"/>
         </w:rPr>
         <w:lastRenderedPageBreak/>
+        <w:t>──────────────────────────────────────────────────────────────────────────────────────────</w:t>
+      </w:r>
+    </w:p>
+    <w:p>
+      <w:pPr>
+        <w:spacing w:before="280" w:after="80"/>
+      </w:pPr>
+      <w:r>
+        <w:rPr>
+          <w:rFonts w:ascii="Calibri" w:hAnsi="Calibri"/>
+          <w:b/>
+          <w:color w:val="2E74B5"/>
+          <w:sz w:val="28"/>
+        </w:rPr>
+        <w:t xml:space="preserve">STEP </w:t>
+      </w:r>
+      <w:proofErr w:type="gramStart"/>
+      <w:r>
+        <w:rPr>
+          <w:rFonts w:ascii="Calibri" w:hAnsi="Calibri"/>
+          <w:b/>
+          <w:color w:val="2E74B5"/>
+          <w:sz w:val="28"/>
+        </w:rPr>
+        <w:t>1</w:t>
+      </w:r>
+      <w:r>
+        <w:rPr>
+          <w:rFonts w:ascii="Calibri" w:hAnsi="Calibri"/>
+          <w:b/>
+          <w:color w:val="2E74B5"/>
+          <w:sz w:val="28"/>
+        </w:rPr>
+        <w:t>0</w:t>
+      </w:r>
+      <w:r>
+        <w:rPr>
+          <w:rFonts w:ascii="Calibri" w:hAnsi="Calibri"/>
+          <w:b/>
+          <w:color w:val="2E74B5"/>
+          <w:sz w:val="28"/>
+        </w:rPr>
+        <w:t xml:space="preserve">  —</w:t>
+      </w:r>
+      <w:proofErr w:type="gramEnd"/>
+      <w:r>
+        <w:rPr>
+          <w:rFonts w:ascii="Calibri" w:hAnsi="Calibri"/>
+          <w:b/>
+          <w:color w:val="2E74B5"/>
+          <w:sz w:val="28"/>
+        </w:rPr>
+        <w:t xml:space="preserve">  Global Exception Handler</w:t>
+      </w:r>
+    </w:p>
+    <w:p>
+      <w:pPr>
+        <w:spacing w:after="60"/>
+      </w:pPr>
+      <w:r>
+        <w:rPr>
+          <w:rFonts w:ascii="Calibri" w:hAnsi="Calibri"/>
+          <w:b/>
+          <w:color w:val="2E74B5"/>
+        </w:rPr>
+        <w:t xml:space="preserve">Depends on: </w:t>
+      </w:r>
+      <w:r>
+        <w:rPr>
+          <w:rFonts w:ascii="Calibri" w:hAnsi="Calibri"/>
+        </w:rPr>
+        <w:t xml:space="preserve">Step </w:t>
+      </w:r>
+      <w:r>
+        <w:rPr>
+          <w:rFonts w:ascii="Calibri" w:hAnsi="Calibri"/>
+        </w:rPr>
+        <w:t>9</w:t>
+      </w:r>
+    </w:p>
+    <w:p>
+      <w:pPr>
+        <w:shd w:val="clear" w:color="auto" w:fill="F2F2F2"/>
+        <w:spacing w:after="0"/>
+        <w:ind w:left="288"/>
+      </w:pPr>
+      <w:r>
+        <w:rPr>
+          <w:rFonts w:ascii="Courier New" w:hAnsi="Courier New"/>
+          <w:sz w:val="18"/>
+        </w:rPr>
+        <w:t xml:space="preserve">In package </w:t>
+      </w:r>
+      <w:proofErr w:type="spellStart"/>
+      <w:proofErr w:type="gramStart"/>
+      <w:r>
+        <w:rPr>
+          <w:rFonts w:ascii="Courier New" w:hAnsi="Courier New"/>
+          <w:sz w:val="18"/>
+        </w:rPr>
+        <w:t>com.portfolio</w:t>
+      </w:r>
+      <w:proofErr w:type="gramEnd"/>
+      <w:r>
+        <w:rPr>
+          <w:rFonts w:ascii="Courier New" w:hAnsi="Courier New"/>
+          <w:sz w:val="18"/>
+        </w:rPr>
+        <w:t>.</w:t>
+      </w:r>
+      <w:proofErr w:type="gramStart"/>
+      <w:r>
+        <w:rPr>
+          <w:rFonts w:ascii="Courier New" w:hAnsi="Courier New"/>
+          <w:sz w:val="18"/>
+        </w:rPr>
+        <w:t>attribution.exception</w:t>
+      </w:r>
+      <w:proofErr w:type="spellEnd"/>
+      <w:proofErr w:type="gramEnd"/>
+      <w:r>
+        <w:rPr>
+          <w:rFonts w:ascii="Courier New" w:hAnsi="Courier New"/>
+          <w:sz w:val="18"/>
+        </w:rPr>
+        <w:t xml:space="preserve">, create </w:t>
+      </w:r>
+      <w:proofErr w:type="spellStart"/>
+      <w:r>
+        <w:rPr>
+          <w:rFonts w:ascii="Courier New" w:hAnsi="Courier New"/>
+          <w:sz w:val="18"/>
+        </w:rPr>
+        <w:t>GlobalExceptionHandler</w:t>
+      </w:r>
+      <w:proofErr w:type="spellEnd"/>
+    </w:p>
+    <w:p>
+      <w:pPr>
+        <w:shd w:val="clear" w:color="auto" w:fill="F2F2F2"/>
+        <w:spacing w:after="0"/>
+        <w:ind w:left="288"/>
+      </w:pPr>
+      <w:r>
+        <w:rPr>
+          <w:rFonts w:ascii="Courier New" w:hAnsi="Courier New"/>
+          <w:sz w:val="18"/>
+        </w:rPr>
+        <w:t>annotated with @RestControllerAdvice and @Slf4j:</w:t>
+      </w:r>
+    </w:p>
+    <w:p>
+      <w:pPr>
+        <w:shd w:val="clear" w:color="auto" w:fill="F2F2F2"/>
+        <w:spacing w:after="0"/>
+        <w:ind w:left="288"/>
+      </w:pPr>
+      <w:r>
+        <w:rPr>
+          <w:rFonts w:ascii="Courier New" w:hAnsi="Courier New"/>
+          <w:sz w:val="18"/>
+        </w:rPr>
+        <w:t xml:space="preserve"> </w:t>
+      </w:r>
+    </w:p>
+    <w:p>
+      <w:pPr>
+        <w:shd w:val="clear" w:color="auto" w:fill="F2F2F2"/>
+        <w:spacing w:after="0"/>
+        <w:ind w:left="288"/>
+      </w:pPr>
+      <w:r>
+        <w:rPr>
+          <w:rFonts w:ascii="Courier New" w:hAnsi="Courier New"/>
+          <w:sz w:val="18"/>
+        </w:rPr>
+        <w:t>Handle the following exception types and return structured JSON error responses:</w:t>
+      </w:r>
+    </w:p>
+    <w:p>
+      <w:pPr>
+        <w:shd w:val="clear" w:color="auto" w:fill="F2F2F2"/>
+        <w:spacing w:after="0"/>
+        <w:ind w:left="288"/>
+      </w:pPr>
+      <w:r>
+        <w:rPr>
+          <w:rFonts w:ascii="Courier New" w:hAnsi="Courier New"/>
+          <w:sz w:val="18"/>
+        </w:rPr>
+        <w:t xml:space="preserve"> </w:t>
+      </w:r>
+    </w:p>
+    <w:p>
+      <w:pPr>
+        <w:shd w:val="clear" w:color="auto" w:fill="F2F2F2"/>
+        <w:spacing w:after="0"/>
+        <w:ind w:left="288"/>
+      </w:pPr>
+      <w:r>
+        <w:rPr>
+          <w:rFonts w:ascii="Courier New" w:hAnsi="Courier New"/>
+          <w:sz w:val="18"/>
+        </w:rPr>
+        <w:t xml:space="preserve">1. </w:t>
+      </w:r>
+      <w:proofErr w:type="spellStart"/>
+      <w:r>
+        <w:rPr>
+          <w:rFonts w:ascii="Courier New" w:hAnsi="Courier New"/>
+          <w:sz w:val="18"/>
+        </w:rPr>
+        <w:t>InvalidAttributionInputException</w:t>
+      </w:r>
+      <w:proofErr w:type="spellEnd"/>
+      <w:r>
+        <w:rPr>
+          <w:rFonts w:ascii="Courier New" w:hAnsi="Courier New"/>
+          <w:sz w:val="18"/>
+        </w:rPr>
+        <w:t>:</w:t>
+      </w:r>
+    </w:p>
+    <w:p>
+      <w:pPr>
+        <w:shd w:val="clear" w:color="auto" w:fill="F2F2F2"/>
+        <w:spacing w:after="0"/>
+        <w:ind w:left="288"/>
+      </w:pPr>
+      <w:r>
+        <w:rPr>
+          <w:rFonts w:ascii="Courier New" w:hAnsi="Courier New"/>
+          <w:sz w:val="18"/>
+        </w:rPr>
+        <w:t xml:space="preserve">   - HTTP 400 Bad Request</w:t>
+      </w:r>
+    </w:p>
+    <w:p>
+      <w:pPr>
+        <w:shd w:val="clear" w:color="auto" w:fill="F2F2F2"/>
+        <w:spacing w:after="0"/>
+        <w:ind w:left="288"/>
+      </w:pPr>
+      <w:r>
+        <w:rPr>
+          <w:rFonts w:ascii="Courier New" w:hAnsi="Courier New"/>
+          <w:sz w:val="18"/>
+        </w:rPr>
+        <w:t xml:space="preserve">   - Response body: </w:t>
+      </w:r>
+      <w:proofErr w:type="gramStart"/>
+      <w:r>
+        <w:rPr>
+          <w:rFonts w:ascii="Courier New" w:hAnsi="Courier New"/>
+          <w:sz w:val="18"/>
+        </w:rPr>
+        <w:t>{ "</w:t>
+      </w:r>
+      <w:proofErr w:type="gramEnd"/>
+      <w:r>
+        <w:rPr>
+          <w:rFonts w:ascii="Courier New" w:hAnsi="Courier New"/>
+          <w:sz w:val="18"/>
+        </w:rPr>
+        <w:t>error": "INVALID_INPUT", "message": &lt;exception message&gt;,</w:t>
+      </w:r>
+    </w:p>
+    <w:p>
+      <w:pPr>
+        <w:shd w:val="clear" w:color="auto" w:fill="F2F2F2"/>
+        <w:spacing w:after="0"/>
+        <w:ind w:left="288"/>
+      </w:pPr>
+      <w:r>
+        <w:rPr>
+          <w:rFonts w:ascii="Courier New" w:hAnsi="Courier New"/>
+          <w:sz w:val="18"/>
+        </w:rPr>
+        <w:t xml:space="preserve">     "timestamp": &lt;ISO instant</w:t>
+      </w:r>
+      <w:proofErr w:type="gramStart"/>
+      <w:r>
+        <w:rPr>
+          <w:rFonts w:ascii="Courier New" w:hAnsi="Courier New"/>
+          <w:sz w:val="18"/>
+        </w:rPr>
+        <w:t>&gt; }</w:t>
+      </w:r>
+      <w:proofErr w:type="gramEnd"/>
+    </w:p>
+    <w:p>
+      <w:pPr>
+        <w:shd w:val="clear" w:color="auto" w:fill="F2F2F2"/>
+        <w:spacing w:after="0"/>
+        <w:ind w:left="288"/>
+      </w:pPr>
+      <w:r>
+        <w:rPr>
+          <w:rFonts w:ascii="Courier New" w:hAnsi="Courier New"/>
+          <w:sz w:val="18"/>
+        </w:rPr>
+        <w:t xml:space="preserve">   - Log at WARN level</w:t>
+      </w:r>
+    </w:p>
+    <w:p>
+      <w:pPr>
+        <w:shd w:val="clear" w:color="auto" w:fill="F2F2F2"/>
+        <w:spacing w:after="0"/>
+        <w:ind w:left="288"/>
+      </w:pPr>
+      <w:r>
+        <w:rPr>
+          <w:rFonts w:ascii="Courier New" w:hAnsi="Courier New"/>
+          <w:sz w:val="18"/>
+        </w:rPr>
+        <w:t xml:space="preserve"> </w:t>
+      </w:r>
+    </w:p>
+    <w:p>
+      <w:pPr>
+        <w:shd w:val="clear" w:color="auto" w:fill="F2F2F2"/>
+        <w:spacing w:after="0"/>
+        <w:ind w:left="288"/>
+      </w:pPr>
+      <w:r>
+        <w:rPr>
+          <w:rFonts w:ascii="Courier New" w:hAnsi="Courier New"/>
+          <w:sz w:val="18"/>
+        </w:rPr>
+        <w:t xml:space="preserve">2. </w:t>
+      </w:r>
+      <w:proofErr w:type="spellStart"/>
+      <w:r>
+        <w:rPr>
+          <w:rFonts w:ascii="Courier New" w:hAnsi="Courier New"/>
+          <w:sz w:val="18"/>
+        </w:rPr>
+        <w:t>MethodArgumentNotValidException</w:t>
+      </w:r>
+      <w:proofErr w:type="spellEnd"/>
+      <w:r>
+        <w:rPr>
+          <w:rFonts w:ascii="Courier New" w:hAnsi="Courier New"/>
+          <w:sz w:val="18"/>
+        </w:rPr>
+        <w:t xml:space="preserve"> (Jakarta Validation failures):</w:t>
+      </w:r>
+    </w:p>
+    <w:p>
+      <w:pPr>
+        <w:shd w:val="clear" w:color="auto" w:fill="F2F2F2"/>
+        <w:spacing w:after="0"/>
+        <w:ind w:left="288"/>
+      </w:pPr>
+      <w:r>
+        <w:rPr>
+          <w:rFonts w:ascii="Courier New" w:hAnsi="Courier New"/>
+          <w:sz w:val="18"/>
+        </w:rPr>
+        <w:t xml:space="preserve">   - HTTP 400 Bad Request</w:t>
+      </w:r>
+    </w:p>
+    <w:p>
+      <w:pPr>
+        <w:shd w:val="clear" w:color="auto" w:fill="F2F2F2"/>
+        <w:spacing w:after="0"/>
+        <w:ind w:left="288"/>
+      </w:pPr>
+      <w:r>
+        <w:rPr>
+          <w:rFonts w:ascii="Courier New" w:hAnsi="Courier New"/>
+          <w:sz w:val="18"/>
+        </w:rPr>
+        <w:t xml:space="preserve">   - Response body: </w:t>
+      </w:r>
+      <w:proofErr w:type="gramStart"/>
+      <w:r>
+        <w:rPr>
+          <w:rFonts w:ascii="Courier New" w:hAnsi="Courier New"/>
+          <w:sz w:val="18"/>
+        </w:rPr>
+        <w:t>{ "</w:t>
+      </w:r>
+      <w:proofErr w:type="gramEnd"/>
+      <w:r>
+        <w:rPr>
+          <w:rFonts w:ascii="Courier New" w:hAnsi="Courier New"/>
+          <w:sz w:val="18"/>
+        </w:rPr>
+        <w:t>error": "VALIDATION_FAILED",</w:t>
+      </w:r>
+    </w:p>
+    <w:p>
+      <w:pPr>
+        <w:shd w:val="clear" w:color="auto" w:fill="F2F2F2"/>
+        <w:spacing w:after="0"/>
+        <w:ind w:left="288"/>
+      </w:pPr>
+      <w:r>
+        <w:rPr>
+          <w:rFonts w:ascii="Courier New" w:hAnsi="Courier New"/>
+          <w:sz w:val="18"/>
+        </w:rPr>
+        <w:t xml:space="preserve">     "message": "Request validation failed",</w:t>
+      </w:r>
+    </w:p>
+    <w:p>
+      <w:pPr>
+        <w:shd w:val="clear" w:color="auto" w:fill="F2F2F2"/>
+        <w:spacing w:after="0"/>
+        <w:ind w:left="288"/>
+      </w:pPr>
+      <w:r>
+        <w:rPr>
+          <w:rFonts w:ascii="Courier New" w:hAnsi="Courier New"/>
+          <w:sz w:val="18"/>
+        </w:rPr>
+        <w:t xml:space="preserve">     "</w:t>
+      </w:r>
+      <w:proofErr w:type="spellStart"/>
+      <w:r>
+        <w:rPr>
+          <w:rFonts w:ascii="Courier New" w:hAnsi="Courier New"/>
+          <w:sz w:val="18"/>
+        </w:rPr>
+        <w:t>fieldErrors</w:t>
+      </w:r>
+      <w:proofErr w:type="spellEnd"/>
+      <w:r>
+        <w:rPr>
+          <w:rFonts w:ascii="Courier New" w:hAnsi="Courier New"/>
+          <w:sz w:val="18"/>
+        </w:rPr>
+        <w:t xml:space="preserve">": [ </w:t>
+      </w:r>
+      <w:proofErr w:type="gramStart"/>
+      <w:r>
+        <w:rPr>
+          <w:rFonts w:ascii="Courier New" w:hAnsi="Courier New"/>
+          <w:sz w:val="18"/>
+        </w:rPr>
+        <w:t>{ "</w:t>
+      </w:r>
+      <w:proofErr w:type="gramEnd"/>
+      <w:r>
+        <w:rPr>
+          <w:rFonts w:ascii="Courier New" w:hAnsi="Courier New"/>
+          <w:sz w:val="18"/>
+        </w:rPr>
+        <w:t xml:space="preserve">field": "...", "message": </w:t>
+      </w:r>
+      <w:proofErr w:type="gramStart"/>
+      <w:r>
+        <w:rPr>
+          <w:rFonts w:ascii="Courier New" w:hAnsi="Courier New"/>
+          <w:sz w:val="18"/>
+        </w:rPr>
+        <w:t>"..." }</w:t>
+      </w:r>
+      <w:proofErr w:type="gramEnd"/>
+      <w:r>
+        <w:rPr>
+          <w:rFonts w:ascii="Courier New" w:hAnsi="Courier New"/>
+          <w:sz w:val="18"/>
+        </w:rPr>
+        <w:t xml:space="preserve"> ],</w:t>
+      </w:r>
+    </w:p>
+    <w:p>
+      <w:pPr>
+        <w:shd w:val="clear" w:color="auto" w:fill="F2F2F2"/>
+        <w:spacing w:after="0"/>
+        <w:ind w:left="288"/>
+      </w:pPr>
+      <w:r>
+        <w:rPr>
+          <w:rFonts w:ascii="Courier New" w:hAnsi="Courier New"/>
+          <w:sz w:val="18"/>
+        </w:rPr>
+        <w:t xml:space="preserve">     "timestamp": &lt;ISO instant</w:t>
+      </w:r>
+      <w:proofErr w:type="gramStart"/>
+      <w:r>
+        <w:rPr>
+          <w:rFonts w:ascii="Courier New" w:hAnsi="Courier New"/>
+          <w:sz w:val="18"/>
+        </w:rPr>
+        <w:t>&gt; }</w:t>
+      </w:r>
+      <w:proofErr w:type="gramEnd"/>
+    </w:p>
+    <w:p>
+      <w:pPr>
+        <w:shd w:val="clear" w:color="auto" w:fill="F2F2F2"/>
+        <w:spacing w:after="0"/>
+        <w:ind w:left="288"/>
+      </w:pPr>
+      <w:r>
+        <w:rPr>
+          <w:rFonts w:ascii="Courier New" w:hAnsi="Courier New"/>
+          <w:sz w:val="18"/>
+        </w:rPr>
+        <w:t xml:space="preserve">   - Log at WARN level</w:t>
+      </w:r>
+    </w:p>
+    <w:p>
+      <w:pPr>
+        <w:shd w:val="clear" w:color="auto" w:fill="F2F2F2"/>
+        <w:spacing w:after="0"/>
+        <w:ind w:left="288"/>
+      </w:pPr>
+      <w:r>
+        <w:rPr>
+          <w:rFonts w:ascii="Courier New" w:hAnsi="Courier New"/>
+          <w:sz w:val="18"/>
+        </w:rPr>
+        <w:t xml:space="preserve"> </w:t>
+      </w:r>
+    </w:p>
+    <w:p>
+      <w:pPr>
+        <w:shd w:val="clear" w:color="auto" w:fill="F2F2F2"/>
+        <w:spacing w:after="0"/>
+        <w:ind w:left="288"/>
+      </w:pPr>
+      <w:r>
+        <w:rPr>
+          <w:rFonts w:ascii="Courier New" w:hAnsi="Courier New"/>
+          <w:sz w:val="18"/>
+        </w:rPr>
+        <w:t>3. Exception (catch-all):</w:t>
+      </w:r>
+    </w:p>
+    <w:p>
+      <w:pPr>
+        <w:shd w:val="clear" w:color="auto" w:fill="F2F2F2"/>
+        <w:spacing w:after="0"/>
+        <w:ind w:left="288"/>
+      </w:pPr>
+      <w:r>
+        <w:rPr>
+          <w:rFonts w:ascii="Courier New" w:hAnsi="Courier New"/>
+          <w:sz w:val="18"/>
+        </w:rPr>
+        <w:t xml:space="preserve">   - HTTP 500 Internal Server Error</w:t>
+      </w:r>
+    </w:p>
+    <w:p>
+      <w:pPr>
+        <w:shd w:val="clear" w:color="auto" w:fill="F2F2F2"/>
+        <w:spacing w:after="0"/>
+        <w:ind w:left="288"/>
+      </w:pPr>
+      <w:r>
+        <w:rPr>
+          <w:rFonts w:ascii="Courier New" w:hAnsi="Courier New"/>
+          <w:sz w:val="18"/>
+        </w:rPr>
+        <w:t xml:space="preserve">   - Response body: </w:t>
+      </w:r>
+      <w:proofErr w:type="gramStart"/>
+      <w:r>
+        <w:rPr>
+          <w:rFonts w:ascii="Courier New" w:hAnsi="Courier New"/>
+          <w:sz w:val="18"/>
+        </w:rPr>
+        <w:t>{ "</w:t>
+      </w:r>
+      <w:proofErr w:type="gramEnd"/>
+      <w:r>
+        <w:rPr>
+          <w:rFonts w:ascii="Courier New" w:hAnsi="Courier New"/>
+          <w:sz w:val="18"/>
+        </w:rPr>
+        <w:t>error": "INTERNAL_ERROR", "message": "An unexpected error occurred",</w:t>
+      </w:r>
+    </w:p>
+    <w:p>
+      <w:pPr>
+        <w:shd w:val="clear" w:color="auto" w:fill="F2F2F2"/>
+        <w:spacing w:after="0"/>
+        <w:ind w:left="288"/>
+      </w:pPr>
+      <w:r>
+        <w:rPr>
+          <w:rFonts w:ascii="Courier New" w:hAnsi="Courier New"/>
+          <w:sz w:val="18"/>
+        </w:rPr>
+        <w:t xml:space="preserve">     "timestamp": &lt;ISO instant</w:t>
+      </w:r>
+      <w:proofErr w:type="gramStart"/>
+      <w:r>
+        <w:rPr>
+          <w:rFonts w:ascii="Courier New" w:hAnsi="Courier New"/>
+          <w:sz w:val="18"/>
+        </w:rPr>
+        <w:t>&gt; }</w:t>
+      </w:r>
+      <w:proofErr w:type="gramEnd"/>
+    </w:p>
+    <w:p>
+      <w:pPr>
+        <w:shd w:val="clear" w:color="auto" w:fill="F2F2F2"/>
+        <w:spacing w:after="0"/>
+        <w:ind w:left="288"/>
+      </w:pPr>
+      <w:r>
+        <w:rPr>
+          <w:rFonts w:ascii="Courier New" w:hAnsi="Courier New"/>
+          <w:sz w:val="18"/>
+        </w:rPr>
+        <w:t xml:space="preserve">   - Log at ERROR level with stack trace</w:t>
+      </w:r>
+    </w:p>
+    <w:p>
+      <w:pPr>
+        <w:shd w:val="clear" w:color="auto" w:fill="F2F2F2"/>
+        <w:spacing w:after="0"/>
+        <w:ind w:left="288"/>
+      </w:pPr>
+      <w:r>
+        <w:rPr>
+          <w:rFonts w:ascii="Courier New" w:hAnsi="Courier New"/>
+          <w:sz w:val="18"/>
+        </w:rPr>
+        <w:t xml:space="preserve"> </w:t>
+      </w:r>
+    </w:p>
+    <w:p>
+      <w:pPr>
+        <w:shd w:val="clear" w:color="auto" w:fill="F2F2F2"/>
+        <w:spacing w:after="0"/>
+        <w:ind w:left="288"/>
+      </w:pPr>
+      <w:r>
+        <w:rPr>
+          <w:rFonts w:ascii="Courier New" w:hAnsi="Courier New"/>
+          <w:sz w:val="18"/>
+        </w:rPr>
+        <w:t xml:space="preserve">Create an </w:t>
+      </w:r>
+      <w:proofErr w:type="spellStart"/>
+      <w:r>
+        <w:rPr>
+          <w:rFonts w:ascii="Courier New" w:hAnsi="Courier New"/>
+          <w:sz w:val="18"/>
+        </w:rPr>
+        <w:t>ErrorResponse</w:t>
+      </w:r>
+      <w:proofErr w:type="spellEnd"/>
+      <w:r>
+        <w:rPr>
+          <w:rFonts w:ascii="Courier New" w:hAnsi="Courier New"/>
+          <w:sz w:val="18"/>
+        </w:rPr>
+        <w:t xml:space="preserve"> record (or class) in the exception package to hold</w:t>
+      </w:r>
+    </w:p>
+    <w:p>
+      <w:pPr>
+        <w:shd w:val="clear" w:color="auto" w:fill="F2F2F2"/>
+        <w:spacing w:after="0"/>
+        <w:ind w:left="288"/>
+      </w:pPr>
+      <w:r>
+        <w:rPr>
+          <w:rFonts w:ascii="Courier New" w:hAnsi="Courier New"/>
+          <w:sz w:val="18"/>
+        </w:rPr>
+        <w:t>the structured error fields.</w:t>
+      </w:r>
+    </w:p>
+    <w:p/>
+    <w:p>
+      <w:pPr>
+        <w:spacing w:before="120" w:after="40"/>
+      </w:pPr>
+      <w:r>
+        <w:rPr>
+          <w:rFonts w:ascii="Calibri" w:hAnsi="Calibri"/>
+          <w:b/>
+          <w:color w:val="1F497D"/>
+        </w:rPr>
+        <w:t>Validation Gate</w:t>
+      </w:r>
+    </w:p>
+    <w:p>
+      <w:pPr>
+        <w:pStyle w:val="ListBullet"/>
+        <w:tabs>
+          <w:tab w:val="num" w:pos="360"/>
+        </w:tabs>
+        <w:spacing w:after="40"/>
+        <w:ind w:left="360" w:hanging="360"/>
+      </w:pPr>
+      <w:r>
+        <w:rPr>
+          <w:rFonts w:ascii="Calibri" w:hAnsi="Calibri"/>
+          <w:sz w:val="21"/>
+        </w:rPr>
+        <w:t>POST with invalid weights → HTTP 400, body contains "error": "INVALID_INPUT"</w:t>
+      </w:r>
+    </w:p>
+    <w:p>
+      <w:pPr>
+        <w:pStyle w:val="ListBullet"/>
+        <w:tabs>
+          <w:tab w:val="num" w:pos="360"/>
+        </w:tabs>
+        <w:spacing w:after="40"/>
+        <w:ind w:left="360" w:hanging="360"/>
+      </w:pPr>
+      <w:r>
+        <w:rPr>
+          <w:rFonts w:ascii="Calibri" w:hAnsi="Calibri"/>
+          <w:sz w:val="21"/>
+        </w:rPr>
+        <w:t xml:space="preserve">POST with missing required field (e.g. no </w:t>
+      </w:r>
+      <w:proofErr w:type="spellStart"/>
+      <w:r>
+        <w:rPr>
+          <w:rFonts w:ascii="Calibri" w:hAnsi="Calibri"/>
+          <w:sz w:val="21"/>
+        </w:rPr>
+        <w:t>requestId</w:t>
+      </w:r>
+      <w:proofErr w:type="spellEnd"/>
+      <w:r>
+        <w:rPr>
+          <w:rFonts w:ascii="Calibri" w:hAnsi="Calibri"/>
+          <w:sz w:val="21"/>
+        </w:rPr>
+        <w:t xml:space="preserve">) → HTTP 400, body contains "error": "VALIDATION_FAILED" with </w:t>
+      </w:r>
+      <w:proofErr w:type="spellStart"/>
+      <w:r>
+        <w:rPr>
+          <w:rFonts w:ascii="Calibri" w:hAnsi="Calibri"/>
+          <w:sz w:val="21"/>
+        </w:rPr>
+        <w:t>fieldErrors</w:t>
+      </w:r>
+      <w:proofErr w:type="spellEnd"/>
+    </w:p>
+    <w:p>
+      <w:pPr>
+        <w:pStyle w:val="ListBullet"/>
+        <w:tabs>
+          <w:tab w:val="num" w:pos="360"/>
+        </w:tabs>
+        <w:spacing w:after="40"/>
+        <w:ind w:left="360" w:hanging="360"/>
+      </w:pPr>
+      <w:r>
+        <w:rPr>
+          <w:rFonts w:ascii="Calibri" w:hAnsi="Calibri"/>
+          <w:sz w:val="21"/>
+        </w:rPr>
+        <w:t>Verify 200 is still returned for a valid mock request (no regression)</w:t>
+      </w:r>
+    </w:p>
+    <w:p>
+      <w:pPr>
+        <w:pStyle w:val="ListBullet"/>
+        <w:tabs>
+          <w:tab w:val="num" w:pos="360"/>
+        </w:tabs>
+        <w:spacing w:after="40"/>
+        <w:ind w:left="360" w:hanging="360"/>
+      </w:pPr>
+      <w:r>
+        <w:rPr>
+          <w:rFonts w:ascii="Calibri" w:hAnsi="Calibri"/>
+          <w:sz w:val="21"/>
+        </w:rPr>
+        <w:t>Run `</w:t>
+      </w:r>
+      <w:proofErr w:type="spellStart"/>
+      <w:r>
+        <w:rPr>
+          <w:rFonts w:ascii="Calibri" w:hAnsi="Calibri"/>
+          <w:sz w:val="21"/>
+        </w:rPr>
+        <w:t>mvn</w:t>
+      </w:r>
+      <w:proofErr w:type="spellEnd"/>
+      <w:r>
+        <w:rPr>
+          <w:rFonts w:ascii="Calibri" w:hAnsi="Calibri"/>
+          <w:sz w:val="21"/>
+        </w:rPr>
+        <w:t xml:space="preserve"> test` — all tests pass</w:t>
+      </w:r>
+    </w:p>
+    <w:p>
+      <w:pPr>
+        <w:spacing w:before="40" w:after="40"/>
+      </w:pPr>
+      <w:r>
+        <w:rPr>
+          <w:color w:val="CCCCCC"/>
+          <w:sz w:val="16"/>
+        </w:rPr>
+        <w:t>──────────────────────────────────────────────────────────────────────────────────────────</w:t>
+      </w:r>
+    </w:p>
+    <w:p>
+      <w:pPr>
+        <w:spacing w:before="280" w:after="80"/>
+      </w:pPr>
+      <w:r>
+        <w:rPr>
+          <w:rFonts w:ascii="Calibri" w:hAnsi="Calibri"/>
+          <w:b/>
+          <w:color w:val="2E74B5"/>
+          <w:sz w:val="28"/>
+        </w:rPr>
+        <w:t xml:space="preserve">STEP </w:t>
+      </w:r>
+      <w:proofErr w:type="gramStart"/>
+      <w:r>
+        <w:rPr>
+          <w:rFonts w:ascii="Calibri" w:hAnsi="Calibri"/>
+          <w:b/>
+          <w:color w:val="2E74B5"/>
+          <w:sz w:val="28"/>
+        </w:rPr>
+        <w:t>1</w:t>
+      </w:r>
+      <w:r>
+        <w:rPr>
+          <w:rFonts w:ascii="Calibri" w:hAnsi="Calibri"/>
+          <w:b/>
+          <w:color w:val="2E74B5"/>
+          <w:sz w:val="28"/>
+        </w:rPr>
+        <w:t>1</w:t>
+      </w:r>
+      <w:r>
+        <w:rPr>
+          <w:rFonts w:ascii="Calibri" w:hAnsi="Calibri"/>
+          <w:b/>
+          <w:color w:val="2E74B5"/>
+          <w:sz w:val="28"/>
+        </w:rPr>
+        <w:t xml:space="preserve">  —</w:t>
+      </w:r>
+      <w:proofErr w:type="gramEnd"/>
+      <w:r>
+        <w:rPr>
+          <w:rFonts w:ascii="Calibri" w:hAnsi="Calibri"/>
+          <w:b/>
+          <w:color w:val="2E74B5"/>
+          <w:sz w:val="28"/>
+        </w:rPr>
+        <w:t xml:space="preserve">  Resilience Simulation (Timeout/Retry Pattern)</w:t>
+      </w:r>
+    </w:p>
+    <w:p>
+      <w:pPr>
+        <w:spacing w:after="60"/>
+      </w:pPr>
+      <w:r>
+        <w:rPr>
+          <w:rFonts w:ascii="Calibri" w:hAnsi="Calibri"/>
+          <w:b/>
+          <w:color w:val="2E74B5"/>
+        </w:rPr>
+        <w:t xml:space="preserve">Depends on: </w:t>
+      </w:r>
+      <w:r>
+        <w:rPr>
+          <w:rFonts w:ascii="Calibri" w:hAnsi="Calibri"/>
+        </w:rPr>
+        <w:t>Step 1</w:t>
+      </w:r>
+      <w:r>
+        <w:rPr>
+          <w:rFonts w:ascii="Calibri" w:hAnsi="Calibri"/>
+        </w:rPr>
+        <w:t>0</w:t>
+      </w:r>
+    </w:p>
+    <w:p>
+      <w:pPr>
+        <w:shd w:val="clear" w:color="auto" w:fill="F2F2F2"/>
+        <w:spacing w:after="0"/>
+        <w:ind w:left="288"/>
+      </w:pPr>
+      <w:r>
+        <w:rPr>
+          <w:rFonts w:ascii="Courier New" w:hAnsi="Courier New"/>
+          <w:sz w:val="18"/>
+        </w:rPr>
+        <w:t xml:space="preserve">In package </w:t>
+      </w:r>
+      <w:proofErr w:type="spellStart"/>
+      <w:proofErr w:type="gramStart"/>
+      <w:r>
+        <w:rPr>
+          <w:rFonts w:ascii="Courier New" w:hAnsi="Courier New"/>
+          <w:sz w:val="18"/>
+        </w:rPr>
+        <w:t>com.portfolio</w:t>
+      </w:r>
+      <w:proofErr w:type="gramEnd"/>
+      <w:r>
+        <w:rPr>
+          <w:rFonts w:ascii="Courier New" w:hAnsi="Courier New"/>
+          <w:sz w:val="18"/>
+        </w:rPr>
+        <w:t>.</w:t>
+      </w:r>
+      <w:proofErr w:type="gramStart"/>
+      <w:r>
+        <w:rPr>
+          <w:rFonts w:ascii="Courier New" w:hAnsi="Courier New"/>
+          <w:sz w:val="18"/>
+        </w:rPr>
+        <w:t>attribution.service</w:t>
+      </w:r>
+      <w:proofErr w:type="spellEnd"/>
+      <w:proofErr w:type="gramEnd"/>
+      <w:r>
+        <w:rPr>
+          <w:rFonts w:ascii="Courier New" w:hAnsi="Courier New"/>
+          <w:sz w:val="18"/>
+        </w:rPr>
+        <w:t xml:space="preserve">, create a class </w:t>
+      </w:r>
+      <w:proofErr w:type="spellStart"/>
+      <w:r>
+        <w:rPr>
+          <w:rFonts w:ascii="Courier New" w:hAnsi="Courier New"/>
+          <w:sz w:val="18"/>
+        </w:rPr>
+        <w:t>PricingResilienceSimulator</w:t>
+      </w:r>
+      <w:proofErr w:type="spellEnd"/>
+    </w:p>
+    <w:p>
+      <w:pPr>
+        <w:shd w:val="clear" w:color="auto" w:fill="F2F2F2"/>
+        <w:spacing w:after="0"/>
+        <w:ind w:left="288"/>
+      </w:pPr>
+      <w:r>
+        <w:rPr>
+          <w:rFonts w:ascii="Courier New" w:hAnsi="Courier New"/>
+          <w:sz w:val="18"/>
+        </w:rPr>
+        <w:t>annotated with @Component and @Slf4j:</w:t>
+      </w:r>
+    </w:p>
+    <w:p>
+      <w:pPr>
+        <w:shd w:val="clear" w:color="auto" w:fill="F2F2F2"/>
+        <w:spacing w:after="0"/>
+        <w:ind w:left="288"/>
+      </w:pPr>
+      <w:r>
+        <w:rPr>
+          <w:rFonts w:ascii="Courier New" w:hAnsi="Courier New"/>
+          <w:sz w:val="18"/>
+        </w:rPr>
+        <w:t xml:space="preserve"> </w:t>
+      </w:r>
+    </w:p>
+    <w:p>
+      <w:pPr>
+        <w:shd w:val="clear" w:color="auto" w:fill="F2F2F2"/>
+        <w:spacing w:after="0"/>
+        <w:ind w:left="288"/>
+      </w:pPr>
+      <w:r>
+        <w:rPr>
+          <w:rFonts w:ascii="Courier New" w:hAnsi="Courier New"/>
+          <w:sz w:val="18"/>
+        </w:rPr>
+        <w:t>This class simulates the real-world scenario where pricing data retrieval may be</w:t>
+      </w:r>
+    </w:p>
+    <w:p>
+      <w:pPr>
+        <w:shd w:val="clear" w:color="auto" w:fill="F2F2F2"/>
+        <w:spacing w:after="0"/>
+        <w:ind w:left="288"/>
+      </w:pPr>
+      <w:r>
+        <w:rPr>
+          <w:rFonts w:ascii="Courier New" w:hAnsi="Courier New"/>
+          <w:sz w:val="18"/>
+        </w:rPr>
+        <w:t>slow or fail. Implement:</w:t>
+      </w:r>
+    </w:p>
+    <w:p>
+      <w:pPr>
+        <w:shd w:val="clear" w:color="auto" w:fill="F2F2F2"/>
+        <w:spacing w:after="0"/>
+        <w:ind w:left="288"/>
+      </w:pPr>
+      <w:r>
+        <w:rPr>
+          <w:rFonts w:ascii="Courier New" w:hAnsi="Courier New"/>
+          <w:sz w:val="18"/>
+        </w:rPr>
+        <w:t xml:space="preserve"> </w:t>
+      </w:r>
+    </w:p>
+    <w:p>
+      <w:pPr>
+        <w:shd w:val="clear" w:color="auto" w:fill="F2F2F2"/>
+        <w:spacing w:after="0"/>
+        <w:ind w:left="288"/>
+      </w:pPr>
+      <w:r>
+        <w:rPr>
+          <w:rFonts w:ascii="Courier New" w:hAnsi="Courier New"/>
+          <w:sz w:val="18"/>
+        </w:rPr>
+        <w:t xml:space="preserve">  </w:t>
+      </w:r>
+      <w:proofErr w:type="spellStart"/>
+      <w:r>
+        <w:rPr>
+          <w:rFonts w:ascii="Courier New" w:hAnsi="Courier New"/>
+          <w:sz w:val="18"/>
+        </w:rPr>
+        <w:t>BigDecimal</w:t>
+      </w:r>
+      <w:proofErr w:type="spellEnd"/>
+      <w:r>
+        <w:rPr>
+          <w:rFonts w:ascii="Courier New" w:hAnsi="Courier New"/>
+          <w:sz w:val="18"/>
+        </w:rPr>
+        <w:t xml:space="preserve"> </w:t>
+      </w:r>
+      <w:proofErr w:type="spellStart"/>
+      <w:proofErr w:type="gramStart"/>
+      <w:r>
+        <w:rPr>
+          <w:rFonts w:ascii="Courier New" w:hAnsi="Courier New"/>
+          <w:sz w:val="18"/>
+        </w:rPr>
+        <w:t>fetchReturnWithFallback</w:t>
+      </w:r>
+      <w:proofErr w:type="spellEnd"/>
+      <w:r>
+        <w:rPr>
+          <w:rFonts w:ascii="Courier New" w:hAnsi="Courier New"/>
+          <w:sz w:val="18"/>
+        </w:rPr>
+        <w:t>(</w:t>
+      </w:r>
+      <w:proofErr w:type="gramEnd"/>
+      <w:r>
+        <w:rPr>
+          <w:rFonts w:ascii="Courier New" w:hAnsi="Courier New"/>
+          <w:sz w:val="18"/>
+        </w:rPr>
+        <w:t xml:space="preserve">String </w:t>
+      </w:r>
+      <w:proofErr w:type="spellStart"/>
+      <w:r>
+        <w:rPr>
+          <w:rFonts w:ascii="Courier New" w:hAnsi="Courier New"/>
+          <w:sz w:val="18"/>
+        </w:rPr>
+        <w:t>groupName</w:t>
+      </w:r>
+      <w:proofErr w:type="spellEnd"/>
+      <w:r>
+        <w:rPr>
+          <w:rFonts w:ascii="Courier New" w:hAnsi="Courier New"/>
+          <w:sz w:val="18"/>
+        </w:rPr>
+        <w:t xml:space="preserve">, </w:t>
+      </w:r>
+      <w:proofErr w:type="spellStart"/>
+      <w:r>
+        <w:rPr>
+          <w:rFonts w:ascii="Courier New" w:hAnsi="Courier New"/>
+          <w:sz w:val="18"/>
+        </w:rPr>
+        <w:t>BigDecimal</w:t>
+      </w:r>
+      <w:proofErr w:type="spellEnd"/>
+      <w:r>
+        <w:rPr>
+          <w:rFonts w:ascii="Courier New" w:hAnsi="Courier New"/>
+          <w:sz w:val="18"/>
+        </w:rPr>
+        <w:t xml:space="preserve"> </w:t>
+      </w:r>
+      <w:proofErr w:type="spellStart"/>
+      <w:r>
+        <w:rPr>
+          <w:rFonts w:ascii="Courier New" w:hAnsi="Courier New"/>
+          <w:sz w:val="18"/>
+        </w:rPr>
+        <w:t>primaryReturn</w:t>
+      </w:r>
+      <w:proofErr w:type="spellEnd"/>
+      <w:r>
+        <w:rPr>
+          <w:rFonts w:ascii="Courier New" w:hAnsi="Courier New"/>
+          <w:sz w:val="18"/>
+        </w:rPr>
+        <w:t>,</w:t>
+      </w:r>
+    </w:p>
+    <w:p>
+      <w:pPr>
+        <w:shd w:val="clear" w:color="auto" w:fill="F2F2F2"/>
+        <w:spacing w:after="0"/>
+        <w:ind w:left="288"/>
+      </w:pPr>
+      <w:r>
+        <w:rPr>
+          <w:rFonts w:ascii="Courier New" w:hAnsi="Courier New"/>
+          <w:sz w:val="18"/>
+        </w:rPr>
+        <w:t xml:space="preserve">                                     </w:t>
+      </w:r>
+      <w:proofErr w:type="spellStart"/>
+      <w:r>
+        <w:rPr>
+          <w:rFonts w:ascii="Courier New" w:hAnsi="Courier New"/>
+          <w:sz w:val="18"/>
+        </w:rPr>
+        <w:t>BigDecimal</w:t>
+      </w:r>
+      <w:proofErr w:type="spellEnd"/>
+      <w:r>
+        <w:rPr>
+          <w:rFonts w:ascii="Courier New" w:hAnsi="Courier New"/>
+          <w:sz w:val="18"/>
+        </w:rPr>
+        <w:t xml:space="preserve"> </w:t>
+      </w:r>
+      <w:proofErr w:type="spellStart"/>
+      <w:r>
+        <w:rPr>
+          <w:rFonts w:ascii="Courier New" w:hAnsi="Courier New"/>
+          <w:sz w:val="18"/>
+        </w:rPr>
+        <w:t>fallbackReturn</w:t>
+      </w:r>
+      <w:proofErr w:type="spellEnd"/>
+      <w:r>
+        <w:rPr>
+          <w:rFonts w:ascii="Courier New" w:hAnsi="Courier New"/>
+          <w:sz w:val="18"/>
+        </w:rPr>
+        <w:t>,</w:t>
+      </w:r>
+    </w:p>
+    <w:p>
+      <w:pPr>
+        <w:shd w:val="clear" w:color="auto" w:fill="F2F2F2"/>
+        <w:spacing w:after="0"/>
+        <w:ind w:left="288"/>
+      </w:pPr>
+      <w:r>
+        <w:rPr>
+          <w:rFonts w:ascii="Courier New" w:hAnsi="Courier New"/>
+          <w:sz w:val="18"/>
+        </w:rPr>
+        <w:t xml:space="preserve">                                     List&lt;String&gt; warnings)</w:t>
+      </w:r>
+    </w:p>
+    <w:p>
+      <w:pPr>
+        <w:shd w:val="clear" w:color="auto" w:fill="F2F2F2"/>
+        <w:spacing w:after="0"/>
+        <w:ind w:left="288"/>
+      </w:pPr>
+      <w:r>
+        <w:rPr>
+          <w:rFonts w:ascii="Courier New" w:hAnsi="Courier New"/>
+          <w:sz w:val="18"/>
+        </w:rPr>
+        <w:lastRenderedPageBreak/>
+        <w:t xml:space="preserve"> </w:t>
+      </w:r>
+    </w:p>
+    <w:p>
+      <w:pPr>
+        <w:shd w:val="clear" w:color="auto" w:fill="F2F2F2"/>
+        <w:spacing w:after="0"/>
+        <w:ind w:left="288"/>
+      </w:pPr>
+      <w:r>
+        <w:rPr>
+          <w:rFonts w:ascii="Courier New" w:hAnsi="Courier New"/>
+          <w:sz w:val="18"/>
+        </w:rPr>
+        <w:t>Logic:</w:t>
+      </w:r>
+    </w:p>
+    <w:p>
+      <w:pPr>
+        <w:shd w:val="clear" w:color="auto" w:fill="F2F2F2"/>
+        <w:spacing w:after="0"/>
+        <w:ind w:left="288"/>
+      </w:pPr>
+      <w:r>
+        <w:rPr>
+          <w:rFonts w:ascii="Courier New" w:hAnsi="Courier New"/>
+          <w:sz w:val="18"/>
+        </w:rPr>
+        <w:t xml:space="preserve">- If </w:t>
+      </w:r>
+      <w:proofErr w:type="spellStart"/>
+      <w:r>
+        <w:rPr>
+          <w:rFonts w:ascii="Courier New" w:hAnsi="Courier New"/>
+          <w:sz w:val="18"/>
+        </w:rPr>
+        <w:t>primaryReturn</w:t>
+      </w:r>
+      <w:proofErr w:type="spellEnd"/>
+      <w:r>
+        <w:rPr>
+          <w:rFonts w:ascii="Courier New" w:hAnsi="Courier New"/>
+          <w:sz w:val="18"/>
+        </w:rPr>
+        <w:t xml:space="preserve"> is non-null, return it immediately (no simulation needed)</w:t>
+      </w:r>
+    </w:p>
+    <w:p>
+      <w:pPr>
+        <w:shd w:val="clear" w:color="auto" w:fill="F2F2F2"/>
+        <w:spacing w:after="0"/>
+        <w:ind w:left="288"/>
+      </w:pPr>
+      <w:r>
+        <w:rPr>
+          <w:rFonts w:ascii="Courier New" w:hAnsi="Courier New"/>
+          <w:sz w:val="18"/>
+        </w:rPr>
+        <w:t xml:space="preserve">- If </w:t>
+      </w:r>
+      <w:proofErr w:type="spellStart"/>
+      <w:r>
+        <w:rPr>
+          <w:rFonts w:ascii="Courier New" w:hAnsi="Courier New"/>
+          <w:sz w:val="18"/>
+        </w:rPr>
+        <w:t>primaryReturn</w:t>
+      </w:r>
+      <w:proofErr w:type="spellEnd"/>
+      <w:r>
+        <w:rPr>
+          <w:rFonts w:ascii="Courier New" w:hAnsi="Courier New"/>
+          <w:sz w:val="18"/>
+        </w:rPr>
+        <w:t xml:space="preserve"> is null:</w:t>
+      </w:r>
+    </w:p>
+    <w:p>
+      <w:pPr>
+        <w:shd w:val="clear" w:color="auto" w:fill="F2F2F2"/>
+        <w:spacing w:after="0"/>
+        <w:ind w:left="288"/>
+      </w:pPr>
+      <w:r>
+        <w:rPr>
+          <w:rFonts w:ascii="Courier New" w:hAnsi="Courier New"/>
+          <w:sz w:val="18"/>
+        </w:rPr>
+        <w:t xml:space="preserve">    - Log WARN: "Primary pricing unavailable for group [{}], attempting fallback"</w:t>
+      </w:r>
+    </w:p>
+    <w:p>
+      <w:pPr>
+        <w:shd w:val="clear" w:color="auto" w:fill="F2F2F2"/>
+        <w:spacing w:after="0"/>
+        <w:ind w:left="288"/>
+      </w:pPr>
+      <w:r>
+        <w:rPr>
+          <w:rFonts w:ascii="Courier New" w:hAnsi="Courier New"/>
+          <w:sz w:val="18"/>
+        </w:rPr>
+        <w:t xml:space="preserve">    - Simulate a brief delay using </w:t>
+      </w:r>
+      <w:proofErr w:type="spellStart"/>
+      <w:r>
+        <w:rPr>
+          <w:rFonts w:ascii="Courier New" w:hAnsi="Courier New"/>
+          <w:sz w:val="18"/>
+        </w:rPr>
+        <w:t>Thread.sleep</w:t>
+      </w:r>
+      <w:proofErr w:type="spellEnd"/>
+      <w:r>
+        <w:rPr>
+          <w:rFonts w:ascii="Courier New" w:hAnsi="Courier New"/>
+          <w:sz w:val="18"/>
+        </w:rPr>
+        <w:t>(50) to represent a timeout probe</w:t>
+      </w:r>
+    </w:p>
+    <w:p>
+      <w:pPr>
+        <w:shd w:val="clear" w:color="auto" w:fill="F2F2F2"/>
+        <w:spacing w:after="0"/>
+        <w:ind w:left="288"/>
+      </w:pPr>
+      <w:r>
+        <w:rPr>
+          <w:rFonts w:ascii="Courier New" w:hAnsi="Courier New"/>
+          <w:sz w:val="18"/>
+        </w:rPr>
+        <w:t xml:space="preserve">    - If </w:t>
+      </w:r>
+      <w:proofErr w:type="spellStart"/>
+      <w:r>
+        <w:rPr>
+          <w:rFonts w:ascii="Courier New" w:hAnsi="Courier New"/>
+          <w:sz w:val="18"/>
+        </w:rPr>
+        <w:t>fallbackReturn</w:t>
+      </w:r>
+      <w:proofErr w:type="spellEnd"/>
+      <w:r>
+        <w:rPr>
+          <w:rFonts w:ascii="Courier New" w:hAnsi="Courier New"/>
+          <w:sz w:val="18"/>
+        </w:rPr>
+        <w:t xml:space="preserve"> is non-null:</w:t>
+      </w:r>
+    </w:p>
+    <w:p>
+      <w:pPr>
+        <w:shd w:val="clear" w:color="auto" w:fill="F2F2F2"/>
+        <w:spacing w:after="0"/>
+        <w:ind w:left="288"/>
+      </w:pPr>
+      <w:r>
+        <w:rPr>
+          <w:rFonts w:ascii="Courier New" w:hAnsi="Courier New"/>
+          <w:sz w:val="18"/>
+        </w:rPr>
+        <w:t xml:space="preserve">        - Log INFO: "Fallback pricing applied for group [{}]"</w:t>
+      </w:r>
+    </w:p>
+    <w:p>
+      <w:pPr>
+        <w:shd w:val="clear" w:color="auto" w:fill="F2F2F2"/>
+        <w:spacing w:after="0"/>
+        <w:ind w:left="288"/>
+      </w:pPr>
+      <w:r>
+        <w:rPr>
+          <w:rFonts w:ascii="Courier New" w:hAnsi="Courier New"/>
+          <w:sz w:val="18"/>
+        </w:rPr>
+        <w:t xml:space="preserve">        - Add to warnings: "Fallback pricing used for {</w:t>
+      </w:r>
+      <w:proofErr w:type="spellStart"/>
+      <w:r>
+        <w:rPr>
+          <w:rFonts w:ascii="Courier New" w:hAnsi="Courier New"/>
+          <w:sz w:val="18"/>
+        </w:rPr>
+        <w:t>groupName</w:t>
+      </w:r>
+      <w:proofErr w:type="spellEnd"/>
+      <w:r>
+        <w:rPr>
+          <w:rFonts w:ascii="Courier New" w:hAnsi="Courier New"/>
+          <w:sz w:val="18"/>
+        </w:rPr>
+        <w:t>}"</w:t>
+      </w:r>
+    </w:p>
+    <w:p>
+      <w:pPr>
+        <w:shd w:val="clear" w:color="auto" w:fill="F2F2F2"/>
+        <w:spacing w:after="0"/>
+        <w:ind w:left="288"/>
+      </w:pPr>
+      <w:r>
+        <w:rPr>
+          <w:rFonts w:ascii="Courier New" w:hAnsi="Courier New"/>
+          <w:sz w:val="18"/>
+        </w:rPr>
+        <w:t xml:space="preserve">        - Return </w:t>
+      </w:r>
+      <w:proofErr w:type="spellStart"/>
+      <w:r>
+        <w:rPr>
+          <w:rFonts w:ascii="Courier New" w:hAnsi="Courier New"/>
+          <w:sz w:val="18"/>
+        </w:rPr>
+        <w:t>fallbackReturn</w:t>
+      </w:r>
+      <w:proofErr w:type="spellEnd"/>
+    </w:p>
+    <w:p>
+      <w:pPr>
+        <w:shd w:val="clear" w:color="auto" w:fill="F2F2F2"/>
+        <w:spacing w:after="0"/>
+        <w:ind w:left="288"/>
+      </w:pPr>
+      <w:r>
+        <w:rPr>
+          <w:rFonts w:ascii="Courier New" w:hAnsi="Courier New"/>
+          <w:sz w:val="18"/>
+        </w:rPr>
+        <w:t xml:space="preserve">    - If </w:t>
+      </w:r>
+      <w:proofErr w:type="spellStart"/>
+      <w:r>
+        <w:rPr>
+          <w:rFonts w:ascii="Courier New" w:hAnsi="Courier New"/>
+          <w:sz w:val="18"/>
+        </w:rPr>
+        <w:t>fallbackReturn</w:t>
+      </w:r>
+      <w:proofErr w:type="spellEnd"/>
+      <w:r>
+        <w:rPr>
+          <w:rFonts w:ascii="Courier New" w:hAnsi="Courier New"/>
+          <w:sz w:val="18"/>
+        </w:rPr>
+        <w:t xml:space="preserve"> is also null:</w:t>
+      </w:r>
+    </w:p>
+    <w:p>
+      <w:pPr>
+        <w:shd w:val="clear" w:color="auto" w:fill="F2F2F2"/>
+        <w:spacing w:after="0"/>
+        <w:ind w:left="288"/>
+      </w:pPr>
+      <w:r>
+        <w:rPr>
+          <w:rFonts w:ascii="Courier New" w:hAnsi="Courier New"/>
+          <w:sz w:val="18"/>
+        </w:rPr>
+        <w:t xml:space="preserve">        - Log WARN: "No pricing available for group [{}], group will be excluded"</w:t>
+      </w:r>
+    </w:p>
+    <w:p>
+      <w:pPr>
+        <w:shd w:val="clear" w:color="auto" w:fill="F2F2F2"/>
+        <w:spacing w:after="0"/>
+        <w:ind w:left="288"/>
+      </w:pPr>
+      <w:r>
+        <w:rPr>
+          <w:rFonts w:ascii="Courier New" w:hAnsi="Courier New"/>
+          <w:sz w:val="18"/>
+        </w:rPr>
+        <w:t xml:space="preserve">        - Add to warnings: "Return unavailable for {</w:t>
+      </w:r>
+      <w:proofErr w:type="spellStart"/>
+      <w:r>
+        <w:rPr>
+          <w:rFonts w:ascii="Courier New" w:hAnsi="Courier New"/>
+          <w:sz w:val="18"/>
+        </w:rPr>
+        <w:t>groupName</w:t>
+      </w:r>
+      <w:proofErr w:type="spellEnd"/>
+      <w:r>
+        <w:rPr>
+          <w:rFonts w:ascii="Courier New" w:hAnsi="Courier New"/>
+          <w:sz w:val="18"/>
+        </w:rPr>
+        <w:t>}"</w:t>
+      </w:r>
+    </w:p>
+    <w:p>
+      <w:pPr>
+        <w:shd w:val="clear" w:color="auto" w:fill="F2F2F2"/>
+        <w:spacing w:after="0"/>
+        <w:ind w:left="288"/>
+      </w:pPr>
+      <w:r>
+        <w:rPr>
+          <w:rFonts w:ascii="Courier New" w:hAnsi="Courier New"/>
+          <w:sz w:val="18"/>
+        </w:rPr>
+        <w:t xml:space="preserve">        - Return null</w:t>
+      </w:r>
+    </w:p>
+    <w:p>
+      <w:pPr>
+        <w:shd w:val="clear" w:color="auto" w:fill="F2F2F2"/>
+        <w:spacing w:after="0"/>
+        <w:ind w:left="288"/>
+      </w:pPr>
+      <w:r>
+        <w:rPr>
+          <w:rFonts w:ascii="Courier New" w:hAnsi="Courier New"/>
+          <w:sz w:val="18"/>
+        </w:rPr>
+        <w:t xml:space="preserve"> </w:t>
+      </w:r>
+    </w:p>
+    <w:p>
+      <w:pPr>
+        <w:shd w:val="clear" w:color="auto" w:fill="F2F2F2"/>
+        <w:spacing w:after="0"/>
+        <w:ind w:left="288"/>
+      </w:pPr>
+      <w:r>
+        <w:rPr>
+          <w:rFonts w:ascii="Courier New" w:hAnsi="Courier New"/>
+          <w:sz w:val="18"/>
+        </w:rPr>
+        <w:t xml:space="preserve">Update </w:t>
+      </w:r>
+      <w:proofErr w:type="spellStart"/>
+      <w:r>
+        <w:rPr>
+          <w:rFonts w:ascii="Courier New" w:hAnsi="Courier New"/>
+          <w:sz w:val="18"/>
+        </w:rPr>
+        <w:t>AttributionCalculator</w:t>
+      </w:r>
+      <w:proofErr w:type="spellEnd"/>
+      <w:r>
+        <w:rPr>
+          <w:rFonts w:ascii="Courier New" w:hAnsi="Courier New"/>
+          <w:sz w:val="18"/>
+        </w:rPr>
+        <w:t xml:space="preserve"> to inject </w:t>
+      </w:r>
+      <w:proofErr w:type="spellStart"/>
+      <w:r>
+        <w:rPr>
+          <w:rFonts w:ascii="Courier New" w:hAnsi="Courier New"/>
+          <w:sz w:val="18"/>
+        </w:rPr>
+        <w:t>PricingResilienceSimulator</w:t>
+      </w:r>
+      <w:proofErr w:type="spellEnd"/>
+      <w:r>
+        <w:rPr>
+          <w:rFonts w:ascii="Courier New" w:hAnsi="Courier New"/>
+          <w:sz w:val="18"/>
+        </w:rPr>
+        <w:t xml:space="preserve"> and use it</w:t>
+      </w:r>
+    </w:p>
+    <w:p>
+      <w:pPr>
+        <w:shd w:val="clear" w:color="auto" w:fill="F2F2F2"/>
+        <w:spacing w:after="0"/>
+        <w:ind w:left="288"/>
+      </w:pPr>
+      <w:r>
+        <w:rPr>
+          <w:rFonts w:ascii="Courier New" w:hAnsi="Courier New"/>
+          <w:sz w:val="18"/>
+        </w:rPr>
+        <w:t xml:space="preserve">in the calculation loop instead of directly accessing </w:t>
+      </w:r>
+      <w:proofErr w:type="spellStart"/>
+      <w:r>
+        <w:rPr>
+          <w:rFonts w:ascii="Courier New" w:hAnsi="Courier New"/>
+          <w:sz w:val="18"/>
+        </w:rPr>
+        <w:t>returnPct</w:t>
+      </w:r>
+      <w:proofErr w:type="spellEnd"/>
+      <w:r>
+        <w:rPr>
+          <w:rFonts w:ascii="Courier New" w:hAnsi="Courier New"/>
+          <w:sz w:val="18"/>
+        </w:rPr>
+        <w:t>/</w:t>
+      </w:r>
+      <w:proofErr w:type="spellStart"/>
+      <w:r>
+        <w:rPr>
+          <w:rFonts w:ascii="Courier New" w:hAnsi="Courier New"/>
+          <w:sz w:val="18"/>
+        </w:rPr>
+        <w:t>fallbackReturnPct</w:t>
+      </w:r>
+      <w:proofErr w:type="spellEnd"/>
+      <w:r>
+        <w:rPr>
+          <w:rFonts w:ascii="Courier New" w:hAnsi="Courier New"/>
+          <w:sz w:val="18"/>
+        </w:rPr>
+        <w:t>.</w:t>
+      </w:r>
+    </w:p>
+    <w:p>
+      <w:pPr>
+        <w:shd w:val="clear" w:color="auto" w:fill="F2F2F2"/>
+        <w:spacing w:after="0"/>
+        <w:ind w:left="288"/>
+      </w:pPr>
+      <w:r>
+        <w:rPr>
+          <w:rFonts w:ascii="Courier New" w:hAnsi="Courier New"/>
+          <w:sz w:val="18"/>
+        </w:rPr>
+        <w:t xml:space="preserve">The determination of </w:t>
+      </w:r>
+      <w:proofErr w:type="spellStart"/>
+      <w:r>
+        <w:rPr>
+          <w:rFonts w:ascii="Courier New" w:hAnsi="Courier New"/>
+          <w:sz w:val="18"/>
+        </w:rPr>
+        <w:t>PricingMode</w:t>
+      </w:r>
+      <w:proofErr w:type="spellEnd"/>
+      <w:r>
+        <w:rPr>
+          <w:rFonts w:ascii="Courier New" w:hAnsi="Courier New"/>
+          <w:sz w:val="18"/>
+        </w:rPr>
+        <w:t xml:space="preserve"> remains the same (based on which path was taken).</w:t>
+      </w:r>
+    </w:p>
+    <w:p/>
+    <w:p>
+      <w:pPr>
+        <w:spacing w:before="120" w:after="40"/>
+      </w:pPr>
+      <w:r>
+        <w:rPr>
+          <w:rFonts w:ascii="Calibri" w:hAnsi="Calibri"/>
+          <w:b/>
+          <w:color w:val="1F497D"/>
+        </w:rPr>
+        <w:t>Validation Gate</w:t>
+      </w:r>
+    </w:p>
+    <w:p>
+      <w:pPr>
+        <w:pStyle w:val="ListBullet"/>
+        <w:tabs>
+          <w:tab w:val="num" w:pos="360"/>
+        </w:tabs>
+        <w:spacing w:after="40"/>
+        <w:ind w:left="360" w:hanging="360"/>
+      </w:pPr>
+      <w:r>
+        <w:rPr>
+          <w:rFonts w:ascii="Calibri" w:hAnsi="Calibri"/>
+          <w:sz w:val="21"/>
+        </w:rPr>
+        <w:t xml:space="preserve">Update existing </w:t>
+      </w:r>
+      <w:proofErr w:type="spellStart"/>
+      <w:r>
+        <w:rPr>
+          <w:rFonts w:ascii="Calibri" w:hAnsi="Calibri"/>
+          <w:sz w:val="21"/>
+        </w:rPr>
+        <w:t>AttributionCalculatorTest</w:t>
+      </w:r>
+      <w:proofErr w:type="spellEnd"/>
+      <w:r>
+        <w:rPr>
+          <w:rFonts w:ascii="Calibri" w:hAnsi="Calibri"/>
+          <w:sz w:val="21"/>
+        </w:rPr>
+        <w:t xml:space="preserve"> — all prior tests must still pass (logic is unchanged; only the delegation path changed)</w:t>
+      </w:r>
+    </w:p>
+    <w:p>
+      <w:pPr>
+        <w:pStyle w:val="ListBullet"/>
+        <w:tabs>
+          <w:tab w:val="num" w:pos="360"/>
+        </w:tabs>
+        <w:spacing w:after="40"/>
+        <w:ind w:left="360" w:hanging="360"/>
+      </w:pPr>
+      <w:r>
+        <w:rPr>
+          <w:rFonts w:ascii="Calibri" w:hAnsi="Calibri"/>
+          <w:sz w:val="21"/>
+        </w:rPr>
+        <w:t xml:space="preserve">Add a test verifying that when </w:t>
+      </w:r>
+      <w:proofErr w:type="spellStart"/>
+      <w:r>
+        <w:rPr>
+          <w:rFonts w:ascii="Calibri" w:hAnsi="Calibri"/>
+          <w:sz w:val="21"/>
+        </w:rPr>
+        <w:t>primaryReturn</w:t>
+      </w:r>
+      <w:proofErr w:type="spellEnd"/>
+      <w:r>
+        <w:rPr>
+          <w:rFonts w:ascii="Calibri" w:hAnsi="Calibri"/>
+          <w:sz w:val="21"/>
+        </w:rPr>
+        <w:t xml:space="preserve"> is null and </w:t>
+      </w:r>
+      <w:proofErr w:type="spellStart"/>
+      <w:r>
+        <w:rPr>
+          <w:rFonts w:ascii="Calibri" w:hAnsi="Calibri"/>
+          <w:sz w:val="21"/>
+        </w:rPr>
+        <w:t>fallbackReturn</w:t>
+      </w:r>
+      <w:proofErr w:type="spellEnd"/>
+      <w:r>
+        <w:rPr>
+          <w:rFonts w:ascii="Calibri" w:hAnsi="Calibri"/>
+          <w:sz w:val="21"/>
+        </w:rPr>
+        <w:t xml:space="preserve"> is provided, the method completes within 500ms (use </w:t>
+      </w:r>
+      <w:proofErr w:type="spellStart"/>
+      <w:r>
+        <w:rPr>
+          <w:rFonts w:ascii="Calibri" w:hAnsi="Calibri"/>
+          <w:sz w:val="21"/>
+        </w:rPr>
+        <w:t>assertTimeout</w:t>
+      </w:r>
+      <w:proofErr w:type="spellEnd"/>
+      <w:r>
+        <w:rPr>
+          <w:rFonts w:ascii="Calibri" w:hAnsi="Calibri"/>
+          <w:sz w:val="21"/>
+        </w:rPr>
+        <w:t xml:space="preserve"> from JUnit 5)</w:t>
+      </w:r>
+    </w:p>
+    <w:p>
+      <w:pPr>
+        <w:pStyle w:val="ListBullet"/>
+        <w:tabs>
+          <w:tab w:val="num" w:pos="360"/>
+        </w:tabs>
+        <w:spacing w:after="40"/>
+        <w:ind w:left="360" w:hanging="360"/>
+      </w:pPr>
+      <w:r>
+        <w:rPr>
+          <w:rFonts w:ascii="Calibri" w:hAnsi="Calibri"/>
+          <w:sz w:val="21"/>
+        </w:rPr>
+        <w:t>Run `</w:t>
+      </w:r>
+      <w:proofErr w:type="spellStart"/>
+      <w:r>
+        <w:rPr>
+          <w:rFonts w:ascii="Calibri" w:hAnsi="Calibri"/>
+          <w:sz w:val="21"/>
+        </w:rPr>
+        <w:t>mvn</w:t>
+      </w:r>
+      <w:proofErr w:type="spellEnd"/>
+      <w:r>
+        <w:rPr>
+          <w:rFonts w:ascii="Calibri" w:hAnsi="Calibri"/>
+          <w:sz w:val="21"/>
+        </w:rPr>
+        <w:t xml:space="preserve"> test` — all tests pass, no timeout failures</w:t>
+      </w:r>
+    </w:p>
+    <w:p>
+      <w:pPr>
+        <w:spacing w:before="40" w:after="40"/>
+      </w:pPr>
+      <w:r>
+        <w:rPr>
+          <w:color w:val="CCCCCC"/>
+          <w:sz w:val="16"/>
+        </w:rPr>
+        <w:t>──────────────────────────────────────────────────────────────────────────────────────────</w:t>
+      </w:r>
+    </w:p>
+    <w:p>
+      <w:pPr>
+        <w:spacing w:before="280" w:after="80"/>
+      </w:pPr>
+      <w:r>
+        <w:rPr>
+          <w:rFonts w:ascii="Calibri" w:hAnsi="Calibri"/>
+          <w:b/>
+          <w:color w:val="2E74B5"/>
+          <w:sz w:val="28"/>
+        </w:rPr>
+        <w:t xml:space="preserve">STEP </w:t>
+      </w:r>
+      <w:proofErr w:type="gramStart"/>
+      <w:r>
+        <w:rPr>
+          <w:rFonts w:ascii="Calibri" w:hAnsi="Calibri"/>
+          <w:b/>
+          <w:color w:val="2E74B5"/>
+          <w:sz w:val="28"/>
+        </w:rPr>
+        <w:t>1</w:t>
+      </w:r>
+      <w:r>
+        <w:rPr>
+          <w:rFonts w:ascii="Calibri" w:hAnsi="Calibri"/>
+          <w:b/>
+          <w:color w:val="2E74B5"/>
+          <w:sz w:val="28"/>
+        </w:rPr>
+        <w:t>2</w:t>
+      </w:r>
+      <w:r>
+        <w:rPr>
+          <w:rFonts w:ascii="Calibri" w:hAnsi="Calibri"/>
+          <w:b/>
+          <w:color w:val="2E74B5"/>
+          <w:sz w:val="28"/>
+        </w:rPr>
+        <w:t xml:space="preserve">  —</w:t>
+      </w:r>
+      <w:proofErr w:type="gramEnd"/>
+      <w:r>
+        <w:rPr>
+          <w:rFonts w:ascii="Calibri" w:hAnsi="Calibri"/>
+          <w:b/>
+          <w:color w:val="2E74B5"/>
+          <w:sz w:val="28"/>
+        </w:rPr>
+        <w:t xml:space="preserve">  Comprehensive Integration Test Suite</w:t>
+      </w:r>
+    </w:p>
+    <w:p>
+      <w:pPr>
+        <w:spacing w:after="60"/>
+      </w:pPr>
+      <w:r>
+        <w:rPr>
+          <w:rFonts w:ascii="Calibri" w:hAnsi="Calibri"/>
+          <w:b/>
+          <w:color w:val="2E74B5"/>
+        </w:rPr>
+        <w:t xml:space="preserve">Depends on: </w:t>
+      </w:r>
+      <w:r>
+        <w:rPr>
+          <w:rFonts w:ascii="Calibri" w:hAnsi="Calibri"/>
+        </w:rPr>
+        <w:t>Step 1</w:t>
+      </w:r>
+      <w:r>
+        <w:rPr>
+          <w:rFonts w:ascii="Calibri" w:hAnsi="Calibri"/>
+        </w:rPr>
+        <w:t>1</w:t>
+      </w:r>
+    </w:p>
+    <w:p>
+      <w:pPr>
+        <w:shd w:val="clear" w:color="auto" w:fill="F2F2F2"/>
+        <w:spacing w:after="0"/>
+        <w:ind w:left="288"/>
+      </w:pPr>
+      <w:r>
+        <w:rPr>
+          <w:rFonts w:ascii="Courier New" w:hAnsi="Courier New"/>
+          <w:sz w:val="18"/>
+        </w:rPr>
+        <w:t xml:space="preserve">Create an integration test class </w:t>
+      </w:r>
+      <w:proofErr w:type="spellStart"/>
+      <w:r>
+        <w:rPr>
+          <w:rFonts w:ascii="Courier New" w:hAnsi="Courier New"/>
+          <w:sz w:val="18"/>
+        </w:rPr>
+        <w:t>AttributionIntegrationTest</w:t>
+      </w:r>
+      <w:proofErr w:type="spellEnd"/>
+      <w:r>
+        <w:rPr>
+          <w:rFonts w:ascii="Courier New" w:hAnsi="Courier New"/>
+          <w:sz w:val="18"/>
+        </w:rPr>
+        <w:t xml:space="preserve"> in the test directory,</w:t>
+      </w:r>
+    </w:p>
+    <w:p>
+      <w:pPr>
+        <w:shd w:val="clear" w:color="auto" w:fill="F2F2F2"/>
+        <w:spacing w:after="0"/>
+        <w:ind w:left="288"/>
+      </w:pPr>
+      <w:r>
+        <w:rPr>
+          <w:rFonts w:ascii="Courier New" w:hAnsi="Courier New"/>
+          <w:sz w:val="18"/>
+        </w:rPr>
+        <w:t>annotated with @</w:t>
+      </w:r>
+      <w:proofErr w:type="gramStart"/>
+      <w:r>
+        <w:rPr>
+          <w:rFonts w:ascii="Courier New" w:hAnsi="Courier New"/>
+          <w:sz w:val="18"/>
+        </w:rPr>
+        <w:t>SpringBootTest(</w:t>
+      </w:r>
+      <w:proofErr w:type="gramEnd"/>
+      <w:r>
+        <w:rPr>
+          <w:rFonts w:ascii="Courier New" w:hAnsi="Courier New"/>
+          <w:sz w:val="18"/>
+        </w:rPr>
+        <w:t>webEnvironment = RANDOM_PORT) and @AutoConfigureTestDatabase.</w:t>
+      </w:r>
+    </w:p>
+    <w:p>
+      <w:pPr>
+        <w:shd w:val="clear" w:color="auto" w:fill="F2F2F2"/>
+        <w:spacing w:after="0"/>
+        <w:ind w:left="288"/>
+      </w:pPr>
+      <w:r>
+        <w:rPr>
+          <w:rFonts w:ascii="Courier New" w:hAnsi="Courier New"/>
+          <w:sz w:val="18"/>
+        </w:rPr>
+        <w:t xml:space="preserve"> </w:t>
+      </w:r>
+    </w:p>
+    <w:p>
+      <w:pPr>
+        <w:shd w:val="clear" w:color="auto" w:fill="F2F2F2"/>
+        <w:spacing w:after="0"/>
+        <w:ind w:left="288"/>
+      </w:pPr>
+      <w:r>
+        <w:rPr>
+          <w:rFonts w:ascii="Courier New" w:hAnsi="Courier New"/>
+          <w:sz w:val="18"/>
+        </w:rPr>
+        <w:t xml:space="preserve">Use </w:t>
+      </w:r>
+      <w:proofErr w:type="spellStart"/>
+      <w:r>
+        <w:rPr>
+          <w:rFonts w:ascii="Courier New" w:hAnsi="Courier New"/>
+          <w:sz w:val="18"/>
+        </w:rPr>
+        <w:t>TestRestTemplate</w:t>
+      </w:r>
+      <w:proofErr w:type="spellEnd"/>
+      <w:r>
+        <w:rPr>
+          <w:rFonts w:ascii="Courier New" w:hAnsi="Courier New"/>
+          <w:sz w:val="18"/>
+        </w:rPr>
+        <w:t xml:space="preserve"> to call POST /portfolio-attribution-service/</w:t>
+      </w:r>
+      <w:proofErr w:type="spellStart"/>
+      <w:r>
+        <w:rPr>
+          <w:rFonts w:ascii="Courier New" w:hAnsi="Courier New"/>
+          <w:sz w:val="18"/>
+        </w:rPr>
+        <w:t>api</w:t>
+      </w:r>
+      <w:proofErr w:type="spellEnd"/>
+      <w:r>
+        <w:rPr>
+          <w:rFonts w:ascii="Courier New" w:hAnsi="Courier New"/>
+          <w:sz w:val="18"/>
+        </w:rPr>
+        <w:t>/performance/attribution.</w:t>
+      </w:r>
+    </w:p>
+    <w:p>
+      <w:pPr>
+        <w:shd w:val="clear" w:color="auto" w:fill="F2F2F2"/>
+        <w:spacing w:after="0"/>
+        <w:ind w:left="288"/>
+      </w:pPr>
+      <w:r>
+        <w:rPr>
+          <w:rFonts w:ascii="Courier New" w:hAnsi="Courier New"/>
+          <w:sz w:val="18"/>
+        </w:rPr>
+        <w:t xml:space="preserve"> </w:t>
+      </w:r>
+    </w:p>
+    <w:p>
+      <w:pPr>
+        <w:shd w:val="clear" w:color="auto" w:fill="F2F2F2"/>
+        <w:spacing w:after="0"/>
+        <w:ind w:left="288"/>
+      </w:pPr>
+      <w:r>
+        <w:rPr>
+          <w:rFonts w:ascii="Courier New" w:hAnsi="Courier New"/>
+          <w:sz w:val="18"/>
+        </w:rPr>
+        <w:t>Write the following test scenarios (minimum 7, cover all required cases):</w:t>
+      </w:r>
+    </w:p>
+    <w:p>
+      <w:pPr>
+        <w:shd w:val="clear" w:color="auto" w:fill="F2F2F2"/>
+        <w:spacing w:after="0"/>
+        <w:ind w:left="288"/>
+      </w:pPr>
+      <w:r>
+        <w:rPr>
+          <w:rFonts w:ascii="Courier New" w:hAnsi="Courier New"/>
+          <w:sz w:val="18"/>
+        </w:rPr>
+        <w:t xml:space="preserve"> </w:t>
+      </w:r>
+    </w:p>
+    <w:p>
+      <w:pPr>
+        <w:shd w:val="clear" w:color="auto" w:fill="F2F2F2"/>
+        <w:spacing w:after="0"/>
+        <w:ind w:left="288"/>
+      </w:pPr>
+      <w:r>
+        <w:rPr>
+          <w:rFonts w:ascii="Courier New" w:hAnsi="Courier New"/>
+          <w:sz w:val="18"/>
+        </w:rPr>
+        <w:t>Test 1 — Valid full pricing (all PRIMARY):</w:t>
+      </w:r>
+    </w:p>
+    <w:p>
+      <w:pPr>
+        <w:shd w:val="clear" w:color="auto" w:fill="F2F2F2"/>
+        <w:spacing w:after="0"/>
+        <w:ind w:left="288"/>
+      </w:pPr>
+      <w:r>
+        <w:rPr>
+          <w:rFonts w:ascii="Courier New" w:hAnsi="Courier New"/>
+          <w:sz w:val="18"/>
+        </w:rPr>
+        <w:t xml:space="preserve">  All three groups have </w:t>
+      </w:r>
+      <w:proofErr w:type="spellStart"/>
+      <w:r>
+        <w:rPr>
+          <w:rFonts w:ascii="Courier New" w:hAnsi="Courier New"/>
+          <w:sz w:val="18"/>
+        </w:rPr>
+        <w:t>returnPct</w:t>
+      </w:r>
+      <w:proofErr w:type="spellEnd"/>
+      <w:r>
+        <w:rPr>
+          <w:rFonts w:ascii="Courier New" w:hAnsi="Courier New"/>
+          <w:sz w:val="18"/>
+        </w:rPr>
+        <w:t>. Assert: HTTP 200, status=VALID, degraded=false,</w:t>
+      </w:r>
+    </w:p>
+    <w:p>
+      <w:pPr>
+        <w:shd w:val="clear" w:color="auto" w:fill="F2F2F2"/>
+        <w:spacing w:after="0"/>
+        <w:ind w:left="288"/>
+      </w:pPr>
+      <w:r>
+        <w:rPr>
+          <w:rFonts w:ascii="Courier New" w:hAnsi="Courier New"/>
+          <w:sz w:val="18"/>
+        </w:rPr>
+        <w:t xml:space="preserve">  warnings </w:t>
+      </w:r>
+      <w:proofErr w:type="gramStart"/>
+      <w:r>
+        <w:rPr>
+          <w:rFonts w:ascii="Courier New" w:hAnsi="Courier New"/>
+          <w:sz w:val="18"/>
+        </w:rPr>
+        <w:t>is</w:t>
+      </w:r>
+      <w:proofErr w:type="gramEnd"/>
+      <w:r>
+        <w:rPr>
+          <w:rFonts w:ascii="Courier New" w:hAnsi="Courier New"/>
+          <w:sz w:val="18"/>
+        </w:rPr>
+        <w:t xml:space="preserve"> empty, all </w:t>
+      </w:r>
+      <w:proofErr w:type="spellStart"/>
+      <w:r>
+        <w:rPr>
+          <w:rFonts w:ascii="Courier New" w:hAnsi="Courier New"/>
+          <w:sz w:val="18"/>
+        </w:rPr>
+        <w:t>pricingMode</w:t>
+      </w:r>
+      <w:proofErr w:type="spellEnd"/>
+      <w:r>
+        <w:rPr>
+          <w:rFonts w:ascii="Courier New" w:hAnsi="Courier New"/>
+          <w:sz w:val="18"/>
+        </w:rPr>
+        <w:t xml:space="preserve">=PRIMARY, </w:t>
+      </w:r>
+      <w:proofErr w:type="spellStart"/>
+      <w:r>
+        <w:rPr>
+          <w:rFonts w:ascii="Courier New" w:hAnsi="Courier New"/>
+          <w:sz w:val="18"/>
+        </w:rPr>
+        <w:t>totalContributionPct</w:t>
+      </w:r>
+      <w:proofErr w:type="spellEnd"/>
+      <w:r>
+        <w:rPr>
+          <w:rFonts w:ascii="Courier New" w:hAnsi="Courier New"/>
+          <w:sz w:val="18"/>
+        </w:rPr>
+        <w:t xml:space="preserve"> is arithmetically correct.</w:t>
+      </w:r>
+    </w:p>
+    <w:p>
+      <w:pPr>
+        <w:shd w:val="clear" w:color="auto" w:fill="F2F2F2"/>
+        <w:spacing w:after="0"/>
+        <w:ind w:left="288"/>
+      </w:pPr>
+      <w:r>
+        <w:rPr>
+          <w:rFonts w:ascii="Courier New" w:hAnsi="Courier New"/>
+          <w:sz w:val="18"/>
+        </w:rPr>
+        <w:t xml:space="preserve"> </w:t>
+      </w:r>
+    </w:p>
+    <w:p>
+      <w:pPr>
+        <w:shd w:val="clear" w:color="auto" w:fill="F2F2F2"/>
+        <w:spacing w:after="0"/>
+        <w:ind w:left="288"/>
+      </w:pPr>
+      <w:r>
+        <w:rPr>
+          <w:rFonts w:ascii="Courier New" w:hAnsi="Courier New"/>
+          <w:sz w:val="18"/>
+        </w:rPr>
+        <w:t>Test 2 — Fallback pricing used (one FALLBACK_USED):</w:t>
+      </w:r>
+    </w:p>
+    <w:p>
+      <w:pPr>
+        <w:shd w:val="clear" w:color="auto" w:fill="F2F2F2"/>
+        <w:spacing w:after="0"/>
+        <w:ind w:left="288"/>
+      </w:pPr>
+      <w:r>
+        <w:rPr>
+          <w:rFonts w:ascii="Courier New" w:hAnsi="Courier New"/>
+          <w:sz w:val="18"/>
+        </w:rPr>
+        <w:t xml:space="preserve">  One group has null </w:t>
+      </w:r>
+      <w:proofErr w:type="spellStart"/>
+      <w:r>
+        <w:rPr>
+          <w:rFonts w:ascii="Courier New" w:hAnsi="Courier New"/>
+          <w:sz w:val="18"/>
+        </w:rPr>
+        <w:t>returnPct</w:t>
+      </w:r>
+      <w:proofErr w:type="spellEnd"/>
+      <w:r>
+        <w:rPr>
+          <w:rFonts w:ascii="Courier New" w:hAnsi="Courier New"/>
+          <w:sz w:val="18"/>
+        </w:rPr>
+        <w:t xml:space="preserve"> but a </w:t>
+      </w:r>
+      <w:proofErr w:type="spellStart"/>
+      <w:r>
+        <w:rPr>
+          <w:rFonts w:ascii="Courier New" w:hAnsi="Courier New"/>
+          <w:sz w:val="18"/>
+        </w:rPr>
+        <w:t>fallbackReturnPct</w:t>
+      </w:r>
+      <w:proofErr w:type="spellEnd"/>
+      <w:r>
+        <w:rPr>
+          <w:rFonts w:ascii="Courier New" w:hAnsi="Courier New"/>
+          <w:sz w:val="18"/>
+        </w:rPr>
+        <w:t>. Assert: HTTP 200, status=VALID,</w:t>
+      </w:r>
+    </w:p>
+    <w:p>
+      <w:pPr>
+        <w:shd w:val="clear" w:color="auto" w:fill="F2F2F2"/>
+        <w:spacing w:after="0"/>
+        <w:ind w:left="288"/>
+      </w:pPr>
+      <w:r>
+        <w:rPr>
+          <w:rFonts w:ascii="Courier New" w:hAnsi="Courier New"/>
+          <w:sz w:val="18"/>
+        </w:rPr>
+        <w:t xml:space="preserve">  degraded=false, that group has </w:t>
+      </w:r>
+      <w:proofErr w:type="spellStart"/>
+      <w:r>
+        <w:rPr>
+          <w:rFonts w:ascii="Courier New" w:hAnsi="Courier New"/>
+          <w:sz w:val="18"/>
+        </w:rPr>
+        <w:t>pricingMode</w:t>
+      </w:r>
+      <w:proofErr w:type="spellEnd"/>
+      <w:r>
+        <w:rPr>
+          <w:rFonts w:ascii="Courier New" w:hAnsi="Courier New"/>
+          <w:sz w:val="18"/>
+        </w:rPr>
+        <w:t xml:space="preserve">=FALLBACK_USED, warnings </w:t>
+      </w:r>
+      <w:proofErr w:type="gramStart"/>
+      <w:r>
+        <w:rPr>
+          <w:rFonts w:ascii="Courier New" w:hAnsi="Courier New"/>
+          <w:sz w:val="18"/>
+        </w:rPr>
+        <w:t>contains</w:t>
+      </w:r>
+      <w:proofErr w:type="gramEnd"/>
+      <w:r>
+        <w:rPr>
+          <w:rFonts w:ascii="Courier New" w:hAnsi="Courier New"/>
+          <w:sz w:val="18"/>
+        </w:rPr>
+        <w:t xml:space="preserve"> one entry,</w:t>
+      </w:r>
+    </w:p>
+    <w:p>
+      <w:pPr>
+        <w:shd w:val="clear" w:color="auto" w:fill="F2F2F2"/>
+        <w:spacing w:after="0"/>
+        <w:ind w:left="288"/>
+      </w:pPr>
+      <w:r>
+        <w:rPr>
+          <w:rFonts w:ascii="Courier New" w:hAnsi="Courier New"/>
+          <w:sz w:val="18"/>
+        </w:rPr>
+        <w:t xml:space="preserve">  </w:t>
+      </w:r>
+      <w:proofErr w:type="spellStart"/>
+      <w:r>
+        <w:rPr>
+          <w:rFonts w:ascii="Courier New" w:hAnsi="Courier New"/>
+          <w:sz w:val="18"/>
+        </w:rPr>
+        <w:t>totalContributionPct</w:t>
+      </w:r>
+      <w:proofErr w:type="spellEnd"/>
+      <w:r>
+        <w:rPr>
+          <w:rFonts w:ascii="Courier New" w:hAnsi="Courier New"/>
+          <w:sz w:val="18"/>
+        </w:rPr>
+        <w:t xml:space="preserve"> includes fallback contribution.</w:t>
+      </w:r>
+    </w:p>
+    <w:p>
+      <w:pPr>
+        <w:shd w:val="clear" w:color="auto" w:fill="F2F2F2"/>
+        <w:spacing w:after="0"/>
+        <w:ind w:left="288"/>
+      </w:pPr>
+      <w:r>
+        <w:rPr>
+          <w:rFonts w:ascii="Courier New" w:hAnsi="Courier New"/>
+          <w:sz w:val="18"/>
+        </w:rPr>
+        <w:lastRenderedPageBreak/>
+        <w:t xml:space="preserve"> </w:t>
+      </w:r>
+    </w:p>
+    <w:p>
+      <w:pPr>
+        <w:shd w:val="clear" w:color="auto" w:fill="F2F2F2"/>
+        <w:spacing w:after="0"/>
+        <w:ind w:left="288"/>
+      </w:pPr>
+      <w:r>
+        <w:rPr>
+          <w:rFonts w:ascii="Courier New" w:hAnsi="Courier New"/>
+          <w:sz w:val="18"/>
+        </w:rPr>
+        <w:t>Test 3 — Degraded (one group fully unavailable):</w:t>
+      </w:r>
+    </w:p>
+    <w:p>
+      <w:pPr>
+        <w:shd w:val="clear" w:color="auto" w:fill="F2F2F2"/>
+        <w:spacing w:after="0"/>
+        <w:ind w:left="288"/>
+      </w:pPr>
+      <w:r>
+        <w:rPr>
+          <w:rFonts w:ascii="Courier New" w:hAnsi="Courier New"/>
+          <w:sz w:val="18"/>
+        </w:rPr>
+        <w:t xml:space="preserve">  One group has both </w:t>
+      </w:r>
+      <w:proofErr w:type="spellStart"/>
+      <w:r>
+        <w:rPr>
+          <w:rFonts w:ascii="Courier New" w:hAnsi="Courier New"/>
+          <w:sz w:val="18"/>
+        </w:rPr>
+        <w:t>returnPct</w:t>
+      </w:r>
+      <w:proofErr w:type="spellEnd"/>
+      <w:r>
+        <w:rPr>
+          <w:rFonts w:ascii="Courier New" w:hAnsi="Courier New"/>
+          <w:sz w:val="18"/>
+        </w:rPr>
+        <w:t xml:space="preserve"> and </w:t>
+      </w:r>
+      <w:proofErr w:type="spellStart"/>
+      <w:r>
+        <w:rPr>
+          <w:rFonts w:ascii="Courier New" w:hAnsi="Courier New"/>
+          <w:sz w:val="18"/>
+        </w:rPr>
+        <w:t>fallbackReturnPct</w:t>
+      </w:r>
+      <w:proofErr w:type="spellEnd"/>
+      <w:r>
+        <w:rPr>
+          <w:rFonts w:ascii="Courier New" w:hAnsi="Courier New"/>
+          <w:sz w:val="18"/>
+        </w:rPr>
+        <w:t xml:space="preserve"> as null. Assert: HTTP 200,</w:t>
+      </w:r>
+    </w:p>
+    <w:p>
+      <w:pPr>
+        <w:shd w:val="clear" w:color="auto" w:fill="F2F2F2"/>
+        <w:spacing w:after="0"/>
+        <w:ind w:left="288"/>
+      </w:pPr>
+      <w:r>
+        <w:rPr>
+          <w:rFonts w:ascii="Courier New" w:hAnsi="Courier New"/>
+          <w:sz w:val="18"/>
+        </w:rPr>
+        <w:t xml:space="preserve">  status=DEGRADED, degraded=true, warnings </w:t>
+      </w:r>
+      <w:proofErr w:type="gramStart"/>
+      <w:r>
+        <w:rPr>
+          <w:rFonts w:ascii="Courier New" w:hAnsi="Courier New"/>
+          <w:sz w:val="18"/>
+        </w:rPr>
+        <w:t>contains</w:t>
+      </w:r>
+      <w:proofErr w:type="gramEnd"/>
+      <w:r>
+        <w:rPr>
+          <w:rFonts w:ascii="Courier New" w:hAnsi="Courier New"/>
+          <w:sz w:val="18"/>
+        </w:rPr>
+        <w:t xml:space="preserve"> one unavailability message,</w:t>
+      </w:r>
+    </w:p>
+    <w:p>
+      <w:pPr>
+        <w:shd w:val="clear" w:color="auto" w:fill="F2F2F2"/>
+        <w:spacing w:after="0"/>
+        <w:ind w:left="288"/>
+      </w:pPr>
+      <w:r>
+        <w:rPr>
+          <w:rFonts w:ascii="Courier New" w:hAnsi="Courier New"/>
+          <w:sz w:val="18"/>
+        </w:rPr>
+        <w:t xml:space="preserve">  that group contributes 0.0 to </w:t>
+      </w:r>
+      <w:proofErr w:type="spellStart"/>
+      <w:r>
+        <w:rPr>
+          <w:rFonts w:ascii="Courier New" w:hAnsi="Courier New"/>
+          <w:sz w:val="18"/>
+        </w:rPr>
+        <w:t>totalContributionPct</w:t>
+      </w:r>
+      <w:proofErr w:type="spellEnd"/>
+      <w:r>
+        <w:rPr>
+          <w:rFonts w:ascii="Courier New" w:hAnsi="Courier New"/>
+          <w:sz w:val="18"/>
+        </w:rPr>
+        <w:t>.</w:t>
+      </w:r>
+    </w:p>
+    <w:p>
+      <w:pPr>
+        <w:shd w:val="clear" w:color="auto" w:fill="F2F2F2"/>
+        <w:spacing w:after="0"/>
+        <w:ind w:left="288"/>
+      </w:pPr>
+      <w:r>
+        <w:rPr>
+          <w:rFonts w:ascii="Courier New" w:hAnsi="Courier New"/>
+          <w:sz w:val="18"/>
+        </w:rPr>
+        <w:t xml:space="preserve"> </w:t>
+      </w:r>
+    </w:p>
+    <w:p>
+      <w:pPr>
+        <w:shd w:val="clear" w:color="auto" w:fill="F2F2F2"/>
+        <w:spacing w:after="0"/>
+        <w:ind w:left="288"/>
+      </w:pPr>
+      <w:r>
+        <w:rPr>
+          <w:rFonts w:ascii="Courier New" w:hAnsi="Courier New"/>
+          <w:sz w:val="18"/>
+        </w:rPr>
+        <w:t>Test 4 — Review Required (two groups fully unavailable):</w:t>
+      </w:r>
+    </w:p>
+    <w:p>
+      <w:pPr>
+        <w:shd w:val="clear" w:color="auto" w:fill="F2F2F2"/>
+        <w:spacing w:after="0"/>
+        <w:ind w:left="288"/>
+      </w:pPr>
+      <w:r>
+        <w:rPr>
+          <w:rFonts w:ascii="Courier New" w:hAnsi="Courier New"/>
+          <w:sz w:val="18"/>
+        </w:rPr>
+        <w:t xml:space="preserve">  Two groups have both values null. Assert: HTTP 200, status=REVIEW_REQUIRED,</w:t>
+      </w:r>
+    </w:p>
+    <w:p>
+      <w:pPr>
+        <w:shd w:val="clear" w:color="auto" w:fill="F2F2F2"/>
+        <w:spacing w:after="0"/>
+        <w:ind w:left="288"/>
+      </w:pPr>
+      <w:r>
+        <w:rPr>
+          <w:rFonts w:ascii="Courier New" w:hAnsi="Courier New"/>
+          <w:sz w:val="18"/>
+        </w:rPr>
+        <w:t xml:space="preserve">  degraded=true, warnings </w:t>
+      </w:r>
+      <w:proofErr w:type="gramStart"/>
+      <w:r>
+        <w:rPr>
+          <w:rFonts w:ascii="Courier New" w:hAnsi="Courier New"/>
+          <w:sz w:val="18"/>
+        </w:rPr>
+        <w:t>contains</w:t>
+      </w:r>
+      <w:proofErr w:type="gramEnd"/>
+      <w:r>
+        <w:rPr>
+          <w:rFonts w:ascii="Courier New" w:hAnsi="Courier New"/>
+          <w:sz w:val="18"/>
+        </w:rPr>
+        <w:t xml:space="preserve"> two unavailability messages.</w:t>
+      </w:r>
+    </w:p>
+    <w:p>
+      <w:pPr>
+        <w:shd w:val="clear" w:color="auto" w:fill="F2F2F2"/>
+        <w:spacing w:after="0"/>
+        <w:ind w:left="288"/>
+      </w:pPr>
+      <w:r>
+        <w:rPr>
+          <w:rFonts w:ascii="Courier New" w:hAnsi="Courier New"/>
+          <w:sz w:val="18"/>
+        </w:rPr>
+        <w:t xml:space="preserve"> </w:t>
+      </w:r>
+    </w:p>
+    <w:p>
+      <w:pPr>
+        <w:shd w:val="clear" w:color="auto" w:fill="F2F2F2"/>
+        <w:spacing w:after="0"/>
+        <w:ind w:left="288"/>
+      </w:pPr>
+      <w:r>
+        <w:rPr>
+          <w:rFonts w:ascii="Courier New" w:hAnsi="Courier New"/>
+          <w:sz w:val="18"/>
+        </w:rPr>
+        <w:t>Test 5 — Invalid weight (sum &lt; 99%):</w:t>
+      </w:r>
+    </w:p>
+    <w:p>
+      <w:pPr>
+        <w:shd w:val="clear" w:color="auto" w:fill="F2F2F2"/>
+        <w:spacing w:after="0"/>
+        <w:ind w:left="288"/>
+      </w:pPr>
+      <w:r>
+        <w:rPr>
+          <w:rFonts w:ascii="Courier New" w:hAnsi="Courier New"/>
+          <w:sz w:val="18"/>
+        </w:rPr>
+        <w:t xml:space="preserve">  Groups with </w:t>
+      </w:r>
+      <w:proofErr w:type="spellStart"/>
+      <w:r>
+        <w:rPr>
+          <w:rFonts w:ascii="Courier New" w:hAnsi="Courier New"/>
+          <w:sz w:val="18"/>
+        </w:rPr>
+        <w:t>weightPct</w:t>
+      </w:r>
+      <w:proofErr w:type="spellEnd"/>
+      <w:r>
+        <w:rPr>
+          <w:rFonts w:ascii="Courier New" w:hAnsi="Courier New"/>
+          <w:sz w:val="18"/>
+        </w:rPr>
+        <w:t xml:space="preserve"> summing to 80. Assert: HTTP 400, error body contains</w:t>
+      </w:r>
+    </w:p>
+    <w:p>
+      <w:pPr>
+        <w:shd w:val="clear" w:color="auto" w:fill="F2F2F2"/>
+        <w:spacing w:after="0"/>
+        <w:ind w:left="288"/>
+      </w:pPr>
+      <w:r>
+        <w:rPr>
+          <w:rFonts w:ascii="Courier New" w:hAnsi="Courier New"/>
+          <w:sz w:val="18"/>
+        </w:rPr>
+        <w:t xml:space="preserve">  "INVALID_INPUT".</w:t>
+      </w:r>
+    </w:p>
+    <w:p>
+      <w:pPr>
+        <w:shd w:val="clear" w:color="auto" w:fill="F2F2F2"/>
+        <w:spacing w:after="0"/>
+        <w:ind w:left="288"/>
+      </w:pPr>
+      <w:r>
+        <w:rPr>
+          <w:rFonts w:ascii="Courier New" w:hAnsi="Courier New"/>
+          <w:sz w:val="18"/>
+        </w:rPr>
+        <w:t xml:space="preserve"> </w:t>
+      </w:r>
+    </w:p>
+    <w:p>
+      <w:pPr>
+        <w:shd w:val="clear" w:color="auto" w:fill="F2F2F2"/>
+        <w:spacing w:after="0"/>
+        <w:ind w:left="288"/>
+      </w:pPr>
+      <w:r>
+        <w:rPr>
+          <w:rFonts w:ascii="Courier New" w:hAnsi="Courier New"/>
+          <w:sz w:val="18"/>
+        </w:rPr>
+        <w:t>Test 6 — Idempotent repeat request:</w:t>
+      </w:r>
+    </w:p>
+    <w:p>
+      <w:pPr>
+        <w:shd w:val="clear" w:color="auto" w:fill="F2F2F2"/>
+        <w:spacing w:after="0"/>
+        <w:ind w:left="288"/>
+      </w:pPr>
+      <w:r>
+        <w:rPr>
+          <w:rFonts w:ascii="Courier New" w:hAnsi="Courier New"/>
+          <w:sz w:val="18"/>
+        </w:rPr>
+        <w:t xml:space="preserve">  Send the same valid request twice with the same </w:t>
+      </w:r>
+      <w:proofErr w:type="spellStart"/>
+      <w:r>
+        <w:rPr>
+          <w:rFonts w:ascii="Courier New" w:hAnsi="Courier New"/>
+          <w:sz w:val="18"/>
+        </w:rPr>
+        <w:t>requestId</w:t>
+      </w:r>
+      <w:proofErr w:type="spellEnd"/>
+      <w:r>
+        <w:rPr>
+          <w:rFonts w:ascii="Courier New" w:hAnsi="Courier New"/>
+          <w:sz w:val="18"/>
+        </w:rPr>
+        <w:t>. Assert: both return</w:t>
+      </w:r>
+    </w:p>
+    <w:p>
+      <w:pPr>
+        <w:shd w:val="clear" w:color="auto" w:fill="F2F2F2"/>
+        <w:spacing w:after="0"/>
+        <w:ind w:left="288"/>
+      </w:pPr>
+      <w:r>
+        <w:rPr>
+          <w:rFonts w:ascii="Courier New" w:hAnsi="Courier New"/>
+          <w:sz w:val="18"/>
+        </w:rPr>
+        <w:t xml:space="preserve">  HTTP 200 with identical </w:t>
+      </w:r>
+      <w:proofErr w:type="spellStart"/>
+      <w:r>
+        <w:rPr>
+          <w:rFonts w:ascii="Courier New" w:hAnsi="Courier New"/>
+          <w:sz w:val="18"/>
+        </w:rPr>
+        <w:t>processedAt</w:t>
+      </w:r>
+      <w:proofErr w:type="spellEnd"/>
+      <w:r>
+        <w:rPr>
+          <w:rFonts w:ascii="Courier New" w:hAnsi="Courier New"/>
+          <w:sz w:val="18"/>
+        </w:rPr>
+        <w:t xml:space="preserve"> timestamps (confirming the second was served</w:t>
+      </w:r>
+    </w:p>
+    <w:p>
+      <w:pPr>
+        <w:shd w:val="clear" w:color="auto" w:fill="F2F2F2"/>
+        <w:spacing w:after="0"/>
+        <w:ind w:left="288"/>
+      </w:pPr>
+      <w:r>
+        <w:rPr>
+          <w:rFonts w:ascii="Courier New" w:hAnsi="Courier New"/>
+          <w:sz w:val="18"/>
+        </w:rPr>
+        <w:t xml:space="preserve">  from the idempotency cache, not reprocessed).</w:t>
+      </w:r>
+    </w:p>
+    <w:p>
+      <w:pPr>
+        <w:shd w:val="clear" w:color="auto" w:fill="F2F2F2"/>
+        <w:spacing w:after="0"/>
+        <w:ind w:left="288"/>
+      </w:pPr>
+      <w:r>
+        <w:rPr>
+          <w:rFonts w:ascii="Courier New" w:hAnsi="Courier New"/>
+          <w:sz w:val="18"/>
+        </w:rPr>
+        <w:t xml:space="preserve"> </w:t>
+      </w:r>
+    </w:p>
+    <w:p>
+      <w:pPr>
+        <w:shd w:val="clear" w:color="auto" w:fill="F2F2F2"/>
+        <w:spacing w:after="0"/>
+        <w:ind w:left="288"/>
+      </w:pPr>
+      <w:r>
+        <w:rPr>
+          <w:rFonts w:ascii="Courier New" w:hAnsi="Courier New"/>
+          <w:sz w:val="18"/>
+        </w:rPr>
+        <w:t>Test 7 — Missing required field validation:</w:t>
+      </w:r>
+    </w:p>
+    <w:p>
+      <w:pPr>
+        <w:shd w:val="clear" w:color="auto" w:fill="F2F2F2"/>
+        <w:spacing w:after="0"/>
+        <w:ind w:left="288"/>
+      </w:pPr>
+      <w:r>
+        <w:rPr>
+          <w:rFonts w:ascii="Courier New" w:hAnsi="Courier New"/>
+          <w:sz w:val="18"/>
+        </w:rPr>
+        <w:t xml:space="preserve">  Send request with null </w:t>
+      </w:r>
+      <w:proofErr w:type="spellStart"/>
+      <w:r>
+        <w:rPr>
+          <w:rFonts w:ascii="Courier New" w:hAnsi="Courier New"/>
+          <w:sz w:val="18"/>
+        </w:rPr>
+        <w:t>requestId</w:t>
+      </w:r>
+      <w:proofErr w:type="spellEnd"/>
+      <w:r>
+        <w:rPr>
+          <w:rFonts w:ascii="Courier New" w:hAnsi="Courier New"/>
+          <w:sz w:val="18"/>
+        </w:rPr>
+        <w:t>. Assert: HTTP 400, error body contains</w:t>
+      </w:r>
+    </w:p>
+    <w:p>
+      <w:pPr>
+        <w:shd w:val="clear" w:color="auto" w:fill="F2F2F2"/>
+        <w:spacing w:after="0"/>
+        <w:ind w:left="288"/>
+      </w:pPr>
+      <w:r>
+        <w:rPr>
+          <w:rFonts w:ascii="Courier New" w:hAnsi="Courier New"/>
+          <w:sz w:val="18"/>
+        </w:rPr>
+        <w:t xml:space="preserve">  "VALIDATION_FAILED".</w:t>
+      </w:r>
+    </w:p>
+    <w:p/>
+    <w:p>
+      <w:pPr>
+        <w:spacing w:before="120" w:after="40"/>
+      </w:pPr>
+      <w:r>
+        <w:rPr>
+          <w:rFonts w:ascii="Calibri" w:hAnsi="Calibri"/>
+          <w:b/>
+          <w:color w:val="1F497D"/>
+        </w:rPr>
+        <w:t>Validation Gate</w:t>
+      </w:r>
+    </w:p>
+    <w:p>
+      <w:pPr>
+        <w:pStyle w:val="ListBullet"/>
+        <w:tabs>
+          <w:tab w:val="num" w:pos="360"/>
+        </w:tabs>
+        <w:spacing w:after="40"/>
+        <w:ind w:left="360" w:hanging="360"/>
+      </w:pPr>
+      <w:r>
+        <w:rPr>
+          <w:rFonts w:ascii="Calibri" w:hAnsi="Calibri"/>
+          <w:sz w:val="21"/>
+        </w:rPr>
+        <w:t>Run `</w:t>
+      </w:r>
+      <w:proofErr w:type="spellStart"/>
+      <w:r>
+        <w:rPr>
+          <w:rFonts w:ascii="Calibri" w:hAnsi="Calibri"/>
+          <w:sz w:val="21"/>
+        </w:rPr>
+        <w:t>mvn</w:t>
+      </w:r>
+      <w:proofErr w:type="spellEnd"/>
+      <w:r>
+        <w:rPr>
+          <w:rFonts w:ascii="Calibri" w:hAnsi="Calibri"/>
+          <w:sz w:val="21"/>
+        </w:rPr>
+        <w:t xml:space="preserve"> test` — all 7 integration tests pass</w:t>
+      </w:r>
+    </w:p>
+    <w:p>
+      <w:pPr>
+        <w:pStyle w:val="ListBullet"/>
+        <w:tabs>
+          <w:tab w:val="num" w:pos="360"/>
+        </w:tabs>
+        <w:spacing w:after="40"/>
+        <w:ind w:left="360" w:hanging="360"/>
+      </w:pPr>
+      <w:r>
+        <w:rPr>
+          <w:rFonts w:ascii="Calibri" w:hAnsi="Calibri"/>
+          <w:sz w:val="21"/>
+        </w:rPr>
+        <w:t>Run `</w:t>
+      </w:r>
+      <w:proofErr w:type="spellStart"/>
+      <w:r>
+        <w:rPr>
+          <w:rFonts w:ascii="Calibri" w:hAnsi="Calibri"/>
+          <w:sz w:val="21"/>
+        </w:rPr>
+        <w:t>mvn</w:t>
+      </w:r>
+      <w:proofErr w:type="spellEnd"/>
+      <w:r>
+        <w:rPr>
+          <w:rFonts w:ascii="Calibri" w:hAnsi="Calibri"/>
+          <w:sz w:val="21"/>
+        </w:rPr>
+        <w:t xml:space="preserve"> test -</w:t>
+      </w:r>
+      <w:proofErr w:type="spellStart"/>
+      <w:r>
+        <w:rPr>
+          <w:rFonts w:ascii="Calibri" w:hAnsi="Calibri"/>
+          <w:sz w:val="21"/>
+        </w:rPr>
+        <w:t>Dtest</w:t>
+      </w:r>
+      <w:proofErr w:type="spellEnd"/>
+      <w:r>
+        <w:rPr>
+          <w:rFonts w:ascii="Calibri" w:hAnsi="Calibri"/>
+          <w:sz w:val="21"/>
+        </w:rPr>
+        <w:t>=</w:t>
+      </w:r>
+      <w:proofErr w:type="spellStart"/>
+      <w:r>
+        <w:rPr>
+          <w:rFonts w:ascii="Calibri" w:hAnsi="Calibri"/>
+          <w:sz w:val="21"/>
+        </w:rPr>
+        <w:t>AttributionIntegrationTest</w:t>
+      </w:r>
+      <w:proofErr w:type="spellEnd"/>
+      <w:r>
+        <w:rPr>
+          <w:rFonts w:ascii="Calibri" w:hAnsi="Calibri"/>
+          <w:sz w:val="21"/>
+        </w:rPr>
+        <w:t>` and confirm each test name logs clearly in output</w:t>
+      </w:r>
+    </w:p>
+    <w:p>
+      <w:pPr>
+        <w:pStyle w:val="ListBullet"/>
+        <w:tabs>
+          <w:tab w:val="num" w:pos="360"/>
+        </w:tabs>
+        <w:spacing w:after="40"/>
+        <w:ind w:left="360" w:hanging="360"/>
+      </w:pPr>
+      <w:r>
+        <w:rPr>
+          <w:rFonts w:ascii="Calibri" w:hAnsi="Calibri"/>
+          <w:sz w:val="21"/>
+        </w:rPr>
+        <w:t xml:space="preserve">Review code coverage: </w:t>
+      </w:r>
+      <w:proofErr w:type="spellStart"/>
+      <w:r>
+        <w:rPr>
+          <w:rFonts w:ascii="Calibri" w:hAnsi="Calibri"/>
+          <w:sz w:val="21"/>
+        </w:rPr>
+        <w:t>AttributionCalculator</w:t>
+      </w:r>
+      <w:proofErr w:type="spellEnd"/>
+      <w:r>
+        <w:rPr>
+          <w:rFonts w:ascii="Calibri" w:hAnsi="Calibri"/>
+          <w:sz w:val="21"/>
+        </w:rPr>
+        <w:t xml:space="preserve">, </w:t>
+      </w:r>
+      <w:proofErr w:type="spellStart"/>
+      <w:r>
+        <w:rPr>
+          <w:rFonts w:ascii="Calibri" w:hAnsi="Calibri"/>
+          <w:sz w:val="21"/>
+        </w:rPr>
+        <w:t>AttributionValidator</w:t>
+      </w:r>
+      <w:proofErr w:type="spellEnd"/>
+      <w:r>
+        <w:rPr>
+          <w:rFonts w:ascii="Calibri" w:hAnsi="Calibri"/>
+          <w:sz w:val="21"/>
+        </w:rPr>
+        <w:t xml:space="preserve">, </w:t>
+      </w:r>
+      <w:proofErr w:type="spellStart"/>
+      <w:r>
+        <w:rPr>
+          <w:rFonts w:ascii="Calibri" w:hAnsi="Calibri"/>
+          <w:sz w:val="21"/>
+        </w:rPr>
+        <w:t>IdempotencyService</w:t>
+      </w:r>
+      <w:proofErr w:type="spellEnd"/>
+      <w:r>
+        <w:rPr>
+          <w:rFonts w:ascii="Calibri" w:hAnsi="Calibri"/>
+          <w:sz w:val="21"/>
+        </w:rPr>
+        <w:t xml:space="preserve">, and </w:t>
+      </w:r>
+      <w:proofErr w:type="spellStart"/>
+      <w:r>
+        <w:rPr>
+          <w:rFonts w:ascii="Calibri" w:hAnsi="Calibri"/>
+          <w:sz w:val="21"/>
+        </w:rPr>
+        <w:t>GlobalExceptionHandler</w:t>
+      </w:r>
+      <w:proofErr w:type="spellEnd"/>
+      <w:r>
+        <w:rPr>
+          <w:rFonts w:ascii="Calibri" w:hAnsi="Calibri"/>
+          <w:sz w:val="21"/>
+        </w:rPr>
+        <w:t xml:space="preserve"> each have &gt;= </w:t>
+      </w:r>
+      <w:proofErr w:type="gramStart"/>
+      <w:r>
+        <w:rPr>
+          <w:rFonts w:ascii="Calibri" w:hAnsi="Calibri"/>
+          <w:sz w:val="21"/>
+        </w:rPr>
+        <w:t>80% line</w:t>
+      </w:r>
+      <w:proofErr w:type="gramEnd"/>
+      <w:r>
+        <w:rPr>
+          <w:rFonts w:ascii="Calibri" w:hAnsi="Calibri"/>
+          <w:sz w:val="21"/>
+        </w:rPr>
+        <w:t xml:space="preserve"> coverage</w:t>
+      </w:r>
+    </w:p>
+    <w:p>
+      <w:pPr>
+        <w:pStyle w:val="ListBullet"/>
+        <w:numPr>
+          <w:ilvl w:val="0"/>
+          <w:numId w:val="0"/>
+        </w:numPr>
+        <w:spacing w:after="40"/>
+        <w:rPr>
+          <w:rFonts w:ascii="Calibri" w:hAnsi="Calibri"/>
+          <w:sz w:val="21"/>
+        </w:rPr>
+      </w:pPr>
+    </w:p>
+    <w:p>
+      <w:pPr>
+        <w:pStyle w:val="ListBullet"/>
+        <w:numPr>
+          <w:ilvl w:val="0"/>
+          <w:numId w:val="0"/>
+        </w:numPr>
+        <w:spacing w:after="40"/>
+        <w:rPr>
+          <w:b/>
+          <w:bCs/>
+          <w:lang w:val="en-IN"/>
+        </w:rPr>
+      </w:pPr>
+      <w:r>
+        <w:rPr>
+          <w:b/>
+          <w:bCs/>
+          <w:lang w:val="en-IN"/>
+        </w:rPr>
+        <w:t xml:space="preserve">Manual work: </w:t>
+      </w:r>
+      <w:r>
+        <w:rPr>
+          <w:b/>
+          <w:bCs/>
+          <w:lang w:val="en-IN"/>
+        </w:rPr>
+        <w:t>Bug caught and fixed: </w:t>
+      </w:r>
+      <w:proofErr w:type="spellStart"/>
+      <w:r>
+        <w:rPr>
+          <w:b/>
+          <w:bCs/>
+          <w:lang w:val="en-IN"/>
+        </w:rPr>
+        <w:t>AttributionAudit.totalContributionPct</w:t>
+      </w:r>
+      <w:proofErr w:type="spellEnd"/>
+      <w:r>
+        <w:rPr>
+          <w:b/>
+          <w:bCs/>
+          <w:lang w:val="en-IN"/>
+        </w:rPr>
+        <w:t> column scale</w:t>
+      </w:r>
+    </w:p>
+    <w:p>
+      <w:pPr>
+        <w:pStyle w:val="ListBullet"/>
+        <w:numPr>
+          <w:ilvl w:val="0"/>
+          <w:numId w:val="0"/>
+        </w:numPr>
+        <w:spacing w:after="40"/>
+        <w:rPr>
+          <w:b/>
+          <w:bCs/>
+        </w:rPr>
+      </w:pPr>
+      <w:r>
+        <w:rPr>
+          <w:b/>
+          <w:bCs/>
+        </w:rPr>
+        <w:t>@Column(name = "</w:t>
+      </w:r>
+      <w:proofErr w:type="spellStart"/>
+      <w:r>
+        <w:rPr>
+          <w:b/>
+          <w:bCs/>
+        </w:rPr>
+        <w:t>total_contribution_pct</w:t>
+      </w:r>
+      <w:proofErr w:type="spellEnd"/>
+      <w:r>
+        <w:rPr>
+          <w:b/>
+          <w:bCs/>
+        </w:rPr>
+        <w:t>", precision = 19, scale = 6)</w:t>
+      </w:r>
+      <w:r>
+        <w:rPr>
+          <w:b/>
+          <w:bCs/>
+        </w:rPr>
+        <w:br/>
+        <w:t xml:space="preserve">private </w:t>
+      </w:r>
+      <w:proofErr w:type="spellStart"/>
+      <w:r>
+        <w:rPr>
+          <w:b/>
+          <w:bCs/>
+        </w:rPr>
+        <w:t>BigDecimal</w:t>
+      </w:r>
+      <w:proofErr w:type="spellEnd"/>
+      <w:r>
+        <w:rPr>
+          <w:b/>
+          <w:bCs/>
+        </w:rPr>
+        <w:t xml:space="preserve"> </w:t>
+      </w:r>
+      <w:proofErr w:type="spellStart"/>
+      <w:r>
+        <w:rPr>
+          <w:b/>
+          <w:bCs/>
+        </w:rPr>
+        <w:t>totalContributionPct</w:t>
+      </w:r>
+      <w:proofErr w:type="spellEnd"/>
+      <w:r>
+        <w:rPr>
+          <w:b/>
+          <w:bCs/>
+        </w:rPr>
+        <w:t>;</w:t>
+      </w:r>
+    </w:p>
+    <w:p>
+      <w:pPr>
+        <w:pStyle w:val="ListBullet"/>
+        <w:numPr>
+          <w:ilvl w:val="0"/>
+          <w:numId w:val="0"/>
+        </w:numPr>
+        <w:spacing w:after="40"/>
+        <w:rPr>
+          <w:b/>
+          <w:bCs/>
+          <w:lang w:val="en-IN"/>
+        </w:rPr>
+      </w:pPr>
+    </w:p>
+    <w:p>
+      <w:pPr>
+        <w:spacing w:before="40" w:after="40"/>
+      </w:pPr>
+      <w:r>
+        <w:rPr>
+          <w:color w:val="CCCCCC"/>
+          <w:sz w:val="16"/>
+        </w:rPr>
         <w:t>──────────────────────────────────────────────────────────────────────────────────────────</w:t>
       </w:r>
     </w:p>
@@ -11400,7 +14506,6 @@
   <w:style w:type="character" w:default="1" w:styleId="DefaultParagraphFont">
     <w:name w:val="Default Paragraph Font"/>
     <w:uiPriority w:val="1"/>
-    <w:semiHidden/>
     <w:unhideWhenUsed/>
   </w:style>
   <w:style w:type="table" w:default="1" w:styleId="TableNormal">

</xml_diff>

<commit_message>
FDE-2: Add Logging, Correlation ID & Production Readiness
</commit_message>
<xml_diff>
--- a/Prompts-FDE- 2.docx
+++ b/Prompts-FDE- 2.docx
@@ -11305,7 +11305,23 @@
           <w:b/>
           <w:bCs/>
         </w:rPr>
-        <w:t>@Column(name = "</w:t>
+        <w:t>@</w:t>
+      </w:r>
+      <w:proofErr w:type="gramStart"/>
+      <w:r>
+        <w:rPr>
+          <w:b/>
+          <w:bCs/>
+        </w:rPr>
+        <w:t>Column(</w:t>
+      </w:r>
+      <w:proofErr w:type="gramEnd"/>
+      <w:r>
+        <w:rPr>
+          <w:b/>
+          <w:bCs/>
+        </w:rPr>
+        <w:t>name = "</w:t>
       </w:r>
       <w:proofErr w:type="spellStart"/>
       <w:r>
@@ -11393,11 +11409,1081 @@
     </w:p>
     <w:p>
       <w:pPr>
+        <w:spacing w:before="280" w:after="80"/>
+      </w:pPr>
+      <w:r>
+        <w:rPr>
+          <w:rFonts w:ascii="Calibri" w:hAnsi="Calibri"/>
+          <w:b/>
+          <w:color w:val="2E74B5"/>
+          <w:sz w:val="28"/>
+        </w:rPr>
+        <w:t xml:space="preserve">STEP </w:t>
+      </w:r>
+      <w:proofErr w:type="gramStart"/>
+      <w:r>
+        <w:rPr>
+          <w:rFonts w:ascii="Calibri" w:hAnsi="Calibri"/>
+          <w:b/>
+          <w:color w:val="2E74B5"/>
+          <w:sz w:val="28"/>
+        </w:rPr>
+        <w:t>1</w:t>
+      </w:r>
+      <w:r>
+        <w:rPr>
+          <w:rFonts w:ascii="Calibri" w:hAnsi="Calibri"/>
+          <w:b/>
+          <w:color w:val="2E74B5"/>
+          <w:sz w:val="28"/>
+        </w:rPr>
+        <w:t>3</w:t>
+      </w:r>
+      <w:r>
+        <w:rPr>
+          <w:rFonts w:ascii="Calibri" w:hAnsi="Calibri"/>
+          <w:b/>
+          <w:color w:val="2E74B5"/>
+          <w:sz w:val="28"/>
+        </w:rPr>
+        <w:t xml:space="preserve">  —</w:t>
+      </w:r>
+      <w:proofErr w:type="gramEnd"/>
+      <w:r>
+        <w:rPr>
+          <w:rFonts w:ascii="Calibri" w:hAnsi="Calibri"/>
+          <w:b/>
+          <w:color w:val="2E74B5"/>
+          <w:sz w:val="28"/>
+        </w:rPr>
+        <w:t xml:space="preserve">  Logging, Correlation ID &amp; Production Readiness</w:t>
+      </w:r>
+    </w:p>
+    <w:p>
+      <w:pPr>
+        <w:spacing w:after="60"/>
+      </w:pPr>
+      <w:r>
+        <w:rPr>
+          <w:rFonts w:ascii="Calibri" w:hAnsi="Calibri"/>
+          <w:b/>
+          <w:color w:val="2E74B5"/>
+        </w:rPr>
+        <w:t xml:space="preserve">Depends on: </w:t>
+      </w:r>
+      <w:r>
+        <w:rPr>
+          <w:rFonts w:ascii="Calibri" w:hAnsi="Calibri"/>
+        </w:rPr>
+        <w:t>Step 1</w:t>
+      </w:r>
+      <w:r>
+        <w:rPr>
+          <w:rFonts w:ascii="Calibri" w:hAnsi="Calibri"/>
+        </w:rPr>
+        <w:t>2</w:t>
+      </w:r>
+    </w:p>
+    <w:p>
+      <w:pPr>
+        <w:shd w:val="clear" w:color="auto" w:fill="F2F2F2"/>
+        <w:spacing w:after="0"/>
+        <w:ind w:left="288"/>
+      </w:pPr>
+      <w:r>
+        <w:rPr>
+          <w:rFonts w:ascii="Courier New" w:hAnsi="Courier New"/>
+          <w:sz w:val="18"/>
+        </w:rPr>
+        <w:t>Add production-readiness enhancements to the portfolio attribution service:</w:t>
+      </w:r>
+    </w:p>
+    <w:p>
+      <w:pPr>
+        <w:shd w:val="clear" w:color="auto" w:fill="F2F2F2"/>
+        <w:spacing w:after="0"/>
+        <w:ind w:left="288"/>
+      </w:pPr>
+      <w:r>
+        <w:rPr>
+          <w:rFonts w:ascii="Courier New" w:hAnsi="Courier New"/>
+          <w:sz w:val="18"/>
+        </w:rPr>
+        <w:t xml:space="preserve"> </w:t>
+      </w:r>
+    </w:p>
+    <w:p>
+      <w:pPr>
+        <w:shd w:val="clear" w:color="auto" w:fill="F2F2F2"/>
+        <w:spacing w:after="0"/>
+        <w:ind w:left="288"/>
+      </w:pPr>
+      <w:r>
+        <w:rPr>
+          <w:rFonts w:ascii="Courier New" w:hAnsi="Courier New"/>
+          <w:sz w:val="18"/>
+        </w:rPr>
+        <w:t xml:space="preserve">1. MDC Correlation Filter — create </w:t>
+      </w:r>
+      <w:proofErr w:type="spellStart"/>
+      <w:r>
+        <w:rPr>
+          <w:rFonts w:ascii="Courier New" w:hAnsi="Courier New"/>
+          <w:sz w:val="18"/>
+        </w:rPr>
+        <w:t>AttributionMdcFilter</w:t>
+      </w:r>
+      <w:proofErr w:type="spellEnd"/>
+      <w:r>
+        <w:rPr>
+          <w:rFonts w:ascii="Courier New" w:hAnsi="Courier New"/>
+          <w:sz w:val="18"/>
+        </w:rPr>
+        <w:t xml:space="preserve"> in package</w:t>
+      </w:r>
+    </w:p>
+    <w:p>
+      <w:pPr>
+        <w:shd w:val="clear" w:color="auto" w:fill="F2F2F2"/>
+        <w:spacing w:after="0"/>
+        <w:ind w:left="288"/>
+      </w:pPr>
+      <w:r>
+        <w:rPr>
+          <w:rFonts w:ascii="Courier New" w:hAnsi="Courier New"/>
+          <w:sz w:val="18"/>
+        </w:rPr>
+        <w:t xml:space="preserve">   </w:t>
+      </w:r>
+      <w:proofErr w:type="spellStart"/>
+      <w:proofErr w:type="gramStart"/>
+      <w:r>
+        <w:rPr>
+          <w:rFonts w:ascii="Courier New" w:hAnsi="Courier New"/>
+          <w:sz w:val="18"/>
+        </w:rPr>
+        <w:t>com.portfolio</w:t>
+      </w:r>
+      <w:proofErr w:type="gramEnd"/>
+      <w:r>
+        <w:rPr>
+          <w:rFonts w:ascii="Courier New" w:hAnsi="Courier New"/>
+          <w:sz w:val="18"/>
+        </w:rPr>
+        <w:t>.attribution.config</w:t>
+      </w:r>
+      <w:proofErr w:type="spellEnd"/>
+      <w:r>
+        <w:rPr>
+          <w:rFonts w:ascii="Courier New" w:hAnsi="Courier New"/>
+          <w:sz w:val="18"/>
+        </w:rPr>
+        <w:t xml:space="preserve"> implementing </w:t>
+      </w:r>
+      <w:proofErr w:type="spellStart"/>
+      <w:r>
+        <w:rPr>
+          <w:rFonts w:ascii="Courier New" w:hAnsi="Courier New"/>
+          <w:sz w:val="18"/>
+        </w:rPr>
+        <w:t>OncePerRequestFilter</w:t>
+      </w:r>
+      <w:proofErr w:type="spellEnd"/>
+      <w:r>
+        <w:rPr>
+          <w:rFonts w:ascii="Courier New" w:hAnsi="Courier New"/>
+          <w:sz w:val="18"/>
+        </w:rPr>
+        <w:t>:</w:t>
+      </w:r>
+    </w:p>
+    <w:p>
+      <w:pPr>
+        <w:shd w:val="clear" w:color="auto" w:fill="F2F2F2"/>
+        <w:spacing w:after="0"/>
+        <w:ind w:left="288"/>
+      </w:pPr>
+      <w:r>
+        <w:rPr>
+          <w:rFonts w:ascii="Courier New" w:hAnsi="Courier New"/>
+          <w:sz w:val="18"/>
+        </w:rPr>
+        <w:t xml:space="preserve">   - Extract X-Request-ID header (or generate UUID if absent)</w:t>
+      </w:r>
+    </w:p>
+    <w:p>
+      <w:pPr>
+        <w:shd w:val="clear" w:color="auto" w:fill="F2F2F2"/>
+        <w:spacing w:after="0"/>
+        <w:ind w:left="288"/>
+      </w:pPr>
+      <w:r>
+        <w:rPr>
+          <w:rFonts w:ascii="Courier New" w:hAnsi="Courier New"/>
+          <w:sz w:val="18"/>
+        </w:rPr>
+        <w:t xml:space="preserve">   - Put it in MDC as "</w:t>
+      </w:r>
+      <w:proofErr w:type="spellStart"/>
+      <w:r>
+        <w:rPr>
+          <w:rFonts w:ascii="Courier New" w:hAnsi="Courier New"/>
+          <w:sz w:val="18"/>
+        </w:rPr>
+        <w:t>correlationId</w:t>
+      </w:r>
+      <w:proofErr w:type="spellEnd"/>
+      <w:r>
+        <w:rPr>
+          <w:rFonts w:ascii="Courier New" w:hAnsi="Courier New"/>
+          <w:sz w:val="18"/>
+        </w:rPr>
+        <w:t>"</w:t>
+      </w:r>
+    </w:p>
+    <w:p>
+      <w:pPr>
+        <w:shd w:val="clear" w:color="auto" w:fill="F2F2F2"/>
+        <w:spacing w:after="0"/>
+        <w:ind w:left="288"/>
+      </w:pPr>
+      <w:r>
+        <w:rPr>
+          <w:rFonts w:ascii="Courier New" w:hAnsi="Courier New"/>
+          <w:sz w:val="18"/>
+        </w:rPr>
+        <w:t xml:space="preserve">   - Also put </w:t>
+      </w:r>
+      <w:proofErr w:type="spellStart"/>
+      <w:r>
+        <w:rPr>
+          <w:rFonts w:ascii="Courier New" w:hAnsi="Courier New"/>
+          <w:sz w:val="18"/>
+        </w:rPr>
+        <w:t>requestId</w:t>
+      </w:r>
+      <w:proofErr w:type="spellEnd"/>
+      <w:r>
+        <w:rPr>
+          <w:rFonts w:ascii="Courier New" w:hAnsi="Courier New"/>
+          <w:sz w:val="18"/>
+        </w:rPr>
+        <w:t xml:space="preserve"> from path/body context if available as "</w:t>
+      </w:r>
+      <w:proofErr w:type="spellStart"/>
+      <w:r>
+        <w:rPr>
+          <w:rFonts w:ascii="Courier New" w:hAnsi="Courier New"/>
+          <w:sz w:val="18"/>
+        </w:rPr>
+        <w:t>requestId</w:t>
+      </w:r>
+      <w:proofErr w:type="spellEnd"/>
+      <w:r>
+        <w:rPr>
+          <w:rFonts w:ascii="Courier New" w:hAnsi="Courier New"/>
+          <w:sz w:val="18"/>
+        </w:rPr>
+        <w:t>"</w:t>
+      </w:r>
+    </w:p>
+    <w:p>
+      <w:pPr>
+        <w:shd w:val="clear" w:color="auto" w:fill="F2F2F2"/>
+        <w:spacing w:after="0"/>
+        <w:ind w:left="288"/>
+      </w:pPr>
+      <w:r>
+        <w:rPr>
+          <w:rFonts w:ascii="Courier New" w:hAnsi="Courier New"/>
+          <w:sz w:val="18"/>
+        </w:rPr>
+        <w:t xml:space="preserve">   - Clear MDC in finally block after request completes</w:t>
+      </w:r>
+    </w:p>
+    <w:p>
+      <w:pPr>
+        <w:shd w:val="clear" w:color="auto" w:fill="F2F2F2"/>
+        <w:spacing w:after="0"/>
+        <w:ind w:left="288"/>
+      </w:pPr>
+      <w:r>
+        <w:rPr>
+          <w:rFonts w:ascii="Courier New" w:hAnsi="Courier New"/>
+          <w:sz w:val="18"/>
+        </w:rPr>
+        <w:t xml:space="preserve">   - Annotate with @Component</w:t>
+      </w:r>
+    </w:p>
+    <w:p>
+      <w:pPr>
+        <w:shd w:val="clear" w:color="auto" w:fill="F2F2F2"/>
+        <w:spacing w:after="0"/>
+        <w:ind w:left="288"/>
+      </w:pPr>
+      <w:r>
+        <w:rPr>
+          <w:rFonts w:ascii="Courier New" w:hAnsi="Courier New"/>
+          <w:sz w:val="18"/>
+        </w:rPr>
+        <w:t xml:space="preserve"> </w:t>
+      </w:r>
+    </w:p>
+    <w:p>
+      <w:pPr>
+        <w:shd w:val="clear" w:color="auto" w:fill="F2F2F2"/>
+        <w:spacing w:after="0"/>
+        <w:ind w:left="288"/>
+      </w:pPr>
+      <w:r>
+        <w:rPr>
+          <w:rFonts w:ascii="Courier New" w:hAnsi="Courier New"/>
+          <w:sz w:val="18"/>
+        </w:rPr>
+        <w:t xml:space="preserve">2. Logging pattern — update </w:t>
+      </w:r>
+      <w:proofErr w:type="spellStart"/>
+      <w:proofErr w:type="gramStart"/>
+      <w:r>
+        <w:rPr>
+          <w:rFonts w:ascii="Courier New" w:hAnsi="Courier New"/>
+          <w:sz w:val="18"/>
+        </w:rPr>
+        <w:t>application.properties</w:t>
+      </w:r>
+      <w:proofErr w:type="spellEnd"/>
+      <w:proofErr w:type="gramEnd"/>
+      <w:r>
+        <w:rPr>
+          <w:rFonts w:ascii="Courier New" w:hAnsi="Courier New"/>
+          <w:sz w:val="18"/>
+        </w:rPr>
+        <w:t xml:space="preserve"> to include </w:t>
+      </w:r>
+      <w:proofErr w:type="spellStart"/>
+      <w:r>
+        <w:rPr>
+          <w:rFonts w:ascii="Courier New" w:hAnsi="Courier New"/>
+          <w:sz w:val="18"/>
+        </w:rPr>
+        <w:t>correlationId</w:t>
+      </w:r>
+      <w:proofErr w:type="spellEnd"/>
+    </w:p>
+    <w:p>
+      <w:pPr>
+        <w:shd w:val="clear" w:color="auto" w:fill="F2F2F2"/>
+        <w:spacing w:after="0"/>
+        <w:ind w:left="288"/>
+      </w:pPr>
+      <w:r>
+        <w:rPr>
+          <w:rFonts w:ascii="Courier New" w:hAnsi="Courier New"/>
+          <w:sz w:val="18"/>
+        </w:rPr>
+        <w:t xml:space="preserve">   in the log pattern:</w:t>
+      </w:r>
+    </w:p>
+    <w:p>
+      <w:pPr>
+        <w:shd w:val="clear" w:color="auto" w:fill="F2F2F2"/>
+        <w:spacing w:after="0"/>
+        <w:ind w:left="288"/>
+      </w:pPr>
+      <w:r>
+        <w:rPr>
+          <w:rFonts w:ascii="Courier New" w:hAnsi="Courier New"/>
+          <w:sz w:val="18"/>
+        </w:rPr>
+        <w:t xml:space="preserve">   </w:t>
+      </w:r>
+      <w:proofErr w:type="spellStart"/>
+      <w:proofErr w:type="gramStart"/>
+      <w:r>
+        <w:rPr>
+          <w:rFonts w:ascii="Courier New" w:hAnsi="Courier New"/>
+          <w:sz w:val="18"/>
+        </w:rPr>
+        <w:t>logging.pattern</w:t>
+      </w:r>
+      <w:proofErr w:type="gramEnd"/>
+      <w:r>
+        <w:rPr>
+          <w:rFonts w:ascii="Courier New" w:hAnsi="Courier New"/>
+          <w:sz w:val="18"/>
+        </w:rPr>
+        <w:t>.console</w:t>
+      </w:r>
+      <w:proofErr w:type="spellEnd"/>
+      <w:r>
+        <w:rPr>
+          <w:rFonts w:ascii="Courier New" w:hAnsi="Courier New"/>
+          <w:sz w:val="18"/>
+        </w:rPr>
+        <w:t>=%d{</w:t>
+      </w:r>
+      <w:proofErr w:type="spellStart"/>
+      <w:r>
+        <w:rPr>
+          <w:rFonts w:ascii="Courier New" w:hAnsi="Courier New"/>
+          <w:sz w:val="18"/>
+        </w:rPr>
+        <w:t>HH:</w:t>
+      </w:r>
+      <w:proofErr w:type="gramStart"/>
+      <w:r>
+        <w:rPr>
+          <w:rFonts w:ascii="Courier New" w:hAnsi="Courier New"/>
+          <w:sz w:val="18"/>
+        </w:rPr>
+        <w:t>mm:ss.SSS</w:t>
+      </w:r>
+      <w:proofErr w:type="spellEnd"/>
+      <w:proofErr w:type="gramEnd"/>
+      <w:r>
+        <w:rPr>
+          <w:rFonts w:ascii="Courier New" w:hAnsi="Courier New"/>
+          <w:sz w:val="18"/>
+        </w:rPr>
+        <w:t>} [%thread] %-5level [%X{</w:t>
+      </w:r>
+      <w:proofErr w:type="spellStart"/>
+      <w:r>
+        <w:rPr>
+          <w:rFonts w:ascii="Courier New" w:hAnsi="Courier New"/>
+          <w:sz w:val="18"/>
+        </w:rPr>
+        <w:t>correlationId</w:t>
+      </w:r>
+      <w:proofErr w:type="spellEnd"/>
+      <w:r>
+        <w:rPr>
+          <w:rFonts w:ascii="Courier New" w:hAnsi="Courier New"/>
+          <w:sz w:val="18"/>
+        </w:rPr>
+        <w:t>}]</w:t>
+      </w:r>
+    </w:p>
+    <w:p>
+      <w:pPr>
+        <w:shd w:val="clear" w:color="auto" w:fill="F2F2F2"/>
+        <w:spacing w:after="0"/>
+        <w:ind w:left="288"/>
+      </w:pPr>
+      <w:r>
+        <w:rPr>
+          <w:rFonts w:ascii="Courier New" w:hAnsi="Courier New"/>
+          <w:sz w:val="18"/>
+        </w:rPr>
+        <w:t xml:space="preserve">   [%X{</w:t>
+      </w:r>
+      <w:proofErr w:type="spellStart"/>
+      <w:r>
+        <w:rPr>
+          <w:rFonts w:ascii="Courier New" w:hAnsi="Courier New"/>
+          <w:sz w:val="18"/>
+        </w:rPr>
+        <w:t>requestId</w:t>
+      </w:r>
+      <w:proofErr w:type="spellEnd"/>
+      <w:r>
+        <w:rPr>
+          <w:rFonts w:ascii="Courier New" w:hAnsi="Courier New"/>
+          <w:sz w:val="18"/>
+        </w:rPr>
+        <w:t>}] %</w:t>
+      </w:r>
+      <w:proofErr w:type="gramStart"/>
+      <w:r>
+        <w:rPr>
+          <w:rFonts w:ascii="Courier New" w:hAnsi="Courier New"/>
+          <w:sz w:val="18"/>
+        </w:rPr>
+        <w:t>logger{</w:t>
+      </w:r>
+      <w:proofErr w:type="gramEnd"/>
+      <w:r>
+        <w:rPr>
+          <w:rFonts w:ascii="Courier New" w:hAnsi="Courier New"/>
+          <w:sz w:val="18"/>
+        </w:rPr>
+        <w:t>36} - %</w:t>
+      </w:r>
+      <w:proofErr w:type="spellStart"/>
+      <w:r>
+        <w:rPr>
+          <w:rFonts w:ascii="Courier New" w:hAnsi="Courier New"/>
+          <w:sz w:val="18"/>
+        </w:rPr>
+        <w:t>msg%n</w:t>
+      </w:r>
+      <w:proofErr w:type="spellEnd"/>
+    </w:p>
+    <w:p>
+      <w:pPr>
+        <w:shd w:val="clear" w:color="auto" w:fill="F2F2F2"/>
+        <w:spacing w:after="0"/>
+        <w:ind w:left="288"/>
+      </w:pPr>
+      <w:r>
+        <w:rPr>
+          <w:rFonts w:ascii="Courier New" w:hAnsi="Courier New"/>
+          <w:sz w:val="18"/>
+        </w:rPr>
+        <w:lastRenderedPageBreak/>
+        <w:t xml:space="preserve"> </w:t>
+      </w:r>
+    </w:p>
+    <w:p>
+      <w:pPr>
+        <w:shd w:val="clear" w:color="auto" w:fill="F2F2F2"/>
+        <w:spacing w:after="0"/>
+        <w:ind w:left="288"/>
+      </w:pPr>
+      <w:r>
+        <w:rPr>
+          <w:rFonts w:ascii="Courier New" w:hAnsi="Courier New"/>
+          <w:sz w:val="18"/>
+        </w:rPr>
+        <w:t>3. Actuator — add spring-boot-starter-actuator dependency to pom.xml and expose</w:t>
+      </w:r>
+    </w:p>
+    <w:p>
+      <w:pPr>
+        <w:shd w:val="clear" w:color="auto" w:fill="F2F2F2"/>
+        <w:spacing w:after="0"/>
+        <w:ind w:left="288"/>
+      </w:pPr>
+      <w:r>
+        <w:rPr>
+          <w:rFonts w:ascii="Courier New" w:hAnsi="Courier New"/>
+          <w:sz w:val="18"/>
+        </w:rPr>
+        <w:t xml:space="preserve">   the health and info endpoints:</w:t>
+      </w:r>
+    </w:p>
+    <w:p>
+      <w:pPr>
+        <w:shd w:val="clear" w:color="auto" w:fill="F2F2F2"/>
+        <w:spacing w:after="0"/>
+        <w:ind w:left="288"/>
+      </w:pPr>
+      <w:r>
+        <w:rPr>
+          <w:rFonts w:ascii="Courier New" w:hAnsi="Courier New"/>
+          <w:sz w:val="18"/>
+        </w:rPr>
+        <w:t xml:space="preserve">   </w:t>
+      </w:r>
+      <w:proofErr w:type="spellStart"/>
+      <w:proofErr w:type="gramStart"/>
+      <w:r>
+        <w:rPr>
+          <w:rFonts w:ascii="Courier New" w:hAnsi="Courier New"/>
+          <w:sz w:val="18"/>
+        </w:rPr>
+        <w:t>management.endpoints.web.exposure</w:t>
+      </w:r>
+      <w:proofErr w:type="gramEnd"/>
+      <w:r>
+        <w:rPr>
+          <w:rFonts w:ascii="Courier New" w:hAnsi="Courier New"/>
+          <w:sz w:val="18"/>
+        </w:rPr>
+        <w:t>.include</w:t>
+      </w:r>
+      <w:proofErr w:type="spellEnd"/>
+      <w:r>
+        <w:rPr>
+          <w:rFonts w:ascii="Courier New" w:hAnsi="Courier New"/>
+          <w:sz w:val="18"/>
+        </w:rPr>
+        <w:t>=</w:t>
+      </w:r>
+      <w:proofErr w:type="spellStart"/>
+      <w:proofErr w:type="gramStart"/>
+      <w:r>
+        <w:rPr>
+          <w:rFonts w:ascii="Courier New" w:hAnsi="Courier New"/>
+          <w:sz w:val="18"/>
+        </w:rPr>
+        <w:t>health,info</w:t>
+      </w:r>
+      <w:proofErr w:type="spellEnd"/>
+      <w:proofErr w:type="gramEnd"/>
+    </w:p>
+    <w:p>
+      <w:pPr>
+        <w:shd w:val="clear" w:color="auto" w:fill="F2F2F2"/>
+        <w:spacing w:after="0"/>
+        <w:ind w:left="288"/>
+      </w:pPr>
+      <w:r>
+        <w:rPr>
+          <w:rFonts w:ascii="Courier New" w:hAnsi="Courier New"/>
+          <w:sz w:val="18"/>
+        </w:rPr>
+        <w:t xml:space="preserve">   </w:t>
+      </w:r>
+      <w:proofErr w:type="spellStart"/>
+      <w:proofErr w:type="gramStart"/>
+      <w:r>
+        <w:rPr>
+          <w:rFonts w:ascii="Courier New" w:hAnsi="Courier New"/>
+          <w:sz w:val="18"/>
+        </w:rPr>
+        <w:t>management.endpoint</w:t>
+      </w:r>
+      <w:proofErr w:type="gramEnd"/>
+      <w:r>
+        <w:rPr>
+          <w:rFonts w:ascii="Courier New" w:hAnsi="Courier New"/>
+          <w:sz w:val="18"/>
+        </w:rPr>
+        <w:t>.</w:t>
+      </w:r>
+      <w:proofErr w:type="gramStart"/>
+      <w:r>
+        <w:rPr>
+          <w:rFonts w:ascii="Courier New" w:hAnsi="Courier New"/>
+          <w:sz w:val="18"/>
+        </w:rPr>
+        <w:t>health.show</w:t>
+      </w:r>
+      <w:proofErr w:type="spellEnd"/>
+      <w:proofErr w:type="gramEnd"/>
+      <w:r>
+        <w:rPr>
+          <w:rFonts w:ascii="Courier New" w:hAnsi="Courier New"/>
+          <w:sz w:val="18"/>
+        </w:rPr>
+        <w:t>-details=always</w:t>
+      </w:r>
+    </w:p>
+    <w:p>
+      <w:pPr>
+        <w:shd w:val="clear" w:color="auto" w:fill="F2F2F2"/>
+        <w:spacing w:after="0"/>
+        <w:ind w:left="288"/>
+      </w:pPr>
+      <w:r>
+        <w:rPr>
+          <w:rFonts w:ascii="Courier New" w:hAnsi="Courier New"/>
+          <w:sz w:val="18"/>
+        </w:rPr>
+        <w:t xml:space="preserve"> </w:t>
+      </w:r>
+    </w:p>
+    <w:p>
+      <w:pPr>
+        <w:shd w:val="clear" w:color="auto" w:fill="F2F2F2"/>
+        <w:spacing w:after="0"/>
+        <w:ind w:left="288"/>
+      </w:pPr>
+      <w:r>
+        <w:rPr>
+          <w:rFonts w:ascii="Courier New" w:hAnsi="Courier New"/>
+          <w:sz w:val="18"/>
+        </w:rPr>
+        <w:t>4. README.md — create a README in the project root with sections:</w:t>
+      </w:r>
+    </w:p>
+    <w:p>
+      <w:pPr>
+        <w:shd w:val="clear" w:color="auto" w:fill="F2F2F2"/>
+        <w:spacing w:after="0"/>
+        <w:ind w:left="288"/>
+      </w:pPr>
+      <w:r>
+        <w:rPr>
+          <w:rFonts w:ascii="Courier New" w:hAnsi="Courier New"/>
+          <w:sz w:val="18"/>
+        </w:rPr>
+        <w:t xml:space="preserve">   - Setup &amp; Run Instructions (</w:t>
+      </w:r>
+      <w:proofErr w:type="spellStart"/>
+      <w:r>
+        <w:rPr>
+          <w:rFonts w:ascii="Courier New" w:hAnsi="Courier New"/>
+          <w:sz w:val="18"/>
+        </w:rPr>
+        <w:t>mvn</w:t>
+      </w:r>
+      <w:proofErr w:type="spellEnd"/>
+      <w:r>
+        <w:rPr>
+          <w:rFonts w:ascii="Courier New" w:hAnsi="Courier New"/>
+          <w:sz w:val="18"/>
+        </w:rPr>
+        <w:t xml:space="preserve"> </w:t>
+      </w:r>
+      <w:proofErr w:type="spellStart"/>
+      <w:r>
+        <w:rPr>
+          <w:rFonts w:ascii="Courier New" w:hAnsi="Courier New"/>
+          <w:sz w:val="18"/>
+        </w:rPr>
+        <w:t>spring-</w:t>
+      </w:r>
+      <w:proofErr w:type="gramStart"/>
+      <w:r>
+        <w:rPr>
+          <w:rFonts w:ascii="Courier New" w:hAnsi="Courier New"/>
+          <w:sz w:val="18"/>
+        </w:rPr>
+        <w:t>boot:run</w:t>
+      </w:r>
+      <w:proofErr w:type="spellEnd"/>
+      <w:proofErr w:type="gramEnd"/>
+      <w:r>
+        <w:rPr>
+          <w:rFonts w:ascii="Courier New" w:hAnsi="Courier New"/>
+          <w:sz w:val="18"/>
+        </w:rPr>
+        <w:t>, H2 console URL)</w:t>
+      </w:r>
+    </w:p>
+    <w:p>
+      <w:pPr>
+        <w:shd w:val="clear" w:color="auto" w:fill="F2F2F2"/>
+        <w:spacing w:after="0"/>
+        <w:ind w:left="288"/>
+      </w:pPr>
+      <w:r>
+        <w:rPr>
+          <w:rFonts w:ascii="Courier New" w:hAnsi="Courier New"/>
+          <w:sz w:val="18"/>
+        </w:rPr>
+        <w:t xml:space="preserve">   - API Contract (request/response examples from the requirements)</w:t>
+      </w:r>
+    </w:p>
+    <w:p>
+      <w:pPr>
+        <w:shd w:val="clear" w:color="auto" w:fill="F2F2F2"/>
+        <w:spacing w:after="0"/>
+        <w:ind w:left="288"/>
+      </w:pPr>
+      <w:r>
+        <w:rPr>
+          <w:rFonts w:ascii="Courier New" w:hAnsi="Courier New"/>
+          <w:sz w:val="18"/>
+        </w:rPr>
+        <w:t xml:space="preserve">   - Assumptions &amp; Fallback Rules (weight tolerance, fallback logic,</w:t>
+      </w:r>
+    </w:p>
+    <w:p>
+      <w:pPr>
+        <w:shd w:val="clear" w:color="auto" w:fill="F2F2F2"/>
+        <w:spacing w:after="0"/>
+        <w:ind w:left="288"/>
+      </w:pPr>
+      <w:r>
+        <w:rPr>
+          <w:rFonts w:ascii="Courier New" w:hAnsi="Courier New"/>
+          <w:sz w:val="18"/>
+        </w:rPr>
+        <w:t xml:space="preserve">     idempotency scope, and degraded/review-required thresholds)</w:t>
+      </w:r>
+    </w:p>
+    <w:p>
+      <w:pPr>
+        <w:shd w:val="clear" w:color="auto" w:fill="F2F2F2"/>
+        <w:spacing w:after="0"/>
+        <w:ind w:left="288"/>
+      </w:pPr>
+      <w:r>
+        <w:rPr>
+          <w:rFonts w:ascii="Courier New" w:hAnsi="Courier New"/>
+          <w:sz w:val="18"/>
+        </w:rPr>
+        <w:t xml:space="preserve">   - Resiliency Design Decisions (why fallback-before-degraded, why in-memory</w:t>
+      </w:r>
+    </w:p>
+    <w:p>
+      <w:pPr>
+        <w:shd w:val="clear" w:color="auto" w:fill="F2F2F2"/>
+        <w:spacing w:after="0"/>
+        <w:ind w:left="288"/>
+      </w:pPr>
+      <w:r>
+        <w:rPr>
+          <w:rFonts w:ascii="Courier New" w:hAnsi="Courier New"/>
+          <w:sz w:val="18"/>
+        </w:rPr>
+        <w:t xml:space="preserve">     idempotency is scoped to run context, timeout simulation approach)</w:t>
+      </w:r>
+    </w:p>
+    <w:p>
+      <w:pPr>
+        <w:shd w:val="clear" w:color="auto" w:fill="F2F2F2"/>
+        <w:spacing w:after="0"/>
+        <w:ind w:left="288"/>
+      </w:pPr>
+      <w:r>
+        <w:rPr>
+          <w:rFonts w:ascii="Courier New" w:hAnsi="Courier New"/>
+          <w:sz w:val="18"/>
+        </w:rPr>
+        <w:t xml:space="preserve">   - Prompt Log (list of actual prompts used with GitHub Copilot at each step)</w:t>
+      </w:r>
+    </w:p>
+    <w:p>
+      <w:pPr>
+        <w:shd w:val="clear" w:color="auto" w:fill="F2F2F2"/>
+        <w:spacing w:after="0"/>
+        <w:ind w:left="288"/>
+      </w:pPr>
+      <w:r>
+        <w:rPr>
+          <w:rFonts w:ascii="Courier New" w:hAnsi="Courier New"/>
+          <w:sz w:val="18"/>
+        </w:rPr>
+        <w:t xml:space="preserve">   - Custom Agent / Reusable Instruction (include the resiliency reviewer prompt</w:t>
+      </w:r>
+    </w:p>
+    <w:p>
+      <w:pPr>
+        <w:shd w:val="clear" w:color="auto" w:fill="F2F2F2"/>
+        <w:spacing w:after="0"/>
+        <w:ind w:left="288"/>
+      </w:pPr>
+      <w:r>
+        <w:rPr>
+          <w:rFonts w:ascii="Courier New" w:hAnsi="Courier New"/>
+          <w:sz w:val="18"/>
+        </w:rPr>
+        <w:t xml:space="preserve">     as a reusable Markdown instruction block)</w:t>
+      </w:r>
+    </w:p>
+    <w:p>
+      <w:pPr>
+        <w:shd w:val="clear" w:color="auto" w:fill="F2F2F2"/>
+        <w:spacing w:after="0"/>
+        <w:ind w:left="288"/>
+      </w:pPr>
+      <w:r>
+        <w:rPr>
+          <w:rFonts w:ascii="Courier New" w:hAnsi="Courier New"/>
+          <w:sz w:val="18"/>
+        </w:rPr>
+        <w:t xml:space="preserve">   - AI Usage Summary (where Copilot helped, what was corrected manually, what</w:t>
+      </w:r>
+    </w:p>
+    <w:p>
+      <w:pPr>
+        <w:shd w:val="clear" w:color="auto" w:fill="F2F2F2"/>
+        <w:spacing w:after="0"/>
+        <w:ind w:left="288"/>
+      </w:pPr>
+      <w:r>
+        <w:rPr>
+          <w:rFonts w:ascii="Courier New" w:hAnsi="Courier New"/>
+          <w:sz w:val="18"/>
+        </w:rPr>
+        <w:t xml:space="preserve">     would be improved given more time)</w:t>
+      </w:r>
+    </w:p>
+    <w:p/>
+    <w:p>
+      <w:pPr>
+        <w:spacing w:before="120" w:after="40"/>
+      </w:pPr>
+      <w:r>
+        <w:rPr>
+          <w:rFonts w:ascii="Calibri" w:hAnsi="Calibri"/>
+          <w:b/>
+          <w:color w:val="1F497D"/>
+        </w:rPr>
+        <w:t>Validation Gate</w:t>
+      </w:r>
+    </w:p>
+    <w:p>
+      <w:pPr>
+        <w:pStyle w:val="ListBullet"/>
+        <w:tabs>
+          <w:tab w:val="num" w:pos="360"/>
+        </w:tabs>
+        <w:spacing w:after="40"/>
+        <w:ind w:left="360" w:hanging="360"/>
+      </w:pPr>
+      <w:r>
+        <w:rPr>
+          <w:rFonts w:ascii="Calibri" w:hAnsi="Calibri"/>
+          <w:sz w:val="21"/>
+        </w:rPr>
+        <w:t>Run `</w:t>
+      </w:r>
+      <w:proofErr w:type="spellStart"/>
+      <w:r>
+        <w:rPr>
+          <w:rFonts w:ascii="Calibri" w:hAnsi="Calibri"/>
+          <w:sz w:val="21"/>
+        </w:rPr>
+        <w:t>mvn</w:t>
+      </w:r>
+      <w:proofErr w:type="spellEnd"/>
+      <w:r>
+        <w:rPr>
+          <w:rFonts w:ascii="Calibri" w:hAnsi="Calibri"/>
+          <w:sz w:val="21"/>
+        </w:rPr>
+        <w:t xml:space="preserve"> </w:t>
+      </w:r>
+      <w:proofErr w:type="spellStart"/>
+      <w:r>
+        <w:rPr>
+          <w:rFonts w:ascii="Calibri" w:hAnsi="Calibri"/>
+          <w:sz w:val="21"/>
+        </w:rPr>
+        <w:t>spring-</w:t>
+      </w:r>
+      <w:proofErr w:type="gramStart"/>
+      <w:r>
+        <w:rPr>
+          <w:rFonts w:ascii="Calibri" w:hAnsi="Calibri"/>
+          <w:sz w:val="21"/>
+        </w:rPr>
+        <w:t>boot:run</w:t>
+      </w:r>
+      <w:proofErr w:type="spellEnd"/>
+      <w:proofErr w:type="gramEnd"/>
+      <w:r>
+        <w:rPr>
+          <w:rFonts w:ascii="Calibri" w:hAnsi="Calibri"/>
+          <w:sz w:val="21"/>
+        </w:rPr>
+        <w:t>` — application starts cleanly</w:t>
+      </w:r>
+    </w:p>
+    <w:p>
+      <w:pPr>
+        <w:pStyle w:val="ListBullet"/>
+        <w:tabs>
+          <w:tab w:val="num" w:pos="360"/>
+        </w:tabs>
+        <w:spacing w:after="40"/>
+        <w:ind w:left="360" w:hanging="360"/>
+      </w:pPr>
+      <w:r>
+        <w:rPr>
+          <w:rFonts w:ascii="Calibri" w:hAnsi="Calibri"/>
+          <w:sz w:val="21"/>
+        </w:rPr>
+        <w:t>Call GET /actuator/health — returns {"</w:t>
+      </w:r>
+      <w:proofErr w:type="spellStart"/>
+      <w:r>
+        <w:rPr>
+          <w:rFonts w:ascii="Calibri" w:hAnsi="Calibri"/>
+          <w:sz w:val="21"/>
+        </w:rPr>
+        <w:t>status":"UP</w:t>
+      </w:r>
+      <w:proofErr w:type="spellEnd"/>
+      <w:r>
+        <w:rPr>
+          <w:rFonts w:ascii="Calibri" w:hAnsi="Calibri"/>
+          <w:sz w:val="21"/>
+        </w:rPr>
+        <w:t>"}</w:t>
+      </w:r>
+    </w:p>
+    <w:p>
+      <w:pPr>
+        <w:pStyle w:val="ListBullet"/>
+        <w:tabs>
+          <w:tab w:val="num" w:pos="360"/>
+        </w:tabs>
+        <w:spacing w:after="40"/>
+        <w:ind w:left="360" w:hanging="360"/>
+      </w:pPr>
+      <w:r>
+        <w:rPr>
+          <w:rFonts w:ascii="Calibri" w:hAnsi="Calibri"/>
+          <w:sz w:val="21"/>
+        </w:rPr>
+        <w:t>Send a POST attribution request and verify logs show [</w:t>
+      </w:r>
+      <w:proofErr w:type="spellStart"/>
+      <w:r>
+        <w:rPr>
+          <w:rFonts w:ascii="Calibri" w:hAnsi="Calibri"/>
+          <w:sz w:val="21"/>
+        </w:rPr>
+        <w:t>correlationId</w:t>
+      </w:r>
+      <w:proofErr w:type="spellEnd"/>
+      <w:r>
+        <w:rPr>
+          <w:rFonts w:ascii="Calibri" w:hAnsi="Calibri"/>
+          <w:sz w:val="21"/>
+        </w:rPr>
+        <w:t>] and [</w:t>
+      </w:r>
+      <w:proofErr w:type="spellStart"/>
+      <w:r>
+        <w:rPr>
+          <w:rFonts w:ascii="Calibri" w:hAnsi="Calibri"/>
+          <w:sz w:val="21"/>
+        </w:rPr>
+        <w:t>requestId</w:t>
+      </w:r>
+      <w:proofErr w:type="spellEnd"/>
+      <w:r>
+        <w:rPr>
+          <w:rFonts w:ascii="Calibri" w:hAnsi="Calibri"/>
+          <w:sz w:val="21"/>
+        </w:rPr>
+        <w:t>] in console output</w:t>
+      </w:r>
+    </w:p>
+    <w:p>
+      <w:pPr>
+        <w:pStyle w:val="ListBullet"/>
+        <w:tabs>
+          <w:tab w:val="num" w:pos="360"/>
+        </w:tabs>
+        <w:spacing w:after="40"/>
+        <w:ind w:left="360" w:hanging="360"/>
+      </w:pPr>
+      <w:r>
+        <w:rPr>
+          <w:rFonts w:ascii="Calibri" w:hAnsi="Calibri"/>
+          <w:sz w:val="21"/>
+        </w:rPr>
+        <w:t>Confirm README.md exists and contains all required sections listed above</w:t>
+      </w:r>
+    </w:p>
+    <w:p>
+      <w:pPr>
         <w:rPr>
           <w:b/>
           <w:bCs/>
         </w:rPr>
       </w:pPr>
+      <w:r>
+        <w:rPr>
+          <w:rFonts w:ascii="Calibri" w:hAnsi="Calibri"/>
+          <w:sz w:val="21"/>
+        </w:rPr>
+        <w:t>Run `</w:t>
+      </w:r>
+      <w:proofErr w:type="spellStart"/>
+      <w:r>
+        <w:rPr>
+          <w:rFonts w:ascii="Calibri" w:hAnsi="Calibri"/>
+          <w:sz w:val="21"/>
+        </w:rPr>
+        <w:t>mvn</w:t>
+      </w:r>
+      <w:proofErr w:type="spellEnd"/>
+      <w:r>
+        <w:rPr>
+          <w:rFonts w:ascii="Calibri" w:hAnsi="Calibri"/>
+          <w:sz w:val="21"/>
+        </w:rPr>
+        <w:t xml:space="preserve"> test` — full test suite still passes (no regression from config changes)</w:t>
+      </w:r>
     </w:p>
     <w:sectPr>
       <w:pgSz w:w="11906" w:h="16838"/>

</xml_diff>